<commit_message>
Minor edits to revision and letter (typos)
</commit_message>
<xml_diff>
--- a/output/papers/Round 2/Response-to-reviewers.docx
+++ b/output/papers/Round 2/Response-to-reviewers.docx
@@ -1,6 +1,6 @@
 
 <file path=word/document.xml><?xml version="1.0" encoding="utf-8"?>
-<w:document xmlns:wpc="http://schemas.microsoft.com/office/word/2010/wordprocessingCanvas" xmlns:cx="http://schemas.microsoft.com/office/drawing/2014/chartex" xmlns:cx1="http://schemas.microsoft.com/office/drawing/2015/9/8/chartex" xmlns:cx2="http://schemas.microsoft.com/office/drawing/2015/10/21/chartex" xmlns:cx3="http://schemas.microsoft.com/office/drawing/2016/5/9/chartex" xmlns:cx4="http://schemas.microsoft.com/office/drawing/2016/5/10/chartex" xmlns:cx5="http://schemas.microsoft.com/office/drawing/2016/5/11/chartex" xmlns:cx6="http://schemas.microsoft.com/office/drawing/2016/5/12/chartex" xmlns:cx7="http://schemas.microsoft.com/office/drawing/2016/5/13/chartex" xmlns:cx8="http://schemas.microsoft.com/office/drawing/2016/5/14/chartex" xmlns:mc="http://schemas.openxmlformats.org/markup-compatibility/2006" xmlns:aink="http://schemas.microsoft.com/office/drawing/2016/ink" xmlns:am3d="http://schemas.microsoft.com/office/drawing/2017/model3d" xmlns:o="urn:schemas-microsoft-com:office:office" xmlns:oel="http://schemas.microsoft.com/office/2019/extlst" xmlns:r="http://schemas.openxmlformats.org/officeDocument/2006/relationships" xmlns:m="http://schemas.openxmlformats.org/officeDocument/2006/math" xmlns:v="urn:schemas-microsoft-com:vml" xmlns:wp14="http://schemas.microsoft.com/office/word/2010/wordprocessingDrawing" xmlns:wp="http://schemas.openxmlformats.org/drawingml/2006/wordprocessingDrawing" xmlns:w10="urn:schemas-microsoft-com:office:word" xmlns:w="http://schemas.openxmlformats.org/wordprocessingml/2006/main" xmlns:w14="http://schemas.microsoft.com/office/word/2010/wordml" xmlns:w15="http://schemas.microsoft.com/office/word/2012/wordml" xmlns:w16cex="http://schemas.microsoft.com/office/word/2018/wordml/cex" xmlns:w16cid="http://schemas.microsoft.com/office/word/2016/wordml/cid" xmlns:w16="http://schemas.microsoft.com/office/word/2018/wordml" xmlns:w16du="http://schemas.microsoft.com/office/word/2023/wordml/word16du" xmlns:w16sdtdh="http://schemas.microsoft.com/office/word/2020/wordml/sdtdatahash" xmlns:w16sdtfl="http://schemas.microsoft.com/office/word/2024/wordml/sdtformatlock" xmlns:w16se="http://schemas.microsoft.com/office/word/2015/wordml/symex" xmlns:wpg="http://schemas.microsoft.com/office/word/2010/wordprocessingGroup" xmlns:wpi="http://schemas.microsoft.com/office/word/2010/wordprocessingInk" xmlns:wne="http://schemas.microsoft.com/office/word/2006/wordml" xmlns:wps="http://schemas.microsoft.com/office/word/2010/wordprocessingShape" mc:Ignorable="w14 w15 w16se w16cid w16 w16cex w16sdtdh w16sdtfl w16du wp14">
+<w:document xmlns:wpc="http://schemas.microsoft.com/office/word/2010/wordprocessingCanvas" xmlns:cx="http://schemas.microsoft.com/office/drawing/2014/chartex" xmlns:cx1="http://schemas.microsoft.com/office/drawing/2015/9/8/chartex" xmlns:cx2="http://schemas.microsoft.com/office/drawing/2015/10/21/chartex" xmlns:cx3="http://schemas.microsoft.com/office/drawing/2016/5/9/chartex" xmlns:cx4="http://schemas.microsoft.com/office/drawing/2016/5/10/chartex" xmlns:cx5="http://schemas.microsoft.com/office/drawing/2016/5/11/chartex" xmlns:cx6="http://schemas.microsoft.com/office/drawing/2016/5/12/chartex" xmlns:cx7="http://schemas.microsoft.com/office/drawing/2016/5/13/chartex" xmlns:cx8="http://schemas.microsoft.com/office/drawing/2016/5/14/chartex" xmlns:mc="http://schemas.openxmlformats.org/markup-compatibility/2006" xmlns:aink="http://schemas.microsoft.com/office/drawing/2016/ink" xmlns:am3d="http://schemas.microsoft.com/office/drawing/2017/model3d" xmlns:o="urn:schemas-microsoft-com:office:office" xmlns:oel="http://schemas.microsoft.com/office/2019/extlst" xmlns:r="http://schemas.openxmlformats.org/officeDocument/2006/relationships" xmlns:m="http://schemas.openxmlformats.org/officeDocument/2006/math" xmlns:v="urn:schemas-microsoft-com:vml" xmlns:wp14="http://schemas.microsoft.com/office/word/2010/wordprocessingDrawing" xmlns:wp="http://schemas.openxmlformats.org/drawingml/2006/wordprocessingDrawing" xmlns:w10="urn:schemas-microsoft-com:office:word" xmlns:w="http://schemas.openxmlformats.org/wordprocessingml/2006/main" xmlns:w14="http://schemas.microsoft.com/office/word/2010/wordml" xmlns:w15="http://schemas.microsoft.com/office/word/2012/wordml" xmlns:w16cex="http://schemas.microsoft.com/office/word/2018/wordml/cex" xmlns:w16cid="http://schemas.microsoft.com/office/word/2016/wordml/cid" xmlns:w16="http://schemas.microsoft.com/office/word/2018/wordml" xmlns:w16du="http://schemas.microsoft.com/office/word/2023/wordml/word16du" xmlns:w16sdtdh="http://schemas.microsoft.com/office/word/2020/wordml/sdtdatahash" xmlns:w16se="http://schemas.microsoft.com/office/word/2015/wordml/symex" xmlns:wpg="http://schemas.microsoft.com/office/word/2010/wordprocessingGroup" xmlns:wpi="http://schemas.microsoft.com/office/word/2010/wordprocessingInk" xmlns:wne="http://schemas.microsoft.com/office/word/2006/wordml" xmlns:wps="http://schemas.microsoft.com/office/word/2010/wordprocessingShape" mc:Ignorable="w14 w15 w16se w16cid w16 w16cex w16sdtdh w16du wp14">
   <w:body>
     <w:p>
       <w:pPr>
@@ -644,53 +644,95 @@
               <w:rPr/>
             </w:rPrChange>
           </w:rPr>
-          <w:t>especially, Kraljic et al. 2008</w:t>
-        </w:r>
-      </w:ins>
-      <w:ins w:id="45" w:author="Jaeger, Florian" w:date="2025-05-08T16:31:00Z" w16du:dateUtc="2025-05-08T20:31:00Z">
-        <w:r>
-          <w:rPr>
-            <w:rFonts w:ascii="Times New Roman" w:hAnsi="Times New Roman" w:cs="Times New Roman"/>
-            <w:sz w:val="24"/>
-            <w:szCs w:val="24"/>
-          </w:rPr>
-          <w:t xml:space="preserve">, </w:t>
-        </w:r>
-      </w:ins>
-      <w:ins w:id="46" w:author="Jaeger, Florian" w:date="2025-05-08T16:40:00Z" w16du:dateUtc="2025-05-08T20:40:00Z">
-        <w:r>
-          <w:rPr>
-            <w:rFonts w:ascii="Times New Roman" w:hAnsi="Times New Roman" w:cs="Times New Roman"/>
-            <w:sz w:val="24"/>
-            <w:szCs w:val="24"/>
-          </w:rPr>
-          <w:t>as well as</w:t>
-        </w:r>
-      </w:ins>
-      <w:ins w:id="47" w:author="Jaeger, Florian" w:date="2025-05-08T16:31:00Z" w16du:dateUtc="2025-05-08T20:31:00Z">
-        <w:r>
-          <w:rPr>
-            <w:rFonts w:ascii="Times New Roman" w:hAnsi="Times New Roman" w:cs="Times New Roman"/>
-            <w:sz w:val="24"/>
-            <w:szCs w:val="24"/>
-          </w:rPr>
-          <w:t xml:space="preserve"> Kraljic &amp; Samuel, 2011; Liu &amp; Jaeger, 2018</w:t>
-        </w:r>
-      </w:ins>
-      <w:ins w:id="48" w:author="Jaeger, Florian" w:date="2025-05-08T16:29:00Z" w16du:dateUtc="2025-05-08T20:29:00Z">
-        <w:r>
-          <w:rPr>
-            <w:rFonts w:ascii="Times New Roman" w:hAnsi="Times New Roman" w:cs="Times New Roman"/>
-            <w:sz w:val="24"/>
-            <w:szCs w:val="24"/>
-            <w:rPrChange w:id="49" w:author="Jaeger, Florian" w:date="2025-05-08T16:29:00Z" w16du:dateUtc="2025-05-08T20:29:00Z">
+          <w:t xml:space="preserve">especially, </w:t>
+        </w:r>
+        <w:proofErr w:type="spellStart"/>
+        <w:r>
+          <w:rPr>
+            <w:rFonts w:ascii="Times New Roman" w:hAnsi="Times New Roman" w:cs="Times New Roman"/>
+            <w:sz w:val="24"/>
+            <w:szCs w:val="24"/>
+            <w:rPrChange w:id="45" w:author="Jaeger, Florian" w:date="2025-05-08T16:29:00Z" w16du:dateUtc="2025-05-08T20:29:00Z">
               <w:rPr/>
             </w:rPrChange>
           </w:rPr>
+          <w:t>Kraljic</w:t>
+        </w:r>
+        <w:proofErr w:type="spellEnd"/>
+        <w:r>
+          <w:rPr>
+            <w:rFonts w:ascii="Times New Roman" w:hAnsi="Times New Roman" w:cs="Times New Roman"/>
+            <w:sz w:val="24"/>
+            <w:szCs w:val="24"/>
+            <w:rPrChange w:id="46" w:author="Jaeger, Florian" w:date="2025-05-08T16:29:00Z" w16du:dateUtc="2025-05-08T20:29:00Z">
+              <w:rPr/>
+            </w:rPrChange>
+          </w:rPr>
+          <w:t xml:space="preserve"> et al. 2008</w:t>
+        </w:r>
+      </w:ins>
+      <w:ins w:id="47" w:author="Jaeger, Florian" w:date="2025-05-08T16:31:00Z" w16du:dateUtc="2025-05-08T20:31:00Z">
+        <w:r>
+          <w:rPr>
+            <w:rFonts w:ascii="Times New Roman" w:hAnsi="Times New Roman" w:cs="Times New Roman"/>
+            <w:sz w:val="24"/>
+            <w:szCs w:val="24"/>
+          </w:rPr>
+          <w:t xml:space="preserve">, </w:t>
+        </w:r>
+      </w:ins>
+      <w:ins w:id="48" w:author="Jaeger, Florian" w:date="2025-05-08T16:40:00Z" w16du:dateUtc="2025-05-08T20:40:00Z">
+        <w:r>
+          <w:rPr>
+            <w:rFonts w:ascii="Times New Roman" w:hAnsi="Times New Roman" w:cs="Times New Roman"/>
+            <w:sz w:val="24"/>
+            <w:szCs w:val="24"/>
+          </w:rPr>
+          <w:t>as well as</w:t>
+        </w:r>
+      </w:ins>
+      <w:ins w:id="49" w:author="Jaeger, Florian" w:date="2025-05-08T16:31:00Z" w16du:dateUtc="2025-05-08T20:31:00Z">
+        <w:r>
+          <w:rPr>
+            <w:rFonts w:ascii="Times New Roman" w:hAnsi="Times New Roman" w:cs="Times New Roman"/>
+            <w:sz w:val="24"/>
+            <w:szCs w:val="24"/>
+          </w:rPr>
+          <w:t xml:space="preserve"> </w:t>
+        </w:r>
+        <w:proofErr w:type="spellStart"/>
+        <w:r>
+          <w:rPr>
+            <w:rFonts w:ascii="Times New Roman" w:hAnsi="Times New Roman" w:cs="Times New Roman"/>
+            <w:sz w:val="24"/>
+            <w:szCs w:val="24"/>
+          </w:rPr>
+          <w:t>Kraljic</w:t>
+        </w:r>
+        <w:proofErr w:type="spellEnd"/>
+        <w:r>
+          <w:rPr>
+            <w:rFonts w:ascii="Times New Roman" w:hAnsi="Times New Roman" w:cs="Times New Roman"/>
+            <w:sz w:val="24"/>
+            <w:szCs w:val="24"/>
+          </w:rPr>
+          <w:t xml:space="preserve"> &amp; Samuel, 2011; Liu &amp; Jaeger, 2018</w:t>
+        </w:r>
+      </w:ins>
+      <w:ins w:id="50" w:author="Jaeger, Florian" w:date="2025-05-08T16:29:00Z" w16du:dateUtc="2025-05-08T20:29:00Z">
+        <w:r>
+          <w:rPr>
+            <w:rFonts w:ascii="Times New Roman" w:hAnsi="Times New Roman" w:cs="Times New Roman"/>
+            <w:sz w:val="24"/>
+            <w:szCs w:val="24"/>
+            <w:rPrChange w:id="51" w:author="Jaeger, Florian" w:date="2025-05-08T16:29:00Z" w16du:dateUtc="2025-05-08T20:29:00Z">
+              <w:rPr/>
+            </w:rPrChange>
+          </w:rPr>
           <w:t>)</w:t>
         </w:r>
       </w:ins>
-      <w:ins w:id="50" w:author="Jaeger, Florian" w:date="2025-05-08T16:30:00Z" w16du:dateUtc="2025-05-08T20:30:00Z">
+      <w:ins w:id="52" w:author="Jaeger, Florian" w:date="2025-05-08T16:30:00Z" w16du:dateUtc="2025-05-08T20:30:00Z">
         <w:r>
           <w:rPr>
             <w:rFonts w:ascii="Times New Roman" w:hAnsi="Times New Roman" w:cs="Times New Roman"/>
@@ -700,7 +742,7 @@
           <w:t xml:space="preserve">. </w:t>
         </w:r>
       </w:ins>
-      <w:ins w:id="51" w:author="Jaeger, Florian" w:date="2025-05-08T16:31:00Z" w16du:dateUtc="2025-05-08T20:31:00Z">
+      <w:ins w:id="53" w:author="Jaeger, Florian" w:date="2025-05-08T16:31:00Z" w16du:dateUtc="2025-05-08T20:31:00Z">
         <w:r>
           <w:rPr>
             <w:rFonts w:ascii="Times New Roman" w:hAnsi="Times New Roman" w:cs="Times New Roman"/>
@@ -718,7 +760,7 @@
           <w:br/>
         </w:r>
       </w:ins>
-      <w:ins w:id="52" w:author="Jaeger, Florian" w:date="2025-05-08T16:30:00Z" w16du:dateUtc="2025-05-08T20:30:00Z">
+      <w:ins w:id="54" w:author="Jaeger, Florian" w:date="2025-05-08T16:30:00Z" w16du:dateUtc="2025-05-08T20:30:00Z">
         <w:r>
           <w:rPr>
             <w:rFonts w:ascii="Times New Roman" w:hAnsi="Times New Roman" w:cs="Times New Roman"/>
@@ -728,7 +770,7 @@
           <w:t>In short, th</w:t>
         </w:r>
       </w:ins>
-      <w:ins w:id="53" w:author="Jaeger, Florian" w:date="2025-05-08T16:31:00Z" w16du:dateUtc="2025-05-08T20:31:00Z">
+      <w:ins w:id="55" w:author="Jaeger, Florian" w:date="2025-05-08T16:31:00Z" w16du:dateUtc="2025-05-08T20:31:00Z">
         <w:r>
           <w:rPr>
             <w:rFonts w:ascii="Times New Roman" w:hAnsi="Times New Roman" w:cs="Times New Roman"/>
@@ -738,7 +780,7 @@
           <w:t>e</w:t>
         </w:r>
       </w:ins>
-      <w:ins w:id="54" w:author="Jaeger, Florian" w:date="2025-05-08T16:30:00Z" w16du:dateUtc="2025-05-08T20:30:00Z">
+      <w:ins w:id="56" w:author="Jaeger, Florian" w:date="2025-05-08T16:30:00Z" w16du:dateUtc="2025-05-08T20:30:00Z">
         <w:r>
           <w:rPr>
             <w:rFonts w:ascii="Times New Roman" w:hAnsi="Times New Roman" w:cs="Times New Roman"/>
@@ -748,7 +790,7 @@
           <w:t xml:space="preserve">se </w:t>
         </w:r>
       </w:ins>
-      <w:ins w:id="55" w:author="Jaeger, Florian" w:date="2025-05-08T16:34:00Z" w16du:dateUtc="2025-05-08T20:34:00Z">
+      <w:ins w:id="57" w:author="Jaeger, Florian" w:date="2025-05-08T16:34:00Z" w16du:dateUtc="2025-05-08T20:34:00Z">
         <w:r>
           <w:rPr>
             <w:rFonts w:ascii="Times New Roman" w:hAnsi="Times New Roman" w:cs="Times New Roman"/>
@@ -758,7 +800,7 @@
           <w:t>studies investigated</w:t>
         </w:r>
       </w:ins>
-      <w:ins w:id="56" w:author="Jaeger, Florian" w:date="2025-05-08T16:30:00Z" w16du:dateUtc="2025-05-08T20:30:00Z">
+      <w:ins w:id="58" w:author="Jaeger, Florian" w:date="2025-05-08T16:30:00Z" w16du:dateUtc="2025-05-08T20:30:00Z">
         <w:r>
           <w:rPr>
             <w:rFonts w:ascii="Times New Roman" w:hAnsi="Times New Roman" w:cs="Times New Roman"/>
@@ -768,7 +810,7 @@
           <w:t xml:space="preserve"> </w:t>
         </w:r>
       </w:ins>
-      <w:ins w:id="57" w:author="Jaeger, Florian" w:date="2025-05-08T16:32:00Z" w16du:dateUtc="2025-05-08T20:32:00Z">
+      <w:ins w:id="59" w:author="Jaeger, Florian" w:date="2025-05-08T16:32:00Z" w16du:dateUtc="2025-05-08T20:32:00Z">
         <w:r>
           <w:rPr>
             <w:rFonts w:ascii="Times New Roman" w:hAnsi="Times New Roman" w:cs="Times New Roman"/>
@@ -778,7 +820,7 @@
           <w:t>how a</w:t>
         </w:r>
       </w:ins>
-      <w:ins w:id="58" w:author="Jaeger, Florian" w:date="2025-05-08T16:30:00Z" w16du:dateUtc="2025-05-08T20:30:00Z">
+      <w:ins w:id="60" w:author="Jaeger, Florian" w:date="2025-05-08T16:30:00Z" w16du:dateUtc="2025-05-08T20:30:00Z">
         <w:r>
           <w:rPr>
             <w:rFonts w:ascii="Times New Roman" w:hAnsi="Times New Roman" w:cs="Times New Roman"/>
@@ -788,7 +830,7 @@
           <w:t xml:space="preserve"> </w:t>
         </w:r>
       </w:ins>
-      <w:ins w:id="59" w:author="Jaeger, Florian" w:date="2025-05-08T16:32:00Z" w16du:dateUtc="2025-05-08T20:32:00Z">
+      <w:ins w:id="61" w:author="Jaeger, Florian" w:date="2025-05-08T16:32:00Z" w16du:dateUtc="2025-05-08T20:32:00Z">
         <w:r>
           <w:rPr>
             <w:rFonts w:ascii="Times New Roman" w:hAnsi="Times New Roman" w:cs="Times New Roman"/>
@@ -798,7 +840,7 @@
           <w:t xml:space="preserve">visually-presented </w:t>
         </w:r>
       </w:ins>
-      <w:ins w:id="60" w:author="Jaeger, Florian" w:date="2025-05-08T16:30:00Z" w16du:dateUtc="2025-05-08T20:30:00Z">
+      <w:ins w:id="62" w:author="Jaeger, Florian" w:date="2025-05-08T16:30:00Z" w16du:dateUtc="2025-05-08T20:30:00Z">
         <w:r>
           <w:rPr>
             <w:rFonts w:ascii="Times New Roman" w:hAnsi="Times New Roman" w:cs="Times New Roman"/>
@@ -808,7 +850,7 @@
           <w:t>pen</w:t>
         </w:r>
       </w:ins>
-      <w:ins w:id="61" w:author="Jaeger, Florian" w:date="2025-05-08T16:32:00Z" w16du:dateUtc="2025-05-08T20:32:00Z">
+      <w:ins w:id="63" w:author="Jaeger, Florian" w:date="2025-05-08T16:32:00Z" w16du:dateUtc="2025-05-08T20:32:00Z">
         <w:r>
           <w:rPr>
             <w:rFonts w:ascii="Times New Roman" w:hAnsi="Times New Roman" w:cs="Times New Roman"/>
@@ -818,7 +860,7 @@
           <w:t xml:space="preserve"> </w:t>
         </w:r>
       </w:ins>
-      <w:ins w:id="62" w:author="Jaeger, Florian" w:date="2025-05-08T16:30:00Z" w16du:dateUtc="2025-05-08T20:30:00Z">
+      <w:ins w:id="64" w:author="Jaeger, Florian" w:date="2025-05-08T16:30:00Z" w16du:dateUtc="2025-05-08T20:30:00Z">
         <w:r>
           <w:rPr>
             <w:rFonts w:ascii="Times New Roman" w:hAnsi="Times New Roman" w:cs="Times New Roman"/>
@@ -828,7 +870,7 @@
           <w:t xml:space="preserve">in the mouth </w:t>
         </w:r>
       </w:ins>
-      <w:ins w:id="63" w:author="Jaeger, Florian" w:date="2025-05-08T16:32:00Z" w16du:dateUtc="2025-05-08T20:32:00Z">
+      <w:ins w:id="65" w:author="Jaeger, Florian" w:date="2025-05-08T16:32:00Z" w16du:dateUtc="2025-05-08T20:32:00Z">
         <w:r>
           <w:rPr>
             <w:rFonts w:ascii="Times New Roman" w:hAnsi="Times New Roman" w:cs="Times New Roman"/>
@@ -838,7 +880,7 @@
           <w:t xml:space="preserve">(vs. hand) of a speaker during </w:t>
         </w:r>
       </w:ins>
-      <w:ins w:id="64" w:author="Jaeger, Florian" w:date="2025-05-08T16:33:00Z" w16du:dateUtc="2025-05-08T20:33:00Z">
+      <w:ins w:id="66" w:author="Jaeger, Florian" w:date="2025-05-08T16:33:00Z" w16du:dateUtc="2025-05-08T20:33:00Z">
         <w:r>
           <w:rPr>
             <w:rFonts w:ascii="Times New Roman" w:hAnsi="Times New Roman" w:cs="Times New Roman"/>
@@ -848,13 +890,13 @@
           <w:t xml:space="preserve">the lexically-guided </w:t>
         </w:r>
       </w:ins>
-      <w:ins w:id="65" w:author="Jaeger, Florian" w:date="2025-05-08T16:32:00Z" w16du:dateUtc="2025-05-08T20:32:00Z">
-        <w:r>
-          <w:rPr>
-            <w:rFonts w:ascii="Times New Roman" w:hAnsi="Times New Roman" w:cs="Times New Roman"/>
-            <w:sz w:val="24"/>
-            <w:szCs w:val="24"/>
-            <w:rPrChange w:id="66" w:author="Jaeger, Florian" w:date="2025-05-08T16:33:00Z" w16du:dateUtc="2025-05-08T20:33:00Z">
+      <w:ins w:id="67" w:author="Jaeger, Florian" w:date="2025-05-08T16:32:00Z" w16du:dateUtc="2025-05-08T20:32:00Z">
+        <w:r>
+          <w:rPr>
+            <w:rFonts w:ascii="Times New Roman" w:hAnsi="Times New Roman" w:cs="Times New Roman"/>
+            <w:sz w:val="24"/>
+            <w:szCs w:val="24"/>
+            <w:rPrChange w:id="68" w:author="Jaeger, Florian" w:date="2025-05-08T16:33:00Z" w16du:dateUtc="2025-05-08T20:33:00Z">
               <w:rPr>
                 <w:rFonts w:ascii="Times New Roman" w:hAnsi="Times New Roman" w:cs="Times New Roman"/>
                 <w:i/>
@@ -875,7 +917,7 @@
           <w:t xml:space="preserve"> </w:t>
         </w:r>
       </w:ins>
-      <w:ins w:id="67" w:author="Jaeger, Florian" w:date="2025-05-08T16:33:00Z" w16du:dateUtc="2025-05-08T20:33:00Z">
+      <w:ins w:id="69" w:author="Jaeger, Florian" w:date="2025-05-08T16:33:00Z" w16du:dateUtc="2025-05-08T20:33:00Z">
         <w:r>
           <w:rPr>
             <w:rFonts w:ascii="Times New Roman" w:hAnsi="Times New Roman" w:cs="Times New Roman"/>
@@ -909,7 +951,7 @@
             <w:rFonts w:ascii="Times New Roman" w:hAnsi="Times New Roman" w:cs="Times New Roman"/>
             <w:sz w:val="24"/>
             <w:szCs w:val="24"/>
-            <w:rPrChange w:id="68" w:author="Jaeger, Florian" w:date="2025-05-08T16:36:00Z" w16du:dateUtc="2025-05-08T20:36:00Z">
+            <w:rPrChange w:id="70" w:author="Jaeger, Florian" w:date="2025-05-08T16:36:00Z" w16du:dateUtc="2025-05-08T20:36:00Z">
               <w:rPr>
                 <w:rFonts w:ascii="Times New Roman" w:hAnsi="Times New Roman" w:cs="Times New Roman"/>
                 <w:i/>
@@ -932,7 +974,7 @@
           <w:t>.</w:t>
         </w:r>
       </w:ins>
-      <w:ins w:id="69" w:author="Jaeger, Florian" w:date="2025-05-08T16:34:00Z" w16du:dateUtc="2025-05-08T20:34:00Z">
+      <w:ins w:id="71" w:author="Jaeger, Florian" w:date="2025-05-08T16:34:00Z" w16du:dateUtc="2025-05-08T20:34:00Z">
         <w:r>
           <w:rPr>
             <w:rFonts w:ascii="Times New Roman" w:hAnsi="Times New Roman" w:cs="Times New Roman"/>
@@ -944,7 +986,7 @@
           <w:t xml:space="preserve"> </w:t>
         </w:r>
       </w:ins>
-      <w:ins w:id="70" w:author="Jaeger, Florian" w:date="2025-05-08T16:39:00Z" w16du:dateUtc="2025-05-08T20:39:00Z">
+      <w:ins w:id="72" w:author="Jaeger, Florian" w:date="2025-05-08T16:39:00Z" w16du:dateUtc="2025-05-08T20:39:00Z">
         <w:r>
           <w:rPr>
             <w:rFonts w:ascii="Times New Roman" w:hAnsi="Times New Roman" w:cs="Times New Roman"/>
@@ -954,7 +996,7 @@
           <w:t xml:space="preserve">The thought-provoking </w:t>
         </w:r>
       </w:ins>
-      <w:ins w:id="71" w:author="Jaeger, Florian" w:date="2025-05-08T16:41:00Z" w16du:dateUtc="2025-05-08T20:41:00Z">
+      <w:ins w:id="73" w:author="Jaeger, Florian" w:date="2025-05-08T16:41:00Z" w16du:dateUtc="2025-05-08T20:41:00Z">
         <w:r>
           <w:rPr>
             <w:rFonts w:ascii="Times New Roman" w:hAnsi="Times New Roman" w:cs="Times New Roman"/>
@@ -964,7 +1006,7 @@
           <w:t>finding</w:t>
         </w:r>
       </w:ins>
-      <w:ins w:id="72" w:author="Jaeger, Florian" w:date="2025-05-08T16:39:00Z" w16du:dateUtc="2025-05-08T20:39:00Z">
+      <w:ins w:id="74" w:author="Jaeger, Florian" w:date="2025-05-08T16:39:00Z" w16du:dateUtc="2025-05-08T20:39:00Z">
         <w:r>
           <w:rPr>
             <w:rFonts w:ascii="Times New Roman" w:hAnsi="Times New Roman" w:cs="Times New Roman"/>
@@ -974,7 +1016,7 @@
           <w:t xml:space="preserve"> of these</w:t>
         </w:r>
       </w:ins>
-      <w:ins w:id="73" w:author="Jaeger, Florian" w:date="2025-05-08T16:38:00Z" w16du:dateUtc="2025-05-08T20:38:00Z">
+      <w:ins w:id="75" w:author="Jaeger, Florian" w:date="2025-05-08T16:38:00Z" w16du:dateUtc="2025-05-08T20:38:00Z">
         <w:r>
           <w:rPr>
             <w:rFonts w:ascii="Times New Roman" w:hAnsi="Times New Roman" w:cs="Times New Roman"/>
@@ -984,7 +1026,7 @@
           <w:t xml:space="preserve"> studies </w:t>
         </w:r>
       </w:ins>
-      <w:ins w:id="74" w:author="Jaeger, Florian" w:date="2025-05-08T16:39:00Z" w16du:dateUtc="2025-05-08T20:39:00Z">
+      <w:ins w:id="76" w:author="Jaeger, Florian" w:date="2025-05-08T16:39:00Z" w16du:dateUtc="2025-05-08T20:39:00Z">
         <w:r>
           <w:rPr>
             <w:rFonts w:ascii="Times New Roman" w:hAnsi="Times New Roman" w:cs="Times New Roman"/>
@@ -994,7 +1036,7 @@
           <w:t xml:space="preserve">was that perceptual recalibration can be blocked or reduced if the </w:t>
         </w:r>
       </w:ins>
-      <w:ins w:id="75" w:author="Jaeger, Florian" w:date="2025-05-08T16:41:00Z" w16du:dateUtc="2025-05-08T20:41:00Z">
+      <w:ins w:id="77" w:author="Jaeger, Florian" w:date="2025-05-08T16:41:00Z" w16du:dateUtc="2025-05-08T20:41:00Z">
         <w:r>
           <w:rPr>
             <w:rFonts w:ascii="Times New Roman" w:hAnsi="Times New Roman" w:cs="Times New Roman"/>
@@ -1004,7 +1046,7 @@
           <w:t>audio-visual</w:t>
         </w:r>
       </w:ins>
-      <w:ins w:id="76" w:author="Jaeger, Florian" w:date="2025-05-08T16:39:00Z" w16du:dateUtc="2025-05-08T20:39:00Z">
+      <w:ins w:id="78" w:author="Jaeger, Florian" w:date="2025-05-08T16:39:00Z" w16du:dateUtc="2025-05-08T20:39:00Z">
         <w:r>
           <w:rPr>
             <w:rFonts w:ascii="Times New Roman" w:hAnsi="Times New Roman" w:cs="Times New Roman"/>
@@ -1014,7 +1056,7 @@
           <w:t xml:space="preserve"> exposure items </w:t>
         </w:r>
       </w:ins>
-      <w:ins w:id="77" w:author="Jaeger, Florian" w:date="2025-05-08T16:41:00Z" w16du:dateUtc="2025-05-08T20:41:00Z">
+      <w:ins w:id="79" w:author="Jaeger, Florian" w:date="2025-05-08T16:41:00Z" w16du:dateUtc="2025-05-08T20:41:00Z">
         <w:r>
           <w:rPr>
             <w:rFonts w:ascii="Times New Roman" w:hAnsi="Times New Roman" w:cs="Times New Roman"/>
@@ -1024,7 +1066,7 @@
           <w:t>with shifted pronunciations o</w:t>
         </w:r>
       </w:ins>
-      <w:ins w:id="78" w:author="Jaeger, Florian" w:date="2025-05-08T16:42:00Z" w16du:dateUtc="2025-05-08T20:42:00Z">
+      <w:ins w:id="80" w:author="Jaeger, Florian" w:date="2025-05-08T16:42:00Z" w16du:dateUtc="2025-05-08T20:42:00Z">
         <w:r>
           <w:rPr>
             <w:rFonts w:ascii="Times New Roman" w:hAnsi="Times New Roman" w:cs="Times New Roman"/>
@@ -1034,17 +1076,35 @@
           <w:t>ccur only while the speaker has a pen in the mouth. Competing explanations have been offered for this reduction of perceptual recalibration</w:t>
         </w:r>
       </w:ins>
-      <w:ins w:id="79" w:author="Jaeger, Florian" w:date="2025-05-08T16:43:00Z" w16du:dateUtc="2025-05-08T20:43:00Z">
-        <w:r>
-          <w:rPr>
-            <w:rFonts w:ascii="Times New Roman" w:hAnsi="Times New Roman" w:cs="Times New Roman"/>
-            <w:sz w:val="24"/>
-            <w:szCs w:val="24"/>
-          </w:rPr>
-          <w:t xml:space="preserve">—from causal inferences (e.g., Kraljic </w:t>
-        </w:r>
-      </w:ins>
-      <w:ins w:id="80" w:author="Jaeger, Florian" w:date="2025-05-08T16:55:00Z" w16du:dateUtc="2025-05-08T20:55:00Z">
+      <w:ins w:id="81" w:author="Jaeger, Florian" w:date="2025-05-08T16:43:00Z" w16du:dateUtc="2025-05-08T20:43:00Z">
+        <w:r>
+          <w:rPr>
+            <w:rFonts w:ascii="Times New Roman" w:hAnsi="Times New Roman" w:cs="Times New Roman"/>
+            <w:sz w:val="24"/>
+            <w:szCs w:val="24"/>
+          </w:rPr>
+          <w:t xml:space="preserve">—from causal inferences (e.g., </w:t>
+        </w:r>
+        <w:proofErr w:type="spellStart"/>
+        <w:r>
+          <w:rPr>
+            <w:rFonts w:ascii="Times New Roman" w:hAnsi="Times New Roman" w:cs="Times New Roman"/>
+            <w:sz w:val="24"/>
+            <w:szCs w:val="24"/>
+          </w:rPr>
+          <w:t>Kraljic</w:t>
+        </w:r>
+        <w:proofErr w:type="spellEnd"/>
+        <w:r>
+          <w:rPr>
+            <w:rFonts w:ascii="Times New Roman" w:hAnsi="Times New Roman" w:cs="Times New Roman"/>
+            <w:sz w:val="24"/>
+            <w:szCs w:val="24"/>
+          </w:rPr>
+          <w:t xml:space="preserve"> </w:t>
+        </w:r>
+      </w:ins>
+      <w:ins w:id="82" w:author="Jaeger, Florian" w:date="2025-05-08T16:55:00Z" w16du:dateUtc="2025-05-08T20:55:00Z">
         <w:r>
           <w:rPr>
             <w:rFonts w:ascii="Times New Roman" w:hAnsi="Times New Roman" w:cs="Times New Roman"/>
@@ -1054,7 +1114,7 @@
           <w:t>et al.</w:t>
         </w:r>
       </w:ins>
-      <w:ins w:id="81" w:author="Jaeger, Florian" w:date="2025-05-08T16:43:00Z" w16du:dateUtc="2025-05-08T20:43:00Z">
+      <w:ins w:id="83" w:author="Jaeger, Florian" w:date="2025-05-08T16:43:00Z" w16du:dateUtc="2025-05-08T20:43:00Z">
         <w:r>
           <w:rPr>
             <w:rFonts w:ascii="Times New Roman" w:hAnsi="Times New Roman" w:cs="Times New Roman"/>
@@ -1064,7 +1124,7 @@
           <w:t>, 2008; Liu &amp; Jaeger, 201</w:t>
         </w:r>
       </w:ins>
-      <w:ins w:id="82" w:author="Jaeger, Florian" w:date="2025-05-08T18:19:00Z" w16du:dateUtc="2025-05-08T22:19:00Z">
+      <w:ins w:id="84" w:author="Jaeger, Florian" w:date="2025-05-08T18:19:00Z" w16du:dateUtc="2025-05-08T22:19:00Z">
         <w:r>
           <w:rPr>
             <w:rFonts w:ascii="Times New Roman" w:hAnsi="Times New Roman" w:cs="Times New Roman"/>
@@ -1074,7 +1134,7 @@
           <w:t>8</w:t>
         </w:r>
       </w:ins>
-      <w:ins w:id="83" w:author="Jaeger, Florian" w:date="2025-05-08T16:43:00Z" w16du:dateUtc="2025-05-08T20:43:00Z">
+      <w:ins w:id="85" w:author="Jaeger, Florian" w:date="2025-05-08T16:43:00Z" w16du:dateUtc="2025-05-08T20:43:00Z">
         <w:r>
           <w:rPr>
             <w:rFonts w:ascii="Times New Roman" w:hAnsi="Times New Roman" w:cs="Times New Roman"/>
@@ -1084,17 +1144,35 @@
           <w:t xml:space="preserve">) to separate exemplar storage </w:t>
         </w:r>
       </w:ins>
-      <w:ins w:id="84" w:author="Jaeger, Florian" w:date="2025-05-08T16:44:00Z" w16du:dateUtc="2025-05-08T20:44:00Z">
-        <w:r>
-          <w:rPr>
-            <w:rFonts w:ascii="Times New Roman" w:hAnsi="Times New Roman" w:cs="Times New Roman"/>
-            <w:sz w:val="24"/>
-            <w:szCs w:val="24"/>
-          </w:rPr>
-          <w:t xml:space="preserve">of audio-only vs. audio-visual inputs (Kraljic &amp; Samuel, 2011). </w:t>
-        </w:r>
-      </w:ins>
-      <w:ins w:id="85" w:author="Jaeger, Florian" w:date="2025-05-08T16:48:00Z" w16du:dateUtc="2025-05-08T20:48:00Z">
+      <w:ins w:id="86" w:author="Jaeger, Florian" w:date="2025-05-08T16:44:00Z" w16du:dateUtc="2025-05-08T20:44:00Z">
+        <w:r>
+          <w:rPr>
+            <w:rFonts w:ascii="Times New Roman" w:hAnsi="Times New Roman" w:cs="Times New Roman"/>
+            <w:sz w:val="24"/>
+            <w:szCs w:val="24"/>
+          </w:rPr>
+          <w:t>of audio-only vs. audio-visual inputs (</w:t>
+        </w:r>
+        <w:proofErr w:type="spellStart"/>
+        <w:r>
+          <w:rPr>
+            <w:rFonts w:ascii="Times New Roman" w:hAnsi="Times New Roman" w:cs="Times New Roman"/>
+            <w:sz w:val="24"/>
+            <w:szCs w:val="24"/>
+          </w:rPr>
+          <w:t>Kraljic</w:t>
+        </w:r>
+        <w:proofErr w:type="spellEnd"/>
+        <w:r>
+          <w:rPr>
+            <w:rFonts w:ascii="Times New Roman" w:hAnsi="Times New Roman" w:cs="Times New Roman"/>
+            <w:sz w:val="24"/>
+            <w:szCs w:val="24"/>
+          </w:rPr>
+          <w:t xml:space="preserve"> &amp; Samuel, 2011). </w:t>
+        </w:r>
+      </w:ins>
+      <w:ins w:id="87" w:author="Jaeger, Florian" w:date="2025-05-08T16:48:00Z" w16du:dateUtc="2025-05-08T20:48:00Z">
         <w:r>
           <w:rPr>
             <w:rFonts w:ascii="Times New Roman" w:hAnsi="Times New Roman" w:cs="Times New Roman"/>
@@ -1112,20 +1190,7 @@
           <w:br/>
         </w:r>
       </w:ins>
-      <w:ins w:id="86" w:author="Jaeger, Florian" w:date="2025-05-08T16:44:00Z" w16du:dateUtc="2025-05-08T20:44:00Z">
-        <w:r>
-          <w:rPr>
-            <w:rFonts w:ascii="Times New Roman" w:hAnsi="Times New Roman" w:cs="Times New Roman"/>
-            <w:sz w:val="24"/>
-            <w:szCs w:val="24"/>
-            <w:rPrChange w:id="87" w:author="Jaeger, Florian" w:date="2025-05-08T16:48:00Z" w16du:dateUtc="2025-05-08T20:48:00Z">
-              <w:rPr/>
-            </w:rPrChange>
-          </w:rPr>
-          <w:t>Critically, t</w:t>
-        </w:r>
-      </w:ins>
-      <w:ins w:id="88" w:author="Jaeger, Florian" w:date="2025-05-08T16:34:00Z" w16du:dateUtc="2025-05-08T20:34:00Z">
+      <w:ins w:id="88" w:author="Jaeger, Florian" w:date="2025-05-08T16:44:00Z" w16du:dateUtc="2025-05-08T20:44:00Z">
         <w:r>
           <w:rPr>
             <w:rFonts w:ascii="Times New Roman" w:hAnsi="Times New Roman" w:cs="Times New Roman"/>
@@ -1135,10 +1200,10 @@
               <w:rPr/>
             </w:rPrChange>
           </w:rPr>
-          <w:t>he desig</w:t>
-        </w:r>
-      </w:ins>
-      <w:ins w:id="90" w:author="Jaeger, Florian" w:date="2025-05-08T16:35:00Z" w16du:dateUtc="2025-05-08T20:35:00Z">
+          <w:t>Critically, t</w:t>
+        </w:r>
+      </w:ins>
+      <w:ins w:id="90" w:author="Jaeger, Florian" w:date="2025-05-08T16:34:00Z" w16du:dateUtc="2025-05-08T20:34:00Z">
         <w:r>
           <w:rPr>
             <w:rFonts w:ascii="Times New Roman" w:hAnsi="Times New Roman" w:cs="Times New Roman"/>
@@ -1148,10 +1213,23 @@
               <w:rPr/>
             </w:rPrChange>
           </w:rPr>
+          <w:t>he desig</w:t>
+        </w:r>
+      </w:ins>
+      <w:ins w:id="92" w:author="Jaeger, Florian" w:date="2025-05-08T16:35:00Z" w16du:dateUtc="2025-05-08T20:35:00Z">
+        <w:r>
+          <w:rPr>
+            <w:rFonts w:ascii="Times New Roman" w:hAnsi="Times New Roman" w:cs="Times New Roman"/>
+            <w:sz w:val="24"/>
+            <w:szCs w:val="24"/>
+            <w:rPrChange w:id="93" w:author="Jaeger, Florian" w:date="2025-05-08T16:48:00Z" w16du:dateUtc="2025-05-08T20:48:00Z">
+              <w:rPr/>
+            </w:rPrChange>
+          </w:rPr>
           <w:t xml:space="preserve">n of these studies did not allow researchers to estimate how the placement of the pen affects perception </w:t>
         </w:r>
       </w:ins>
-      <w:ins w:id="92" w:author="Jaeger, Florian" w:date="2025-05-08T16:45:00Z" w16du:dateUtc="2025-05-08T20:45:00Z">
+      <w:ins w:id="94" w:author="Jaeger, Florian" w:date="2025-05-08T16:45:00Z" w16du:dateUtc="2025-05-08T20:45:00Z">
         <w:r>
           <w:rPr>
             <w:rFonts w:ascii="Times New Roman" w:hAnsi="Times New Roman" w:cs="Times New Roman"/>
@@ -1159,7 +1237,7 @@
             <w:iCs/>
             <w:sz w:val="24"/>
             <w:szCs w:val="24"/>
-            <w:rPrChange w:id="93" w:author="Jaeger, Florian" w:date="2025-05-08T16:48:00Z" w16du:dateUtc="2025-05-08T20:48:00Z">
+            <w:rPrChange w:id="95" w:author="Jaeger, Florian" w:date="2025-05-08T16:48:00Z" w16du:dateUtc="2025-05-08T20:48:00Z">
               <w:rPr>
                 <w:i/>
                 <w:iCs/>
@@ -1173,27 +1251,14 @@
             <w:rFonts w:ascii="Times New Roman" w:hAnsi="Times New Roman" w:cs="Times New Roman"/>
             <w:sz w:val="24"/>
             <w:szCs w:val="24"/>
-            <w:rPrChange w:id="94" w:author="Jaeger, Florian" w:date="2025-05-08T16:48:00Z" w16du:dateUtc="2025-05-08T20:48:00Z">
-              <w:rPr/>
-            </w:rPrChange>
-          </w:rPr>
-          <w:t xml:space="preserve">, </w:t>
-        </w:r>
-      </w:ins>
-      <w:ins w:id="95" w:author="Jaeger, Florian" w:date="2025-05-08T16:46:00Z" w16du:dateUtc="2025-05-08T20:46:00Z">
-        <w:r>
-          <w:rPr>
-            <w:rFonts w:ascii="Times New Roman" w:hAnsi="Times New Roman" w:cs="Times New Roman"/>
-            <w:sz w:val="24"/>
-            <w:szCs w:val="24"/>
             <w:rPrChange w:id="96" w:author="Jaeger, Florian" w:date="2025-05-08T16:48:00Z" w16du:dateUtc="2025-05-08T20:48:00Z">
               <w:rPr/>
             </w:rPrChange>
           </w:rPr>
-          <w:t>making it difficult to adjudicate between the competing hypotheses about its downstream effects during the test phase</w:t>
-        </w:r>
-      </w:ins>
-      <w:ins w:id="97" w:author="Jaeger, Florian" w:date="2025-05-08T16:37:00Z" w16du:dateUtc="2025-05-08T20:37:00Z">
+          <w:t xml:space="preserve">, </w:t>
+        </w:r>
+      </w:ins>
+      <w:ins w:id="97" w:author="Jaeger, Florian" w:date="2025-05-08T16:46:00Z" w16du:dateUtc="2025-05-08T20:46:00Z">
         <w:r>
           <w:rPr>
             <w:rFonts w:ascii="Times New Roman" w:hAnsi="Times New Roman" w:cs="Times New Roman"/>
@@ -1203,10 +1268,10 @@
               <w:rPr/>
             </w:rPrChange>
           </w:rPr>
-          <w:t>.</w:t>
-        </w:r>
-      </w:ins>
-      <w:ins w:id="99" w:author="Jaeger, Florian" w:date="2025-05-08T16:46:00Z" w16du:dateUtc="2025-05-08T20:46:00Z">
+          <w:t>making it difficult to adjudicate between the competing hypotheses about its downstream effects during the test phase</w:t>
+        </w:r>
+      </w:ins>
+      <w:ins w:id="99" w:author="Jaeger, Florian" w:date="2025-05-08T16:37:00Z" w16du:dateUtc="2025-05-08T20:37:00Z">
         <w:r>
           <w:rPr>
             <w:rFonts w:ascii="Times New Roman" w:hAnsi="Times New Roman" w:cs="Times New Roman"/>
@@ -1216,10 +1281,10 @@
               <w:rPr/>
             </w:rPrChange>
           </w:rPr>
-          <w:t xml:space="preserve"> The revised introduction now clarified that this is the knowledge gap addressed by our study</w:t>
-        </w:r>
-      </w:ins>
-      <w:ins w:id="101" w:author="Jaeger, Florian" w:date="2025-05-08T16:47:00Z" w16du:dateUtc="2025-05-08T20:47:00Z">
+          <w:t>.</w:t>
+        </w:r>
+      </w:ins>
+      <w:ins w:id="101" w:author="Jaeger, Florian" w:date="2025-05-08T16:46:00Z" w16du:dateUtc="2025-05-08T20:46:00Z">
         <w:r>
           <w:rPr>
             <w:rFonts w:ascii="Times New Roman" w:hAnsi="Times New Roman" w:cs="Times New Roman"/>
@@ -1229,10 +1294,23 @@
               <w:rPr/>
             </w:rPrChange>
           </w:rPr>
+          <w:t xml:space="preserve"> The revised introduction now clarified that this is the knowledge gap addressed by our study</w:t>
+        </w:r>
+      </w:ins>
+      <w:ins w:id="103" w:author="Jaeger, Florian" w:date="2025-05-08T16:47:00Z" w16du:dateUtc="2025-05-08T20:47:00Z">
+        <w:r>
+          <w:rPr>
+            <w:rFonts w:ascii="Times New Roman" w:hAnsi="Times New Roman" w:cs="Times New Roman"/>
+            <w:sz w:val="24"/>
+            <w:szCs w:val="24"/>
+            <w:rPrChange w:id="104" w:author="Jaeger, Florian" w:date="2025-05-08T16:48:00Z" w16du:dateUtc="2025-05-08T20:48:00Z">
+              <w:rPr/>
+            </w:rPrChange>
+          </w:rPr>
           <w:t>. We have also revised the discussion to spell out in more detail what our results mean for this earlier line of work.</w:t>
         </w:r>
       </w:ins>
-      <w:ins w:id="103" w:author="Jaeger, Florian" w:date="2025-05-08T16:48:00Z" w16du:dateUtc="2025-05-08T20:48:00Z">
+      <w:ins w:id="105" w:author="Jaeger, Florian" w:date="2025-05-08T16:48:00Z" w16du:dateUtc="2025-05-08T20:48:00Z">
         <w:r>
           <w:rPr>
             <w:rFonts w:ascii="Times New Roman" w:hAnsi="Times New Roman" w:cs="Times New Roman"/>
@@ -1252,20 +1330,20 @@
         </w:numPr>
         <w:spacing w:after="0" w:line="240" w:lineRule="auto"/>
         <w:rPr>
-          <w:ins w:id="104" w:author="Jaeger, Florian" w:date="2025-05-08T16:49:00Z" w16du:dateUtc="2025-05-08T20:49:00Z"/>
-          <w:rFonts w:ascii="Times New Roman" w:hAnsi="Times New Roman" w:cs="Times New Roman"/>
-          <w:sz w:val="24"/>
-          <w:szCs w:val="24"/>
-        </w:rPr>
-      </w:pPr>
-      <w:ins w:id="105" w:author="Jaeger, Florian" w:date="2025-05-08T16:48:00Z" w16du:dateUtc="2025-05-08T20:48:00Z">
+          <w:ins w:id="106" w:author="Jaeger, Florian" w:date="2025-05-08T16:49:00Z" w16du:dateUtc="2025-05-08T20:49:00Z"/>
+          <w:rFonts w:ascii="Times New Roman" w:hAnsi="Times New Roman" w:cs="Times New Roman"/>
+          <w:sz w:val="24"/>
+          <w:szCs w:val="24"/>
+        </w:rPr>
+      </w:pPr>
+      <w:ins w:id="107" w:author="Jaeger, Florian" w:date="2025-05-08T16:48:00Z" w16du:dateUtc="2025-05-08T20:48:00Z">
         <w:r>
           <w:rPr>
             <w:rFonts w:ascii="Times New Roman" w:hAnsi="Times New Roman" w:cs="Times New Roman"/>
             <w:sz w:val="24"/>
             <w:szCs w:val="24"/>
             <w:u w:val="single"/>
-            <w:rPrChange w:id="106" w:author="Jaeger, Florian" w:date="2025-05-08T16:48:00Z" w16du:dateUtc="2025-05-08T20:48:00Z">
+            <w:rPrChange w:id="108" w:author="Jaeger, Florian" w:date="2025-05-08T16:48:00Z" w16du:dateUtc="2025-05-08T20:48:00Z">
               <w:rPr>
                 <w:rFonts w:ascii="Times New Roman" w:hAnsi="Times New Roman" w:cs="Times New Roman"/>
                 <w:sz w:val="24"/>
@@ -1284,7 +1362,7 @@
           <w:t xml:space="preserve"> now contain all the information requested by reviewers (moved there from the supplementary information).</w:t>
         </w:r>
       </w:ins>
-      <w:ins w:id="107" w:author="Jaeger, Florian" w:date="2025-05-08T16:49:00Z" w16du:dateUtc="2025-05-08T20:49:00Z">
+      <w:ins w:id="109" w:author="Jaeger, Florian" w:date="2025-05-08T16:49:00Z" w16du:dateUtc="2025-05-08T20:49:00Z">
         <w:r>
           <w:rPr>
             <w:rFonts w:ascii="Times New Roman" w:hAnsi="Times New Roman" w:cs="Times New Roman"/>
@@ -1312,41 +1390,23 @@
         </w:numPr>
         <w:spacing w:after="0" w:line="240" w:lineRule="auto"/>
         <w:rPr>
-          <w:ins w:id="108" w:author="Jaeger, Florian" w:date="2025-05-08T16:28:00Z" w16du:dateUtc="2025-05-08T20:28:00Z"/>
-          <w:rFonts w:ascii="Times New Roman" w:hAnsi="Times New Roman" w:cs="Times New Roman"/>
-          <w:sz w:val="24"/>
-          <w:szCs w:val="24"/>
-          <w:rPrChange w:id="109" w:author="Jaeger, Florian" w:date="2025-05-08T16:52:00Z" w16du:dateUtc="2025-05-08T20:52:00Z">
+          <w:ins w:id="110" w:author="Jaeger, Florian" w:date="2025-05-08T16:28:00Z" w16du:dateUtc="2025-05-08T20:28:00Z"/>
+          <w:rFonts w:ascii="Times New Roman" w:hAnsi="Times New Roman" w:cs="Times New Roman"/>
+          <w:sz w:val="24"/>
+          <w:szCs w:val="24"/>
+          <w:rPrChange w:id="111" w:author="Jaeger, Florian" w:date="2025-05-08T16:52:00Z" w16du:dateUtc="2025-05-08T20:52:00Z">
             <w:rPr>
-              <w:ins w:id="110" w:author="Jaeger, Florian" w:date="2025-05-08T16:28:00Z" w16du:dateUtc="2025-05-08T20:28:00Z"/>
+              <w:ins w:id="112" w:author="Jaeger, Florian" w:date="2025-05-08T16:28:00Z" w16du:dateUtc="2025-05-08T20:28:00Z"/>
             </w:rPr>
           </w:rPrChange>
         </w:rPr>
-        <w:pPrChange w:id="111" w:author="Jaeger, Florian" w:date="2025-05-08T16:52:00Z" w16du:dateUtc="2025-05-08T20:52:00Z">
+        <w:pPrChange w:id="113" w:author="Jaeger, Florian" w:date="2025-05-08T16:52:00Z" w16du:dateUtc="2025-05-08T20:52:00Z">
           <w:pPr>
             <w:spacing w:after="0" w:line="240" w:lineRule="auto"/>
           </w:pPr>
         </w:pPrChange>
       </w:pPr>
-      <w:ins w:id="112" w:author="Jaeger, Florian" w:date="2025-05-08T16:49:00Z" w16du:dateUtc="2025-05-08T20:49:00Z">
-        <w:r>
-          <w:rPr>
-            <w:rFonts w:ascii="Times New Roman" w:hAnsi="Times New Roman" w:cs="Times New Roman"/>
-            <w:sz w:val="24"/>
-            <w:szCs w:val="24"/>
-            <w:u w:val="single"/>
-            <w:rPrChange w:id="113" w:author="Jaeger, Florian" w:date="2025-05-08T16:52:00Z" w16du:dateUtc="2025-05-08T20:52:00Z">
-              <w:rPr>
-                <w:rFonts w:ascii="Times New Roman" w:hAnsi="Times New Roman" w:cs="Times New Roman"/>
-                <w:sz w:val="24"/>
-                <w:szCs w:val="24"/>
-              </w:rPr>
-            </w:rPrChange>
-          </w:rPr>
-          <w:t>T</w:t>
-        </w:r>
-      </w:ins>
-      <w:ins w:id="114" w:author="Jaeger, Florian" w:date="2025-05-08T16:50:00Z" w16du:dateUtc="2025-05-08T20:50:00Z">
+      <w:ins w:id="114" w:author="Jaeger, Florian" w:date="2025-05-08T16:49:00Z" w16du:dateUtc="2025-05-08T20:49:00Z">
         <w:r>
           <w:rPr>
             <w:rFonts w:ascii="Times New Roman" w:hAnsi="Times New Roman" w:cs="Times New Roman"/>
@@ -1361,6 +1421,24 @@
               </w:rPr>
             </w:rPrChange>
           </w:rPr>
+          <w:t>T</w:t>
+        </w:r>
+      </w:ins>
+      <w:ins w:id="116" w:author="Jaeger, Florian" w:date="2025-05-08T16:50:00Z" w16du:dateUtc="2025-05-08T20:50:00Z">
+        <w:r>
+          <w:rPr>
+            <w:rFonts w:ascii="Times New Roman" w:hAnsi="Times New Roman" w:cs="Times New Roman"/>
+            <w:sz w:val="24"/>
+            <w:szCs w:val="24"/>
+            <w:u w:val="single"/>
+            <w:rPrChange w:id="117" w:author="Jaeger, Florian" w:date="2025-05-08T16:52:00Z" w16du:dateUtc="2025-05-08T20:52:00Z">
+              <w:rPr>
+                <w:rFonts w:ascii="Times New Roman" w:hAnsi="Times New Roman" w:cs="Times New Roman"/>
+                <w:sz w:val="24"/>
+                <w:szCs w:val="24"/>
+              </w:rPr>
+            </w:rPrChange>
+          </w:rPr>
           <w:t>he revised discussion of Study 2</w:t>
         </w:r>
         <w:r>
@@ -1372,7 +1450,7 @@
           <w:t xml:space="preserve"> now transparently acknowledges the concern raised by Reviewer 1. </w:t>
         </w:r>
       </w:ins>
-      <w:ins w:id="116" w:author="Jaeger, Florian" w:date="2025-05-08T16:51:00Z" w16du:dateUtc="2025-05-08T20:51:00Z">
+      <w:ins w:id="118" w:author="Jaeger, Florian" w:date="2025-05-08T16:51:00Z" w16du:dateUtc="2025-05-08T20:51:00Z">
         <w:r>
           <w:rPr>
             <w:rFonts w:ascii="Times New Roman" w:hAnsi="Times New Roman" w:cs="Times New Roman"/>
@@ -1382,7 +1460,7 @@
           <w:t>In that context, w</w:t>
         </w:r>
       </w:ins>
-      <w:ins w:id="117" w:author="Jaeger, Florian" w:date="2025-05-08T16:50:00Z" w16du:dateUtc="2025-05-08T20:50:00Z">
+      <w:ins w:id="119" w:author="Jaeger, Florian" w:date="2025-05-08T16:50:00Z" w16du:dateUtc="2025-05-08T20:50:00Z">
         <w:r>
           <w:rPr>
             <w:rFonts w:ascii="Times New Roman" w:hAnsi="Times New Roman" w:cs="Times New Roman"/>
@@ -1392,7 +1470,7 @@
           <w:t xml:space="preserve">e </w:t>
         </w:r>
       </w:ins>
-      <w:ins w:id="118" w:author="Jaeger, Florian" w:date="2025-05-08T16:51:00Z" w16du:dateUtc="2025-05-08T20:51:00Z">
+      <w:ins w:id="120" w:author="Jaeger, Florian" w:date="2025-05-08T16:51:00Z" w16du:dateUtc="2025-05-08T20:51:00Z">
         <w:r>
           <w:rPr>
             <w:rFonts w:ascii="Times New Roman" w:hAnsi="Times New Roman" w:cs="Times New Roman"/>
@@ -1418,7 +1496,7 @@
           <w:t xml:space="preserve"> </w:t>
         </w:r>
       </w:ins>
-      <w:ins w:id="119" w:author="Jaeger, Florian" w:date="2025-05-08T16:50:00Z" w16du:dateUtc="2025-05-08T20:50:00Z">
+      <w:ins w:id="121" w:author="Jaeger, Florian" w:date="2025-05-08T16:50:00Z" w16du:dateUtc="2025-05-08T20:50:00Z">
         <w:r>
           <w:rPr>
             <w:rFonts w:ascii="Times New Roman" w:hAnsi="Times New Roman" w:cs="Times New Roman"/>
@@ -1428,7 +1506,7 @@
           <w:t>Study 2b</w:t>
         </w:r>
       </w:ins>
-      <w:ins w:id="120" w:author="Jaeger, Florian" w:date="2025-05-08T16:51:00Z" w16du:dateUtc="2025-05-08T20:51:00Z">
+      <w:ins w:id="122" w:author="Jaeger, Florian" w:date="2025-05-08T16:51:00Z" w16du:dateUtc="2025-05-08T20:51:00Z">
         <w:r>
           <w:rPr>
             <w:rFonts w:ascii="Times New Roman" w:hAnsi="Times New Roman" w:cs="Times New Roman"/>
@@ -1446,7 +1524,7 @@
           <w:t>described in detail in the SI)</w:t>
         </w:r>
       </w:ins>
-      <w:ins w:id="121" w:author="Jaeger, Florian" w:date="2025-05-08T16:50:00Z" w16du:dateUtc="2025-05-08T20:50:00Z">
+      <w:ins w:id="123" w:author="Jaeger, Florian" w:date="2025-05-08T16:50:00Z" w16du:dateUtc="2025-05-08T20:50:00Z">
         <w:r>
           <w:rPr>
             <w:rFonts w:ascii="Times New Roman" w:hAnsi="Times New Roman" w:cs="Times New Roman"/>
@@ -1456,7 +1534,7 @@
           <w:t xml:space="preserve">, </w:t>
         </w:r>
       </w:ins>
-      <w:ins w:id="122" w:author="Jaeger, Florian" w:date="2025-05-08T16:51:00Z" w16du:dateUtc="2025-05-08T20:51:00Z">
+      <w:ins w:id="124" w:author="Jaeger, Florian" w:date="2025-05-08T16:51:00Z" w16du:dateUtc="2025-05-08T20:51:00Z">
         <w:r>
           <w:rPr>
             <w:rFonts w:ascii="Times New Roman" w:hAnsi="Times New Roman" w:cs="Times New Roman"/>
@@ -1466,7 +1544,7 @@
           <w:t>and how it speak</w:t>
         </w:r>
       </w:ins>
-      <w:ins w:id="123" w:author="Jaeger, Florian" w:date="2025-05-08T16:52:00Z" w16du:dateUtc="2025-05-08T20:52:00Z">
+      <w:ins w:id="125" w:author="Jaeger, Florian" w:date="2025-05-08T16:52:00Z" w16du:dateUtc="2025-05-08T20:52:00Z">
         <w:r>
           <w:rPr>
             <w:rFonts w:ascii="Times New Roman" w:hAnsi="Times New Roman" w:cs="Times New Roman"/>
@@ -1476,7 +1554,7 @@
           <w:t>s to—but does not fully remove—that concern.</w:t>
         </w:r>
       </w:ins>
-      <w:ins w:id="124" w:author="Jaeger, Florian" w:date="2025-05-08T16:53:00Z" w16du:dateUtc="2025-05-08T20:53:00Z">
+      <w:ins w:id="126" w:author="Jaeger, Florian" w:date="2025-05-08T16:53:00Z" w16du:dateUtc="2025-05-08T20:53:00Z">
         <w:r>
           <w:rPr>
             <w:rFonts w:ascii="Times New Roman" w:hAnsi="Times New Roman" w:cs="Times New Roman"/>
@@ -1491,28 +1569,6 @@
       <w:pPr>
         <w:spacing w:after="0" w:line="240" w:lineRule="auto"/>
         <w:rPr>
-          <w:del w:id="125" w:author="Jaeger, Florian" w:date="2025-05-08T16:27:00Z" w16du:dateUtc="2025-05-08T20:27:00Z"/>
-          <w:rFonts w:ascii="Times New Roman" w:hAnsi="Times New Roman" w:cs="Times New Roman"/>
-          <w:sz w:val="24"/>
-          <w:szCs w:val="24"/>
-        </w:rPr>
-      </w:pPr>
-    </w:p>
-    <w:p>
-      <w:pPr>
-        <w:spacing w:after="0" w:line="240" w:lineRule="auto"/>
-        <w:rPr>
-          <w:ins w:id="126" w:author="Jaeger, Florian" w:date="2025-05-08T16:53:00Z" w16du:dateUtc="2025-05-08T20:53:00Z"/>
-          <w:rFonts w:ascii="Times New Roman" w:hAnsi="Times New Roman" w:cs="Times New Roman"/>
-          <w:sz w:val="24"/>
-          <w:szCs w:val="24"/>
-        </w:rPr>
-      </w:pPr>
-    </w:p>
-    <w:p>
-      <w:pPr>
-        <w:spacing w:after="0" w:line="240" w:lineRule="auto"/>
-        <w:rPr>
           <w:del w:id="127" w:author="Jaeger, Florian" w:date="2025-05-08T16:27:00Z" w16du:dateUtc="2025-05-08T20:27:00Z"/>
           <w:rFonts w:ascii="Times New Roman" w:hAnsi="Times New Roman" w:cs="Times New Roman"/>
           <w:sz w:val="24"/>
@@ -1524,12 +1580,34 @@
       <w:pPr>
         <w:spacing w:after="0" w:line="240" w:lineRule="auto"/>
         <w:rPr>
-          <w:rFonts w:ascii="Times New Roman" w:hAnsi="Times New Roman" w:cs="Times New Roman"/>
-          <w:sz w:val="24"/>
-          <w:szCs w:val="24"/>
-        </w:rPr>
-      </w:pPr>
-      <w:del w:id="128" w:author="Jaeger, Florian" w:date="2025-05-08T16:53:00Z" w16du:dateUtc="2025-05-08T20:53:00Z">
+          <w:ins w:id="128" w:author="Jaeger, Florian" w:date="2025-05-08T16:53:00Z" w16du:dateUtc="2025-05-08T20:53:00Z"/>
+          <w:rFonts w:ascii="Times New Roman" w:hAnsi="Times New Roman" w:cs="Times New Roman"/>
+          <w:sz w:val="24"/>
+          <w:szCs w:val="24"/>
+        </w:rPr>
+      </w:pPr>
+    </w:p>
+    <w:p>
+      <w:pPr>
+        <w:spacing w:after="0" w:line="240" w:lineRule="auto"/>
+        <w:rPr>
+          <w:del w:id="129" w:author="Jaeger, Florian" w:date="2025-05-08T16:27:00Z" w16du:dateUtc="2025-05-08T20:27:00Z"/>
+          <w:rFonts w:ascii="Times New Roman" w:hAnsi="Times New Roman" w:cs="Times New Roman"/>
+          <w:sz w:val="24"/>
+          <w:szCs w:val="24"/>
+        </w:rPr>
+      </w:pPr>
+    </w:p>
+    <w:p>
+      <w:pPr>
+        <w:spacing w:after="0" w:line="240" w:lineRule="auto"/>
+        <w:rPr>
+          <w:rFonts w:ascii="Times New Roman" w:hAnsi="Times New Roman" w:cs="Times New Roman"/>
+          <w:sz w:val="24"/>
+          <w:szCs w:val="24"/>
+        </w:rPr>
+      </w:pPr>
+      <w:del w:id="130" w:author="Jaeger, Florian" w:date="2025-05-08T16:53:00Z" w16du:dateUtc="2025-05-08T20:53:00Z">
         <w:r>
           <w:rPr>
             <w:rFonts w:ascii="Times New Roman" w:hAnsi="Times New Roman" w:cs="Times New Roman"/>
@@ -1584,24 +1662,24 @@
       <w:pPr>
         <w:spacing w:after="0" w:line="240" w:lineRule="auto"/>
         <w:rPr>
-          <w:del w:id="129" w:author="Jaeger, Florian" w:date="2025-05-08T16:27:00Z" w16du:dateUtc="2025-05-08T20:27:00Z"/>
-          <w:rFonts w:ascii="Times New Roman" w:hAnsi="Times New Roman" w:cs="Times New Roman"/>
-          <w:sz w:val="24"/>
-          <w:szCs w:val="24"/>
-        </w:rPr>
-      </w:pPr>
-    </w:p>
-    <w:p>
-      <w:pPr>
-        <w:spacing w:after="0" w:line="240" w:lineRule="auto"/>
-        <w:rPr>
-          <w:del w:id="130" w:author="Jaeger, Florian" w:date="2025-05-08T16:27:00Z" w16du:dateUtc="2025-05-08T20:27:00Z"/>
-          <w:rFonts w:ascii="Times New Roman" w:hAnsi="Times New Roman" w:cs="Times New Roman"/>
-          <w:sz w:val="24"/>
-          <w:szCs w:val="24"/>
-        </w:rPr>
-      </w:pPr>
-      <w:del w:id="131" w:author="Jaeger, Florian" w:date="2025-05-08T16:27:00Z" w16du:dateUtc="2025-05-08T20:27:00Z">
+          <w:del w:id="131" w:author="Jaeger, Florian" w:date="2025-05-08T16:27:00Z" w16du:dateUtc="2025-05-08T20:27:00Z"/>
+          <w:rFonts w:ascii="Times New Roman" w:hAnsi="Times New Roman" w:cs="Times New Roman"/>
+          <w:sz w:val="24"/>
+          <w:szCs w:val="24"/>
+        </w:rPr>
+      </w:pPr>
+    </w:p>
+    <w:p>
+      <w:pPr>
+        <w:spacing w:after="0" w:line="240" w:lineRule="auto"/>
+        <w:rPr>
+          <w:del w:id="132" w:author="Jaeger, Florian" w:date="2025-05-08T16:27:00Z" w16du:dateUtc="2025-05-08T20:27:00Z"/>
+          <w:rFonts w:ascii="Times New Roman" w:hAnsi="Times New Roman" w:cs="Times New Roman"/>
+          <w:sz w:val="24"/>
+          <w:szCs w:val="24"/>
+        </w:rPr>
+      </w:pPr>
+      <w:del w:id="133" w:author="Jaeger, Florian" w:date="2025-05-08T16:27:00Z" w16du:dateUtc="2025-05-08T20:27:00Z">
         <w:r>
           <w:rPr>
             <w:rFonts w:ascii="Times New Roman" w:hAnsi="Times New Roman" w:cs="Times New Roman"/>
@@ -1713,32 +1791,62 @@
           <w:szCs w:val="24"/>
         </w:rPr>
       </w:pPr>
-      <w:r>
-        <w:rPr>
-          <w:rFonts w:ascii="Times New Roman" w:hAnsi="Times New Roman" w:cs="Times New Roman"/>
-          <w:sz w:val="24"/>
-          <w:szCs w:val="24"/>
-        </w:rPr>
-        <w:t>Menghan Yang</w:t>
-      </w:r>
-    </w:p>
-    <w:p>
-      <w:pPr>
-        <w:spacing w:after="0" w:line="240" w:lineRule="auto"/>
-        <w:rPr>
-          <w:rFonts w:ascii="Times New Roman" w:hAnsi="Times New Roman" w:cs="Times New Roman"/>
-          <w:sz w:val="24"/>
-          <w:szCs w:val="24"/>
-        </w:rPr>
-      </w:pPr>
-      <w:r>
-        <w:rPr>
-          <w:rFonts w:ascii="Times New Roman" w:hAnsi="Times New Roman" w:cs="Times New Roman"/>
-          <w:sz w:val="24"/>
-          <w:szCs w:val="24"/>
-        </w:rPr>
-        <w:t>Gevher Karboga</w:t>
-      </w:r>
+      <w:proofErr w:type="spellStart"/>
+      <w:r>
+        <w:rPr>
+          <w:rFonts w:ascii="Times New Roman" w:hAnsi="Times New Roman" w:cs="Times New Roman"/>
+          <w:sz w:val="24"/>
+          <w:szCs w:val="24"/>
+        </w:rPr>
+        <w:t>Menghan</w:t>
+      </w:r>
+      <w:proofErr w:type="spellEnd"/>
+      <w:r>
+        <w:rPr>
+          <w:rFonts w:ascii="Times New Roman" w:hAnsi="Times New Roman" w:cs="Times New Roman"/>
+          <w:sz w:val="24"/>
+          <w:szCs w:val="24"/>
+        </w:rPr>
+        <w:t xml:space="preserve"> Yang</w:t>
+      </w:r>
+    </w:p>
+    <w:p>
+      <w:pPr>
+        <w:spacing w:after="0" w:line="240" w:lineRule="auto"/>
+        <w:rPr>
+          <w:rFonts w:ascii="Times New Roman" w:hAnsi="Times New Roman" w:cs="Times New Roman"/>
+          <w:sz w:val="24"/>
+          <w:szCs w:val="24"/>
+        </w:rPr>
+      </w:pPr>
+      <w:proofErr w:type="spellStart"/>
+      <w:r>
+        <w:rPr>
+          <w:rFonts w:ascii="Times New Roman" w:hAnsi="Times New Roman" w:cs="Times New Roman"/>
+          <w:sz w:val="24"/>
+          <w:szCs w:val="24"/>
+        </w:rPr>
+        <w:t>Gevher</w:t>
+      </w:r>
+      <w:proofErr w:type="spellEnd"/>
+      <w:r>
+        <w:rPr>
+          <w:rFonts w:ascii="Times New Roman" w:hAnsi="Times New Roman" w:cs="Times New Roman"/>
+          <w:sz w:val="24"/>
+          <w:szCs w:val="24"/>
+        </w:rPr>
+        <w:t xml:space="preserve"> </w:t>
+      </w:r>
+      <w:proofErr w:type="spellStart"/>
+      <w:r>
+        <w:rPr>
+          <w:rFonts w:ascii="Times New Roman" w:hAnsi="Times New Roman" w:cs="Times New Roman"/>
+          <w:sz w:val="24"/>
+          <w:szCs w:val="24"/>
+        </w:rPr>
+        <w:t>Karboga</w:t>
+      </w:r>
+      <w:proofErr w:type="spellEnd"/>
     </w:p>
     <w:p>
       <w:pPr>
@@ -1795,13 +1903,13 @@
       <w:pPr>
         <w:spacing w:after="0" w:line="240" w:lineRule="auto"/>
         <w:rPr>
-          <w:del w:id="132" w:author="Jaeger, Florian" w:date="2025-05-08T16:28:00Z" w16du:dateUtc="2025-05-08T20:28:00Z"/>
-          <w:rFonts w:ascii="Times New Roman" w:hAnsi="Times New Roman" w:cs="Times New Roman"/>
-          <w:sz w:val="24"/>
-          <w:szCs w:val="24"/>
-        </w:rPr>
-      </w:pPr>
-      <w:del w:id="133" w:author="Jaeger, Florian" w:date="2025-05-08T16:28:00Z" w16du:dateUtc="2025-05-08T20:28:00Z">
+          <w:del w:id="134" w:author="Jaeger, Florian" w:date="2025-05-08T16:28:00Z" w16du:dateUtc="2025-05-08T20:28:00Z"/>
+          <w:rFonts w:ascii="Times New Roman" w:hAnsi="Times New Roman" w:cs="Times New Roman"/>
+          <w:sz w:val="24"/>
+          <w:szCs w:val="24"/>
+        </w:rPr>
+      </w:pPr>
+      <w:del w:id="135" w:author="Jaeger, Florian" w:date="2025-05-08T16:28:00Z" w16du:dateUtc="2025-05-08T20:28:00Z">
         <w:r>
           <w:rPr>
             <w:rFonts w:ascii="Times New Roman" w:hAnsi="Times New Roman" w:cs="Times New Roman"/>
@@ -1820,7 +1928,7 @@
       <w:pPr>
         <w:spacing w:after="0" w:line="240" w:lineRule="auto"/>
         <w:rPr>
-          <w:del w:id="134" w:author="Jaeger, Florian" w:date="2025-05-08T16:28:00Z" w16du:dateUtc="2025-05-08T20:28:00Z"/>
+          <w:del w:id="136" w:author="Jaeger, Florian" w:date="2025-05-08T16:28:00Z" w16du:dateUtc="2025-05-08T20:28:00Z"/>
           <w:rFonts w:ascii="Times New Roman" w:hAnsi="Times New Roman" w:cs="Times New Roman"/>
           <w:sz w:val="24"/>
           <w:szCs w:val="24"/>
@@ -1837,12 +1945,12 @@
         </w:pBdr>
         <w:spacing w:after="0" w:line="240" w:lineRule="auto"/>
         <w:rPr>
-          <w:del w:id="135" w:author="Jaeger, Florian" w:date="2025-05-08T16:28:00Z" w16du:dateUtc="2025-05-08T20:28:00Z"/>
-          <w:rFonts w:ascii="Times New Roman" w:hAnsi="Times New Roman" w:cs="Times New Roman"/>
-          <w:sz w:val="24"/>
-          <w:szCs w:val="24"/>
-        </w:rPr>
-        <w:pPrChange w:id="136" w:author="Jaeger, Florian" w:date="2025-05-08T16:27:00Z" w16du:dateUtc="2025-05-08T20:27:00Z">
+          <w:del w:id="137" w:author="Jaeger, Florian" w:date="2025-05-08T16:28:00Z" w16du:dateUtc="2025-05-08T20:28:00Z"/>
+          <w:rFonts w:ascii="Times New Roman" w:hAnsi="Times New Roman" w:cs="Times New Roman"/>
+          <w:sz w:val="24"/>
+          <w:szCs w:val="24"/>
+        </w:rPr>
+        <w:pPrChange w:id="138" w:author="Jaeger, Florian" w:date="2025-05-08T16:27:00Z" w16du:dateUtc="2025-05-08T20:27:00Z">
           <w:pPr>
             <w:pBdr>
               <w:top w:val="single" w:sz="4" w:space="1" w:color="auto"/>
@@ -1854,7 +1962,7 @@
           </w:pPr>
         </w:pPrChange>
       </w:pPr>
-      <w:del w:id="137" w:author="Jaeger, Florian" w:date="2025-05-08T16:28:00Z" w16du:dateUtc="2025-05-08T20:28:00Z">
+      <w:del w:id="139" w:author="Jaeger, Florian" w:date="2025-05-08T16:28:00Z" w16du:dateUtc="2025-05-08T20:28:00Z">
         <w:r>
           <w:rPr>
             <w:rFonts w:ascii="Times New Roman" w:hAnsi="Times New Roman" w:cs="Times New Roman"/>
@@ -1877,24 +1985,24 @@
       <w:pPr>
         <w:spacing w:after="0" w:line="240" w:lineRule="auto"/>
         <w:rPr>
-          <w:del w:id="138" w:author="Jaeger, Florian" w:date="2025-05-08T16:28:00Z" w16du:dateUtc="2025-05-08T20:28:00Z"/>
-          <w:rFonts w:ascii="Times New Roman" w:hAnsi="Times New Roman" w:cs="Times New Roman"/>
-          <w:sz w:val="24"/>
-          <w:szCs w:val="24"/>
-        </w:rPr>
-      </w:pPr>
-    </w:p>
-    <w:p>
-      <w:pPr>
-        <w:spacing w:after="0" w:line="240" w:lineRule="auto"/>
-        <w:rPr>
-          <w:del w:id="139" w:author="Jaeger, Florian" w:date="2025-05-08T16:28:00Z" w16du:dateUtc="2025-05-08T20:28:00Z"/>
-          <w:rFonts w:ascii="Times New Roman" w:hAnsi="Times New Roman" w:cs="Times New Roman"/>
-          <w:sz w:val="24"/>
-          <w:szCs w:val="24"/>
-        </w:rPr>
-      </w:pPr>
-      <w:del w:id="140" w:author="Jaeger, Florian" w:date="2025-05-08T16:28:00Z" w16du:dateUtc="2025-05-08T20:28:00Z">
+          <w:del w:id="140" w:author="Jaeger, Florian" w:date="2025-05-08T16:28:00Z" w16du:dateUtc="2025-05-08T20:28:00Z"/>
+          <w:rFonts w:ascii="Times New Roman" w:hAnsi="Times New Roman" w:cs="Times New Roman"/>
+          <w:sz w:val="24"/>
+          <w:szCs w:val="24"/>
+        </w:rPr>
+      </w:pPr>
+    </w:p>
+    <w:p>
+      <w:pPr>
+        <w:spacing w:after="0" w:line="240" w:lineRule="auto"/>
+        <w:rPr>
+          <w:del w:id="141" w:author="Jaeger, Florian" w:date="2025-05-08T16:28:00Z" w16du:dateUtc="2025-05-08T20:28:00Z"/>
+          <w:rFonts w:ascii="Times New Roman" w:hAnsi="Times New Roman" w:cs="Times New Roman"/>
+          <w:sz w:val="24"/>
+          <w:szCs w:val="24"/>
+        </w:rPr>
+      </w:pPr>
+      <w:del w:id="142" w:author="Jaeger, Florian" w:date="2025-05-08T16:28:00Z" w16du:dateUtc="2025-05-08T20:28:00Z">
         <w:r>
           <w:rPr>
             <w:rFonts w:ascii="Times New Roman" w:hAnsi="Times New Roman" w:cs="Times New Roman"/>
@@ -1909,7 +2017,7 @@
       <w:pPr>
         <w:spacing w:after="0" w:line="240" w:lineRule="auto"/>
         <w:rPr>
-          <w:del w:id="141" w:author="Jaeger, Florian" w:date="2025-05-08T16:28:00Z" w16du:dateUtc="2025-05-08T20:28:00Z"/>
+          <w:del w:id="143" w:author="Jaeger, Florian" w:date="2025-05-08T16:28:00Z" w16du:dateUtc="2025-05-08T20:28:00Z"/>
           <w:rFonts w:ascii="Times New Roman" w:hAnsi="Times New Roman" w:cs="Times New Roman"/>
           <w:sz w:val="24"/>
           <w:szCs w:val="24"/>
@@ -1926,13 +2034,13 @@
         </w:pBdr>
         <w:spacing w:after="0" w:line="240" w:lineRule="auto"/>
         <w:rPr>
-          <w:del w:id="142" w:author="Jaeger, Florian" w:date="2025-05-08T16:28:00Z" w16du:dateUtc="2025-05-08T20:28:00Z"/>
-          <w:rFonts w:ascii="Times New Roman" w:hAnsi="Times New Roman" w:cs="Times New Roman"/>
-          <w:sz w:val="24"/>
-          <w:szCs w:val="24"/>
-        </w:rPr>
-      </w:pPr>
-      <w:del w:id="143" w:author="Jaeger, Florian" w:date="2025-05-08T16:28:00Z" w16du:dateUtc="2025-05-08T20:28:00Z">
+          <w:del w:id="144" w:author="Jaeger, Florian" w:date="2025-05-08T16:28:00Z" w16du:dateUtc="2025-05-08T20:28:00Z"/>
+          <w:rFonts w:ascii="Times New Roman" w:hAnsi="Times New Roman" w:cs="Times New Roman"/>
+          <w:sz w:val="24"/>
+          <w:szCs w:val="24"/>
+        </w:rPr>
+      </w:pPr>
+      <w:del w:id="145" w:author="Jaeger, Florian" w:date="2025-05-08T16:28:00Z" w16du:dateUtc="2025-05-08T20:28:00Z">
         <w:r>
           <w:rPr>
             <w:rFonts w:ascii="Times New Roman" w:hAnsi="Times New Roman" w:cs="Times New Roman"/>
@@ -1947,24 +2055,24 @@
       <w:pPr>
         <w:spacing w:after="0" w:line="240" w:lineRule="auto"/>
         <w:rPr>
-          <w:del w:id="144" w:author="Jaeger, Florian" w:date="2025-05-08T16:28:00Z" w16du:dateUtc="2025-05-08T20:28:00Z"/>
-          <w:rFonts w:ascii="Times New Roman" w:hAnsi="Times New Roman" w:cs="Times New Roman"/>
-          <w:sz w:val="24"/>
-          <w:szCs w:val="24"/>
-        </w:rPr>
-      </w:pPr>
-    </w:p>
-    <w:p>
-      <w:pPr>
-        <w:spacing w:after="0" w:line="240" w:lineRule="auto"/>
-        <w:rPr>
-          <w:del w:id="145" w:author="Jaeger, Florian" w:date="2025-05-08T16:28:00Z" w16du:dateUtc="2025-05-08T20:28:00Z"/>
-          <w:rFonts w:ascii="Times New Roman" w:hAnsi="Times New Roman" w:cs="Times New Roman"/>
-          <w:sz w:val="24"/>
-          <w:szCs w:val="24"/>
-        </w:rPr>
-      </w:pPr>
-      <w:del w:id="146" w:author="Jaeger, Florian" w:date="2025-05-08T16:28:00Z" w16du:dateUtc="2025-05-08T20:28:00Z">
+          <w:del w:id="146" w:author="Jaeger, Florian" w:date="2025-05-08T16:28:00Z" w16du:dateUtc="2025-05-08T20:28:00Z"/>
+          <w:rFonts w:ascii="Times New Roman" w:hAnsi="Times New Roman" w:cs="Times New Roman"/>
+          <w:sz w:val="24"/>
+          <w:szCs w:val="24"/>
+        </w:rPr>
+      </w:pPr>
+    </w:p>
+    <w:p>
+      <w:pPr>
+        <w:spacing w:after="0" w:line="240" w:lineRule="auto"/>
+        <w:rPr>
+          <w:del w:id="147" w:author="Jaeger, Florian" w:date="2025-05-08T16:28:00Z" w16du:dateUtc="2025-05-08T20:28:00Z"/>
+          <w:rFonts w:ascii="Times New Roman" w:hAnsi="Times New Roman" w:cs="Times New Roman"/>
+          <w:sz w:val="24"/>
+          <w:szCs w:val="24"/>
+        </w:rPr>
+      </w:pPr>
+      <w:del w:id="148" w:author="Jaeger, Florian" w:date="2025-05-08T16:28:00Z" w16du:dateUtc="2025-05-08T20:28:00Z">
         <w:r>
           <w:rPr>
             <w:rFonts w:ascii="Times New Roman" w:hAnsi="Times New Roman" w:cs="Times New Roman"/>
@@ -1979,7 +2087,7 @@
       <w:pPr>
         <w:spacing w:after="0" w:line="240" w:lineRule="auto"/>
         <w:rPr>
-          <w:del w:id="147" w:author="Jaeger, Florian" w:date="2025-05-08T16:28:00Z" w16du:dateUtc="2025-05-08T20:28:00Z"/>
+          <w:del w:id="149" w:author="Jaeger, Florian" w:date="2025-05-08T16:28:00Z" w16du:dateUtc="2025-05-08T20:28:00Z"/>
           <w:rFonts w:ascii="Times New Roman" w:hAnsi="Times New Roman" w:cs="Times New Roman"/>
           <w:sz w:val="24"/>
           <w:szCs w:val="24"/>
@@ -1996,13 +2104,13 @@
         </w:pBdr>
         <w:spacing w:after="0" w:line="240" w:lineRule="auto"/>
         <w:rPr>
-          <w:del w:id="148" w:author="Jaeger, Florian" w:date="2025-05-08T16:28:00Z" w16du:dateUtc="2025-05-08T20:28:00Z"/>
-          <w:rFonts w:ascii="Times New Roman" w:hAnsi="Times New Roman" w:cs="Times New Roman"/>
-          <w:sz w:val="24"/>
-          <w:szCs w:val="24"/>
-        </w:rPr>
-      </w:pPr>
-      <w:del w:id="149" w:author="Jaeger, Florian" w:date="2025-05-08T16:28:00Z" w16du:dateUtc="2025-05-08T20:28:00Z">
+          <w:del w:id="150" w:author="Jaeger, Florian" w:date="2025-05-08T16:28:00Z" w16du:dateUtc="2025-05-08T20:28:00Z"/>
+          <w:rFonts w:ascii="Times New Roman" w:hAnsi="Times New Roman" w:cs="Times New Roman"/>
+          <w:sz w:val="24"/>
+          <w:szCs w:val="24"/>
+        </w:rPr>
+      </w:pPr>
+      <w:del w:id="151" w:author="Jaeger, Florian" w:date="2025-05-08T16:28:00Z" w16du:dateUtc="2025-05-08T20:28:00Z">
         <w:r>
           <w:rPr>
             <w:rFonts w:ascii="Times New Roman" w:hAnsi="Times New Roman" w:cs="Times New Roman"/>
@@ -2026,24 +2134,24 @@
       <w:pPr>
         <w:spacing w:after="0" w:line="240" w:lineRule="auto"/>
         <w:rPr>
-          <w:del w:id="150" w:author="Jaeger, Florian" w:date="2025-05-08T16:28:00Z" w16du:dateUtc="2025-05-08T20:28:00Z"/>
-          <w:rFonts w:ascii="Times New Roman" w:hAnsi="Times New Roman" w:cs="Times New Roman"/>
-          <w:sz w:val="24"/>
-          <w:szCs w:val="24"/>
-        </w:rPr>
-      </w:pPr>
-    </w:p>
-    <w:p>
-      <w:pPr>
-        <w:spacing w:after="0" w:line="240" w:lineRule="auto"/>
-        <w:rPr>
-          <w:del w:id="151" w:author="Jaeger, Florian" w:date="2025-05-08T16:28:00Z" w16du:dateUtc="2025-05-08T20:28:00Z"/>
-          <w:rFonts w:ascii="Times New Roman" w:hAnsi="Times New Roman" w:cs="Times New Roman"/>
-          <w:sz w:val="24"/>
-          <w:szCs w:val="24"/>
-        </w:rPr>
-      </w:pPr>
-      <w:del w:id="152" w:author="Jaeger, Florian" w:date="2025-05-08T16:28:00Z" w16du:dateUtc="2025-05-08T20:28:00Z">
+          <w:del w:id="152" w:author="Jaeger, Florian" w:date="2025-05-08T16:28:00Z" w16du:dateUtc="2025-05-08T20:28:00Z"/>
+          <w:rFonts w:ascii="Times New Roman" w:hAnsi="Times New Roman" w:cs="Times New Roman"/>
+          <w:sz w:val="24"/>
+          <w:szCs w:val="24"/>
+        </w:rPr>
+      </w:pPr>
+    </w:p>
+    <w:p>
+      <w:pPr>
+        <w:spacing w:after="0" w:line="240" w:lineRule="auto"/>
+        <w:rPr>
+          <w:del w:id="153" w:author="Jaeger, Florian" w:date="2025-05-08T16:28:00Z" w16du:dateUtc="2025-05-08T20:28:00Z"/>
+          <w:rFonts w:ascii="Times New Roman" w:hAnsi="Times New Roman" w:cs="Times New Roman"/>
+          <w:sz w:val="24"/>
+          <w:szCs w:val="24"/>
+        </w:rPr>
+      </w:pPr>
+      <w:del w:id="154" w:author="Jaeger, Florian" w:date="2025-05-08T16:28:00Z" w16du:dateUtc="2025-05-08T20:28:00Z">
         <w:r>
           <w:rPr>
             <w:rFonts w:ascii="Times New Roman" w:hAnsi="Times New Roman" w:cs="Times New Roman"/>
@@ -2058,7 +2166,7 @@
       <w:pPr>
         <w:spacing w:after="0" w:line="240" w:lineRule="auto"/>
         <w:rPr>
-          <w:del w:id="153" w:author="Jaeger, Florian" w:date="2025-05-08T16:28:00Z" w16du:dateUtc="2025-05-08T20:28:00Z"/>
+          <w:del w:id="155" w:author="Jaeger, Florian" w:date="2025-05-08T16:28:00Z" w16du:dateUtc="2025-05-08T20:28:00Z"/>
           <w:rFonts w:ascii="Times New Roman" w:hAnsi="Times New Roman" w:cs="Times New Roman"/>
           <w:sz w:val="24"/>
           <w:szCs w:val="24"/>
@@ -2106,13 +2214,13 @@
         </w:pBdr>
         <w:spacing w:after="0" w:line="240" w:lineRule="auto"/>
         <w:rPr>
-          <w:del w:id="154" w:author="Jaeger, Florian" w:date="2025-05-08T16:54:00Z" w16du:dateUtc="2025-05-08T20:54:00Z"/>
-          <w:rFonts w:ascii="Times New Roman" w:hAnsi="Times New Roman" w:cs="Times New Roman"/>
-          <w:sz w:val="24"/>
-          <w:szCs w:val="24"/>
-        </w:rPr>
-      </w:pPr>
-      <w:del w:id="155" w:author="Jaeger, Florian" w:date="2025-05-08T16:54:00Z" w16du:dateUtc="2025-05-08T20:54:00Z">
+          <w:del w:id="156" w:author="Jaeger, Florian" w:date="2025-05-08T16:54:00Z" w16du:dateUtc="2025-05-08T20:54:00Z"/>
+          <w:rFonts w:ascii="Times New Roman" w:hAnsi="Times New Roman" w:cs="Times New Roman"/>
+          <w:sz w:val="24"/>
+          <w:szCs w:val="24"/>
+        </w:rPr>
+      </w:pPr>
+      <w:del w:id="157" w:author="Jaeger, Florian" w:date="2025-05-08T16:54:00Z" w16du:dateUtc="2025-05-08T20:54:00Z">
         <w:r>
           <w:rPr>
             <w:rFonts w:ascii="Times New Roman" w:hAnsi="Times New Roman" w:cs="Times New Roman"/>
@@ -2122,7 +2230,7 @@
           <w:delText>This study aimed at examining whether listeners engage in compensation in audiovisual speech perception when the contextual cues are non-linguistic and presented visually (i.e., seeing a talker with a pen in their mouth). To examine this, the authors presented audiovisual speech stimuli to participants and tested their perception using a 2AFC task. The results suggest that listeners 'explain away' (part of) the pen-in-mouth effect, at least when the visual information is not blocked.</w:delText>
         </w:r>
       </w:del>
-      <w:ins w:id="156" w:author="Jaeger, Florian" w:date="2025-05-08T16:54:00Z" w16du:dateUtc="2025-05-08T20:54:00Z">
+      <w:ins w:id="158" w:author="Jaeger, Florian" w:date="2025-05-08T16:54:00Z" w16du:dateUtc="2025-05-08T20:54:00Z">
         <w:r>
           <w:rPr>
             <w:rFonts w:ascii="Times New Roman" w:hAnsi="Times New Roman" w:cs="Times New Roman"/>
@@ -2164,7 +2272,7 @@
         </w:rPr>
         <w:br/>
       </w:r>
-      <w:ins w:id="157" w:author="Jaeger, Florian" w:date="2025-05-08T16:54:00Z" w16du:dateUtc="2025-05-08T20:54:00Z">
+      <w:ins w:id="159" w:author="Jaeger, Florian" w:date="2025-05-08T16:54:00Z" w16du:dateUtc="2025-05-08T20:54:00Z">
         <w:r>
           <w:rPr>
             <w:rFonts w:ascii="Times New Roman" w:hAnsi="Times New Roman" w:cs="Times New Roman"/>
@@ -2250,20 +2358,38 @@
           <w:sz w:val="24"/>
           <w:szCs w:val="24"/>
         </w:rPr>
-        <w:t>It is not entirely clear to me what exactly is the novelty of this work. As mentioned in the Discussion, the question of how listeners deal with shifted speech input as a function of whether the shift is attributed to idiosyncratic characteristics of the speaker (e.g., accent) versus incidental factors (e.g., pen in mouth) has already been addressed in the past. Kraljic et al (2008) asked this question and found that the effect of interest (perceptual recalibration in that case) goes away when the shift is attributed to incidental factors. Thus, the main conclusion of that study was the same as here: listeners 'explain away' the shift when it can be attributed to an incidental factor. I understand that there are some novel aspects introduced in this work, but they are not sufficiently highlighted/clarified right now. One suggestion would be to first present this work in the Introduction (rather than the Discussion) and explain what the present study adds that is new / different from that work.</w:t>
-      </w:r>
-    </w:p>
-    <w:p>
-      <w:pPr>
-        <w:spacing w:after="0" w:line="240" w:lineRule="auto"/>
-        <w:rPr>
-          <w:del w:id="158" w:author="Jaeger, Florian" w:date="2025-05-08T16:55:00Z" w16du:dateUtc="2025-05-08T20:55:00Z"/>
-          <w:rFonts w:ascii="Times New Roman" w:hAnsi="Times New Roman" w:cs="Times New Roman"/>
-          <w:sz w:val="24"/>
-          <w:szCs w:val="24"/>
-        </w:rPr>
-      </w:pPr>
-      <w:del w:id="159" w:author="Jaeger, Florian" w:date="2025-05-08T16:55:00Z" w16du:dateUtc="2025-05-08T20:55:00Z">
+        <w:t xml:space="preserve">It is not entirely clear to me what exactly is the novelty of this work. As mentioned in the Discussion, the question of how listeners deal with shifted speech input as a function of whether the shift is attributed to idiosyncratic characteristics of the speaker (e.g., accent) versus incidental factors (e.g., pen in mouth) has already been addressed in the past. </w:t>
+      </w:r>
+      <w:proofErr w:type="spellStart"/>
+      <w:r>
+        <w:rPr>
+          <w:rFonts w:ascii="Times New Roman" w:hAnsi="Times New Roman" w:cs="Times New Roman"/>
+          <w:sz w:val="24"/>
+          <w:szCs w:val="24"/>
+        </w:rPr>
+        <w:t>Kraljic</w:t>
+      </w:r>
+      <w:proofErr w:type="spellEnd"/>
+      <w:r>
+        <w:rPr>
+          <w:rFonts w:ascii="Times New Roman" w:hAnsi="Times New Roman" w:cs="Times New Roman"/>
+          <w:sz w:val="24"/>
+          <w:szCs w:val="24"/>
+        </w:rPr>
+        <w:t xml:space="preserve"> et al (2008) asked this question and found that the effect of interest (perceptual recalibration in that case) goes away when the shift is attributed to incidental factors. Thus, the main conclusion of that study was the same as here: listeners 'explain away' the shift when it can be attributed to an incidental factor. I understand that there are some novel aspects introduced in this work, but they are not sufficiently highlighted/clarified right now. One suggestion would be to first present this work in the Introduction (rather than the Discussion) and explain what the present study adds that is new / different from that work.</w:t>
+      </w:r>
+    </w:p>
+    <w:p>
+      <w:pPr>
+        <w:spacing w:after="0" w:line="240" w:lineRule="auto"/>
+        <w:rPr>
+          <w:del w:id="160" w:author="Jaeger, Florian" w:date="2025-05-08T16:55:00Z" w16du:dateUtc="2025-05-08T20:55:00Z"/>
+          <w:rFonts w:ascii="Times New Roman" w:hAnsi="Times New Roman" w:cs="Times New Roman"/>
+          <w:sz w:val="24"/>
+          <w:szCs w:val="24"/>
+        </w:rPr>
+      </w:pPr>
+      <w:del w:id="161" w:author="Jaeger, Florian" w:date="2025-05-08T16:55:00Z" w16du:dateUtc="2025-05-08T20:55:00Z">
         <w:r>
           <w:rPr>
             <w:rFonts w:ascii="Times New Roman" w:hAnsi="Times New Roman" w:cs="Times New Roman"/>
@@ -2286,13 +2412,13 @@
       <w:pPr>
         <w:spacing w:after="0" w:line="240" w:lineRule="auto"/>
         <w:rPr>
-          <w:ins w:id="160" w:author="Jaeger, Florian" w:date="2025-05-08T16:57:00Z" w16du:dateUtc="2025-05-08T20:57:00Z"/>
-          <w:rFonts w:ascii="Times New Roman" w:hAnsi="Times New Roman" w:cs="Times New Roman"/>
-          <w:sz w:val="24"/>
-          <w:szCs w:val="24"/>
-        </w:rPr>
-      </w:pPr>
-      <w:ins w:id="161" w:author="Jaeger, Florian" w:date="2025-05-08T16:55:00Z" w16du:dateUtc="2025-05-08T20:55:00Z">
+          <w:ins w:id="162" w:author="Jaeger, Florian" w:date="2025-05-08T16:57:00Z" w16du:dateUtc="2025-05-08T20:57:00Z"/>
+          <w:rFonts w:ascii="Times New Roman" w:hAnsi="Times New Roman" w:cs="Times New Roman"/>
+          <w:sz w:val="24"/>
+          <w:szCs w:val="24"/>
+        </w:rPr>
+      </w:pPr>
+      <w:ins w:id="163" w:author="Jaeger, Florian" w:date="2025-05-08T16:55:00Z" w16du:dateUtc="2025-05-08T20:55:00Z">
         <w:r>
           <w:rPr>
             <w:rFonts w:ascii="Times New Roman" w:hAnsi="Times New Roman" w:cs="Times New Roman"/>
@@ -2303,7 +2429,7 @@
           <w:t xml:space="preserve">We thank the reviewer for highlighting this point. Indeed, our experiments were </w:t>
         </w:r>
       </w:ins>
-      <w:ins w:id="162" w:author="Jaeger, Florian" w:date="2025-05-08T18:04:00Z" w16du:dateUtc="2025-05-08T22:04:00Z">
+      <w:ins w:id="164" w:author="Jaeger, Florian" w:date="2025-05-08T18:04:00Z" w16du:dateUtc="2025-05-08T22:04:00Z">
         <w:r>
           <w:rPr>
             <w:rFonts w:ascii="Times New Roman" w:hAnsi="Times New Roman" w:cs="Times New Roman"/>
@@ -2313,7 +2439,7 @@
           <w:t>in part</w:t>
         </w:r>
       </w:ins>
-      <w:ins w:id="163" w:author="Jaeger, Florian" w:date="2025-05-08T16:55:00Z" w16du:dateUtc="2025-05-08T20:55:00Z">
+      <w:ins w:id="165" w:author="Jaeger, Florian" w:date="2025-05-08T16:55:00Z" w16du:dateUtc="2025-05-08T20:55:00Z">
         <w:r>
           <w:rPr>
             <w:rFonts w:ascii="Times New Roman" w:hAnsi="Times New Roman" w:cs="Times New Roman"/>
@@ -2323,7 +2449,7 @@
           <w:t xml:space="preserve"> motivated by </w:t>
         </w:r>
       </w:ins>
-      <w:ins w:id="164" w:author="Jaeger, Florian" w:date="2025-05-08T18:03:00Z" w16du:dateUtc="2025-05-08T22:03:00Z">
+      <w:ins w:id="166" w:author="Jaeger, Florian" w:date="2025-05-08T18:03:00Z" w16du:dateUtc="2025-05-08T22:03:00Z">
         <w:r>
           <w:rPr>
             <w:rFonts w:ascii="Times New Roman" w:hAnsi="Times New Roman" w:cs="Times New Roman"/>
@@ -2333,7 +2459,8 @@
           <w:t xml:space="preserve">an effort to better understand the results of </w:t>
         </w:r>
       </w:ins>
-      <w:ins w:id="165" w:author="Jaeger, Florian" w:date="2025-05-08T16:55:00Z" w16du:dateUtc="2025-05-08T20:55:00Z">
+      <w:proofErr w:type="spellStart"/>
+      <w:ins w:id="167" w:author="Jaeger, Florian" w:date="2025-05-08T16:55:00Z" w16du:dateUtc="2025-05-08T20:55:00Z">
         <w:r>
           <w:rPr>
             <w:rFonts w:ascii="Times New Roman" w:hAnsi="Times New Roman" w:cs="Times New Roman"/>
@@ -2343,17 +2470,26 @@
           <w:t>Kralj</w:t>
         </w:r>
       </w:ins>
-      <w:ins w:id="166" w:author="Jaeger, Florian" w:date="2025-05-08T16:56:00Z" w16du:dateUtc="2025-05-08T20:56:00Z">
-        <w:r>
-          <w:rPr>
-            <w:rFonts w:ascii="Times New Roman" w:hAnsi="Times New Roman" w:cs="Times New Roman"/>
-            <w:sz w:val="24"/>
-            <w:szCs w:val="24"/>
-          </w:rPr>
-          <w:t>ic and colleagues’ seminal work</w:t>
-        </w:r>
-      </w:ins>
-      <w:ins w:id="167" w:author="Jaeger, Florian" w:date="2025-05-08T18:03:00Z" w16du:dateUtc="2025-05-08T22:03:00Z">
+      <w:ins w:id="168" w:author="Jaeger, Florian" w:date="2025-05-08T16:56:00Z" w16du:dateUtc="2025-05-08T20:56:00Z">
+        <w:r>
+          <w:rPr>
+            <w:rFonts w:ascii="Times New Roman" w:hAnsi="Times New Roman" w:cs="Times New Roman"/>
+            <w:sz w:val="24"/>
+            <w:szCs w:val="24"/>
+          </w:rPr>
+          <w:t>ic</w:t>
+        </w:r>
+        <w:proofErr w:type="spellEnd"/>
+        <w:r>
+          <w:rPr>
+            <w:rFonts w:ascii="Times New Roman" w:hAnsi="Times New Roman" w:cs="Times New Roman"/>
+            <w:sz w:val="24"/>
+            <w:szCs w:val="24"/>
+          </w:rPr>
+          <w:t xml:space="preserve"> and colleagues’ seminal work</w:t>
+        </w:r>
+      </w:ins>
+      <w:ins w:id="169" w:author="Jaeger, Florian" w:date="2025-05-08T18:03:00Z" w16du:dateUtc="2025-05-08T22:03:00Z">
         <w:r>
           <w:rPr>
             <w:rFonts w:ascii="Times New Roman" w:hAnsi="Times New Roman" w:cs="Times New Roman"/>
@@ -2363,7 +2499,7 @@
           <w:t>, and to take some steps towards</w:t>
         </w:r>
       </w:ins>
-      <w:ins w:id="168" w:author="Jaeger, Florian" w:date="2025-05-08T16:57:00Z" w16du:dateUtc="2025-05-08T20:57:00Z">
+      <w:ins w:id="170" w:author="Jaeger, Florian" w:date="2025-05-08T16:57:00Z" w16du:dateUtc="2025-05-08T20:57:00Z">
         <w:r>
           <w:rPr>
             <w:rFonts w:ascii="Times New Roman" w:hAnsi="Times New Roman" w:cs="Times New Roman"/>
@@ -2373,7 +2509,7 @@
           <w:t xml:space="preserve"> disentangl</w:t>
         </w:r>
       </w:ins>
-      <w:ins w:id="169" w:author="Jaeger, Florian" w:date="2025-05-08T18:04:00Z" w16du:dateUtc="2025-05-08T22:04:00Z">
+      <w:ins w:id="171" w:author="Jaeger, Florian" w:date="2025-05-08T18:04:00Z" w16du:dateUtc="2025-05-08T22:04:00Z">
         <w:r>
           <w:rPr>
             <w:rFonts w:ascii="Times New Roman" w:hAnsi="Times New Roman" w:cs="Times New Roman"/>
@@ -2383,49 +2519,85 @@
           <w:t>ing</w:t>
         </w:r>
       </w:ins>
-      <w:ins w:id="170" w:author="Jaeger, Florian" w:date="2025-05-08T16:57:00Z" w16du:dateUtc="2025-05-08T20:57:00Z">
-        <w:r>
-          <w:rPr>
-            <w:rFonts w:ascii="Times New Roman" w:hAnsi="Times New Roman" w:cs="Times New Roman"/>
-            <w:sz w:val="24"/>
-            <w:szCs w:val="24"/>
-          </w:rPr>
-          <w:t xml:space="preserve"> competing explanations for the result obtained by Kraljic et al. (2008). </w:t>
-        </w:r>
-      </w:ins>
-    </w:p>
-    <w:p>
-      <w:pPr>
-        <w:spacing w:after="0" w:line="240" w:lineRule="auto"/>
-        <w:rPr>
-          <w:ins w:id="171" w:author="Jaeger, Florian" w:date="2025-05-08T16:57:00Z" w16du:dateUtc="2025-05-08T20:57:00Z"/>
-          <w:rFonts w:ascii="Times New Roman" w:hAnsi="Times New Roman" w:cs="Times New Roman"/>
-          <w:sz w:val="24"/>
-          <w:szCs w:val="24"/>
-        </w:rPr>
-      </w:pPr>
-    </w:p>
-    <w:p>
-      <w:pPr>
-        <w:spacing w:after="0" w:line="240" w:lineRule="auto"/>
-        <w:rPr>
-          <w:ins w:id="172" w:author="Jaeger, Florian" w:date="2025-05-08T17:01:00Z" w16du:dateUtc="2025-05-08T21:01:00Z"/>
-          <w:rFonts w:ascii="Times New Roman" w:hAnsi="Times New Roman" w:cs="Times New Roman"/>
-          <w:sz w:val="24"/>
-          <w:szCs w:val="24"/>
-        </w:rPr>
-      </w:pPr>
-      <w:ins w:id="173" w:author="Jaeger, Florian" w:date="2025-05-08T16:57:00Z" w16du:dateUtc="2025-05-08T20:57:00Z">
-        <w:r>
-          <w:rPr>
-            <w:rFonts w:ascii="Times New Roman" w:hAnsi="Times New Roman" w:cs="Times New Roman"/>
-            <w:sz w:val="24"/>
-            <w:szCs w:val="24"/>
-          </w:rPr>
-          <w:t>For instance, Kraljic &amp; Samuel (2011) proposed an alternative explanation</w:t>
-        </w:r>
-      </w:ins>
-      <w:ins w:id="174" w:author="Jaeger, Florian" w:date="2025-05-08T16:58:00Z" w16du:dateUtc="2025-05-08T20:58:00Z">
+      <w:ins w:id="172" w:author="Jaeger, Florian" w:date="2025-05-08T16:57:00Z" w16du:dateUtc="2025-05-08T20:57:00Z">
+        <w:r>
+          <w:rPr>
+            <w:rFonts w:ascii="Times New Roman" w:hAnsi="Times New Roman" w:cs="Times New Roman"/>
+            <w:sz w:val="24"/>
+            <w:szCs w:val="24"/>
+          </w:rPr>
+          <w:t xml:space="preserve"> competing explanations for the result obtained by </w:t>
+        </w:r>
+        <w:proofErr w:type="spellStart"/>
+        <w:r>
+          <w:rPr>
+            <w:rFonts w:ascii="Times New Roman" w:hAnsi="Times New Roman" w:cs="Times New Roman"/>
+            <w:sz w:val="24"/>
+            <w:szCs w:val="24"/>
+          </w:rPr>
+          <w:t>Kraljic</w:t>
+        </w:r>
+        <w:proofErr w:type="spellEnd"/>
+        <w:r>
+          <w:rPr>
+            <w:rFonts w:ascii="Times New Roman" w:hAnsi="Times New Roman" w:cs="Times New Roman"/>
+            <w:sz w:val="24"/>
+            <w:szCs w:val="24"/>
+          </w:rPr>
+          <w:t xml:space="preserve"> et al. (2008). </w:t>
+        </w:r>
+      </w:ins>
+    </w:p>
+    <w:p>
+      <w:pPr>
+        <w:spacing w:after="0" w:line="240" w:lineRule="auto"/>
+        <w:rPr>
+          <w:ins w:id="173" w:author="Jaeger, Florian" w:date="2025-05-08T16:57:00Z" w16du:dateUtc="2025-05-08T20:57:00Z"/>
+          <w:rFonts w:ascii="Times New Roman" w:hAnsi="Times New Roman" w:cs="Times New Roman"/>
+          <w:sz w:val="24"/>
+          <w:szCs w:val="24"/>
+        </w:rPr>
+      </w:pPr>
+    </w:p>
+    <w:p>
+      <w:pPr>
+        <w:spacing w:after="0" w:line="240" w:lineRule="auto"/>
+        <w:rPr>
+          <w:ins w:id="174" w:author="Jaeger, Florian" w:date="2025-05-08T17:01:00Z" w16du:dateUtc="2025-05-08T21:01:00Z"/>
+          <w:rFonts w:ascii="Times New Roman" w:hAnsi="Times New Roman" w:cs="Times New Roman"/>
+          <w:sz w:val="24"/>
+          <w:szCs w:val="24"/>
+        </w:rPr>
+      </w:pPr>
+      <w:ins w:id="175" w:author="Jaeger, Florian" w:date="2025-05-08T16:57:00Z" w16du:dateUtc="2025-05-08T20:57:00Z">
+        <w:r>
+          <w:rPr>
+            <w:rFonts w:ascii="Times New Roman" w:hAnsi="Times New Roman" w:cs="Times New Roman"/>
+            <w:sz w:val="24"/>
+            <w:szCs w:val="24"/>
+          </w:rPr>
+          <w:t xml:space="preserve">For instance, </w:t>
+        </w:r>
+        <w:proofErr w:type="spellStart"/>
+        <w:r>
+          <w:rPr>
+            <w:rFonts w:ascii="Times New Roman" w:hAnsi="Times New Roman" w:cs="Times New Roman"/>
+            <w:sz w:val="24"/>
+            <w:szCs w:val="24"/>
+          </w:rPr>
+          <w:t>Kraljic</w:t>
+        </w:r>
+        <w:proofErr w:type="spellEnd"/>
+        <w:r>
+          <w:rPr>
+            <w:rFonts w:ascii="Times New Roman" w:hAnsi="Times New Roman" w:cs="Times New Roman"/>
+            <w:sz w:val="24"/>
+            <w:szCs w:val="24"/>
+          </w:rPr>
+          <w:t xml:space="preserve"> &amp; Samuel (2011) proposed an alternative explanation</w:t>
+        </w:r>
+      </w:ins>
+      <w:ins w:id="176" w:author="Jaeger, Florian" w:date="2025-05-08T16:58:00Z" w16du:dateUtc="2025-05-08T20:58:00Z">
         <w:r>
           <w:rPr>
             <w:rFonts w:ascii="Times New Roman" w:hAnsi="Times New Roman" w:cs="Times New Roman"/>
@@ -2435,7 +2607,7 @@
           <w:t xml:space="preserve"> that does not appeal to ‘explaining away’, but rather appeals to specifics of exemplar storage. Liu &amp; Jaeger (201</w:t>
         </w:r>
       </w:ins>
-      <w:ins w:id="175" w:author="Jaeger, Florian" w:date="2025-05-08T18:19:00Z" w16du:dateUtc="2025-05-08T22:19:00Z">
+      <w:ins w:id="177" w:author="Jaeger, Florian" w:date="2025-05-08T18:19:00Z" w16du:dateUtc="2025-05-08T22:19:00Z">
         <w:r>
           <w:rPr>
             <w:rFonts w:ascii="Times New Roman" w:hAnsi="Times New Roman" w:cs="Times New Roman"/>
@@ -2445,7 +2617,7 @@
           <w:t>8</w:t>
         </w:r>
       </w:ins>
-      <w:ins w:id="176" w:author="Jaeger, Florian" w:date="2025-05-08T16:58:00Z" w16du:dateUtc="2025-05-08T20:58:00Z">
+      <w:ins w:id="178" w:author="Jaeger, Florian" w:date="2025-05-08T16:58:00Z" w16du:dateUtc="2025-05-08T20:58:00Z">
         <w:r>
           <w:rPr>
             <w:rFonts w:ascii="Times New Roman" w:hAnsi="Times New Roman" w:cs="Times New Roman"/>
@@ -2455,7 +2627,7 @@
           <w:t xml:space="preserve">) argued that this alternative </w:t>
         </w:r>
       </w:ins>
-      <w:ins w:id="177" w:author="Jaeger, Florian" w:date="2025-05-08T16:59:00Z" w16du:dateUtc="2025-05-08T20:59:00Z">
+      <w:ins w:id="179" w:author="Jaeger, Florian" w:date="2025-05-08T16:59:00Z" w16du:dateUtc="2025-05-08T20:59:00Z">
         <w:r>
           <w:rPr>
             <w:rFonts w:ascii="Times New Roman" w:hAnsi="Times New Roman" w:cs="Times New Roman"/>
@@ -2465,7 +2637,7 @@
           <w:t>account faces both theoretical and empirical issue. In a series of experiments, Liu &amp; Jaeger (201</w:t>
         </w:r>
       </w:ins>
-      <w:ins w:id="178" w:author="Jaeger, Florian" w:date="2025-05-08T18:19:00Z" w16du:dateUtc="2025-05-08T22:19:00Z">
+      <w:ins w:id="180" w:author="Jaeger, Florian" w:date="2025-05-08T18:19:00Z" w16du:dateUtc="2025-05-08T22:19:00Z">
         <w:r>
           <w:rPr>
             <w:rFonts w:ascii="Times New Roman" w:hAnsi="Times New Roman" w:cs="Times New Roman"/>
@@ -2475,17 +2647,35 @@
           <w:t>8</w:t>
         </w:r>
       </w:ins>
-      <w:ins w:id="179" w:author="Jaeger, Florian" w:date="2025-05-08T16:59:00Z" w16du:dateUtc="2025-05-08T20:59:00Z">
-        <w:r>
-          <w:rPr>
-            <w:rFonts w:ascii="Times New Roman" w:hAnsi="Times New Roman" w:cs="Times New Roman"/>
-            <w:sz w:val="24"/>
-            <w:szCs w:val="24"/>
-          </w:rPr>
-          <w:t>) argued for an elaborated version of the original proposal in Kraljic et al. (2008): that the effe</w:t>
-        </w:r>
-      </w:ins>
-      <w:ins w:id="180" w:author="Jaeger, Florian" w:date="2025-05-08T17:00:00Z" w16du:dateUtc="2025-05-08T21:00:00Z">
+      <w:ins w:id="181" w:author="Jaeger, Florian" w:date="2025-05-08T16:59:00Z" w16du:dateUtc="2025-05-08T20:59:00Z">
+        <w:r>
+          <w:rPr>
+            <w:rFonts w:ascii="Times New Roman" w:hAnsi="Times New Roman" w:cs="Times New Roman"/>
+            <w:sz w:val="24"/>
+            <w:szCs w:val="24"/>
+          </w:rPr>
+          <w:t xml:space="preserve">) argued for an elaborated version of the original proposal in </w:t>
+        </w:r>
+        <w:proofErr w:type="spellStart"/>
+        <w:r>
+          <w:rPr>
+            <w:rFonts w:ascii="Times New Roman" w:hAnsi="Times New Roman" w:cs="Times New Roman"/>
+            <w:sz w:val="24"/>
+            <w:szCs w:val="24"/>
+          </w:rPr>
+          <w:t>Kraljic</w:t>
+        </w:r>
+        <w:proofErr w:type="spellEnd"/>
+        <w:r>
+          <w:rPr>
+            <w:rFonts w:ascii="Times New Roman" w:hAnsi="Times New Roman" w:cs="Times New Roman"/>
+            <w:sz w:val="24"/>
+            <w:szCs w:val="24"/>
+          </w:rPr>
+          <w:t xml:space="preserve"> et al. (2008): that the effe</w:t>
+        </w:r>
+      </w:ins>
+      <w:ins w:id="182" w:author="Jaeger, Florian" w:date="2025-05-08T17:00:00Z" w16du:dateUtc="2025-05-08T21:00:00Z">
         <w:r>
           <w:rPr>
             <w:rFonts w:ascii="Times New Roman" w:hAnsi="Times New Roman" w:cs="Times New Roman"/>
@@ -2495,7 +2685,7 @@
           <w:t xml:space="preserve">cts of pen placement are rooted in </w:t>
         </w:r>
       </w:ins>
-      <w:ins w:id="181" w:author="Jaeger, Florian" w:date="2025-05-08T17:01:00Z" w16du:dateUtc="2025-05-08T21:01:00Z">
+      <w:ins w:id="183" w:author="Jaeger, Florian" w:date="2025-05-08T17:01:00Z" w16du:dateUtc="2025-05-08T21:01:00Z">
         <w:r>
           <w:rPr>
             <w:rFonts w:ascii="Times New Roman" w:hAnsi="Times New Roman" w:cs="Times New Roman"/>
@@ -2505,7 +2695,7 @@
           <w:t xml:space="preserve">causal inferences under uncertainty—uncertainty about whether the pen or the talker is the cause for the observed unexpected pronunciation. </w:t>
         </w:r>
       </w:ins>
-      <w:ins w:id="182" w:author="Jaeger, Florian" w:date="2025-05-08T18:07:00Z" w16du:dateUtc="2025-05-08T22:07:00Z">
+      <w:ins w:id="184" w:author="Jaeger, Florian" w:date="2025-05-08T18:07:00Z" w16du:dateUtc="2025-05-08T22:07:00Z">
         <w:r>
           <w:rPr>
             <w:rFonts w:ascii="Times New Roman" w:hAnsi="Times New Roman" w:cs="Times New Roman"/>
@@ -2515,17 +2705,35 @@
           <w:t xml:space="preserve">In short, competing explanations have been offered for the findings </w:t>
         </w:r>
       </w:ins>
-      <w:ins w:id="183" w:author="Jaeger, Florian" w:date="2025-05-08T18:11:00Z" w16du:dateUtc="2025-05-08T22:11:00Z">
-        <w:r>
-          <w:rPr>
-            <w:rFonts w:ascii="Times New Roman" w:hAnsi="Times New Roman" w:cs="Times New Roman"/>
-            <w:sz w:val="24"/>
-            <w:szCs w:val="24"/>
-          </w:rPr>
-          <w:t>of Kraljic et al. (2008) and subsequent related works</w:t>
-        </w:r>
-      </w:ins>
-      <w:ins w:id="184" w:author="Jaeger, Florian" w:date="2025-05-08T18:07:00Z" w16du:dateUtc="2025-05-08T22:07:00Z">
+      <w:ins w:id="185" w:author="Jaeger, Florian" w:date="2025-05-08T18:11:00Z" w16du:dateUtc="2025-05-08T22:11:00Z">
+        <w:r>
+          <w:rPr>
+            <w:rFonts w:ascii="Times New Roman" w:hAnsi="Times New Roman" w:cs="Times New Roman"/>
+            <w:sz w:val="24"/>
+            <w:szCs w:val="24"/>
+          </w:rPr>
+          <w:t xml:space="preserve">of </w:t>
+        </w:r>
+        <w:proofErr w:type="spellStart"/>
+        <w:r>
+          <w:rPr>
+            <w:rFonts w:ascii="Times New Roman" w:hAnsi="Times New Roman" w:cs="Times New Roman"/>
+            <w:sz w:val="24"/>
+            <w:szCs w:val="24"/>
+          </w:rPr>
+          <w:t>Kraljic</w:t>
+        </w:r>
+        <w:proofErr w:type="spellEnd"/>
+        <w:r>
+          <w:rPr>
+            <w:rFonts w:ascii="Times New Roman" w:hAnsi="Times New Roman" w:cs="Times New Roman"/>
+            <w:sz w:val="24"/>
+            <w:szCs w:val="24"/>
+          </w:rPr>
+          <w:t xml:space="preserve"> et al. (2008) and subsequent related works</w:t>
+        </w:r>
+      </w:ins>
+      <w:ins w:id="186" w:author="Jaeger, Florian" w:date="2025-05-08T18:07:00Z" w16du:dateUtc="2025-05-08T22:07:00Z">
         <w:r>
           <w:rPr>
             <w:rFonts w:ascii="Times New Roman" w:hAnsi="Times New Roman" w:cs="Times New Roman"/>
@@ -2540,24 +2748,24 @@
       <w:pPr>
         <w:spacing w:after="0" w:line="240" w:lineRule="auto"/>
         <w:rPr>
-          <w:ins w:id="185" w:author="Jaeger, Florian" w:date="2025-05-08T17:01:00Z" w16du:dateUtc="2025-05-08T21:01:00Z"/>
-          <w:rFonts w:ascii="Times New Roman" w:hAnsi="Times New Roman" w:cs="Times New Roman"/>
-          <w:sz w:val="24"/>
-          <w:szCs w:val="24"/>
-        </w:rPr>
-      </w:pPr>
-    </w:p>
-    <w:p>
-      <w:pPr>
-        <w:spacing w:after="0" w:line="240" w:lineRule="auto"/>
-        <w:rPr>
-          <w:ins w:id="186" w:author="Jaeger, Florian" w:date="2025-05-08T17:06:00Z" w16du:dateUtc="2025-05-08T21:06:00Z"/>
-          <w:rFonts w:ascii="Times New Roman" w:hAnsi="Times New Roman" w:cs="Times New Roman"/>
-          <w:sz w:val="24"/>
-          <w:szCs w:val="24"/>
-        </w:rPr>
-      </w:pPr>
-      <w:ins w:id="187" w:author="Jaeger, Florian" w:date="2025-05-08T17:01:00Z" w16du:dateUtc="2025-05-08T21:01:00Z">
+          <w:ins w:id="187" w:author="Jaeger, Florian" w:date="2025-05-08T17:01:00Z" w16du:dateUtc="2025-05-08T21:01:00Z"/>
+          <w:rFonts w:ascii="Times New Roman" w:hAnsi="Times New Roman" w:cs="Times New Roman"/>
+          <w:sz w:val="24"/>
+          <w:szCs w:val="24"/>
+        </w:rPr>
+      </w:pPr>
+    </w:p>
+    <w:p>
+      <w:pPr>
+        <w:spacing w:after="0" w:line="240" w:lineRule="auto"/>
+        <w:rPr>
+          <w:ins w:id="188" w:author="Jaeger, Florian" w:date="2025-05-08T17:06:00Z" w16du:dateUtc="2025-05-08T21:06:00Z"/>
+          <w:rFonts w:ascii="Times New Roman" w:hAnsi="Times New Roman" w:cs="Times New Roman"/>
+          <w:sz w:val="24"/>
+          <w:szCs w:val="24"/>
+        </w:rPr>
+      </w:pPr>
+      <w:ins w:id="189" w:author="Jaeger, Florian" w:date="2025-05-08T17:01:00Z" w16du:dateUtc="2025-05-08T21:01:00Z">
         <w:r>
           <w:rPr>
             <w:rFonts w:ascii="Times New Roman" w:hAnsi="Times New Roman" w:cs="Times New Roman"/>
@@ -2567,7 +2775,7 @@
           <w:t xml:space="preserve">Critically, none of these </w:t>
         </w:r>
       </w:ins>
-      <w:ins w:id="188" w:author="Jaeger, Florian" w:date="2025-05-08T18:10:00Z" w16du:dateUtc="2025-05-08T22:10:00Z">
+      <w:ins w:id="190" w:author="Jaeger, Florian" w:date="2025-05-08T18:10:00Z" w16du:dateUtc="2025-05-08T22:10:00Z">
         <w:r>
           <w:rPr>
             <w:rFonts w:ascii="Times New Roman" w:hAnsi="Times New Roman" w:cs="Times New Roman"/>
@@ -2577,7 +2785,7 @@
           <w:t>earlier</w:t>
         </w:r>
       </w:ins>
-      <w:ins w:id="189" w:author="Jaeger, Florian" w:date="2025-05-08T17:01:00Z" w16du:dateUtc="2025-05-08T21:01:00Z">
+      <w:ins w:id="191" w:author="Jaeger, Florian" w:date="2025-05-08T17:01:00Z" w16du:dateUtc="2025-05-08T21:01:00Z">
         <w:r>
           <w:rPr>
             <w:rFonts w:ascii="Times New Roman" w:hAnsi="Times New Roman" w:cs="Times New Roman"/>
@@ -2587,7 +2795,7 @@
           <w:t xml:space="preserve"> experiments addressed how the pen actually affects p</w:t>
         </w:r>
       </w:ins>
-      <w:ins w:id="190" w:author="Jaeger, Florian" w:date="2025-05-08T17:02:00Z" w16du:dateUtc="2025-05-08T21:02:00Z">
+      <w:ins w:id="192" w:author="Jaeger, Florian" w:date="2025-05-08T17:02:00Z" w16du:dateUtc="2025-05-08T21:02:00Z">
         <w:r>
           <w:rPr>
             <w:rFonts w:ascii="Times New Roman" w:hAnsi="Times New Roman" w:cs="Times New Roman"/>
@@ -2615,7 +2823,7 @@
           <w:t xml:space="preserve">. Instead, all </w:t>
         </w:r>
       </w:ins>
-      <w:ins w:id="191" w:author="Jaeger, Florian" w:date="2025-05-08T17:04:00Z" w16du:dateUtc="2025-05-08T21:04:00Z">
+      <w:ins w:id="193" w:author="Jaeger, Florian" w:date="2025-05-08T17:04:00Z" w16du:dateUtc="2025-05-08T21:04:00Z">
         <w:r>
           <w:rPr>
             <w:rFonts w:ascii="Times New Roman" w:hAnsi="Times New Roman" w:cs="Times New Roman"/>
@@ -2625,7 +2833,7 @@
           <w:t xml:space="preserve">previous </w:t>
         </w:r>
       </w:ins>
-      <w:ins w:id="192" w:author="Jaeger, Florian" w:date="2025-05-08T17:02:00Z" w16du:dateUtc="2025-05-08T21:02:00Z">
+      <w:ins w:id="194" w:author="Jaeger, Florian" w:date="2025-05-08T17:02:00Z" w16du:dateUtc="2025-05-08T21:02:00Z">
         <w:r>
           <w:rPr>
             <w:rFonts w:ascii="Times New Roman" w:hAnsi="Times New Roman" w:cs="Times New Roman"/>
@@ -2635,7 +2843,7 @@
           <w:t xml:space="preserve">experiments assessed effects during audio-only test phases that followed the </w:t>
         </w:r>
       </w:ins>
-      <w:ins w:id="193" w:author="Jaeger, Florian" w:date="2025-05-08T17:04:00Z" w16du:dateUtc="2025-05-08T21:04:00Z">
+      <w:ins w:id="195" w:author="Jaeger, Florian" w:date="2025-05-08T17:04:00Z" w16du:dateUtc="2025-05-08T21:04:00Z">
         <w:r>
           <w:rPr>
             <w:rFonts w:ascii="Times New Roman" w:hAnsi="Times New Roman" w:cs="Times New Roman"/>
@@ -2645,7 +2853,7 @@
           <w:t xml:space="preserve">audio-visual </w:t>
         </w:r>
       </w:ins>
-      <w:ins w:id="194" w:author="Jaeger, Florian" w:date="2025-05-08T17:02:00Z" w16du:dateUtc="2025-05-08T21:02:00Z">
+      <w:ins w:id="196" w:author="Jaeger, Florian" w:date="2025-05-08T17:02:00Z" w16du:dateUtc="2025-05-08T21:02:00Z">
         <w:r>
           <w:rPr>
             <w:rFonts w:ascii="Times New Roman" w:hAnsi="Times New Roman" w:cs="Times New Roman"/>
@@ -2655,7 +2863,7 @@
           <w:t>exposure phase in which pen placement was manipulated</w:t>
         </w:r>
       </w:ins>
-      <w:ins w:id="195" w:author="Jaeger, Florian" w:date="2025-05-08T17:03:00Z" w16du:dateUtc="2025-05-08T21:03:00Z">
+      <w:ins w:id="197" w:author="Jaeger, Florian" w:date="2025-05-08T17:03:00Z" w16du:dateUtc="2025-05-08T21:03:00Z">
         <w:r>
           <w:rPr>
             <w:rFonts w:ascii="Times New Roman" w:hAnsi="Times New Roman" w:cs="Times New Roman"/>
@@ -2665,7 +2873,7 @@
           <w:t xml:space="preserve">. In those original experiments, it is thus unclear </w:t>
         </w:r>
       </w:ins>
-      <w:ins w:id="196" w:author="Jaeger, Florian" w:date="2025-05-08T17:05:00Z" w16du:dateUtc="2025-05-08T21:05:00Z">
+      <w:ins w:id="198" w:author="Jaeger, Florian" w:date="2025-05-08T17:05:00Z" w16du:dateUtc="2025-05-08T21:05:00Z">
         <w:r>
           <w:rPr>
             <w:rFonts w:ascii="Times New Roman" w:hAnsi="Times New Roman" w:cs="Times New Roman"/>
@@ -2675,7 +2883,7 @@
           <w:t xml:space="preserve">(1) how the pen affects perception (as opposed to subsequent perceptual recalibration) and (2) </w:t>
         </w:r>
       </w:ins>
-      <w:ins w:id="197" w:author="Jaeger, Florian" w:date="2025-05-08T17:03:00Z" w16du:dateUtc="2025-05-08T21:03:00Z">
+      <w:ins w:id="199" w:author="Jaeger, Florian" w:date="2025-05-08T17:03:00Z" w16du:dateUtc="2025-05-08T21:03:00Z">
         <w:r>
           <w:rPr>
             <w:rFonts w:ascii="Times New Roman" w:hAnsi="Times New Roman" w:cs="Times New Roman"/>
@@ -2685,7 +2893,7 @@
           <w:t xml:space="preserve">what assumptions listeners held about the pen placement during test </w:t>
         </w:r>
       </w:ins>
-      <w:ins w:id="198" w:author="Jaeger, Florian" w:date="2025-05-08T17:05:00Z" w16du:dateUtc="2025-05-08T21:05:00Z">
+      <w:ins w:id="200" w:author="Jaeger, Florian" w:date="2025-05-08T17:05:00Z" w16du:dateUtc="2025-05-08T21:05:00Z">
         <w:r>
           <w:rPr>
             <w:rFonts w:ascii="Times New Roman" w:hAnsi="Times New Roman" w:cs="Times New Roman"/>
@@ -2695,7 +2903,7 @@
           <w:t>(</w:t>
         </w:r>
       </w:ins>
-      <w:ins w:id="199" w:author="Jaeger, Florian" w:date="2025-05-08T17:06:00Z" w16du:dateUtc="2025-05-08T21:06:00Z">
+      <w:ins w:id="201" w:author="Jaeger, Florian" w:date="2025-05-08T17:06:00Z" w16du:dateUtc="2025-05-08T21:06:00Z">
         <w:r>
           <w:rPr>
             <w:rFonts w:ascii="Times New Roman" w:hAnsi="Times New Roman" w:cs="Times New Roman"/>
@@ -2705,7 +2913,7 @@
           <w:t>where no audiovisual materials were used</w:t>
         </w:r>
       </w:ins>
-      <w:ins w:id="200" w:author="Jaeger, Florian" w:date="2025-05-08T17:03:00Z" w16du:dateUtc="2025-05-08T21:03:00Z">
+      <w:ins w:id="202" w:author="Jaeger, Florian" w:date="2025-05-08T17:03:00Z" w16du:dateUtc="2025-05-08T21:03:00Z">
         <w:r>
           <w:rPr>
             <w:rFonts w:ascii="Times New Roman" w:hAnsi="Times New Roman" w:cs="Times New Roman"/>
@@ -2715,7 +2923,7 @@
           <w:t>)</w:t>
         </w:r>
       </w:ins>
-      <w:ins w:id="201" w:author="Jaeger, Florian" w:date="2025-05-08T17:04:00Z" w16du:dateUtc="2025-05-08T21:04:00Z">
+      <w:ins w:id="203" w:author="Jaeger, Florian" w:date="2025-05-08T17:04:00Z" w16du:dateUtc="2025-05-08T21:04:00Z">
         <w:r>
           <w:rPr>
             <w:rFonts w:ascii="Times New Roman" w:hAnsi="Times New Roman" w:cs="Times New Roman"/>
@@ -2730,23 +2938,23 @@
       <w:pPr>
         <w:spacing w:after="0" w:line="240" w:lineRule="auto"/>
         <w:rPr>
-          <w:ins w:id="202" w:author="Jaeger, Florian" w:date="2025-05-08T17:06:00Z" w16du:dateUtc="2025-05-08T21:06:00Z"/>
-          <w:rFonts w:ascii="Times New Roman" w:hAnsi="Times New Roman" w:cs="Times New Roman"/>
-          <w:sz w:val="24"/>
-          <w:szCs w:val="24"/>
-        </w:rPr>
-      </w:pPr>
-    </w:p>
-    <w:p>
-      <w:pPr>
-        <w:spacing w:after="0" w:line="240" w:lineRule="auto"/>
-        <w:rPr>
-          <w:rFonts w:ascii="Times New Roman" w:hAnsi="Times New Roman" w:cs="Times New Roman"/>
-          <w:sz w:val="24"/>
-          <w:szCs w:val="24"/>
-        </w:rPr>
-      </w:pPr>
-      <w:ins w:id="203" w:author="Jaeger, Florian" w:date="2025-05-08T17:06:00Z" w16du:dateUtc="2025-05-08T21:06:00Z">
+          <w:ins w:id="204" w:author="Jaeger, Florian" w:date="2025-05-08T17:06:00Z" w16du:dateUtc="2025-05-08T21:06:00Z"/>
+          <w:rFonts w:ascii="Times New Roman" w:hAnsi="Times New Roman" w:cs="Times New Roman"/>
+          <w:sz w:val="24"/>
+          <w:szCs w:val="24"/>
+        </w:rPr>
+      </w:pPr>
+    </w:p>
+    <w:p>
+      <w:pPr>
+        <w:spacing w:after="0" w:line="240" w:lineRule="auto"/>
+        <w:rPr>
+          <w:rFonts w:ascii="Times New Roman" w:hAnsi="Times New Roman" w:cs="Times New Roman"/>
+          <w:sz w:val="24"/>
+          <w:szCs w:val="24"/>
+        </w:rPr>
+      </w:pPr>
+      <w:ins w:id="205" w:author="Jaeger, Florian" w:date="2025-05-08T17:06:00Z" w16du:dateUtc="2025-05-08T21:06:00Z">
         <w:r>
           <w:rPr>
             <w:rFonts w:ascii="Times New Roman" w:hAnsi="Times New Roman" w:cs="Times New Roman"/>
@@ -2757,7 +2965,7 @@
           <w:t>These knowledge gaps</w:t>
         </w:r>
       </w:ins>
-      <w:ins w:id="204" w:author="Jaeger, Florian" w:date="2025-05-08T18:04:00Z" w16du:dateUtc="2025-05-08T22:04:00Z">
+      <w:ins w:id="206" w:author="Jaeger, Florian" w:date="2025-05-08T18:04:00Z" w16du:dateUtc="2025-05-08T22:04:00Z">
         <w:r>
           <w:rPr>
             <w:rFonts w:ascii="Times New Roman" w:hAnsi="Times New Roman" w:cs="Times New Roman"/>
@@ -2767,7 +2975,7 @@
           <w:t>—which we address in the present work—</w:t>
         </w:r>
       </w:ins>
-      <w:ins w:id="205" w:author="Jaeger, Florian" w:date="2025-05-08T17:06:00Z" w16du:dateUtc="2025-05-08T21:06:00Z">
+      <w:ins w:id="207" w:author="Jaeger, Florian" w:date="2025-05-08T17:06:00Z" w16du:dateUtc="2025-05-08T21:06:00Z">
         <w:r>
           <w:rPr>
             <w:rFonts w:ascii="Times New Roman" w:hAnsi="Times New Roman" w:cs="Times New Roman"/>
@@ -2777,7 +2985,7 @@
           <w:t>have</w:t>
         </w:r>
       </w:ins>
-      <w:ins w:id="206" w:author="Jaeger, Florian" w:date="2025-05-08T17:04:00Z" w16du:dateUtc="2025-05-08T21:04:00Z">
+      <w:ins w:id="208" w:author="Jaeger, Florian" w:date="2025-05-08T17:04:00Z" w16du:dateUtc="2025-05-08T21:04:00Z">
         <w:r>
           <w:rPr>
             <w:rFonts w:ascii="Times New Roman" w:hAnsi="Times New Roman" w:cs="Times New Roman"/>
@@ -2787,7 +2995,7 @@
           <w:t xml:space="preserve"> limited </w:t>
         </w:r>
       </w:ins>
-      <w:ins w:id="207" w:author="Jaeger, Florian" w:date="2025-05-08T17:05:00Z" w16du:dateUtc="2025-05-08T21:05:00Z">
+      <w:ins w:id="209" w:author="Jaeger, Florian" w:date="2025-05-08T17:05:00Z" w16du:dateUtc="2025-05-08T21:05:00Z">
         <w:r>
           <w:rPr>
             <w:rFonts w:ascii="Times New Roman" w:hAnsi="Times New Roman" w:cs="Times New Roman"/>
@@ -2797,7 +3005,7 @@
           <w:t>researchers’ ability</w:t>
         </w:r>
       </w:ins>
-      <w:ins w:id="208" w:author="Jaeger, Florian" w:date="2025-05-08T17:06:00Z" w16du:dateUtc="2025-05-08T21:06:00Z">
+      <w:ins w:id="210" w:author="Jaeger, Florian" w:date="2025-05-08T17:06:00Z" w16du:dateUtc="2025-05-08T21:06:00Z">
         <w:r>
           <w:rPr>
             <w:rFonts w:ascii="Times New Roman" w:hAnsi="Times New Roman" w:cs="Times New Roman"/>
@@ -2807,7 +3015,7 @@
           <w:t xml:space="preserve"> to distinguish between the competing hypotheses described above.</w:t>
         </w:r>
       </w:ins>
-      <w:ins w:id="209" w:author="Jaeger, Florian" w:date="2025-05-08T17:07:00Z" w16du:dateUtc="2025-05-08T21:07:00Z">
+      <w:ins w:id="211" w:author="Jaeger, Florian" w:date="2025-05-08T17:07:00Z" w16du:dateUtc="2025-05-08T21:07:00Z">
         <w:r>
           <w:rPr>
             <w:rFonts w:ascii="Times New Roman" w:hAnsi="Times New Roman" w:cs="Times New Roman"/>
@@ -2817,7 +3025,7 @@
           <w:t xml:space="preserve"> </w:t>
         </w:r>
       </w:ins>
-      <w:ins w:id="210" w:author="Jaeger, Florian" w:date="2025-05-08T18:04:00Z" w16du:dateUtc="2025-05-08T22:04:00Z">
+      <w:ins w:id="212" w:author="Jaeger, Florian" w:date="2025-05-08T18:04:00Z" w16du:dateUtc="2025-05-08T22:04:00Z">
         <w:r>
           <w:rPr>
             <w:rFonts w:ascii="Times New Roman" w:hAnsi="Times New Roman" w:cs="Times New Roman"/>
@@ -2827,7 +3035,7 @@
           <w:t xml:space="preserve">Additionally, </w:t>
         </w:r>
       </w:ins>
-      <w:ins w:id="211" w:author="Jaeger, Florian" w:date="2025-05-08T17:07:00Z" w16du:dateUtc="2025-05-08T21:07:00Z">
+      <w:ins w:id="213" w:author="Jaeger, Florian" w:date="2025-05-08T17:07:00Z" w16du:dateUtc="2025-05-08T21:07:00Z">
         <w:r>
           <w:rPr>
             <w:rFonts w:ascii="Times New Roman" w:hAnsi="Times New Roman" w:cs="Times New Roman"/>
@@ -2837,17 +3045,35 @@
           <w:t xml:space="preserve"> </w:t>
         </w:r>
       </w:ins>
-      <w:ins w:id="212" w:author="Jaeger, Florian" w:date="2025-05-08T18:05:00Z" w16du:dateUtc="2025-05-08T22:05:00Z">
-        <w:r>
-          <w:rPr>
-            <w:rFonts w:ascii="Times New Roman" w:hAnsi="Times New Roman" w:cs="Times New Roman"/>
-            <w:sz w:val="24"/>
-            <w:szCs w:val="24"/>
-          </w:rPr>
-          <w:t xml:space="preserve">our experiments have the potential to shed light on some more nuanced complexities in the line of work inspired by Kraljic and colleagues. For example, </w:t>
-        </w:r>
-      </w:ins>
-      <w:ins w:id="213" w:author="Jaeger, Florian" w:date="2025-05-08T17:07:00Z" w16du:dateUtc="2025-05-08T21:07:00Z">
+      <w:ins w:id="214" w:author="Jaeger, Florian" w:date="2025-05-08T18:05:00Z" w16du:dateUtc="2025-05-08T22:05:00Z">
+        <w:r>
+          <w:rPr>
+            <w:rFonts w:ascii="Times New Roman" w:hAnsi="Times New Roman" w:cs="Times New Roman"/>
+            <w:sz w:val="24"/>
+            <w:szCs w:val="24"/>
+          </w:rPr>
+          <w:t xml:space="preserve">our experiments have the potential to shed light on some more nuanced complexities in the line of work inspired by </w:t>
+        </w:r>
+        <w:proofErr w:type="spellStart"/>
+        <w:r>
+          <w:rPr>
+            <w:rFonts w:ascii="Times New Roman" w:hAnsi="Times New Roman" w:cs="Times New Roman"/>
+            <w:sz w:val="24"/>
+            <w:szCs w:val="24"/>
+          </w:rPr>
+          <w:t>Kraljic</w:t>
+        </w:r>
+        <w:proofErr w:type="spellEnd"/>
+        <w:r>
+          <w:rPr>
+            <w:rFonts w:ascii="Times New Roman" w:hAnsi="Times New Roman" w:cs="Times New Roman"/>
+            <w:sz w:val="24"/>
+            <w:szCs w:val="24"/>
+          </w:rPr>
+          <w:t xml:space="preserve"> and colleagues. For example, </w:t>
+        </w:r>
+      </w:ins>
+      <w:ins w:id="215" w:author="Jaeger, Florian" w:date="2025-05-08T17:07:00Z" w16du:dateUtc="2025-05-08T21:07:00Z">
         <w:r>
           <w:rPr>
             <w:rFonts w:ascii="Times New Roman" w:hAnsi="Times New Roman" w:cs="Times New Roman"/>
@@ -2857,7 +3083,7 @@
           <w:t>Liu &amp; Jaeger (201</w:t>
         </w:r>
       </w:ins>
-      <w:ins w:id="214" w:author="Jaeger, Florian" w:date="2025-05-08T18:19:00Z" w16du:dateUtc="2025-05-08T22:19:00Z">
+      <w:ins w:id="216" w:author="Jaeger, Florian" w:date="2025-05-08T18:19:00Z" w16du:dateUtc="2025-05-08T22:19:00Z">
         <w:r>
           <w:rPr>
             <w:rFonts w:ascii="Times New Roman" w:hAnsi="Times New Roman" w:cs="Times New Roman"/>
@@ -2867,7 +3093,7 @@
           <w:t>8</w:t>
         </w:r>
       </w:ins>
-      <w:ins w:id="215" w:author="Jaeger, Florian" w:date="2025-05-08T17:07:00Z" w16du:dateUtc="2025-05-08T21:07:00Z">
+      <w:ins w:id="217" w:author="Jaeger, Florian" w:date="2025-05-08T17:07:00Z" w16du:dateUtc="2025-05-08T21:07:00Z">
         <w:r>
           <w:rPr>
             <w:rFonts w:ascii="Times New Roman" w:hAnsi="Times New Roman" w:cs="Times New Roman"/>
@@ -2877,7 +3103,7 @@
           <w:t xml:space="preserve">) found </w:t>
         </w:r>
       </w:ins>
-      <w:ins w:id="216" w:author="Jaeger, Florian" w:date="2025-05-08T18:05:00Z" w16du:dateUtc="2025-05-08T22:05:00Z">
+      <w:ins w:id="218" w:author="Jaeger, Florian" w:date="2025-05-08T18:05:00Z" w16du:dateUtc="2025-05-08T22:05:00Z">
         <w:r>
           <w:rPr>
             <w:rFonts w:ascii="Times New Roman" w:hAnsi="Times New Roman" w:cs="Times New Roman"/>
@@ -2887,7 +3113,7 @@
           <w:t xml:space="preserve">that </w:t>
         </w:r>
       </w:ins>
-      <w:ins w:id="217" w:author="Jaeger, Florian" w:date="2025-05-08T18:09:00Z" w16du:dateUtc="2025-05-08T22:09:00Z">
+      <w:ins w:id="219" w:author="Jaeger, Florian" w:date="2025-05-08T18:09:00Z" w16du:dateUtc="2025-05-08T22:09:00Z">
         <w:r>
           <w:rPr>
             <w:rFonts w:ascii="Times New Roman" w:hAnsi="Times New Roman" w:cs="Times New Roman"/>
@@ -2897,7 +3123,7 @@
           <w:t xml:space="preserve">the blocking/reduction of </w:t>
         </w:r>
       </w:ins>
-      <w:ins w:id="218" w:author="Jaeger, Florian" w:date="2025-05-08T17:09:00Z" w16du:dateUtc="2025-05-08T21:09:00Z">
+      <w:ins w:id="220" w:author="Jaeger, Florian" w:date="2025-05-08T17:09:00Z" w16du:dateUtc="2025-05-08T21:09:00Z">
         <w:r>
           <w:rPr>
             <w:rFonts w:ascii="Times New Roman" w:hAnsi="Times New Roman" w:cs="Times New Roman"/>
@@ -2907,7 +3133,7 @@
           <w:t>perceptual recalibration</w:t>
         </w:r>
       </w:ins>
-      <w:ins w:id="219" w:author="Jaeger, Florian" w:date="2025-05-08T17:08:00Z" w16du:dateUtc="2025-05-08T21:08:00Z">
+      <w:ins w:id="221" w:author="Jaeger, Florian" w:date="2025-05-08T17:08:00Z" w16du:dateUtc="2025-05-08T21:08:00Z">
         <w:r>
           <w:rPr>
             <w:rFonts w:ascii="Times New Roman" w:hAnsi="Times New Roman" w:cs="Times New Roman"/>
@@ -2917,7 +3143,7 @@
           <w:t xml:space="preserve"> </w:t>
         </w:r>
       </w:ins>
-      <w:ins w:id="220" w:author="Jaeger, Florian" w:date="2025-05-08T18:09:00Z" w16du:dateUtc="2025-05-08T22:09:00Z">
+      <w:ins w:id="222" w:author="Jaeger, Florian" w:date="2025-05-08T18:09:00Z" w16du:dateUtc="2025-05-08T22:09:00Z">
         <w:r>
           <w:rPr>
             <w:rFonts w:ascii="Times New Roman" w:hAnsi="Times New Roman" w:cs="Times New Roman"/>
@@ -2927,7 +3153,7 @@
           <w:t>i</w:t>
         </w:r>
       </w:ins>
-      <w:ins w:id="221" w:author="Jaeger, Florian" w:date="2025-05-08T18:10:00Z" w16du:dateUtc="2025-05-08T22:10:00Z">
+      <w:ins w:id="223" w:author="Jaeger, Florian" w:date="2025-05-08T18:10:00Z" w16du:dateUtc="2025-05-08T22:10:00Z">
         <w:r>
           <w:rPr>
             <w:rFonts w:ascii="Times New Roman" w:hAnsi="Times New Roman" w:cs="Times New Roman"/>
@@ -2937,7 +3163,7 @@
           <w:t xml:space="preserve">n the pen-in-the-mouth condition </w:t>
         </w:r>
       </w:ins>
-      <w:ins w:id="222" w:author="Jaeger, Florian" w:date="2025-05-08T18:09:00Z" w16du:dateUtc="2025-05-08T22:09:00Z">
+      <w:ins w:id="224" w:author="Jaeger, Florian" w:date="2025-05-08T18:09:00Z" w16du:dateUtc="2025-05-08T22:09:00Z">
         <w:r>
           <w:rPr>
             <w:rFonts w:ascii="Times New Roman" w:hAnsi="Times New Roman" w:cs="Times New Roman"/>
@@ -2947,7 +3173,7 @@
           <w:t>is</w:t>
         </w:r>
       </w:ins>
-      <w:ins w:id="223" w:author="Jaeger, Florian" w:date="2025-05-08T17:09:00Z" w16du:dateUtc="2025-05-08T21:09:00Z">
+      <w:ins w:id="225" w:author="Jaeger, Florian" w:date="2025-05-08T17:09:00Z" w16du:dateUtc="2025-05-08T21:09:00Z">
         <w:r>
           <w:rPr>
             <w:rFonts w:ascii="Times New Roman" w:hAnsi="Times New Roman" w:cs="Times New Roman"/>
@@ -2957,17 +3183,35 @@
           <w:t xml:space="preserve"> asy</w:t>
         </w:r>
       </w:ins>
-      <w:ins w:id="224" w:author="Jaeger, Florian" w:date="2025-05-08T17:08:00Z" w16du:dateUtc="2025-05-08T21:08:00Z">
-        <w:r>
-          <w:rPr>
-            <w:rFonts w:ascii="Times New Roman" w:hAnsi="Times New Roman" w:cs="Times New Roman"/>
-            <w:sz w:val="24"/>
-            <w:szCs w:val="24"/>
-          </w:rPr>
-          <w:t>mmetric between “s” and “sh”-biased exposure</w:t>
-        </w:r>
-      </w:ins>
-      <w:ins w:id="225" w:author="Jaeger, Florian" w:date="2025-05-08T17:09:00Z" w16du:dateUtc="2025-05-08T21:09:00Z">
+      <w:ins w:id="226" w:author="Jaeger, Florian" w:date="2025-05-08T17:08:00Z" w16du:dateUtc="2025-05-08T21:08:00Z">
+        <w:r>
+          <w:rPr>
+            <w:rFonts w:ascii="Times New Roman" w:hAnsi="Times New Roman" w:cs="Times New Roman"/>
+            <w:sz w:val="24"/>
+            <w:szCs w:val="24"/>
+          </w:rPr>
+          <w:t>mmetric between “s” and “</w:t>
+        </w:r>
+        <w:proofErr w:type="spellStart"/>
+        <w:r>
+          <w:rPr>
+            <w:rFonts w:ascii="Times New Roman" w:hAnsi="Times New Roman" w:cs="Times New Roman"/>
+            <w:sz w:val="24"/>
+            <w:szCs w:val="24"/>
+          </w:rPr>
+          <w:t>sh</w:t>
+        </w:r>
+        <w:proofErr w:type="spellEnd"/>
+        <w:r>
+          <w:rPr>
+            <w:rFonts w:ascii="Times New Roman" w:hAnsi="Times New Roman" w:cs="Times New Roman"/>
+            <w:sz w:val="24"/>
+            <w:szCs w:val="24"/>
+          </w:rPr>
+          <w:t>”-biased exposure</w:t>
+        </w:r>
+      </w:ins>
+      <w:ins w:id="227" w:author="Jaeger, Florian" w:date="2025-05-08T17:09:00Z" w16du:dateUtc="2025-05-08T21:09:00Z">
         <w:r>
           <w:rPr>
             <w:rFonts w:ascii="Times New Roman" w:hAnsi="Times New Roman" w:cs="Times New Roman"/>
@@ -2977,7 +3221,7 @@
           <w:t xml:space="preserve">. </w:t>
         </w:r>
       </w:ins>
-      <w:ins w:id="226" w:author="Jaeger, Florian" w:date="2025-05-08T18:12:00Z" w16du:dateUtc="2025-05-08T22:12:00Z">
+      <w:ins w:id="228" w:author="Jaeger, Florian" w:date="2025-05-08T18:12:00Z" w16du:dateUtc="2025-05-08T22:12:00Z">
         <w:r>
           <w:rPr>
             <w:rFonts w:ascii="Times New Roman" w:hAnsi="Times New Roman" w:cs="Times New Roman"/>
@@ -2987,7 +3231,7 @@
           <w:t xml:space="preserve">In the </w:t>
         </w:r>
       </w:ins>
-      <w:ins w:id="227" w:author="Jaeger, Florian" w:date="2025-05-08T17:09:00Z" w16du:dateUtc="2025-05-08T21:09:00Z">
+      <w:ins w:id="229" w:author="Jaeger, Florian" w:date="2025-05-08T17:09:00Z" w16du:dateUtc="2025-05-08T21:09:00Z">
         <w:r>
           <w:rPr>
             <w:rFonts w:ascii="Times New Roman" w:hAnsi="Times New Roman" w:cs="Times New Roman"/>
@@ -2997,7 +3241,7 @@
           <w:t xml:space="preserve">revised general </w:t>
         </w:r>
       </w:ins>
-      <w:ins w:id="228" w:author="Jaeger, Florian" w:date="2025-05-08T18:12:00Z" w16du:dateUtc="2025-05-08T22:12:00Z">
+      <w:ins w:id="230" w:author="Jaeger, Florian" w:date="2025-05-08T18:12:00Z" w16du:dateUtc="2025-05-08T22:12:00Z">
         <w:r>
           <w:rPr>
             <w:rFonts w:ascii="Times New Roman" w:hAnsi="Times New Roman" w:cs="Times New Roman"/>
@@ -3007,7 +3251,7 @@
           <w:t>discussion, we clarify how</w:t>
         </w:r>
       </w:ins>
-      <w:ins w:id="229" w:author="Jaeger, Florian" w:date="2025-05-08T18:08:00Z" w16du:dateUtc="2025-05-08T22:08:00Z">
+      <w:ins w:id="231" w:author="Jaeger, Florian" w:date="2025-05-08T18:08:00Z" w16du:dateUtc="2025-05-08T22:08:00Z">
         <w:r>
           <w:rPr>
             <w:rFonts w:ascii="Times New Roman" w:hAnsi="Times New Roman" w:cs="Times New Roman"/>
@@ -3017,7 +3261,7 @@
           <w:t xml:space="preserve"> our findings offer the beginning of </w:t>
         </w:r>
       </w:ins>
-      <w:ins w:id="230" w:author="Jaeger, Florian" w:date="2025-05-08T18:09:00Z" w16du:dateUtc="2025-05-08T22:09:00Z">
+      <w:ins w:id="232" w:author="Jaeger, Florian" w:date="2025-05-08T18:09:00Z" w16du:dateUtc="2025-05-08T22:09:00Z">
         <w:r>
           <w:rPr>
             <w:rFonts w:ascii="Times New Roman" w:hAnsi="Times New Roman" w:cs="Times New Roman"/>
@@ -3027,7 +3271,7 @@
           <w:t>a new explanation for thi</w:t>
         </w:r>
       </w:ins>
-      <w:ins w:id="231" w:author="Jaeger, Florian" w:date="2025-05-08T18:10:00Z" w16du:dateUtc="2025-05-08T22:10:00Z">
+      <w:ins w:id="233" w:author="Jaeger, Florian" w:date="2025-05-08T18:10:00Z" w16du:dateUtc="2025-05-08T22:10:00Z">
         <w:r>
           <w:rPr>
             <w:rFonts w:ascii="Times New Roman" w:hAnsi="Times New Roman" w:cs="Times New Roman"/>
@@ -3037,7 +3281,7 @@
           <w:t>s asymmetry.</w:t>
         </w:r>
       </w:ins>
-      <w:ins w:id="232" w:author="Jaeger, Florian" w:date="2025-05-08T16:55:00Z" w16du:dateUtc="2025-05-08T20:55:00Z">
+      <w:ins w:id="234" w:author="Jaeger, Florian" w:date="2025-05-08T16:55:00Z" w16du:dateUtc="2025-05-08T20:55:00Z">
         <w:r>
           <w:rPr>
             <w:rFonts w:ascii="Times New Roman" w:hAnsi="Times New Roman" w:cs="Times New Roman"/>
@@ -3076,7 +3320,7 @@
       <w:pPr>
         <w:spacing w:after="0" w:line="240" w:lineRule="auto"/>
         <w:rPr>
-          <w:ins w:id="233" w:author="Jaeger, Florian" w:date="2025-05-08T18:13:00Z" w16du:dateUtc="2025-05-08T22:13:00Z"/>
+          <w:ins w:id="235" w:author="Jaeger, Florian" w:date="2025-05-08T18:13:00Z" w16du:dateUtc="2025-05-08T22:13:00Z"/>
           <w:rFonts w:ascii="Times New Roman" w:hAnsi="Times New Roman" w:cs="Times New Roman"/>
           <w:sz w:val="24"/>
           <w:szCs w:val="24"/>
@@ -3100,7 +3344,7 @@
         </w:rPr>
         <w:t>Thank</w:t>
       </w:r>
-      <w:ins w:id="234" w:author="Jaeger, Florian" w:date="2025-05-08T18:13:00Z" w16du:dateUtc="2025-05-08T22:13:00Z">
+      <w:ins w:id="236" w:author="Jaeger, Florian" w:date="2025-05-08T18:13:00Z" w16du:dateUtc="2025-05-08T22:13:00Z">
         <w:r>
           <w:rPr>
             <w:rFonts w:ascii="Times New Roman" w:hAnsi="Times New Roman" w:cs="Times New Roman"/>
@@ -3110,7 +3354,7 @@
           <w:t xml:space="preserve"> you</w:t>
         </w:r>
       </w:ins>
-      <w:ins w:id="235" w:author="Jaeger, Florian" w:date="2025-05-08T18:14:00Z" w16du:dateUtc="2025-05-08T22:14:00Z">
+      <w:ins w:id="237" w:author="Jaeger, Florian" w:date="2025-05-08T18:14:00Z" w16du:dateUtc="2025-05-08T22:14:00Z">
         <w:r>
           <w:rPr>
             <w:rFonts w:ascii="Times New Roman" w:hAnsi="Times New Roman" w:cs="Times New Roman"/>
@@ -3120,7 +3364,7 @@
           <w:t xml:space="preserve"> for raising this point</w:t>
         </w:r>
       </w:ins>
-      <w:ins w:id="236" w:author="Jaeger, Florian" w:date="2025-05-08T18:13:00Z" w16du:dateUtc="2025-05-08T22:13:00Z">
+      <w:ins w:id="238" w:author="Jaeger, Florian" w:date="2025-05-08T18:13:00Z" w16du:dateUtc="2025-05-08T22:13:00Z">
         <w:r>
           <w:rPr>
             <w:rFonts w:ascii="Times New Roman" w:hAnsi="Times New Roman" w:cs="Times New Roman"/>
@@ -3130,7 +3374,7 @@
           <w:t xml:space="preserve">. As laid out in the main part of the letter, </w:t>
         </w:r>
       </w:ins>
-      <w:ins w:id="237" w:author="Jaeger, Florian" w:date="2025-05-08T18:14:00Z" w16du:dateUtc="2025-05-08T22:14:00Z">
+      <w:ins w:id="239" w:author="Jaeger, Florian" w:date="2025-05-08T18:14:00Z" w16du:dateUtc="2025-05-08T22:14:00Z">
         <w:r>
           <w:rPr>
             <w:rFonts w:ascii="Times New Roman" w:hAnsi="Times New Roman" w:cs="Times New Roman"/>
@@ -3140,7 +3384,7 @@
           <w:t>the revised discussion of Experiment 2</w:t>
         </w:r>
       </w:ins>
-      <w:ins w:id="238" w:author="Jaeger, Florian" w:date="2025-05-08T18:13:00Z" w16du:dateUtc="2025-05-08T22:13:00Z">
+      <w:ins w:id="240" w:author="Jaeger, Florian" w:date="2025-05-08T18:13:00Z" w16du:dateUtc="2025-05-08T22:13:00Z">
         <w:r>
           <w:rPr>
             <w:rFonts w:ascii="Times New Roman" w:hAnsi="Times New Roman" w:cs="Times New Roman"/>
@@ -3150,7 +3394,7 @@
           <w:t xml:space="preserve"> now </w:t>
         </w:r>
       </w:ins>
-      <w:ins w:id="239" w:author="Jaeger, Florian" w:date="2025-05-08T18:14:00Z" w16du:dateUtc="2025-05-08T22:14:00Z">
+      <w:ins w:id="241" w:author="Jaeger, Florian" w:date="2025-05-08T18:14:00Z" w16du:dateUtc="2025-05-08T22:14:00Z">
         <w:r>
           <w:rPr>
             <w:rFonts w:ascii="Times New Roman" w:hAnsi="Times New Roman" w:cs="Times New Roman"/>
@@ -3364,7 +3608,7 @@
         </w:rPr>
         <w:t>Thank you again for your careful assessment of the work</w:t>
       </w:r>
-      <w:del w:id="240" w:author="Jaeger, Florian" w:date="2025-05-08T18:16:00Z" w16du:dateUtc="2025-05-08T22:16:00Z">
+      <w:del w:id="242" w:author="Jaeger, Florian" w:date="2025-05-08T18:16:00Z" w16du:dateUtc="2025-05-08T22:16:00Z">
         <w:r>
           <w:rPr>
             <w:rFonts w:ascii="Times New Roman" w:hAnsi="Times New Roman" w:cs="Times New Roman"/>
@@ -3374,7 +3618,7 @@
           <w:delText xml:space="preserve">, and for your willingness to </w:delText>
         </w:r>
       </w:del>
-      <w:ins w:id="241" w:author="Jaeger, Florian" w:date="2025-05-08T18:16:00Z" w16du:dateUtc="2025-05-08T22:16:00Z">
+      <w:ins w:id="243" w:author="Jaeger, Florian" w:date="2025-05-08T18:16:00Z" w16du:dateUtc="2025-05-08T22:16:00Z">
         <w:r>
           <w:rPr>
             <w:rFonts w:ascii="Times New Roman" w:hAnsi="Times New Roman" w:cs="Times New Roman"/>
@@ -3439,13 +3683,13 @@
         </w:pBdr>
         <w:spacing w:after="0" w:line="240" w:lineRule="auto"/>
         <w:rPr>
-          <w:del w:id="242" w:author="Jaeger, Florian" w:date="2025-05-08T18:16:00Z" w16du:dateUtc="2025-05-08T22:16:00Z"/>
-          <w:rFonts w:ascii="Times New Roman" w:hAnsi="Times New Roman" w:cs="Times New Roman"/>
-          <w:sz w:val="24"/>
-          <w:szCs w:val="24"/>
-        </w:rPr>
-      </w:pPr>
-      <w:ins w:id="243" w:author="Jaeger, Florian" w:date="2025-05-08T18:16:00Z" w16du:dateUtc="2025-05-08T22:16:00Z">
+          <w:del w:id="244" w:author="Jaeger, Florian" w:date="2025-05-08T18:16:00Z" w16du:dateUtc="2025-05-08T22:16:00Z"/>
+          <w:rFonts w:ascii="Times New Roman" w:hAnsi="Times New Roman" w:cs="Times New Roman"/>
+          <w:sz w:val="24"/>
+          <w:szCs w:val="24"/>
+        </w:rPr>
+      </w:pPr>
+      <w:ins w:id="245" w:author="Jaeger, Florian" w:date="2025-05-08T18:16:00Z" w16du:dateUtc="2025-05-08T22:16:00Z">
         <w:r>
           <w:rPr>
             <w:rFonts w:ascii="Times New Roman" w:hAnsi="Times New Roman" w:cs="Times New Roman"/>
@@ -3455,7 +3699,7 @@
           <w:t xml:space="preserve">[summary omitted] </w:t>
         </w:r>
       </w:ins>
-      <w:del w:id="244" w:author="Jaeger, Florian" w:date="2025-05-08T18:16:00Z" w16du:dateUtc="2025-05-08T22:16:00Z">
+      <w:del w:id="246" w:author="Jaeger, Florian" w:date="2025-05-08T18:16:00Z" w16du:dateUtc="2025-05-08T22:16:00Z">
         <w:r>
           <w:rPr>
             <w:rFonts w:ascii="Times New Roman" w:hAnsi="Times New Roman" w:cs="Times New Roman"/>
@@ -3470,24 +3714,24 @@
       <w:pPr>
         <w:spacing w:after="0" w:line="240" w:lineRule="auto"/>
         <w:rPr>
-          <w:del w:id="245" w:author="Jaeger, Florian" w:date="2025-05-08T18:16:00Z" w16du:dateUtc="2025-05-08T22:16:00Z"/>
-          <w:rFonts w:ascii="Times New Roman" w:hAnsi="Times New Roman" w:cs="Times New Roman"/>
-          <w:sz w:val="24"/>
-          <w:szCs w:val="24"/>
-        </w:rPr>
-      </w:pPr>
-    </w:p>
-    <w:p>
-      <w:pPr>
-        <w:spacing w:after="0" w:line="240" w:lineRule="auto"/>
-        <w:rPr>
-          <w:del w:id="246" w:author="Jaeger, Florian" w:date="2025-05-08T18:16:00Z" w16du:dateUtc="2025-05-08T22:16:00Z"/>
-          <w:rFonts w:ascii="Times New Roman" w:hAnsi="Times New Roman" w:cs="Times New Roman"/>
-          <w:sz w:val="24"/>
-          <w:szCs w:val="24"/>
-        </w:rPr>
-      </w:pPr>
-      <w:del w:id="247" w:author="Jaeger, Florian" w:date="2025-05-08T18:16:00Z" w16du:dateUtc="2025-05-08T22:16:00Z">
+          <w:del w:id="247" w:author="Jaeger, Florian" w:date="2025-05-08T18:16:00Z" w16du:dateUtc="2025-05-08T22:16:00Z"/>
+          <w:rFonts w:ascii="Times New Roman" w:hAnsi="Times New Roman" w:cs="Times New Roman"/>
+          <w:sz w:val="24"/>
+          <w:szCs w:val="24"/>
+        </w:rPr>
+      </w:pPr>
+    </w:p>
+    <w:p>
+      <w:pPr>
+        <w:spacing w:after="0" w:line="240" w:lineRule="auto"/>
+        <w:rPr>
+          <w:del w:id="248" w:author="Jaeger, Florian" w:date="2025-05-08T18:16:00Z" w16du:dateUtc="2025-05-08T22:16:00Z"/>
+          <w:rFonts w:ascii="Times New Roman" w:hAnsi="Times New Roman" w:cs="Times New Roman"/>
+          <w:sz w:val="24"/>
+          <w:szCs w:val="24"/>
+        </w:rPr>
+      </w:pPr>
+      <w:del w:id="249" w:author="Jaeger, Florian" w:date="2025-05-08T18:16:00Z" w16du:dateUtc="2025-05-08T22:16:00Z">
         <w:r>
           <w:rPr>
             <w:rFonts w:ascii="Times New Roman" w:hAnsi="Times New Roman" w:cs="Times New Roman"/>
@@ -3526,7 +3770,7 @@
       <w:pPr>
         <w:spacing w:after="0" w:line="240" w:lineRule="auto"/>
         <w:rPr>
-          <w:del w:id="248" w:author="Jaeger, Florian" w:date="2025-05-08T18:16:00Z" w16du:dateUtc="2025-05-08T22:16:00Z"/>
+          <w:del w:id="250" w:author="Jaeger, Florian" w:date="2025-05-08T18:16:00Z" w16du:dateUtc="2025-05-08T22:16:00Z"/>
           <w:rFonts w:ascii="Times New Roman" w:hAnsi="Times New Roman" w:cs="Times New Roman"/>
           <w:sz w:val="24"/>
           <w:szCs w:val="24"/>
@@ -3601,7 +3845,7 @@
         </w:rPr>
         <w:t xml:space="preserve">Thank you for these kind words! </w:t>
       </w:r>
-      <w:del w:id="249" w:author="Jaeger, Florian" w:date="2025-05-08T18:17:00Z" w16du:dateUtc="2025-05-08T22:17:00Z">
+      <w:del w:id="251" w:author="Jaeger, Florian" w:date="2025-05-08T18:17:00Z" w16du:dateUtc="2025-05-08T22:17:00Z">
         <w:r>
           <w:rPr>
             <w:rFonts w:ascii="Times New Roman" w:hAnsi="Times New Roman" w:cs="Times New Roman"/>
@@ -3611,7 +3855,7 @@
           <w:delText>We too are intrigued with the possibility that….</w:delText>
         </w:r>
       </w:del>
-      <w:ins w:id="250" w:author="Jaeger, Florian" w:date="2025-05-08T18:17:00Z" w16du:dateUtc="2025-05-08T22:17:00Z">
+      <w:ins w:id="252" w:author="Jaeger, Florian" w:date="2025-05-08T18:17:00Z" w16du:dateUtc="2025-05-08T22:17:00Z">
         <w:r>
           <w:rPr>
             <w:rFonts w:ascii="Times New Roman" w:hAnsi="Times New Roman" w:cs="Times New Roman"/>
@@ -3621,7 +3865,7 @@
           <w:t xml:space="preserve">And, yes, we were similarly intrigued by this possible explanation, which differs in some relevant ways from both </w:t>
         </w:r>
       </w:ins>
-      <w:ins w:id="251" w:author="Jaeger, Florian" w:date="2025-05-08T18:18:00Z" w16du:dateUtc="2025-05-08T22:18:00Z">
+      <w:ins w:id="253" w:author="Jaeger, Florian" w:date="2025-05-08T18:18:00Z" w16du:dateUtc="2025-05-08T22:18:00Z">
         <w:r>
           <w:rPr>
             <w:rFonts w:ascii="Times New Roman" w:hAnsi="Times New Roman" w:cs="Times New Roman"/>
@@ -3631,24 +3875,60 @@
           <w:t xml:space="preserve">of the explanations that have previously been advanced to explain to explain why we might not see perceptual learning when a speaker has a pen in the </w:t>
         </w:r>
       </w:ins>
-      <w:ins w:id="252" w:author="Jaeger, Florian" w:date="2025-05-08T18:19:00Z" w16du:dateUtc="2025-05-08T22:19:00Z">
-        <w:r>
-          <w:rPr>
-            <w:rFonts w:ascii="Times New Roman" w:hAnsi="Times New Roman" w:cs="Times New Roman"/>
-            <w:sz w:val="24"/>
-            <w:szCs w:val="24"/>
-          </w:rPr>
-          <w:t>mouth (causal inference/’explaining way’, Kraljic et al., 2008; Liu &amp; Jaeger, 2018; v</w:t>
-        </w:r>
-      </w:ins>
-      <w:ins w:id="253" w:author="Jaeger, Florian" w:date="2025-05-08T18:20:00Z" w16du:dateUtc="2025-05-08T22:20:00Z">
-        <w:r>
-          <w:rPr>
-            <w:rFonts w:ascii="Times New Roman" w:hAnsi="Times New Roman" w:cs="Times New Roman"/>
-            <w:sz w:val="24"/>
-            <w:szCs w:val="24"/>
-          </w:rPr>
-          <w:t>s. separate exemplar storage for audio-visual vs. audio-only exemplars, Kraljic &amp; Samuel, 2011).</w:t>
+      <w:ins w:id="254" w:author="Jaeger, Florian" w:date="2025-05-08T18:19:00Z" w16du:dateUtc="2025-05-08T22:19:00Z">
+        <w:r>
+          <w:rPr>
+            <w:rFonts w:ascii="Times New Roman" w:hAnsi="Times New Roman" w:cs="Times New Roman"/>
+            <w:sz w:val="24"/>
+            <w:szCs w:val="24"/>
+          </w:rPr>
+          <w:t xml:space="preserve">mouth (causal inference/’explaining way’, </w:t>
+        </w:r>
+        <w:proofErr w:type="spellStart"/>
+        <w:r>
+          <w:rPr>
+            <w:rFonts w:ascii="Times New Roman" w:hAnsi="Times New Roman" w:cs="Times New Roman"/>
+            <w:sz w:val="24"/>
+            <w:szCs w:val="24"/>
+          </w:rPr>
+          <w:t>Kraljic</w:t>
+        </w:r>
+        <w:proofErr w:type="spellEnd"/>
+        <w:r>
+          <w:rPr>
+            <w:rFonts w:ascii="Times New Roman" w:hAnsi="Times New Roman" w:cs="Times New Roman"/>
+            <w:sz w:val="24"/>
+            <w:szCs w:val="24"/>
+          </w:rPr>
+          <w:t xml:space="preserve"> et al., 2008; Liu &amp; Jaeger, 2018; v</w:t>
+        </w:r>
+      </w:ins>
+      <w:ins w:id="255" w:author="Jaeger, Florian" w:date="2025-05-08T18:20:00Z" w16du:dateUtc="2025-05-08T22:20:00Z">
+        <w:r>
+          <w:rPr>
+            <w:rFonts w:ascii="Times New Roman" w:hAnsi="Times New Roman" w:cs="Times New Roman"/>
+            <w:sz w:val="24"/>
+            <w:szCs w:val="24"/>
+          </w:rPr>
+          <w:t xml:space="preserve">s. separate exemplar storage for audio-visual vs. audio-only exemplars, </w:t>
+        </w:r>
+        <w:proofErr w:type="spellStart"/>
+        <w:r>
+          <w:rPr>
+            <w:rFonts w:ascii="Times New Roman" w:hAnsi="Times New Roman" w:cs="Times New Roman"/>
+            <w:sz w:val="24"/>
+            <w:szCs w:val="24"/>
+          </w:rPr>
+          <w:t>Kraljic</w:t>
+        </w:r>
+        <w:proofErr w:type="spellEnd"/>
+        <w:r>
+          <w:rPr>
+            <w:rFonts w:ascii="Times New Roman" w:hAnsi="Times New Roman" w:cs="Times New Roman"/>
+            <w:sz w:val="24"/>
+            <w:szCs w:val="24"/>
+          </w:rPr>
+          <w:t xml:space="preserve"> &amp; Samuel, 2011).</w:t>
         </w:r>
       </w:ins>
     </w:p>
@@ -3700,13 +3980,13 @@
       <w:pPr>
         <w:spacing w:after="0" w:line="240" w:lineRule="auto"/>
         <w:rPr>
-          <w:del w:id="254" w:author="Jaeger, Florian" w:date="2025-05-08T18:21:00Z" w16du:dateUtc="2025-05-08T22:21:00Z"/>
-          <w:rFonts w:ascii="Times New Roman" w:hAnsi="Times New Roman" w:cs="Times New Roman"/>
-          <w:sz w:val="24"/>
-          <w:szCs w:val="24"/>
-        </w:rPr>
-      </w:pPr>
-      <w:del w:id="255" w:author="Jaeger, Florian" w:date="2025-05-08T18:21:00Z" w16du:dateUtc="2025-05-08T22:21:00Z">
+          <w:del w:id="256" w:author="Jaeger, Florian" w:date="2025-05-08T18:21:00Z" w16du:dateUtc="2025-05-08T22:21:00Z"/>
+          <w:rFonts w:ascii="Times New Roman" w:hAnsi="Times New Roman" w:cs="Times New Roman"/>
+          <w:sz w:val="24"/>
+          <w:szCs w:val="24"/>
+        </w:rPr>
+      </w:pPr>
+      <w:del w:id="257" w:author="Jaeger, Florian" w:date="2025-05-08T18:21:00Z" w16du:dateUtc="2025-05-08T22:21:00Z">
         <w:r>
           <w:rPr>
             <w:rFonts w:ascii="Times New Roman" w:hAnsi="Times New Roman" w:cs="Times New Roman"/>
@@ -3716,7 +3996,7 @@
           <w:delText xml:space="preserve">We are heartened to hear your confidence in our study and conclusions. We are glad you appreciated the extensive detail provided in the supplementary material, and are happy to elevate needed information into the main text. More specific details can be found below.  </w:delText>
         </w:r>
       </w:del>
-      <w:ins w:id="256" w:author="Jaeger, Florian" w:date="2025-05-08T18:21:00Z" w16du:dateUtc="2025-05-08T22:21:00Z">
+      <w:ins w:id="258" w:author="Jaeger, Florian" w:date="2025-05-08T18:21:00Z" w16du:dateUtc="2025-05-08T22:21:00Z">
         <w:r>
           <w:rPr>
             <w:rFonts w:ascii="Times New Roman" w:hAnsi="Times New Roman" w:cs="Times New Roman"/>
@@ -3726,7 +4006,7 @@
           <w:t>Agreed! R1 also requested more details on the methods to be included in the main part of the paper. And so we have moved many of the details from the SI into the paper.</w:t>
         </w:r>
       </w:ins>
-      <w:ins w:id="257" w:author="Jaeger, Florian" w:date="2025-05-08T18:22:00Z" w16du:dateUtc="2025-05-08T22:22:00Z">
+      <w:ins w:id="259" w:author="Jaeger, Florian" w:date="2025-05-08T18:22:00Z" w16du:dateUtc="2025-05-08T22:22:00Z">
         <w:r>
           <w:rPr>
             <w:rFonts w:ascii="Times New Roman" w:hAnsi="Times New Roman" w:cs="Times New Roman"/>
@@ -3937,13 +4217,13 @@
       <w:pPr>
         <w:spacing w:after="0" w:line="240" w:lineRule="auto"/>
         <w:rPr>
-          <w:del w:id="258" w:author="Jaeger, Florian" w:date="2025-05-08T18:26:00Z" w16du:dateUtc="2025-05-08T22:26:00Z"/>
-          <w:rFonts w:ascii="Times New Roman" w:hAnsi="Times New Roman" w:cs="Times New Roman"/>
-          <w:sz w:val="24"/>
-          <w:szCs w:val="24"/>
-        </w:rPr>
-      </w:pPr>
-      <w:del w:id="259" w:author="Jaeger, Florian" w:date="2025-05-08T18:26:00Z" w16du:dateUtc="2025-05-08T22:26:00Z">
+          <w:del w:id="260" w:author="Jaeger, Florian" w:date="2025-05-08T18:26:00Z" w16du:dateUtc="2025-05-08T22:26:00Z"/>
+          <w:rFonts w:ascii="Times New Roman" w:hAnsi="Times New Roman" w:cs="Times New Roman"/>
+          <w:sz w:val="24"/>
+          <w:szCs w:val="24"/>
+        </w:rPr>
+      </w:pPr>
+      <w:del w:id="261" w:author="Jaeger, Florian" w:date="2025-05-08T18:26:00Z" w16du:dateUtc="2025-05-08T22:26:00Z">
         <w:r>
           <w:rPr>
             <w:rFonts w:ascii="Times New Roman" w:hAnsi="Times New Roman" w:cs="Times New Roman"/>
@@ -3958,24 +4238,24 @@
       <w:pPr>
         <w:spacing w:after="0" w:line="240" w:lineRule="auto"/>
         <w:rPr>
-          <w:ins w:id="260" w:author="Jaeger, Florian" w:date="2025-05-08T18:26:00Z" w16du:dateUtc="2025-05-08T22:26:00Z"/>
-          <w:rFonts w:ascii="Times New Roman" w:hAnsi="Times New Roman" w:cs="Times New Roman"/>
-          <w:sz w:val="24"/>
-          <w:szCs w:val="24"/>
-        </w:rPr>
-      </w:pPr>
-    </w:p>
-    <w:p>
-      <w:pPr>
-        <w:spacing w:after="0" w:line="240" w:lineRule="auto"/>
-        <w:rPr>
-          <w:ins w:id="261" w:author="Jaeger, Florian" w:date="2025-05-08T18:34:00Z" w16du:dateUtc="2025-05-08T22:34:00Z"/>
-          <w:rFonts w:ascii="Times New Roman" w:hAnsi="Times New Roman" w:cs="Times New Roman"/>
-          <w:sz w:val="24"/>
-          <w:szCs w:val="24"/>
-        </w:rPr>
-      </w:pPr>
-      <w:ins w:id="262" w:author="Jaeger, Florian" w:date="2025-05-08T18:27:00Z" w16du:dateUtc="2025-05-08T22:27:00Z">
+          <w:ins w:id="262" w:author="Jaeger, Florian" w:date="2025-05-08T18:26:00Z" w16du:dateUtc="2025-05-08T22:26:00Z"/>
+          <w:rFonts w:ascii="Times New Roman" w:hAnsi="Times New Roman" w:cs="Times New Roman"/>
+          <w:sz w:val="24"/>
+          <w:szCs w:val="24"/>
+        </w:rPr>
+      </w:pPr>
+    </w:p>
+    <w:p>
+      <w:pPr>
+        <w:spacing w:after="0" w:line="240" w:lineRule="auto"/>
+        <w:rPr>
+          <w:ins w:id="263" w:author="Jaeger, Florian" w:date="2025-05-08T18:34:00Z" w16du:dateUtc="2025-05-08T22:34:00Z"/>
+          <w:rFonts w:ascii="Times New Roman" w:hAnsi="Times New Roman" w:cs="Times New Roman"/>
+          <w:sz w:val="24"/>
+          <w:szCs w:val="24"/>
+        </w:rPr>
+      </w:pPr>
+      <w:ins w:id="264" w:author="Jaeger, Florian" w:date="2025-05-08T18:27:00Z" w16du:dateUtc="2025-05-08T22:27:00Z">
         <w:r>
           <w:rPr>
             <w:rFonts w:ascii="Times New Roman" w:hAnsi="Times New Roman" w:cs="Times New Roman"/>
@@ -3985,7 +4265,7 @@
           <w:t>None of the experiments actually had any trials with white dots. We only included the instructions about the white dots because we had planned to use such catch trials in subsequent perce</w:t>
         </w:r>
       </w:ins>
-      <w:ins w:id="263" w:author="Jaeger, Florian" w:date="2025-05-08T18:28:00Z" w16du:dateUtc="2025-05-08T22:28:00Z">
+      <w:ins w:id="265" w:author="Jaeger, Florian" w:date="2025-05-08T18:28:00Z" w16du:dateUtc="2025-05-08T22:28:00Z">
         <w:r>
           <w:rPr>
             <w:rFonts w:ascii="Times New Roman" w:hAnsi="Times New Roman" w:cs="Times New Roman"/>
@@ -3995,7 +4275,7 @@
           <w:t xml:space="preserve">ptual recalibration experiments (which we have since done). </w:t>
         </w:r>
       </w:ins>
-      <w:ins w:id="264" w:author="Jaeger, Florian" w:date="2025-05-08T18:34:00Z" w16du:dateUtc="2025-05-08T22:34:00Z">
+      <w:ins w:id="266" w:author="Jaeger, Florian" w:date="2025-05-08T18:34:00Z" w16du:dateUtc="2025-05-08T22:34:00Z">
         <w:r>
           <w:rPr>
             <w:rFonts w:ascii="Times New Roman" w:hAnsi="Times New Roman" w:cs="Times New Roman"/>
@@ -4028,23 +4308,23 @@
       <w:pPr>
         <w:spacing w:after="0" w:line="240" w:lineRule="auto"/>
         <w:rPr>
-          <w:ins w:id="265" w:author="Jaeger, Florian" w:date="2025-05-08T18:34:00Z" w16du:dateUtc="2025-05-08T22:34:00Z"/>
-          <w:rFonts w:ascii="Times New Roman" w:hAnsi="Times New Roman" w:cs="Times New Roman"/>
-          <w:sz w:val="24"/>
-          <w:szCs w:val="24"/>
-        </w:rPr>
-      </w:pPr>
-    </w:p>
-    <w:p>
-      <w:pPr>
-        <w:spacing w:after="0" w:line="240" w:lineRule="auto"/>
-        <w:rPr>
-          <w:rFonts w:ascii="Times New Roman" w:hAnsi="Times New Roman" w:cs="Times New Roman"/>
-          <w:sz w:val="24"/>
-          <w:szCs w:val="24"/>
-        </w:rPr>
-      </w:pPr>
-      <w:ins w:id="266" w:author="Jaeger, Florian" w:date="2025-05-08T18:34:00Z" w16du:dateUtc="2025-05-08T22:34:00Z">
+          <w:ins w:id="267" w:author="Jaeger, Florian" w:date="2025-05-08T18:34:00Z" w16du:dateUtc="2025-05-08T22:34:00Z"/>
+          <w:rFonts w:ascii="Times New Roman" w:hAnsi="Times New Roman" w:cs="Times New Roman"/>
+          <w:sz w:val="24"/>
+          <w:szCs w:val="24"/>
+        </w:rPr>
+      </w:pPr>
+    </w:p>
+    <w:p>
+      <w:pPr>
+        <w:spacing w:after="0" w:line="240" w:lineRule="auto"/>
+        <w:rPr>
+          <w:rFonts w:ascii="Times New Roman" w:hAnsi="Times New Roman" w:cs="Times New Roman"/>
+          <w:sz w:val="24"/>
+          <w:szCs w:val="24"/>
+        </w:rPr>
+      </w:pPr>
+      <w:ins w:id="268" w:author="Jaeger, Florian" w:date="2025-05-08T18:34:00Z" w16du:dateUtc="2025-05-08T22:34:00Z">
         <w:r>
           <w:rPr>
             <w:rFonts w:ascii="Times New Roman" w:hAnsi="Times New Roman" w:cs="Times New Roman"/>
@@ -4055,7 +4335,7 @@
           <w:t xml:space="preserve">As we now clarify, participants </w:t>
         </w:r>
       </w:ins>
-      <w:ins w:id="267" w:author="Jaeger, Florian" w:date="2025-05-08T18:35:00Z" w16du:dateUtc="2025-05-08T22:35:00Z">
+      <w:ins w:id="269" w:author="Jaeger, Florian" w:date="2025-05-08T18:35:00Z" w16du:dateUtc="2025-05-08T22:35:00Z">
         <w:r>
           <w:rPr>
             <w:rFonts w:ascii="Times New Roman" w:hAnsi="Times New Roman" w:cs="Times New Roman"/>
@@ -4065,7 +4345,7 @@
           <w:t xml:space="preserve">very </w:t>
         </w:r>
       </w:ins>
-      <w:ins w:id="268" w:author="Jaeger, Florian" w:date="2025-05-08T18:34:00Z" w16du:dateUtc="2025-05-08T22:34:00Z">
+      <w:ins w:id="270" w:author="Jaeger, Florian" w:date="2025-05-08T18:34:00Z" w16du:dateUtc="2025-05-08T22:34:00Z">
         <w:r>
           <w:rPr>
             <w:rFonts w:ascii="Times New Roman" w:hAnsi="Times New Roman" w:cs="Times New Roman"/>
@@ -4073,7 +4353,7 @@
             <w:iCs/>
             <w:sz w:val="24"/>
             <w:szCs w:val="24"/>
-            <w:rPrChange w:id="269" w:author="Jaeger, Florian" w:date="2025-05-08T18:35:00Z" w16du:dateUtc="2025-05-08T22:35:00Z">
+            <w:rPrChange w:id="271" w:author="Jaeger, Florian" w:date="2025-05-08T18:35:00Z" w16du:dateUtc="2025-05-08T22:35:00Z">
               <w:rPr>
                 <w:rFonts w:ascii="Times New Roman" w:hAnsi="Times New Roman" w:cs="Times New Roman"/>
                 <w:sz w:val="24"/>
@@ -4092,7 +4372,7 @@
           <w:t xml:space="preserve"> made that mistake, and no part</w:t>
         </w:r>
       </w:ins>
-      <w:ins w:id="270" w:author="Jaeger, Florian" w:date="2025-05-08T18:35:00Z" w16du:dateUtc="2025-05-08T22:35:00Z">
+      <w:ins w:id="272" w:author="Jaeger, Florian" w:date="2025-05-08T18:35:00Z" w16du:dateUtc="2025-05-08T22:35:00Z">
         <w:r>
           <w:rPr>
             <w:rFonts w:ascii="Times New Roman" w:hAnsi="Times New Roman" w:cs="Times New Roman"/>
@@ -4102,7 +4382,7 @@
           <w:t xml:space="preserve">icipant had to be excluded based on that criterion. However, since pressing the SPACE bar </w:t>
         </w:r>
       </w:ins>
-      <w:ins w:id="271" w:author="Jaeger, Florian" w:date="2025-05-08T18:36:00Z" w16du:dateUtc="2025-05-08T22:36:00Z">
+      <w:ins w:id="273" w:author="Jaeger, Florian" w:date="2025-05-08T18:36:00Z" w16du:dateUtc="2025-05-08T22:36:00Z">
         <w:r>
           <w:rPr>
             <w:rFonts w:ascii="Times New Roman" w:hAnsi="Times New Roman" w:cs="Times New Roman"/>
@@ -4112,7 +4392,7 @@
           <w:t>auto-advanced to the next trial, trials with SPACE bar responses are lacking categorization responses, and thus had to be excluded (1.6%</w:t>
         </w:r>
       </w:ins>
-      <w:ins w:id="272" w:author="Jaeger, Florian" w:date="2025-05-08T18:37:00Z" w16du:dateUtc="2025-05-08T22:37:00Z">
+      <w:ins w:id="274" w:author="Jaeger, Florian" w:date="2025-05-08T18:37:00Z" w16du:dateUtc="2025-05-08T22:37:00Z">
         <w:r>
           <w:rPr>
             <w:rFonts w:ascii="Times New Roman" w:hAnsi="Times New Roman" w:cs="Times New Roman"/>
@@ -4122,7 +4402,7 @@
           <w:t xml:space="preserve"> of all trials</w:t>
         </w:r>
       </w:ins>
-      <w:ins w:id="273" w:author="Jaeger, Florian" w:date="2025-05-08T18:36:00Z" w16du:dateUtc="2025-05-08T22:36:00Z">
+      <w:ins w:id="275" w:author="Jaeger, Florian" w:date="2025-05-08T18:36:00Z" w16du:dateUtc="2025-05-08T22:36:00Z">
         <w:r>
           <w:rPr>
             <w:rFonts w:ascii="Times New Roman" w:hAnsi="Times New Roman" w:cs="Times New Roman"/>
@@ -4132,7 +4412,7 @@
           <w:t>)</w:t>
         </w:r>
       </w:ins>
-      <w:ins w:id="274" w:author="Jaeger, Florian" w:date="2025-05-08T18:37:00Z" w16du:dateUtc="2025-05-08T22:37:00Z">
+      <w:ins w:id="276" w:author="Jaeger, Florian" w:date="2025-05-08T18:37:00Z" w16du:dateUtc="2025-05-08T22:37:00Z">
         <w:r>
           <w:rPr>
             <w:rFonts w:ascii="Times New Roman" w:hAnsi="Times New Roman" w:cs="Times New Roman"/>
@@ -4186,7 +4466,7 @@
           <w:szCs w:val="24"/>
         </w:rPr>
       </w:pPr>
-      <w:commentRangeStart w:id="275"/>
+      <w:commentRangeStart w:id="277"/>
       <w:r>
         <w:rPr>
           <w:rFonts w:ascii="Times New Roman" w:hAnsi="Times New Roman" w:cs="Times New Roman"/>
@@ -4195,12 +4475,12 @@
         </w:rPr>
         <w:t>We have added ____.</w:t>
       </w:r>
-      <w:commentRangeEnd w:id="275"/>
+      <w:commentRangeEnd w:id="277"/>
       <w:r>
         <w:rPr>
           <w:rStyle w:val="CommentReference"/>
         </w:rPr>
-        <w:commentReference w:id="275"/>
+        <w:commentReference w:id="277"/>
       </w:r>
     </w:p>
     <w:p>
@@ -4234,20 +4514,56 @@
           <w:sz w:val="24"/>
           <w:szCs w:val="24"/>
         </w:rPr>
-        <w:t>-it is impossible to understand the difference between the a-c versions of Experiment 1 without reading the supplemental materials. All the main text says is that there were different test stimuli across their experiments, because they were chosen such that they elicited a certain percent of s and sh responses. But it's not clear why that would have changed so much across experiments until you see the issues that arose in the supplement (and it's so important to understand the differences because the predictions and a great deal of the discussion of Experiment 2 involve relating them to different conditions of Experiment 1 - for example, on p20 "Under this alternative hypothesis, both pen conditions (pen in mouth vs. hand) of Experiment 2 should yield rates of ashi-responses comparable to the pen in mouth condition in Experiment 1c (since Experiment 2 occludes most direct visual evidence of fricative articulation.)" All that needs to be said is that there were errors in labelling the continuum tokens and so the acoustic region covered by the continuum differed across these experiments, with Experiments 1a and 1b being shifted relative to Experiment 1c….</w:t>
-      </w:r>
-    </w:p>
-    <w:p>
-      <w:pPr>
-        <w:spacing w:after="0" w:line="240" w:lineRule="auto"/>
-        <w:rPr>
-          <w:del w:id="276" w:author="Jaeger, Florian" w:date="2025-05-08T18:25:00Z" w16du:dateUtc="2025-05-08T22:25:00Z"/>
-          <w:rFonts w:ascii="Times New Roman" w:hAnsi="Times New Roman" w:cs="Times New Roman"/>
-          <w:sz w:val="24"/>
-          <w:szCs w:val="24"/>
-        </w:rPr>
-      </w:pPr>
-      <w:del w:id="277" w:author="Jaeger, Florian" w:date="2025-05-08T18:25:00Z" w16du:dateUtc="2025-05-08T22:25:00Z">
+        <w:t xml:space="preserve">-it is impossible to understand the difference between the a-c versions of Experiment 1 without reading the supplemental materials. All the main text says is that there were different test stimuli across their experiments, because they were chosen such that they elicited a certain percent of s and </w:t>
+      </w:r>
+      <w:proofErr w:type="spellStart"/>
+      <w:r>
+        <w:rPr>
+          <w:rFonts w:ascii="Times New Roman" w:hAnsi="Times New Roman" w:cs="Times New Roman"/>
+          <w:sz w:val="24"/>
+          <w:szCs w:val="24"/>
+        </w:rPr>
+        <w:t>sh</w:t>
+      </w:r>
+      <w:proofErr w:type="spellEnd"/>
+      <w:r>
+        <w:rPr>
+          <w:rFonts w:ascii="Times New Roman" w:hAnsi="Times New Roman" w:cs="Times New Roman"/>
+          <w:sz w:val="24"/>
+          <w:szCs w:val="24"/>
+        </w:rPr>
+        <w:t xml:space="preserve"> responses. But it's not clear why that would have changed so much across experiments until you see the issues that arose in the supplement (and it's so important to understand the differences because the predictions and a great deal of the discussion of Experiment 2 involve relating them to different conditions of Experiment 1 - for example, on p20 "Under this alternative hypothesis, both pen conditions (pen in mouth vs. hand) of Experiment 2 should yield rates of </w:t>
+      </w:r>
+      <w:proofErr w:type="spellStart"/>
+      <w:r>
+        <w:rPr>
+          <w:rFonts w:ascii="Times New Roman" w:hAnsi="Times New Roman" w:cs="Times New Roman"/>
+          <w:sz w:val="24"/>
+          <w:szCs w:val="24"/>
+        </w:rPr>
+        <w:t>ashi</w:t>
+      </w:r>
+      <w:proofErr w:type="spellEnd"/>
+      <w:r>
+        <w:rPr>
+          <w:rFonts w:ascii="Times New Roman" w:hAnsi="Times New Roman" w:cs="Times New Roman"/>
+          <w:sz w:val="24"/>
+          <w:szCs w:val="24"/>
+        </w:rPr>
+        <w:t>-responses comparable to the pen in mouth condition in Experiment 1c (since Experiment 2 occludes most direct visual evidence of fricative articulation.)" All that needs to be said is that there were errors in labelling the continuum tokens and so the acoustic region covered by the continuum differed across these experiments, with Experiments 1a and 1b being shifted relative to Experiment 1c….</w:t>
+      </w:r>
+    </w:p>
+    <w:p>
+      <w:pPr>
+        <w:spacing w:after="0" w:line="240" w:lineRule="auto"/>
+        <w:rPr>
+          <w:del w:id="278" w:author="Jaeger, Florian" w:date="2025-05-08T18:25:00Z" w16du:dateUtc="2025-05-08T22:25:00Z"/>
+          <w:rFonts w:ascii="Times New Roman" w:hAnsi="Times New Roman" w:cs="Times New Roman"/>
+          <w:sz w:val="24"/>
+          <w:szCs w:val="24"/>
+        </w:rPr>
+      </w:pPr>
+      <w:del w:id="279" w:author="Jaeger, Florian" w:date="2025-05-08T18:25:00Z" w16du:dateUtc="2025-05-08T22:25:00Z">
         <w:r>
           <w:rPr>
             <w:rFonts w:ascii="Times New Roman" w:hAnsi="Times New Roman" w:cs="Times New Roman"/>
@@ -4262,24 +4578,24 @@
       <w:pPr>
         <w:spacing w:after="0" w:line="240" w:lineRule="auto"/>
         <w:rPr>
-          <w:ins w:id="278" w:author="Jaeger, Florian" w:date="2025-05-08T18:25:00Z" w16du:dateUtc="2025-05-08T22:25:00Z"/>
-          <w:rFonts w:ascii="Times New Roman" w:hAnsi="Times New Roman" w:cs="Times New Roman"/>
-          <w:sz w:val="24"/>
-          <w:szCs w:val="24"/>
-        </w:rPr>
-      </w:pPr>
-    </w:p>
-    <w:p>
-      <w:pPr>
-        <w:spacing w:after="0" w:line="240" w:lineRule="auto"/>
-        <w:rPr>
-          <w:del w:id="279" w:author="Jaeger, Florian" w:date="2025-05-08T18:25:00Z" w16du:dateUtc="2025-05-08T22:25:00Z"/>
-          <w:rFonts w:ascii="Times New Roman" w:hAnsi="Times New Roman" w:cs="Times New Roman"/>
-          <w:sz w:val="24"/>
-          <w:szCs w:val="24"/>
-        </w:rPr>
-      </w:pPr>
-      <w:ins w:id="280" w:author="Jaeger, Florian" w:date="2025-05-08T18:25:00Z" w16du:dateUtc="2025-05-08T22:25:00Z">
+          <w:ins w:id="280" w:author="Jaeger, Florian" w:date="2025-05-08T18:25:00Z" w16du:dateUtc="2025-05-08T22:25:00Z"/>
+          <w:rFonts w:ascii="Times New Roman" w:hAnsi="Times New Roman" w:cs="Times New Roman"/>
+          <w:sz w:val="24"/>
+          <w:szCs w:val="24"/>
+        </w:rPr>
+      </w:pPr>
+    </w:p>
+    <w:p>
+      <w:pPr>
+        <w:spacing w:after="0" w:line="240" w:lineRule="auto"/>
+        <w:rPr>
+          <w:del w:id="281" w:author="Jaeger, Florian" w:date="2025-05-08T18:25:00Z" w16du:dateUtc="2025-05-08T22:25:00Z"/>
+          <w:rFonts w:ascii="Times New Roman" w:hAnsi="Times New Roman" w:cs="Times New Roman"/>
+          <w:sz w:val="24"/>
+          <w:szCs w:val="24"/>
+        </w:rPr>
+      </w:pPr>
+      <w:ins w:id="282" w:author="Jaeger, Florian" w:date="2025-05-08T18:25:00Z" w16du:dateUtc="2025-05-08T22:25:00Z">
         <w:r>
           <w:rPr>
             <w:rFonts w:ascii="Times New Roman" w:hAnsi="Times New Roman" w:cs="Times New Roman"/>
@@ -4289,7 +4605,7 @@
           <w:t>We have followed these suggestions (thank you for going the extra step o</w:t>
         </w:r>
       </w:ins>
-      <w:ins w:id="281" w:author="Jaeger, Florian" w:date="2025-05-08T18:26:00Z" w16du:dateUtc="2025-05-08T22:26:00Z">
+      <w:ins w:id="283" w:author="Jaeger, Florian" w:date="2025-05-08T18:26:00Z" w16du:dateUtc="2025-05-08T22:26:00Z">
         <w:r>
           <w:rPr>
             <w:rFonts w:ascii="Times New Roman" w:hAnsi="Times New Roman" w:cs="Times New Roman"/>
@@ -4304,7 +4620,7 @@
       <w:pPr>
         <w:spacing w:after="0" w:line="240" w:lineRule="auto"/>
         <w:rPr>
-          <w:ins w:id="282" w:author="Jaeger, Florian" w:date="2025-05-08T18:25:00Z" w16du:dateUtc="2025-05-08T22:25:00Z"/>
+          <w:ins w:id="284" w:author="Jaeger, Florian" w:date="2025-05-08T18:25:00Z" w16du:dateUtc="2025-05-08T22:25:00Z"/>
           <w:rFonts w:ascii="Times New Roman" w:hAnsi="Times New Roman" w:cs="Times New Roman"/>
           <w:sz w:val="24"/>
           <w:szCs w:val="24"/>
@@ -4349,13 +4665,13 @@
       <w:pPr>
         <w:spacing w:after="0" w:line="240" w:lineRule="auto"/>
         <w:rPr>
-          <w:del w:id="283" w:author="Jaeger, Florian" w:date="2025-05-08T18:23:00Z" w16du:dateUtc="2025-05-08T22:23:00Z"/>
-          <w:rFonts w:ascii="Times New Roman" w:hAnsi="Times New Roman" w:cs="Times New Roman"/>
-          <w:sz w:val="24"/>
-          <w:szCs w:val="24"/>
-        </w:rPr>
-      </w:pPr>
-      <w:del w:id="284" w:author="Jaeger, Florian" w:date="2025-05-08T18:23:00Z" w16du:dateUtc="2025-05-08T22:23:00Z">
+          <w:del w:id="285" w:author="Jaeger, Florian" w:date="2025-05-08T18:23:00Z" w16du:dateUtc="2025-05-08T22:23:00Z"/>
+          <w:rFonts w:ascii="Times New Roman" w:hAnsi="Times New Roman" w:cs="Times New Roman"/>
+          <w:sz w:val="24"/>
+          <w:szCs w:val="24"/>
+        </w:rPr>
+      </w:pPr>
+      <w:del w:id="286" w:author="Jaeger, Florian" w:date="2025-05-08T18:23:00Z" w16du:dateUtc="2025-05-08T22:23:00Z">
         <w:r>
           <w:rPr>
             <w:rFonts w:ascii="Times New Roman" w:hAnsi="Times New Roman" w:cs="Times New Roman"/>
@@ -4370,23 +4686,23 @@
       <w:pPr>
         <w:spacing w:after="0" w:line="240" w:lineRule="auto"/>
         <w:rPr>
-          <w:ins w:id="285" w:author="Jaeger, Florian" w:date="2025-05-08T18:23:00Z" w16du:dateUtc="2025-05-08T22:23:00Z"/>
-          <w:rFonts w:ascii="Times New Roman" w:hAnsi="Times New Roman" w:cs="Times New Roman"/>
-          <w:sz w:val="24"/>
-          <w:szCs w:val="24"/>
-        </w:rPr>
-      </w:pPr>
-    </w:p>
-    <w:p>
-      <w:pPr>
-        <w:spacing w:after="0" w:line="240" w:lineRule="auto"/>
-        <w:rPr>
-          <w:rFonts w:ascii="Times New Roman" w:hAnsi="Times New Roman" w:cs="Times New Roman"/>
-          <w:sz w:val="24"/>
-          <w:szCs w:val="24"/>
-        </w:rPr>
-      </w:pPr>
-      <w:ins w:id="286" w:author="Jaeger, Florian" w:date="2025-05-08T18:23:00Z" w16du:dateUtc="2025-05-08T22:23:00Z">
+          <w:ins w:id="287" w:author="Jaeger, Florian" w:date="2025-05-08T18:23:00Z" w16du:dateUtc="2025-05-08T22:23:00Z"/>
+          <w:rFonts w:ascii="Times New Roman" w:hAnsi="Times New Roman" w:cs="Times New Roman"/>
+          <w:sz w:val="24"/>
+          <w:szCs w:val="24"/>
+        </w:rPr>
+      </w:pPr>
+    </w:p>
+    <w:p>
+      <w:pPr>
+        <w:spacing w:after="0" w:line="240" w:lineRule="auto"/>
+        <w:rPr>
+          <w:rFonts w:ascii="Times New Roman" w:hAnsi="Times New Roman" w:cs="Times New Roman"/>
+          <w:sz w:val="24"/>
+          <w:szCs w:val="24"/>
+        </w:rPr>
+      </w:pPr>
+      <w:ins w:id="288" w:author="Jaeger, Florian" w:date="2025-05-08T18:23:00Z" w16du:dateUtc="2025-05-08T22:23:00Z">
         <w:r>
           <w:rPr>
             <w:rFonts w:ascii="Times New Roman" w:hAnsi="Times New Roman" w:cs="Times New Roman"/>
@@ -4396,7 +4712,7 @@
           <w:t xml:space="preserve">This was poorly worded: we meant the center/mean of the continuum steps (a direct consequence of </w:t>
         </w:r>
       </w:ins>
-      <w:ins w:id="287" w:author="Jaeger, Florian" w:date="2025-05-08T18:24:00Z" w16du:dateUtc="2025-05-08T22:24:00Z">
+      <w:ins w:id="289" w:author="Jaeger, Florian" w:date="2025-05-08T18:24:00Z" w16du:dateUtc="2025-05-08T22:24:00Z">
         <w:r>
           <w:rPr>
             <w:rFonts w:ascii="Times New Roman" w:hAnsi="Times New Roman" w:cs="Times New Roman"/>
@@ -4445,7 +4761,7 @@
       <w:pPr>
         <w:spacing w:after="0" w:line="240" w:lineRule="auto"/>
         <w:rPr>
-          <w:ins w:id="288" w:author="Jaeger, Florian" w:date="2025-05-08T18:22:00Z" w16du:dateUtc="2025-05-08T22:22:00Z"/>
+          <w:ins w:id="290" w:author="Jaeger, Florian" w:date="2025-05-08T18:22:00Z" w16du:dateUtc="2025-05-08T22:22:00Z"/>
           <w:rFonts w:ascii="Times New Roman" w:hAnsi="Times New Roman" w:cs="Times New Roman"/>
           <w:sz w:val="24"/>
           <w:szCs w:val="24"/>
@@ -4469,7 +4785,7 @@
         </w:rPr>
         <w:t>Thank</w:t>
       </w:r>
-      <w:ins w:id="289" w:author="Jaeger, Florian" w:date="2025-05-08T18:23:00Z" w16du:dateUtc="2025-05-08T22:23:00Z">
+      <w:ins w:id="291" w:author="Jaeger, Florian" w:date="2025-05-08T18:23:00Z" w16du:dateUtc="2025-05-08T22:23:00Z">
         <w:r>
           <w:rPr>
             <w:rFonts w:ascii="Times New Roman" w:hAnsi="Times New Roman" w:cs="Times New Roman"/>
@@ -4479,7 +4795,7 @@
           <w:t xml:space="preserve"> you</w:t>
         </w:r>
       </w:ins>
-      <w:del w:id="290" w:author="Jaeger, Florian" w:date="2025-05-08T18:23:00Z" w16du:dateUtc="2025-05-08T22:23:00Z">
+      <w:del w:id="292" w:author="Jaeger, Florian" w:date="2025-05-08T18:23:00Z" w16du:dateUtc="2025-05-08T22:23:00Z">
         <w:r>
           <w:rPr>
             <w:rFonts w:ascii="Times New Roman" w:hAnsi="Times New Roman" w:cs="Times New Roman"/>
@@ -4557,7 +4873,7 @@
       <w:pPr>
         <w:spacing w:after="0" w:line="240" w:lineRule="auto"/>
         <w:rPr>
-          <w:del w:id="291" w:author="Jaeger, Florian" w:date="2025-05-08T18:41:00Z" w16du:dateUtc="2025-05-08T22:41:00Z"/>
+          <w:del w:id="293" w:author="Jaeger, Florian" w:date="2025-05-08T18:41:00Z" w16du:dateUtc="2025-05-08T22:41:00Z"/>
           <w:rFonts w:ascii="Times New Roman" w:hAnsi="Times New Roman" w:cs="Times New Roman"/>
           <w:sz w:val="24"/>
           <w:szCs w:val="24"/>
@@ -4574,13 +4890,13 @@
         </w:pBdr>
         <w:spacing w:after="0" w:line="240" w:lineRule="auto"/>
         <w:rPr>
-          <w:del w:id="292" w:author="Jaeger, Florian" w:date="2025-05-08T18:41:00Z" w16du:dateUtc="2025-05-08T22:41:00Z"/>
-          <w:rFonts w:ascii="Times New Roman" w:hAnsi="Times New Roman" w:cs="Times New Roman"/>
-          <w:sz w:val="24"/>
-          <w:szCs w:val="24"/>
-        </w:rPr>
-      </w:pPr>
-      <w:del w:id="293" w:author="Jaeger, Florian" w:date="2025-05-08T18:41:00Z" w16du:dateUtc="2025-05-08T22:41:00Z">
+          <w:del w:id="294" w:author="Jaeger, Florian" w:date="2025-05-08T18:41:00Z" w16du:dateUtc="2025-05-08T22:41:00Z"/>
+          <w:rFonts w:ascii="Times New Roman" w:hAnsi="Times New Roman" w:cs="Times New Roman"/>
+          <w:sz w:val="24"/>
+          <w:szCs w:val="24"/>
+        </w:rPr>
+      </w:pPr>
+      <w:del w:id="295" w:author="Jaeger, Florian" w:date="2025-05-08T18:41:00Z" w16du:dateUtc="2025-05-08T22:41:00Z">
         <w:r>
           <w:rPr>
             <w:rFonts w:ascii="Times New Roman" w:hAnsi="Times New Roman" w:cs="Times New Roman"/>
@@ -4595,24 +4911,24 @@
       <w:pPr>
         <w:spacing w:after="0" w:line="240" w:lineRule="auto"/>
         <w:rPr>
-          <w:del w:id="294" w:author="Jaeger, Florian" w:date="2025-05-08T18:41:00Z" w16du:dateUtc="2025-05-08T22:41:00Z"/>
-          <w:rFonts w:ascii="Times New Roman" w:hAnsi="Times New Roman" w:cs="Times New Roman"/>
-          <w:sz w:val="24"/>
-          <w:szCs w:val="24"/>
-        </w:rPr>
-      </w:pPr>
-    </w:p>
-    <w:p>
-      <w:pPr>
-        <w:spacing w:after="0" w:line="240" w:lineRule="auto"/>
-        <w:rPr>
-          <w:del w:id="295" w:author="Jaeger, Florian" w:date="2025-05-08T18:41:00Z" w16du:dateUtc="2025-05-08T22:41:00Z"/>
-          <w:rFonts w:ascii="Times New Roman" w:hAnsi="Times New Roman" w:cs="Times New Roman"/>
-          <w:sz w:val="24"/>
-          <w:szCs w:val="24"/>
-        </w:rPr>
-      </w:pPr>
-      <w:del w:id="296" w:author="Jaeger, Florian" w:date="2025-05-08T18:41:00Z" w16du:dateUtc="2025-05-08T22:41:00Z">
+          <w:del w:id="296" w:author="Jaeger, Florian" w:date="2025-05-08T18:41:00Z" w16du:dateUtc="2025-05-08T22:41:00Z"/>
+          <w:rFonts w:ascii="Times New Roman" w:hAnsi="Times New Roman" w:cs="Times New Roman"/>
+          <w:sz w:val="24"/>
+          <w:szCs w:val="24"/>
+        </w:rPr>
+      </w:pPr>
+    </w:p>
+    <w:p>
+      <w:pPr>
+        <w:spacing w:after="0" w:line="240" w:lineRule="auto"/>
+        <w:rPr>
+          <w:del w:id="297" w:author="Jaeger, Florian" w:date="2025-05-08T18:41:00Z" w16du:dateUtc="2025-05-08T22:41:00Z"/>
+          <w:rFonts w:ascii="Times New Roman" w:hAnsi="Times New Roman" w:cs="Times New Roman"/>
+          <w:sz w:val="24"/>
+          <w:szCs w:val="24"/>
+        </w:rPr>
+      </w:pPr>
+      <w:del w:id="298" w:author="Jaeger, Florian" w:date="2025-05-08T18:41:00Z" w16du:dateUtc="2025-05-08T22:41:00Z">
         <w:r>
           <w:rPr>
             <w:rFonts w:ascii="Times New Roman" w:hAnsi="Times New Roman" w:cs="Times New Roman"/>
@@ -4648,7 +4964,7 @@
           <w:szCs w:val="24"/>
         </w:rPr>
       </w:pPr>
-      <w:ins w:id="297" w:author="Jaeger, Florian" w:date="2025-05-08T18:41:00Z" w16du:dateUtc="2025-05-08T22:41:00Z">
+      <w:ins w:id="299" w:author="Jaeger, Florian" w:date="2025-05-08T18:41:00Z" w16du:dateUtc="2025-05-08T22:41:00Z">
         <w:r>
           <w:rPr>
             <w:rFonts w:ascii="Times New Roman" w:hAnsi="Times New Roman" w:cs="Times New Roman"/>
@@ -4756,7 +5072,7 @@
           <w:szCs w:val="24"/>
         </w:rPr>
       </w:pPr>
-      <w:ins w:id="298" w:author="Jaeger, Florian" w:date="2025-05-08T18:50:00Z" w16du:dateUtc="2025-05-08T22:50:00Z">
+      <w:ins w:id="300" w:author="Jaeger, Florian" w:date="2025-05-08T18:50:00Z" w16du:dateUtc="2025-05-08T22:50:00Z">
         <w:r>
           <w:rPr>
             <w:rFonts w:ascii="Times New Roman" w:hAnsi="Times New Roman" w:cs="Times New Roman"/>
@@ -4774,7 +5090,7 @@
         </w:rPr>
         <w:t xml:space="preserve">We </w:t>
       </w:r>
-      <w:ins w:id="299" w:author="Jaeger, Florian" w:date="2025-05-08T18:50:00Z" w16du:dateUtc="2025-05-08T22:50:00Z">
+      <w:ins w:id="301" w:author="Jaeger, Florian" w:date="2025-05-08T18:50:00Z" w16du:dateUtc="2025-05-08T22:50:00Z">
         <w:r>
           <w:rPr>
             <w:rFonts w:ascii="Times New Roman" w:hAnsi="Times New Roman" w:cs="Times New Roman"/>
@@ -4838,7 +5154,7 @@
           <w:szCs w:val="24"/>
         </w:rPr>
       </w:pPr>
-      <w:commentRangeStart w:id="300"/>
+      <w:commentRangeStart w:id="302"/>
       <w:r>
         <w:rPr>
           <w:rFonts w:ascii="Times New Roman" w:hAnsi="Times New Roman" w:cs="Times New Roman"/>
@@ -4847,12 +5163,12 @@
         </w:rPr>
         <w:t>We have added ____.</w:t>
       </w:r>
-      <w:commentRangeEnd w:id="300"/>
+      <w:commentRangeEnd w:id="302"/>
       <w:r>
         <w:rPr>
           <w:rStyle w:val="CommentReference"/>
         </w:rPr>
-        <w:commentReference w:id="300"/>
+        <w:commentReference w:id="302"/>
       </w:r>
     </w:p>
     <w:p>
@@ -4991,7 +5307,7 @@
           <w:szCs w:val="24"/>
         </w:rPr>
       </w:pPr>
-      <w:commentRangeStart w:id="301"/>
+      <w:commentRangeStart w:id="303"/>
       <w:r>
         <w:rPr>
           <w:rFonts w:ascii="Times New Roman" w:hAnsi="Times New Roman" w:cs="Times New Roman"/>
@@ -5001,23 +5317,44 @@
         <w:lastRenderedPageBreak/>
         <w:t>TYPOS:</w:t>
       </w:r>
-      <w:commentRangeEnd w:id="301"/>
+      <w:commentRangeEnd w:id="303"/>
       <w:r>
         <w:rPr>
           <w:rStyle w:val="CommentReference"/>
         </w:rPr>
-        <w:commentReference w:id="301"/>
-      </w:r>
-    </w:p>
-    <w:p>
-      <w:pPr>
-        <w:spacing w:after="0" w:line="240" w:lineRule="auto"/>
-        <w:rPr>
-          <w:rFonts w:ascii="Times New Roman" w:hAnsi="Times New Roman" w:cs="Times New Roman"/>
-          <w:sz w:val="24"/>
-          <w:szCs w:val="24"/>
-        </w:rPr>
-      </w:pPr>
+        <w:commentReference w:id="303"/>
+      </w:r>
+    </w:p>
+    <w:p>
+      <w:pPr>
+        <w:spacing w:after="0" w:line="240" w:lineRule="auto"/>
+        <w:rPr>
+          <w:rFonts w:ascii="Times New Roman" w:hAnsi="Times New Roman" w:cs="Times New Roman"/>
+          <w:sz w:val="24"/>
+          <w:szCs w:val="24"/>
+        </w:rPr>
+      </w:pPr>
+    </w:p>
+    <w:p>
+      <w:pPr>
+        <w:spacing w:after="0" w:line="240" w:lineRule="auto"/>
+        <w:rPr>
+          <w:del w:id="304" w:author="Cummings, Shawn" w:date="2025-05-08T22:44:00Z" w16du:dateUtc="2025-05-09T02:44:00Z"/>
+          <w:rFonts w:ascii="Times New Roman" w:hAnsi="Times New Roman" w:cs="Times New Roman"/>
+          <w:sz w:val="24"/>
+          <w:szCs w:val="24"/>
+        </w:rPr>
+      </w:pPr>
+      <w:del w:id="305" w:author="Cummings, Shawn" w:date="2025-05-08T22:44:00Z" w16du:dateUtc="2025-05-09T02:44:00Z">
+        <w:r>
+          <w:rPr>
+            <w:rFonts w:ascii="Times New Roman" w:hAnsi="Times New Roman" w:cs="Times New Roman"/>
+            <w:sz w:val="24"/>
+            <w:szCs w:val="24"/>
+          </w:rPr>
+          <w:delText>Discussion -&gt; "In perceptual recalibration experiments, listeners are expected to speech from an unfamiliar talker for which the realization of a particular sound is shifted towards a neighboring category". -&gt; Did you mean "listeners are exposed"?</w:delText>
+        </w:r>
+      </w:del>
     </w:p>
     <w:p>
       <w:pPr>
@@ -5029,147 +5366,173 @@
         </w:pBdr>
         <w:spacing w:after="0" w:line="240" w:lineRule="auto"/>
         <w:rPr>
-          <w:rFonts w:ascii="Times New Roman" w:hAnsi="Times New Roman" w:cs="Times New Roman"/>
-          <w:sz w:val="24"/>
-          <w:szCs w:val="24"/>
-        </w:rPr>
-      </w:pPr>
-      <w:r>
-        <w:rPr>
-          <w:rFonts w:ascii="Times New Roman" w:hAnsi="Times New Roman" w:cs="Times New Roman"/>
-          <w:sz w:val="24"/>
-          <w:szCs w:val="24"/>
-        </w:rPr>
-        <w:t>Discussion -&gt; "In perceptual recalibration experiments, listeners are expected to speech from an unfamiliar talker for which the realization of a particular sound is shifted towards a neighboring category". -&gt; Did you mean "listeners are exposed"?</w:t>
-      </w:r>
-    </w:p>
-    <w:p>
-      <w:pPr>
-        <w:spacing w:after="0" w:line="240" w:lineRule="auto"/>
-        <w:rPr>
-          <w:rFonts w:ascii="Times New Roman" w:hAnsi="Times New Roman" w:cs="Times New Roman"/>
-          <w:sz w:val="24"/>
-          <w:szCs w:val="24"/>
-        </w:rPr>
-      </w:pPr>
-      <w:r>
-        <w:rPr>
-          <w:rFonts w:ascii="Times New Roman" w:hAnsi="Times New Roman" w:cs="Times New Roman"/>
-          <w:sz w:val="24"/>
-          <w:szCs w:val="24"/>
-        </w:rPr>
-        <w:t>p13: "40 instead of 64 fewer participants" - - delete fewer</w:t>
-      </w:r>
-      <w:r>
-        <w:rPr>
-          <w:rFonts w:ascii="Times New Roman" w:hAnsi="Times New Roman" w:cs="Times New Roman"/>
-          <w:sz w:val="24"/>
-          <w:szCs w:val="24"/>
-        </w:rPr>
-        <w:br/>
-      </w:r>
-    </w:p>
-    <w:p>
-      <w:pPr>
-        <w:spacing w:after="0" w:line="240" w:lineRule="auto"/>
-        <w:rPr>
-          <w:rFonts w:ascii="Times New Roman" w:hAnsi="Times New Roman" w:cs="Times New Roman"/>
-          <w:sz w:val="24"/>
-          <w:szCs w:val="24"/>
-        </w:rPr>
-      </w:pPr>
-      <w:r>
-        <w:rPr>
-          <w:rFonts w:ascii="Times New Roman" w:hAnsi="Times New Roman" w:cs="Times New Roman"/>
-          <w:sz w:val="24"/>
-          <w:szCs w:val="24"/>
-        </w:rPr>
-        <w:br/>
-        <w:t>p25: "listeners are expected to speech from an unfamiliar talker for which the realization of a particular sound is shifted towards a neighboring category" - this should be "exposed to speech"</w:t>
-      </w:r>
-    </w:p>
-    <w:p>
-      <w:pPr>
-        <w:spacing w:after="0" w:line="240" w:lineRule="auto"/>
-        <w:rPr>
-          <w:rFonts w:ascii="Times New Roman" w:hAnsi="Times New Roman" w:cs="Times New Roman"/>
-          <w:sz w:val="24"/>
-          <w:szCs w:val="24"/>
-        </w:rPr>
-      </w:pPr>
-    </w:p>
-    <w:p>
-      <w:pPr>
-        <w:spacing w:after="0" w:line="240" w:lineRule="auto"/>
-        <w:rPr>
-          <w:rFonts w:ascii="Times New Roman" w:hAnsi="Times New Roman" w:cs="Times New Roman"/>
-          <w:sz w:val="24"/>
-          <w:szCs w:val="24"/>
-        </w:rPr>
-      </w:pPr>
-      <w:r>
-        <w:rPr>
-          <w:rFonts w:ascii="Times New Roman" w:hAnsi="Times New Roman" w:cs="Times New Roman"/>
-          <w:sz w:val="24"/>
-          <w:szCs w:val="24"/>
-        </w:rPr>
-        <w:t>Pg. 11, 2nd para., line 7. "each of each of" --&gt; "each of"</w:t>
-      </w:r>
-      <w:r>
-        <w:rPr>
-          <w:rFonts w:ascii="Times New Roman" w:hAnsi="Times New Roman" w:cs="Times New Roman"/>
-          <w:sz w:val="24"/>
-          <w:szCs w:val="24"/>
-        </w:rPr>
-        <w:br/>
-        <w:t>Pg. 13, Statistical Power</w:t>
-      </w:r>
-      <w:r>
-        <w:rPr>
-          <w:rFonts w:ascii="Times New Roman" w:hAnsi="Times New Roman" w:cs="Times New Roman"/>
-          <w:sz w:val="24"/>
-          <w:szCs w:val="24"/>
-        </w:rPr>
-        <w:br/>
-        <w:t>Change "reliable" to "reliably"; remove "fewer"?</w:t>
-      </w:r>
-      <w:r>
-        <w:rPr>
-          <w:rFonts w:ascii="Times New Roman" w:hAnsi="Times New Roman" w:cs="Times New Roman"/>
-          <w:sz w:val="24"/>
-          <w:szCs w:val="24"/>
-        </w:rPr>
-        <w:br/>
-        <w:t>Pg. 14, 3rd para. "the exact same (missing word) as in"</w:t>
-      </w:r>
-    </w:p>
-    <w:p>
-      <w:pPr>
-        <w:spacing w:after="0" w:line="240" w:lineRule="auto"/>
-        <w:rPr>
-          <w:rFonts w:ascii="Times New Roman" w:hAnsi="Times New Roman" w:cs="Times New Roman"/>
-          <w:sz w:val="24"/>
-          <w:szCs w:val="24"/>
-        </w:rPr>
-      </w:pPr>
-    </w:p>
-    <w:p>
-      <w:pPr>
-        <w:spacing w:after="0" w:line="240" w:lineRule="auto"/>
-        <w:rPr>
-          <w:rFonts w:ascii="Times New Roman" w:hAnsi="Times New Roman" w:cs="Times New Roman"/>
-          <w:sz w:val="24"/>
-          <w:szCs w:val="24"/>
-        </w:rPr>
-      </w:pPr>
-      <w:r>
-        <w:rPr>
-          <w:rFonts w:ascii="Times New Roman" w:hAnsi="Times New Roman" w:cs="Times New Roman"/>
-          <w:sz w:val="24"/>
-          <w:szCs w:val="24"/>
-        </w:rPr>
-        <w:t>Pg. 25, 3rd para. "listeners are expected to speech from an unfamiliar talker"--&gt; "listeners are expected to adapt to speech from an unfamiliar talker"?</w:t>
-      </w:r>
+          <w:ins w:id="306" w:author="Cummings, Shawn" w:date="2025-05-08T22:44:00Z" w16du:dateUtc="2025-05-09T02:44:00Z"/>
+          <w:rFonts w:ascii="Times New Roman" w:hAnsi="Times New Roman" w:cs="Times New Roman"/>
+          <w:sz w:val="24"/>
+          <w:szCs w:val="24"/>
+        </w:rPr>
+      </w:pPr>
+    </w:p>
+    <w:p>
+      <w:pPr>
+        <w:spacing w:after="0" w:line="240" w:lineRule="auto"/>
+        <w:rPr>
+          <w:del w:id="307" w:author="Cummings, Shawn" w:date="2025-05-08T22:44:00Z" w16du:dateUtc="2025-05-09T02:44:00Z"/>
+          <w:rFonts w:ascii="Times New Roman" w:hAnsi="Times New Roman" w:cs="Times New Roman"/>
+          <w:sz w:val="24"/>
+          <w:szCs w:val="24"/>
+        </w:rPr>
+      </w:pPr>
+      <w:ins w:id="308" w:author="Cummings, Shawn" w:date="2025-05-08T22:44:00Z" w16du:dateUtc="2025-05-09T02:44:00Z">
+        <w:r>
+          <w:rPr>
+            <w:rFonts w:ascii="Times New Roman" w:hAnsi="Times New Roman" w:cs="Times New Roman"/>
+            <w:sz w:val="24"/>
+            <w:szCs w:val="24"/>
+          </w:rPr>
+          <w:t xml:space="preserve">We also amended a </w:t>
+        </w:r>
+      </w:ins>
+      <w:ins w:id="309" w:author="Cummings, Shawn" w:date="2025-05-08T22:45:00Z" w16du:dateUtc="2025-05-09T02:45:00Z">
+        <w:r>
+          <w:rPr>
+            <w:rFonts w:ascii="Times New Roman" w:hAnsi="Times New Roman" w:cs="Times New Roman"/>
+            <w:sz w:val="24"/>
+            <w:szCs w:val="24"/>
+          </w:rPr>
+          <w:t xml:space="preserve">handful of typos helpfully pointed out by all reviewers. </w:t>
+        </w:r>
+      </w:ins>
+      <w:del w:id="310" w:author="Cummings, Shawn" w:date="2025-05-08T22:44:00Z" w16du:dateUtc="2025-05-09T02:44:00Z">
+        <w:r>
+          <w:rPr>
+            <w:rFonts w:ascii="Times New Roman" w:hAnsi="Times New Roman" w:cs="Times New Roman"/>
+            <w:sz w:val="24"/>
+            <w:szCs w:val="24"/>
+          </w:rPr>
+          <w:delText>p13: "40 instead of 64 fewer participants" - - delete fewer</w:delText>
+        </w:r>
+        <w:r>
+          <w:rPr>
+            <w:rFonts w:ascii="Times New Roman" w:hAnsi="Times New Roman" w:cs="Times New Roman"/>
+            <w:sz w:val="24"/>
+            <w:szCs w:val="24"/>
+          </w:rPr>
+          <w:br/>
+        </w:r>
+      </w:del>
+    </w:p>
+    <w:p>
+      <w:pPr>
+        <w:spacing w:after="0" w:line="240" w:lineRule="auto"/>
+        <w:rPr>
+          <w:del w:id="311" w:author="Cummings, Shawn" w:date="2025-05-08T22:44:00Z" w16du:dateUtc="2025-05-09T02:44:00Z"/>
+          <w:rFonts w:ascii="Times New Roman" w:hAnsi="Times New Roman" w:cs="Times New Roman"/>
+          <w:sz w:val="24"/>
+          <w:szCs w:val="24"/>
+        </w:rPr>
+      </w:pPr>
+      <w:del w:id="312" w:author="Cummings, Shawn" w:date="2025-05-08T22:44:00Z" w16du:dateUtc="2025-05-09T02:44:00Z">
+        <w:r>
+          <w:rPr>
+            <w:rFonts w:ascii="Times New Roman" w:hAnsi="Times New Roman" w:cs="Times New Roman"/>
+            <w:sz w:val="24"/>
+            <w:szCs w:val="24"/>
+          </w:rPr>
+          <w:br/>
+          <w:delText>p25: "listeners are expected to speech from an unfamiliar talker for which the realization of a particular sound is shifted towards a neighboring category" - this should be "exposed to speech"</w:delText>
+        </w:r>
+      </w:del>
+    </w:p>
+    <w:p>
+      <w:pPr>
+        <w:spacing w:after="0" w:line="240" w:lineRule="auto"/>
+        <w:rPr>
+          <w:del w:id="313" w:author="Cummings, Shawn" w:date="2025-05-08T22:44:00Z" w16du:dateUtc="2025-05-09T02:44:00Z"/>
+          <w:rFonts w:ascii="Times New Roman" w:hAnsi="Times New Roman" w:cs="Times New Roman"/>
+          <w:sz w:val="24"/>
+          <w:szCs w:val="24"/>
+        </w:rPr>
+      </w:pPr>
+    </w:p>
+    <w:p>
+      <w:pPr>
+        <w:spacing w:after="0" w:line="240" w:lineRule="auto"/>
+        <w:rPr>
+          <w:del w:id="314" w:author="Cummings, Shawn" w:date="2025-05-08T22:44:00Z" w16du:dateUtc="2025-05-09T02:44:00Z"/>
+          <w:rFonts w:ascii="Times New Roman" w:hAnsi="Times New Roman" w:cs="Times New Roman"/>
+          <w:sz w:val="24"/>
+          <w:szCs w:val="24"/>
+        </w:rPr>
+      </w:pPr>
+      <w:del w:id="315" w:author="Cummings, Shawn" w:date="2025-05-08T22:44:00Z" w16du:dateUtc="2025-05-09T02:44:00Z">
+        <w:r>
+          <w:rPr>
+            <w:rFonts w:ascii="Times New Roman" w:hAnsi="Times New Roman" w:cs="Times New Roman"/>
+            <w:sz w:val="24"/>
+            <w:szCs w:val="24"/>
+          </w:rPr>
+          <w:delText>Pg. 11, 2nd para., line 7. "each of each of" --&gt; "each of"</w:delText>
+        </w:r>
+        <w:r>
+          <w:rPr>
+            <w:rFonts w:ascii="Times New Roman" w:hAnsi="Times New Roman" w:cs="Times New Roman"/>
+            <w:sz w:val="24"/>
+            <w:szCs w:val="24"/>
+          </w:rPr>
+          <w:br/>
+          <w:delText>Pg. 13, Statistical Power</w:delText>
+        </w:r>
+        <w:r>
+          <w:rPr>
+            <w:rFonts w:ascii="Times New Roman" w:hAnsi="Times New Roman" w:cs="Times New Roman"/>
+            <w:sz w:val="24"/>
+            <w:szCs w:val="24"/>
+          </w:rPr>
+          <w:br/>
+          <w:delText>Change "reliable" to "reliably"; remove "fewer"?</w:delText>
+        </w:r>
+        <w:r>
+          <w:rPr>
+            <w:rFonts w:ascii="Times New Roman" w:hAnsi="Times New Roman" w:cs="Times New Roman"/>
+            <w:sz w:val="24"/>
+            <w:szCs w:val="24"/>
+          </w:rPr>
+          <w:br/>
+          <w:delText>Pg. 14, 3rd para. "the exact same (missing word) as in"</w:delText>
+        </w:r>
+      </w:del>
+    </w:p>
+    <w:p>
+      <w:pPr>
+        <w:spacing w:after="0" w:line="240" w:lineRule="auto"/>
+        <w:rPr>
+          <w:del w:id="316" w:author="Cummings, Shawn" w:date="2025-05-08T22:44:00Z" w16du:dateUtc="2025-05-09T02:44:00Z"/>
+          <w:rFonts w:ascii="Times New Roman" w:hAnsi="Times New Roman" w:cs="Times New Roman"/>
+          <w:sz w:val="24"/>
+          <w:szCs w:val="24"/>
+        </w:rPr>
+      </w:pPr>
+    </w:p>
+    <w:p>
+      <w:pPr>
+        <w:spacing w:after="0" w:line="240" w:lineRule="auto"/>
+        <w:rPr>
+          <w:rFonts w:ascii="Times New Roman" w:hAnsi="Times New Roman" w:cs="Times New Roman"/>
+          <w:sz w:val="24"/>
+          <w:szCs w:val="24"/>
+        </w:rPr>
+      </w:pPr>
+      <w:del w:id="317" w:author="Cummings, Shawn" w:date="2025-05-08T22:44:00Z" w16du:dateUtc="2025-05-09T02:44:00Z">
+        <w:r>
+          <w:rPr>
+            <w:rFonts w:ascii="Times New Roman" w:hAnsi="Times New Roman" w:cs="Times New Roman"/>
+            <w:sz w:val="24"/>
+            <w:szCs w:val="24"/>
+          </w:rPr>
+          <w:delText>Pg. 25, 3rd para. "listeners are expected to speech from an unfamiliar talker"--&gt; "listeners are expected to adapt to speech from an unfamiliar talker"?</w:delText>
+        </w:r>
+      </w:del>
     </w:p>
     <w:sectPr>
       <w:headerReference w:type="even" r:id="rId12"/>
@@ -5188,8 +5551,8 @@
 </file>
 
 <file path=word/comments.xml><?xml version="1.0" encoding="utf-8"?>
-<w:comments xmlns:wpc="http://schemas.microsoft.com/office/word/2010/wordprocessingCanvas" xmlns:cx="http://schemas.microsoft.com/office/drawing/2014/chartex" xmlns:cx1="http://schemas.microsoft.com/office/drawing/2015/9/8/chartex" xmlns:cx2="http://schemas.microsoft.com/office/drawing/2015/10/21/chartex" xmlns:cx3="http://schemas.microsoft.com/office/drawing/2016/5/9/chartex" xmlns:cx4="http://schemas.microsoft.com/office/drawing/2016/5/10/chartex" xmlns:cx5="http://schemas.microsoft.com/office/drawing/2016/5/11/chartex" xmlns:cx6="http://schemas.microsoft.com/office/drawing/2016/5/12/chartex" xmlns:cx7="http://schemas.microsoft.com/office/drawing/2016/5/13/chartex" xmlns:cx8="http://schemas.microsoft.com/office/drawing/2016/5/14/chartex" xmlns:mc="http://schemas.openxmlformats.org/markup-compatibility/2006" xmlns:aink="http://schemas.microsoft.com/office/drawing/2016/ink" xmlns:am3d="http://schemas.microsoft.com/office/drawing/2017/model3d" xmlns:o="urn:schemas-microsoft-com:office:office" xmlns:oel="http://schemas.microsoft.com/office/2019/extlst" xmlns:r="http://schemas.openxmlformats.org/officeDocument/2006/relationships" xmlns:m="http://schemas.openxmlformats.org/officeDocument/2006/math" xmlns:v="urn:schemas-microsoft-com:vml" xmlns:wp14="http://schemas.microsoft.com/office/word/2010/wordprocessingDrawing" xmlns:wp="http://schemas.openxmlformats.org/drawingml/2006/wordprocessingDrawing" xmlns:w10="urn:schemas-microsoft-com:office:word" xmlns:w="http://schemas.openxmlformats.org/wordprocessingml/2006/main" xmlns:w14="http://schemas.microsoft.com/office/word/2010/wordml" xmlns:w15="http://schemas.microsoft.com/office/word/2012/wordml" xmlns:w16cex="http://schemas.microsoft.com/office/word/2018/wordml/cex" xmlns:w16cid="http://schemas.microsoft.com/office/word/2016/wordml/cid" xmlns:w16="http://schemas.microsoft.com/office/word/2018/wordml" xmlns:w16du="http://schemas.microsoft.com/office/word/2023/wordml/word16du" xmlns:w16sdtdh="http://schemas.microsoft.com/office/word/2020/wordml/sdtdatahash" xmlns:w16sdtfl="http://schemas.microsoft.com/office/word/2024/wordml/sdtformatlock" xmlns:w16se="http://schemas.microsoft.com/office/word/2015/wordml/symex" xmlns:wpg="http://schemas.microsoft.com/office/word/2010/wordprocessingGroup" xmlns:wpi="http://schemas.microsoft.com/office/word/2010/wordprocessingInk" xmlns:wne="http://schemas.microsoft.com/office/word/2006/wordml" xmlns:wps="http://schemas.microsoft.com/office/word/2010/wordprocessingShape" mc:Ignorable="w14 w15 w16se w16cid w16 w16cex w16sdtdh w16sdtfl w16du wp14">
-  <w:comment w:id="275" w:author="Jaeger, Florian" w:date="2025-05-08T18:41:00Z" w:initials="TJ">
+<w:comments xmlns:wpc="http://schemas.microsoft.com/office/word/2010/wordprocessingCanvas" xmlns:cx="http://schemas.microsoft.com/office/drawing/2014/chartex" xmlns:cx1="http://schemas.microsoft.com/office/drawing/2015/9/8/chartex" xmlns:cx2="http://schemas.microsoft.com/office/drawing/2015/10/21/chartex" xmlns:cx3="http://schemas.microsoft.com/office/drawing/2016/5/9/chartex" xmlns:cx4="http://schemas.microsoft.com/office/drawing/2016/5/10/chartex" xmlns:cx5="http://schemas.microsoft.com/office/drawing/2016/5/11/chartex" xmlns:cx6="http://schemas.microsoft.com/office/drawing/2016/5/12/chartex" xmlns:cx7="http://schemas.microsoft.com/office/drawing/2016/5/13/chartex" xmlns:cx8="http://schemas.microsoft.com/office/drawing/2016/5/14/chartex" xmlns:mc="http://schemas.openxmlformats.org/markup-compatibility/2006" xmlns:aink="http://schemas.microsoft.com/office/drawing/2016/ink" xmlns:am3d="http://schemas.microsoft.com/office/drawing/2017/model3d" xmlns:o="urn:schemas-microsoft-com:office:office" xmlns:oel="http://schemas.microsoft.com/office/2019/extlst" xmlns:r="http://schemas.openxmlformats.org/officeDocument/2006/relationships" xmlns:m="http://schemas.openxmlformats.org/officeDocument/2006/math" xmlns:v="urn:schemas-microsoft-com:vml" xmlns:wp14="http://schemas.microsoft.com/office/word/2010/wordprocessingDrawing" xmlns:wp="http://schemas.openxmlformats.org/drawingml/2006/wordprocessingDrawing" xmlns:w10="urn:schemas-microsoft-com:office:word" xmlns:w="http://schemas.openxmlformats.org/wordprocessingml/2006/main" xmlns:w14="http://schemas.microsoft.com/office/word/2010/wordml" xmlns:w15="http://schemas.microsoft.com/office/word/2012/wordml" xmlns:w16cex="http://schemas.microsoft.com/office/word/2018/wordml/cex" xmlns:w16cid="http://schemas.microsoft.com/office/word/2016/wordml/cid" xmlns:w16="http://schemas.microsoft.com/office/word/2018/wordml" xmlns:w16du="http://schemas.microsoft.com/office/word/2023/wordml/word16du" xmlns:w16sdtdh="http://schemas.microsoft.com/office/word/2020/wordml/sdtdatahash" xmlns:w16se="http://schemas.microsoft.com/office/word/2015/wordml/symex" xmlns:wpg="http://schemas.microsoft.com/office/word/2010/wordprocessingGroup" xmlns:wpi="http://schemas.microsoft.com/office/word/2010/wordprocessingInk" xmlns:wne="http://schemas.microsoft.com/office/word/2006/wordml" xmlns:wps="http://schemas.microsoft.com/office/word/2010/wordprocessingShape" mc:Ignorable="w14 w15 w16se w16cid w16 w16cex w16sdtdh w16du wp14">
+  <w:comment w:id="277" w:author="Jaeger, Florian" w:date="2025-05-08T18:41:00Z" w:initials="TJ">
     <w:p>
       <w:r>
         <w:rPr>
@@ -5207,7 +5570,7 @@
       </w:r>
     </w:p>
   </w:comment>
-  <w:comment w:id="300" w:author="Jaeger, Florian" w:date="2025-05-08T18:51:00Z" w:initials="TJ">
+  <w:comment w:id="302" w:author="Jaeger, Florian" w:date="2025-05-08T18:51:00Z" w:initials="TJ">
     <w:p>
       <w:r>
         <w:rPr>
@@ -5225,7 +5588,7 @@
       </w:r>
     </w:p>
   </w:comment>
-  <w:comment w:id="301" w:author="Cummings, Shawn" w:date="2025-05-03T11:40:00Z" w:initials="SC">
+  <w:comment w:id="303" w:author="Cummings, Shawn" w:date="2025-05-03T11:40:00Z" w:initials="SC">
     <w:p>
       <w:pPr>
         <w:pStyle w:val="CommentText"/>
@@ -5245,7 +5608,7 @@
 </file>
 
 <file path=word/commentsExtended.xml><?xml version="1.0" encoding="utf-8"?>
-<w15:commentsEx xmlns:wpc="http://schemas.microsoft.com/office/word/2010/wordprocessingCanvas" xmlns:cx="http://schemas.microsoft.com/office/drawing/2014/chartex" xmlns:cx1="http://schemas.microsoft.com/office/drawing/2015/9/8/chartex" xmlns:cx2="http://schemas.microsoft.com/office/drawing/2015/10/21/chartex" xmlns:cx3="http://schemas.microsoft.com/office/drawing/2016/5/9/chartex" xmlns:cx4="http://schemas.microsoft.com/office/drawing/2016/5/10/chartex" xmlns:cx5="http://schemas.microsoft.com/office/drawing/2016/5/11/chartex" xmlns:cx6="http://schemas.microsoft.com/office/drawing/2016/5/12/chartex" xmlns:cx7="http://schemas.microsoft.com/office/drawing/2016/5/13/chartex" xmlns:cx8="http://schemas.microsoft.com/office/drawing/2016/5/14/chartex" xmlns:mc="http://schemas.openxmlformats.org/markup-compatibility/2006" xmlns:aink="http://schemas.microsoft.com/office/drawing/2016/ink" xmlns:am3d="http://schemas.microsoft.com/office/drawing/2017/model3d" xmlns:o="urn:schemas-microsoft-com:office:office" xmlns:oel="http://schemas.microsoft.com/office/2019/extlst" xmlns:r="http://schemas.openxmlformats.org/officeDocument/2006/relationships" xmlns:m="http://schemas.openxmlformats.org/officeDocument/2006/math" xmlns:v="urn:schemas-microsoft-com:vml" xmlns:wp14="http://schemas.microsoft.com/office/word/2010/wordprocessingDrawing" xmlns:wp="http://schemas.openxmlformats.org/drawingml/2006/wordprocessingDrawing" xmlns:w10="urn:schemas-microsoft-com:office:word" xmlns:w="http://schemas.openxmlformats.org/wordprocessingml/2006/main" xmlns:w14="http://schemas.microsoft.com/office/word/2010/wordml" xmlns:w15="http://schemas.microsoft.com/office/word/2012/wordml" xmlns:w16cex="http://schemas.microsoft.com/office/word/2018/wordml/cex" xmlns:w16cid="http://schemas.microsoft.com/office/word/2016/wordml/cid" xmlns:w16="http://schemas.microsoft.com/office/word/2018/wordml" xmlns:w16du="http://schemas.microsoft.com/office/word/2023/wordml/word16du" xmlns:w16sdtdh="http://schemas.microsoft.com/office/word/2020/wordml/sdtdatahash" xmlns:w16sdtfl="http://schemas.microsoft.com/office/word/2024/wordml/sdtformatlock" xmlns:w16se="http://schemas.microsoft.com/office/word/2015/wordml/symex" xmlns:wpg="http://schemas.microsoft.com/office/word/2010/wordprocessingGroup" xmlns:wpi="http://schemas.microsoft.com/office/word/2010/wordprocessingInk" xmlns:wne="http://schemas.microsoft.com/office/word/2006/wordml" xmlns:wps="http://schemas.microsoft.com/office/word/2010/wordprocessingShape" mc:Ignorable="w14 w15 w16se w16cid w16 w16cex w16sdtdh w16sdtfl w16du wp14">
+<w15:commentsEx xmlns:wpc="http://schemas.microsoft.com/office/word/2010/wordprocessingCanvas" xmlns:cx="http://schemas.microsoft.com/office/drawing/2014/chartex" xmlns:cx1="http://schemas.microsoft.com/office/drawing/2015/9/8/chartex" xmlns:cx2="http://schemas.microsoft.com/office/drawing/2015/10/21/chartex" xmlns:cx3="http://schemas.microsoft.com/office/drawing/2016/5/9/chartex" xmlns:cx4="http://schemas.microsoft.com/office/drawing/2016/5/10/chartex" xmlns:cx5="http://schemas.microsoft.com/office/drawing/2016/5/11/chartex" xmlns:cx6="http://schemas.microsoft.com/office/drawing/2016/5/12/chartex" xmlns:cx7="http://schemas.microsoft.com/office/drawing/2016/5/13/chartex" xmlns:cx8="http://schemas.microsoft.com/office/drawing/2016/5/14/chartex" xmlns:mc="http://schemas.openxmlformats.org/markup-compatibility/2006" xmlns:aink="http://schemas.microsoft.com/office/drawing/2016/ink" xmlns:am3d="http://schemas.microsoft.com/office/drawing/2017/model3d" xmlns:o="urn:schemas-microsoft-com:office:office" xmlns:oel="http://schemas.microsoft.com/office/2019/extlst" xmlns:r="http://schemas.openxmlformats.org/officeDocument/2006/relationships" xmlns:m="http://schemas.openxmlformats.org/officeDocument/2006/math" xmlns:v="urn:schemas-microsoft-com:vml" xmlns:wp14="http://schemas.microsoft.com/office/word/2010/wordprocessingDrawing" xmlns:wp="http://schemas.openxmlformats.org/drawingml/2006/wordprocessingDrawing" xmlns:w10="urn:schemas-microsoft-com:office:word" xmlns:w="http://schemas.openxmlformats.org/wordprocessingml/2006/main" xmlns:w14="http://schemas.microsoft.com/office/word/2010/wordml" xmlns:w15="http://schemas.microsoft.com/office/word/2012/wordml" xmlns:w16cex="http://schemas.microsoft.com/office/word/2018/wordml/cex" xmlns:w16cid="http://schemas.microsoft.com/office/word/2016/wordml/cid" xmlns:w16="http://schemas.microsoft.com/office/word/2018/wordml" xmlns:w16du="http://schemas.microsoft.com/office/word/2023/wordml/word16du" xmlns:w16sdtdh="http://schemas.microsoft.com/office/word/2020/wordml/sdtdatahash" xmlns:w16se="http://schemas.microsoft.com/office/word/2015/wordml/symex" xmlns:wpg="http://schemas.microsoft.com/office/word/2010/wordprocessingGroup" xmlns:wpi="http://schemas.microsoft.com/office/word/2010/wordprocessingInk" xmlns:wne="http://schemas.microsoft.com/office/word/2006/wordml" xmlns:wps="http://schemas.microsoft.com/office/word/2010/wordprocessingShape" mc:Ignorable="w14 w15 w16se w16cid w16 w16cex w16sdtdh w16du wp14">
   <w15:commentEx w15:paraId="6F322517" w15:done="0"/>
   <w15:commentEx w15:paraId="2A929C5A" w15:done="0"/>
   <w15:commentEx w15:paraId="6D2F08B0" w15:done="0"/>
@@ -5253,7 +5616,7 @@
 </file>
 
 <file path=word/commentsExtensible.xml><?xml version="1.0" encoding="utf-8"?>
-<w16cex:commentsExtensible xmlns:wpc="http://schemas.microsoft.com/office/word/2010/wordprocessingCanvas" xmlns:cx="http://schemas.microsoft.com/office/drawing/2014/chartex" xmlns:cx1="http://schemas.microsoft.com/office/drawing/2015/9/8/chartex" xmlns:cx2="http://schemas.microsoft.com/office/drawing/2015/10/21/chartex" xmlns:cx3="http://schemas.microsoft.com/office/drawing/2016/5/9/chartex" xmlns:cx4="http://schemas.microsoft.com/office/drawing/2016/5/10/chartex" xmlns:cx5="http://schemas.microsoft.com/office/drawing/2016/5/11/chartex" xmlns:cx6="http://schemas.microsoft.com/office/drawing/2016/5/12/chartex" xmlns:cx7="http://schemas.microsoft.com/office/drawing/2016/5/13/chartex" xmlns:cx8="http://schemas.microsoft.com/office/drawing/2016/5/14/chartex" xmlns:cr="http://schemas.microsoft.com/office/comments/2020/reactions" xmlns:mc="http://schemas.openxmlformats.org/markup-compatibility/2006" xmlns:aink="http://schemas.microsoft.com/office/drawing/2016/ink" xmlns:am3d="http://schemas.microsoft.com/office/drawing/2017/model3d" xmlns:o="urn:schemas-microsoft-com:office:office" xmlns:oel="http://schemas.microsoft.com/office/2019/extlst" xmlns:r="http://schemas.openxmlformats.org/officeDocument/2006/relationships" xmlns:m="http://schemas.openxmlformats.org/officeDocument/2006/math" xmlns:v="urn:schemas-microsoft-com:vml" xmlns:wp14="http://schemas.microsoft.com/office/word/2010/wordprocessingDrawing" xmlns:wp="http://schemas.openxmlformats.org/drawingml/2006/wordprocessingDrawing" xmlns:w10="urn:schemas-microsoft-com:office:word" xmlns:w="http://schemas.openxmlformats.org/wordprocessingml/2006/main" xmlns:w14="http://schemas.microsoft.com/office/word/2010/wordml" xmlns:w15="http://schemas.microsoft.com/office/word/2012/wordml" xmlns:w16cex="http://schemas.microsoft.com/office/word/2018/wordml/cex" xmlns:w16cid="http://schemas.microsoft.com/office/word/2016/wordml/cid" xmlns:w16="http://schemas.microsoft.com/office/word/2018/wordml" xmlns:w16du="http://schemas.microsoft.com/office/word/2023/wordml/word16du" xmlns:w16sdtdh="http://schemas.microsoft.com/office/word/2020/wordml/sdtdatahash" xmlns:w16sdtfl="http://schemas.microsoft.com/office/word/2024/wordml/sdtformatlock" xmlns:w16se="http://schemas.microsoft.com/office/word/2015/wordml/symex" xmlns:wpg="http://schemas.microsoft.com/office/word/2010/wordprocessingGroup" xmlns:wpi="http://schemas.microsoft.com/office/word/2010/wordprocessingInk" xmlns:wne="http://schemas.microsoft.com/office/word/2006/wordml" xmlns:wps="http://schemas.microsoft.com/office/word/2010/wordprocessingShape" mc:Ignorable="w14 w15 w16se w16cid w16 w16cex w16sdtdh w16sdtfl cr w16du wp14">
+<w16cex:commentsExtensible xmlns:wpc="http://schemas.microsoft.com/office/word/2010/wordprocessingCanvas" xmlns:cx="http://schemas.microsoft.com/office/drawing/2014/chartex" xmlns:cx1="http://schemas.microsoft.com/office/drawing/2015/9/8/chartex" xmlns:cx2="http://schemas.microsoft.com/office/drawing/2015/10/21/chartex" xmlns:cx3="http://schemas.microsoft.com/office/drawing/2016/5/9/chartex" xmlns:cx4="http://schemas.microsoft.com/office/drawing/2016/5/10/chartex" xmlns:cx5="http://schemas.microsoft.com/office/drawing/2016/5/11/chartex" xmlns:cx6="http://schemas.microsoft.com/office/drawing/2016/5/12/chartex" xmlns:cx7="http://schemas.microsoft.com/office/drawing/2016/5/13/chartex" xmlns:cx8="http://schemas.microsoft.com/office/drawing/2016/5/14/chartex" xmlns:cr="http://schemas.microsoft.com/office/comments/2020/reactions" xmlns:mc="http://schemas.openxmlformats.org/markup-compatibility/2006" xmlns:aink="http://schemas.microsoft.com/office/drawing/2016/ink" xmlns:am3d="http://schemas.microsoft.com/office/drawing/2017/model3d" xmlns:o="urn:schemas-microsoft-com:office:office" xmlns:oel="http://schemas.microsoft.com/office/2019/extlst" xmlns:r="http://schemas.openxmlformats.org/officeDocument/2006/relationships" xmlns:m="http://schemas.openxmlformats.org/officeDocument/2006/math" xmlns:v="urn:schemas-microsoft-com:vml" xmlns:wp14="http://schemas.microsoft.com/office/word/2010/wordprocessingDrawing" xmlns:wp="http://schemas.openxmlformats.org/drawingml/2006/wordprocessingDrawing" xmlns:w10="urn:schemas-microsoft-com:office:word" xmlns:w="http://schemas.openxmlformats.org/wordprocessingml/2006/main" xmlns:w14="http://schemas.microsoft.com/office/word/2010/wordml" xmlns:w15="http://schemas.microsoft.com/office/word/2012/wordml" xmlns:w16cex="http://schemas.microsoft.com/office/word/2018/wordml/cex" xmlns:w16cid="http://schemas.microsoft.com/office/word/2016/wordml/cid" xmlns:w16="http://schemas.microsoft.com/office/word/2018/wordml" xmlns:w16du="http://schemas.microsoft.com/office/word/2023/wordml/word16du" xmlns:w16sdtdh="http://schemas.microsoft.com/office/word/2020/wordml/sdtdatahash" xmlns:w16se="http://schemas.microsoft.com/office/word/2015/wordml/symex" xmlns:wpg="http://schemas.microsoft.com/office/word/2010/wordprocessingGroup" xmlns:wpi="http://schemas.microsoft.com/office/word/2010/wordprocessingInk" xmlns:wne="http://schemas.microsoft.com/office/word/2006/wordml" xmlns:wps="http://schemas.microsoft.com/office/word/2010/wordprocessingShape" mc:Ignorable="w14 w15 w16se w16cid w16 w16cex w16sdtdh cr w16du wp14">
   <w16cex:commentExtensible w16cex:durableId="5FDB0EAD" w16cex:dateUtc="2025-05-08T22:41:00Z"/>
   <w16cex:commentExtensible w16cex:durableId="019ED708" w16cex:dateUtc="2025-05-08T22:51:00Z"/>
   <w16cex:commentExtensible w16cex:durableId="45BDE0BE" w16cex:dateUtc="2025-05-03T15:40:00Z"/>
@@ -5261,7 +5624,7 @@
 </file>
 
 <file path=word/commentsIds.xml><?xml version="1.0" encoding="utf-8"?>
-<w16cid:commentsIds xmlns:wpc="http://schemas.microsoft.com/office/word/2010/wordprocessingCanvas" xmlns:cx="http://schemas.microsoft.com/office/drawing/2014/chartex" xmlns:cx1="http://schemas.microsoft.com/office/drawing/2015/9/8/chartex" xmlns:cx2="http://schemas.microsoft.com/office/drawing/2015/10/21/chartex" xmlns:cx3="http://schemas.microsoft.com/office/drawing/2016/5/9/chartex" xmlns:cx4="http://schemas.microsoft.com/office/drawing/2016/5/10/chartex" xmlns:cx5="http://schemas.microsoft.com/office/drawing/2016/5/11/chartex" xmlns:cx6="http://schemas.microsoft.com/office/drawing/2016/5/12/chartex" xmlns:cx7="http://schemas.microsoft.com/office/drawing/2016/5/13/chartex" xmlns:cx8="http://schemas.microsoft.com/office/drawing/2016/5/14/chartex" xmlns:mc="http://schemas.openxmlformats.org/markup-compatibility/2006" xmlns:aink="http://schemas.microsoft.com/office/drawing/2016/ink" xmlns:am3d="http://schemas.microsoft.com/office/drawing/2017/model3d" xmlns:o="urn:schemas-microsoft-com:office:office" xmlns:oel="http://schemas.microsoft.com/office/2019/extlst" xmlns:r="http://schemas.openxmlformats.org/officeDocument/2006/relationships" xmlns:m="http://schemas.openxmlformats.org/officeDocument/2006/math" xmlns:v="urn:schemas-microsoft-com:vml" xmlns:wp14="http://schemas.microsoft.com/office/word/2010/wordprocessingDrawing" xmlns:wp="http://schemas.openxmlformats.org/drawingml/2006/wordprocessingDrawing" xmlns:w10="urn:schemas-microsoft-com:office:word" xmlns:w="http://schemas.openxmlformats.org/wordprocessingml/2006/main" xmlns:w14="http://schemas.microsoft.com/office/word/2010/wordml" xmlns:w15="http://schemas.microsoft.com/office/word/2012/wordml" xmlns:w16cex="http://schemas.microsoft.com/office/word/2018/wordml/cex" xmlns:w16cid="http://schemas.microsoft.com/office/word/2016/wordml/cid" xmlns:w16="http://schemas.microsoft.com/office/word/2018/wordml" xmlns:w16du="http://schemas.microsoft.com/office/word/2023/wordml/word16du" xmlns:w16sdtdh="http://schemas.microsoft.com/office/word/2020/wordml/sdtdatahash" xmlns:w16sdtfl="http://schemas.microsoft.com/office/word/2024/wordml/sdtformatlock" xmlns:w16se="http://schemas.microsoft.com/office/word/2015/wordml/symex" xmlns:wpg="http://schemas.microsoft.com/office/word/2010/wordprocessingGroup" xmlns:wpi="http://schemas.microsoft.com/office/word/2010/wordprocessingInk" xmlns:wne="http://schemas.microsoft.com/office/word/2006/wordml" xmlns:wps="http://schemas.microsoft.com/office/word/2010/wordprocessingShape" mc:Ignorable="w14 w15 w16se w16cid w16 w16cex w16sdtdh w16sdtfl w16du wp14">
+<w16cid:commentsIds xmlns:wpc="http://schemas.microsoft.com/office/word/2010/wordprocessingCanvas" xmlns:cx="http://schemas.microsoft.com/office/drawing/2014/chartex" xmlns:cx1="http://schemas.microsoft.com/office/drawing/2015/9/8/chartex" xmlns:cx2="http://schemas.microsoft.com/office/drawing/2015/10/21/chartex" xmlns:cx3="http://schemas.microsoft.com/office/drawing/2016/5/9/chartex" xmlns:cx4="http://schemas.microsoft.com/office/drawing/2016/5/10/chartex" xmlns:cx5="http://schemas.microsoft.com/office/drawing/2016/5/11/chartex" xmlns:cx6="http://schemas.microsoft.com/office/drawing/2016/5/12/chartex" xmlns:cx7="http://schemas.microsoft.com/office/drawing/2016/5/13/chartex" xmlns:cx8="http://schemas.microsoft.com/office/drawing/2016/5/14/chartex" xmlns:mc="http://schemas.openxmlformats.org/markup-compatibility/2006" xmlns:aink="http://schemas.microsoft.com/office/drawing/2016/ink" xmlns:am3d="http://schemas.microsoft.com/office/drawing/2017/model3d" xmlns:o="urn:schemas-microsoft-com:office:office" xmlns:oel="http://schemas.microsoft.com/office/2019/extlst" xmlns:r="http://schemas.openxmlformats.org/officeDocument/2006/relationships" xmlns:m="http://schemas.openxmlformats.org/officeDocument/2006/math" xmlns:v="urn:schemas-microsoft-com:vml" xmlns:wp14="http://schemas.microsoft.com/office/word/2010/wordprocessingDrawing" xmlns:wp="http://schemas.openxmlformats.org/drawingml/2006/wordprocessingDrawing" xmlns:w10="urn:schemas-microsoft-com:office:word" xmlns:w="http://schemas.openxmlformats.org/wordprocessingml/2006/main" xmlns:w14="http://schemas.microsoft.com/office/word/2010/wordml" xmlns:w15="http://schemas.microsoft.com/office/word/2012/wordml" xmlns:w16cex="http://schemas.microsoft.com/office/word/2018/wordml/cex" xmlns:w16cid="http://schemas.microsoft.com/office/word/2016/wordml/cid" xmlns:w16="http://schemas.microsoft.com/office/word/2018/wordml" xmlns:w16du="http://schemas.microsoft.com/office/word/2023/wordml/word16du" xmlns:w16sdtdh="http://schemas.microsoft.com/office/word/2020/wordml/sdtdatahash" xmlns:w16se="http://schemas.microsoft.com/office/word/2015/wordml/symex" xmlns:wpg="http://schemas.microsoft.com/office/word/2010/wordprocessingGroup" xmlns:wpi="http://schemas.microsoft.com/office/word/2010/wordprocessingInk" xmlns:wne="http://schemas.microsoft.com/office/word/2006/wordml" xmlns:wps="http://schemas.microsoft.com/office/word/2010/wordprocessingShape" mc:Ignorable="w14 w15 w16se w16cid w16 w16cex w16sdtdh w16du wp14">
   <w16cid:commentId w16cid:paraId="6F322517" w16cid:durableId="5FDB0EAD"/>
   <w16cid:commentId w16cid:paraId="2A929C5A" w16cid:durableId="019ED708"/>
   <w16cid:commentId w16cid:paraId="6D2F08B0" w16cid:durableId="45BDE0BE"/>
@@ -5269,7 +5632,7 @@
 </file>
 
 <file path=word/endnotes.xml><?xml version="1.0" encoding="utf-8"?>
-<w:endnotes xmlns:wpc="http://schemas.microsoft.com/office/word/2010/wordprocessingCanvas" xmlns:cx="http://schemas.microsoft.com/office/drawing/2014/chartex" xmlns:cx1="http://schemas.microsoft.com/office/drawing/2015/9/8/chartex" xmlns:cx2="http://schemas.microsoft.com/office/drawing/2015/10/21/chartex" xmlns:cx3="http://schemas.microsoft.com/office/drawing/2016/5/9/chartex" xmlns:cx4="http://schemas.microsoft.com/office/drawing/2016/5/10/chartex" xmlns:cx5="http://schemas.microsoft.com/office/drawing/2016/5/11/chartex" xmlns:cx6="http://schemas.microsoft.com/office/drawing/2016/5/12/chartex" xmlns:cx7="http://schemas.microsoft.com/office/drawing/2016/5/13/chartex" xmlns:cx8="http://schemas.microsoft.com/office/drawing/2016/5/14/chartex" xmlns:mc="http://schemas.openxmlformats.org/markup-compatibility/2006" xmlns:aink="http://schemas.microsoft.com/office/drawing/2016/ink" xmlns:am3d="http://schemas.microsoft.com/office/drawing/2017/model3d" xmlns:o="urn:schemas-microsoft-com:office:office" xmlns:oel="http://schemas.microsoft.com/office/2019/extlst" xmlns:r="http://schemas.openxmlformats.org/officeDocument/2006/relationships" xmlns:m="http://schemas.openxmlformats.org/officeDocument/2006/math" xmlns:v="urn:schemas-microsoft-com:vml" xmlns:wp14="http://schemas.microsoft.com/office/word/2010/wordprocessingDrawing" xmlns:wp="http://schemas.openxmlformats.org/drawingml/2006/wordprocessingDrawing" xmlns:w10="urn:schemas-microsoft-com:office:word" xmlns:w="http://schemas.openxmlformats.org/wordprocessingml/2006/main" xmlns:w14="http://schemas.microsoft.com/office/word/2010/wordml" xmlns:w15="http://schemas.microsoft.com/office/word/2012/wordml" xmlns:w16cex="http://schemas.microsoft.com/office/word/2018/wordml/cex" xmlns:w16cid="http://schemas.microsoft.com/office/word/2016/wordml/cid" xmlns:w16="http://schemas.microsoft.com/office/word/2018/wordml" xmlns:w16du="http://schemas.microsoft.com/office/word/2023/wordml/word16du" xmlns:w16sdtdh="http://schemas.microsoft.com/office/word/2020/wordml/sdtdatahash" xmlns:w16sdtfl="http://schemas.microsoft.com/office/word/2024/wordml/sdtformatlock" xmlns:w16se="http://schemas.microsoft.com/office/word/2015/wordml/symex" xmlns:wpg="http://schemas.microsoft.com/office/word/2010/wordprocessingGroup" xmlns:wpi="http://schemas.microsoft.com/office/word/2010/wordprocessingInk" xmlns:wne="http://schemas.microsoft.com/office/word/2006/wordml" xmlns:wps="http://schemas.microsoft.com/office/word/2010/wordprocessingShape" mc:Ignorable="w14 w15 w16se w16cid w16 w16cex w16sdtdh w16sdtfl w16du wp14">
+<w:endnotes xmlns:wpc="http://schemas.microsoft.com/office/word/2010/wordprocessingCanvas" xmlns:cx="http://schemas.microsoft.com/office/drawing/2014/chartex" xmlns:cx1="http://schemas.microsoft.com/office/drawing/2015/9/8/chartex" xmlns:cx2="http://schemas.microsoft.com/office/drawing/2015/10/21/chartex" xmlns:cx3="http://schemas.microsoft.com/office/drawing/2016/5/9/chartex" xmlns:cx4="http://schemas.microsoft.com/office/drawing/2016/5/10/chartex" xmlns:cx5="http://schemas.microsoft.com/office/drawing/2016/5/11/chartex" xmlns:cx6="http://schemas.microsoft.com/office/drawing/2016/5/12/chartex" xmlns:cx7="http://schemas.microsoft.com/office/drawing/2016/5/13/chartex" xmlns:cx8="http://schemas.microsoft.com/office/drawing/2016/5/14/chartex" xmlns:mc="http://schemas.openxmlformats.org/markup-compatibility/2006" xmlns:aink="http://schemas.microsoft.com/office/drawing/2016/ink" xmlns:am3d="http://schemas.microsoft.com/office/drawing/2017/model3d" xmlns:o="urn:schemas-microsoft-com:office:office" xmlns:oel="http://schemas.microsoft.com/office/2019/extlst" xmlns:r="http://schemas.openxmlformats.org/officeDocument/2006/relationships" xmlns:m="http://schemas.openxmlformats.org/officeDocument/2006/math" xmlns:v="urn:schemas-microsoft-com:vml" xmlns:wp14="http://schemas.microsoft.com/office/word/2010/wordprocessingDrawing" xmlns:wp="http://schemas.openxmlformats.org/drawingml/2006/wordprocessingDrawing" xmlns:w10="urn:schemas-microsoft-com:office:word" xmlns:w="http://schemas.openxmlformats.org/wordprocessingml/2006/main" xmlns:w14="http://schemas.microsoft.com/office/word/2010/wordml" xmlns:w15="http://schemas.microsoft.com/office/word/2012/wordml" xmlns:w16cex="http://schemas.microsoft.com/office/word/2018/wordml/cex" xmlns:w16cid="http://schemas.microsoft.com/office/word/2016/wordml/cid" xmlns:w16="http://schemas.microsoft.com/office/word/2018/wordml" xmlns:w16du="http://schemas.microsoft.com/office/word/2023/wordml/word16du" xmlns:w16sdtdh="http://schemas.microsoft.com/office/word/2020/wordml/sdtdatahash" xmlns:w16se="http://schemas.microsoft.com/office/word/2015/wordml/symex" xmlns:wpg="http://schemas.microsoft.com/office/word/2010/wordprocessingGroup" xmlns:wpi="http://schemas.microsoft.com/office/word/2010/wordprocessingInk" xmlns:wne="http://schemas.microsoft.com/office/word/2006/wordml" xmlns:wps="http://schemas.microsoft.com/office/word/2010/wordprocessingShape" mc:Ignorable="w14 w15 w16se w16cid w16 w16cex w16sdtdh w16du wp14">
   <w:endnote w:type="separator" w:id="-1">
     <w:p>
       <w:pPr>
@@ -5294,7 +5657,7 @@
 </file>
 
 <file path=word/footer1.xml><?xml version="1.0" encoding="utf-8"?>
-<w:ftr xmlns:wpc="http://schemas.microsoft.com/office/word/2010/wordprocessingCanvas" xmlns:cx="http://schemas.microsoft.com/office/drawing/2014/chartex" xmlns:cx1="http://schemas.microsoft.com/office/drawing/2015/9/8/chartex" xmlns:cx2="http://schemas.microsoft.com/office/drawing/2015/10/21/chartex" xmlns:cx3="http://schemas.microsoft.com/office/drawing/2016/5/9/chartex" xmlns:cx4="http://schemas.microsoft.com/office/drawing/2016/5/10/chartex" xmlns:cx5="http://schemas.microsoft.com/office/drawing/2016/5/11/chartex" xmlns:cx6="http://schemas.microsoft.com/office/drawing/2016/5/12/chartex" xmlns:cx7="http://schemas.microsoft.com/office/drawing/2016/5/13/chartex" xmlns:cx8="http://schemas.microsoft.com/office/drawing/2016/5/14/chartex" xmlns:mc="http://schemas.openxmlformats.org/markup-compatibility/2006" xmlns:aink="http://schemas.microsoft.com/office/drawing/2016/ink" xmlns:am3d="http://schemas.microsoft.com/office/drawing/2017/model3d" xmlns:o="urn:schemas-microsoft-com:office:office" xmlns:oel="http://schemas.microsoft.com/office/2019/extlst" xmlns:r="http://schemas.openxmlformats.org/officeDocument/2006/relationships" xmlns:m="http://schemas.openxmlformats.org/officeDocument/2006/math" xmlns:v="urn:schemas-microsoft-com:vml" xmlns:wp14="http://schemas.microsoft.com/office/word/2010/wordprocessingDrawing" xmlns:wp="http://schemas.openxmlformats.org/drawingml/2006/wordprocessingDrawing" xmlns:w10="urn:schemas-microsoft-com:office:word" xmlns:w="http://schemas.openxmlformats.org/wordprocessingml/2006/main" xmlns:w14="http://schemas.microsoft.com/office/word/2010/wordml" xmlns:w15="http://schemas.microsoft.com/office/word/2012/wordml" xmlns:w16cex="http://schemas.microsoft.com/office/word/2018/wordml/cex" xmlns:w16cid="http://schemas.microsoft.com/office/word/2016/wordml/cid" xmlns:w16="http://schemas.microsoft.com/office/word/2018/wordml" xmlns:w16du="http://schemas.microsoft.com/office/word/2023/wordml/word16du" xmlns:w16sdtdh="http://schemas.microsoft.com/office/word/2020/wordml/sdtdatahash" xmlns:w16sdtfl="http://schemas.microsoft.com/office/word/2024/wordml/sdtformatlock" xmlns:w16se="http://schemas.microsoft.com/office/word/2015/wordml/symex" xmlns:wpg="http://schemas.microsoft.com/office/word/2010/wordprocessingGroup" xmlns:wpi="http://schemas.microsoft.com/office/word/2010/wordprocessingInk" xmlns:wne="http://schemas.microsoft.com/office/word/2006/wordml" xmlns:wps="http://schemas.microsoft.com/office/word/2010/wordprocessingShape" mc:Ignorable="w14 w15 w16se w16cid w16 w16cex w16sdtdh w16sdtfl w16du wp14">
+<w:ftr xmlns:wpc="http://schemas.microsoft.com/office/word/2010/wordprocessingCanvas" xmlns:cx="http://schemas.microsoft.com/office/drawing/2014/chartex" xmlns:cx1="http://schemas.microsoft.com/office/drawing/2015/9/8/chartex" xmlns:cx2="http://schemas.microsoft.com/office/drawing/2015/10/21/chartex" xmlns:cx3="http://schemas.microsoft.com/office/drawing/2016/5/9/chartex" xmlns:cx4="http://schemas.microsoft.com/office/drawing/2016/5/10/chartex" xmlns:cx5="http://schemas.microsoft.com/office/drawing/2016/5/11/chartex" xmlns:cx6="http://schemas.microsoft.com/office/drawing/2016/5/12/chartex" xmlns:cx7="http://schemas.microsoft.com/office/drawing/2016/5/13/chartex" xmlns:cx8="http://schemas.microsoft.com/office/drawing/2016/5/14/chartex" xmlns:mc="http://schemas.openxmlformats.org/markup-compatibility/2006" xmlns:aink="http://schemas.microsoft.com/office/drawing/2016/ink" xmlns:am3d="http://schemas.microsoft.com/office/drawing/2017/model3d" xmlns:o="urn:schemas-microsoft-com:office:office" xmlns:oel="http://schemas.microsoft.com/office/2019/extlst" xmlns:r="http://schemas.openxmlformats.org/officeDocument/2006/relationships" xmlns:m="http://schemas.openxmlformats.org/officeDocument/2006/math" xmlns:v="urn:schemas-microsoft-com:vml" xmlns:wp14="http://schemas.microsoft.com/office/word/2010/wordprocessingDrawing" xmlns:wp="http://schemas.openxmlformats.org/drawingml/2006/wordprocessingDrawing" xmlns:w10="urn:schemas-microsoft-com:office:word" xmlns:w="http://schemas.openxmlformats.org/wordprocessingml/2006/main" xmlns:w14="http://schemas.microsoft.com/office/word/2010/wordml" xmlns:w15="http://schemas.microsoft.com/office/word/2012/wordml" xmlns:w16cex="http://schemas.microsoft.com/office/word/2018/wordml/cex" xmlns:w16cid="http://schemas.microsoft.com/office/word/2016/wordml/cid" xmlns:w16="http://schemas.microsoft.com/office/word/2018/wordml" xmlns:w16du="http://schemas.microsoft.com/office/word/2023/wordml/word16du" xmlns:w16sdtdh="http://schemas.microsoft.com/office/word/2020/wordml/sdtdatahash" xmlns:w16se="http://schemas.microsoft.com/office/word/2015/wordml/symex" xmlns:wpg="http://schemas.microsoft.com/office/word/2010/wordprocessingGroup" xmlns:wpi="http://schemas.microsoft.com/office/word/2010/wordprocessingInk" xmlns:wne="http://schemas.microsoft.com/office/word/2006/wordml" xmlns:wps="http://schemas.microsoft.com/office/word/2010/wordprocessingShape" mc:Ignorable="w14 w15 w16se w16cid w16 w16cex w16sdtdh w16du wp14">
   <w:p>
     <w:pPr>
       <w:pStyle w:val="Footer"/>
@@ -5304,12 +5667,12 @@
 </file>
 
 <file path=word/footer2.xml><?xml version="1.0" encoding="utf-8"?>
-<w:ftr xmlns:wpc="http://schemas.microsoft.com/office/word/2010/wordprocessingCanvas" xmlns:cx="http://schemas.microsoft.com/office/drawing/2014/chartex" xmlns:cx1="http://schemas.microsoft.com/office/drawing/2015/9/8/chartex" xmlns:cx2="http://schemas.microsoft.com/office/drawing/2015/10/21/chartex" xmlns:cx3="http://schemas.microsoft.com/office/drawing/2016/5/9/chartex" xmlns:cx4="http://schemas.microsoft.com/office/drawing/2016/5/10/chartex" xmlns:cx5="http://schemas.microsoft.com/office/drawing/2016/5/11/chartex" xmlns:cx6="http://schemas.microsoft.com/office/drawing/2016/5/12/chartex" xmlns:cx7="http://schemas.microsoft.com/office/drawing/2016/5/13/chartex" xmlns:cx8="http://schemas.microsoft.com/office/drawing/2016/5/14/chartex" xmlns:mc="http://schemas.openxmlformats.org/markup-compatibility/2006" xmlns:aink="http://schemas.microsoft.com/office/drawing/2016/ink" xmlns:am3d="http://schemas.microsoft.com/office/drawing/2017/model3d" xmlns:o="urn:schemas-microsoft-com:office:office" xmlns:oel="http://schemas.microsoft.com/office/2019/extlst" xmlns:r="http://schemas.openxmlformats.org/officeDocument/2006/relationships" xmlns:m="http://schemas.openxmlformats.org/officeDocument/2006/math" xmlns:v="urn:schemas-microsoft-com:vml" xmlns:wp14="http://schemas.microsoft.com/office/word/2010/wordprocessingDrawing" xmlns:wp="http://schemas.openxmlformats.org/drawingml/2006/wordprocessingDrawing" xmlns:w10="urn:schemas-microsoft-com:office:word" xmlns:w="http://schemas.openxmlformats.org/wordprocessingml/2006/main" xmlns:w14="http://schemas.microsoft.com/office/word/2010/wordml" xmlns:w15="http://schemas.microsoft.com/office/word/2012/wordml" xmlns:w16cex="http://schemas.microsoft.com/office/word/2018/wordml/cex" xmlns:w16cid="http://schemas.microsoft.com/office/word/2016/wordml/cid" xmlns:w16="http://schemas.microsoft.com/office/word/2018/wordml" xmlns:w16du="http://schemas.microsoft.com/office/word/2023/wordml/word16du" xmlns:w16sdtdh="http://schemas.microsoft.com/office/word/2020/wordml/sdtdatahash" xmlns:w16sdtfl="http://schemas.microsoft.com/office/word/2024/wordml/sdtformatlock" xmlns:w16se="http://schemas.microsoft.com/office/word/2015/wordml/symex" xmlns:wpg="http://schemas.microsoft.com/office/word/2010/wordprocessingGroup" xmlns:wpi="http://schemas.microsoft.com/office/word/2010/wordprocessingInk" xmlns:wne="http://schemas.microsoft.com/office/word/2006/wordml" xmlns:wps="http://schemas.microsoft.com/office/word/2010/wordprocessingShape" mc:Ignorable="w14 w15 w16se w16cid w16 w16cex w16sdtdh w16sdtfl w16du wp14">
+<w:ftr xmlns:wpc="http://schemas.microsoft.com/office/word/2010/wordprocessingCanvas" xmlns:cx="http://schemas.microsoft.com/office/drawing/2014/chartex" xmlns:cx1="http://schemas.microsoft.com/office/drawing/2015/9/8/chartex" xmlns:cx2="http://schemas.microsoft.com/office/drawing/2015/10/21/chartex" xmlns:cx3="http://schemas.microsoft.com/office/drawing/2016/5/9/chartex" xmlns:cx4="http://schemas.microsoft.com/office/drawing/2016/5/10/chartex" xmlns:cx5="http://schemas.microsoft.com/office/drawing/2016/5/11/chartex" xmlns:cx6="http://schemas.microsoft.com/office/drawing/2016/5/12/chartex" xmlns:cx7="http://schemas.microsoft.com/office/drawing/2016/5/13/chartex" xmlns:cx8="http://schemas.microsoft.com/office/drawing/2016/5/14/chartex" xmlns:mc="http://schemas.openxmlformats.org/markup-compatibility/2006" xmlns:aink="http://schemas.microsoft.com/office/drawing/2016/ink" xmlns:am3d="http://schemas.microsoft.com/office/drawing/2017/model3d" xmlns:o="urn:schemas-microsoft-com:office:office" xmlns:oel="http://schemas.microsoft.com/office/2019/extlst" xmlns:r="http://schemas.openxmlformats.org/officeDocument/2006/relationships" xmlns:m="http://schemas.openxmlformats.org/officeDocument/2006/math" xmlns:v="urn:schemas-microsoft-com:vml" xmlns:wp14="http://schemas.microsoft.com/office/word/2010/wordprocessingDrawing" xmlns:wp="http://schemas.openxmlformats.org/drawingml/2006/wordprocessingDrawing" xmlns:w10="urn:schemas-microsoft-com:office:word" xmlns:w="http://schemas.openxmlformats.org/wordprocessingml/2006/main" xmlns:w14="http://schemas.microsoft.com/office/word/2010/wordml" xmlns:w15="http://schemas.microsoft.com/office/word/2012/wordml" xmlns:w16cex="http://schemas.microsoft.com/office/word/2018/wordml/cex" xmlns:w16cid="http://schemas.microsoft.com/office/word/2016/wordml/cid" xmlns:w16="http://schemas.microsoft.com/office/word/2018/wordml" xmlns:w16du="http://schemas.microsoft.com/office/word/2023/wordml/word16du" xmlns:w16sdtdh="http://schemas.microsoft.com/office/word/2020/wordml/sdtdatahash" xmlns:w16se="http://schemas.microsoft.com/office/word/2015/wordml/symex" xmlns:wpg="http://schemas.microsoft.com/office/word/2010/wordprocessingGroup" xmlns:wpi="http://schemas.microsoft.com/office/word/2010/wordprocessingInk" xmlns:wne="http://schemas.microsoft.com/office/word/2006/wordml" xmlns:wps="http://schemas.microsoft.com/office/word/2010/wordprocessingShape" mc:Ignorable="w14 w15 w16se w16cid w16 w16cex w16sdtdh w16du wp14">
   <w:p>
     <w:pPr>
       <w:pStyle w:val="Footer"/>
     </w:pPr>
-    <w:bookmarkStart w:id="302" w:name="TITUS1FooterPrimary"/>
+    <w:bookmarkStart w:id="318" w:name="TITUS1FooterPrimary"/>
     <w:r>
       <w:rPr>
         <w:color w:val="000000"/>
@@ -5317,13 +5680,13 @@
       </w:rPr>
       <w:t>  </w:t>
     </w:r>
-    <w:bookmarkEnd w:id="302"/>
+    <w:bookmarkEnd w:id="318"/>
   </w:p>
 </w:ftr>
 </file>
 
 <file path=word/footer3.xml><?xml version="1.0" encoding="utf-8"?>
-<w:ftr xmlns:wpc="http://schemas.microsoft.com/office/word/2010/wordprocessingCanvas" xmlns:cx="http://schemas.microsoft.com/office/drawing/2014/chartex" xmlns:cx1="http://schemas.microsoft.com/office/drawing/2015/9/8/chartex" xmlns:cx2="http://schemas.microsoft.com/office/drawing/2015/10/21/chartex" xmlns:cx3="http://schemas.microsoft.com/office/drawing/2016/5/9/chartex" xmlns:cx4="http://schemas.microsoft.com/office/drawing/2016/5/10/chartex" xmlns:cx5="http://schemas.microsoft.com/office/drawing/2016/5/11/chartex" xmlns:cx6="http://schemas.microsoft.com/office/drawing/2016/5/12/chartex" xmlns:cx7="http://schemas.microsoft.com/office/drawing/2016/5/13/chartex" xmlns:cx8="http://schemas.microsoft.com/office/drawing/2016/5/14/chartex" xmlns:mc="http://schemas.openxmlformats.org/markup-compatibility/2006" xmlns:aink="http://schemas.microsoft.com/office/drawing/2016/ink" xmlns:am3d="http://schemas.microsoft.com/office/drawing/2017/model3d" xmlns:o="urn:schemas-microsoft-com:office:office" xmlns:oel="http://schemas.microsoft.com/office/2019/extlst" xmlns:r="http://schemas.openxmlformats.org/officeDocument/2006/relationships" xmlns:m="http://schemas.openxmlformats.org/officeDocument/2006/math" xmlns:v="urn:schemas-microsoft-com:vml" xmlns:wp14="http://schemas.microsoft.com/office/word/2010/wordprocessingDrawing" xmlns:wp="http://schemas.openxmlformats.org/drawingml/2006/wordprocessingDrawing" xmlns:w10="urn:schemas-microsoft-com:office:word" xmlns:w="http://schemas.openxmlformats.org/wordprocessingml/2006/main" xmlns:w14="http://schemas.microsoft.com/office/word/2010/wordml" xmlns:w15="http://schemas.microsoft.com/office/word/2012/wordml" xmlns:w16cex="http://schemas.microsoft.com/office/word/2018/wordml/cex" xmlns:w16cid="http://schemas.microsoft.com/office/word/2016/wordml/cid" xmlns:w16="http://schemas.microsoft.com/office/word/2018/wordml" xmlns:w16du="http://schemas.microsoft.com/office/word/2023/wordml/word16du" xmlns:w16sdtdh="http://schemas.microsoft.com/office/word/2020/wordml/sdtdatahash" xmlns:w16sdtfl="http://schemas.microsoft.com/office/word/2024/wordml/sdtformatlock" xmlns:w16se="http://schemas.microsoft.com/office/word/2015/wordml/symex" xmlns:wpg="http://schemas.microsoft.com/office/word/2010/wordprocessingGroup" xmlns:wpi="http://schemas.microsoft.com/office/word/2010/wordprocessingInk" xmlns:wne="http://schemas.microsoft.com/office/word/2006/wordml" xmlns:wps="http://schemas.microsoft.com/office/word/2010/wordprocessingShape" mc:Ignorable="w14 w15 w16se w16cid w16 w16cex w16sdtdh w16sdtfl w16du wp14">
+<w:ftr xmlns:wpc="http://schemas.microsoft.com/office/word/2010/wordprocessingCanvas" xmlns:cx="http://schemas.microsoft.com/office/drawing/2014/chartex" xmlns:cx1="http://schemas.microsoft.com/office/drawing/2015/9/8/chartex" xmlns:cx2="http://schemas.microsoft.com/office/drawing/2015/10/21/chartex" xmlns:cx3="http://schemas.microsoft.com/office/drawing/2016/5/9/chartex" xmlns:cx4="http://schemas.microsoft.com/office/drawing/2016/5/10/chartex" xmlns:cx5="http://schemas.microsoft.com/office/drawing/2016/5/11/chartex" xmlns:cx6="http://schemas.microsoft.com/office/drawing/2016/5/12/chartex" xmlns:cx7="http://schemas.microsoft.com/office/drawing/2016/5/13/chartex" xmlns:cx8="http://schemas.microsoft.com/office/drawing/2016/5/14/chartex" xmlns:mc="http://schemas.openxmlformats.org/markup-compatibility/2006" xmlns:aink="http://schemas.microsoft.com/office/drawing/2016/ink" xmlns:am3d="http://schemas.microsoft.com/office/drawing/2017/model3d" xmlns:o="urn:schemas-microsoft-com:office:office" xmlns:oel="http://schemas.microsoft.com/office/2019/extlst" xmlns:r="http://schemas.openxmlformats.org/officeDocument/2006/relationships" xmlns:m="http://schemas.openxmlformats.org/officeDocument/2006/math" xmlns:v="urn:schemas-microsoft-com:vml" xmlns:wp14="http://schemas.microsoft.com/office/word/2010/wordprocessingDrawing" xmlns:wp="http://schemas.openxmlformats.org/drawingml/2006/wordprocessingDrawing" xmlns:w10="urn:schemas-microsoft-com:office:word" xmlns:w="http://schemas.openxmlformats.org/wordprocessingml/2006/main" xmlns:w14="http://schemas.microsoft.com/office/word/2010/wordml" xmlns:w15="http://schemas.microsoft.com/office/word/2012/wordml" xmlns:w16cex="http://schemas.microsoft.com/office/word/2018/wordml/cex" xmlns:w16cid="http://schemas.microsoft.com/office/word/2016/wordml/cid" xmlns:w16="http://schemas.microsoft.com/office/word/2018/wordml" xmlns:w16du="http://schemas.microsoft.com/office/word/2023/wordml/word16du" xmlns:w16sdtdh="http://schemas.microsoft.com/office/word/2020/wordml/sdtdatahash" xmlns:w16se="http://schemas.microsoft.com/office/word/2015/wordml/symex" xmlns:wpg="http://schemas.microsoft.com/office/word/2010/wordprocessingGroup" xmlns:wpi="http://schemas.microsoft.com/office/word/2010/wordprocessingInk" xmlns:wne="http://schemas.microsoft.com/office/word/2006/wordml" xmlns:wps="http://schemas.microsoft.com/office/word/2010/wordprocessingShape" mc:Ignorable="w14 w15 w16se w16cid w16 w16cex w16sdtdh w16du wp14">
   <w:p>
     <w:pPr>
       <w:pStyle w:val="Footer"/>
@@ -5333,7 +5696,7 @@
 </file>
 
 <file path=word/footnotes.xml><?xml version="1.0" encoding="utf-8"?>
-<w:footnotes xmlns:wpc="http://schemas.microsoft.com/office/word/2010/wordprocessingCanvas" xmlns:cx="http://schemas.microsoft.com/office/drawing/2014/chartex" xmlns:cx1="http://schemas.microsoft.com/office/drawing/2015/9/8/chartex" xmlns:cx2="http://schemas.microsoft.com/office/drawing/2015/10/21/chartex" xmlns:cx3="http://schemas.microsoft.com/office/drawing/2016/5/9/chartex" xmlns:cx4="http://schemas.microsoft.com/office/drawing/2016/5/10/chartex" xmlns:cx5="http://schemas.microsoft.com/office/drawing/2016/5/11/chartex" xmlns:cx6="http://schemas.microsoft.com/office/drawing/2016/5/12/chartex" xmlns:cx7="http://schemas.microsoft.com/office/drawing/2016/5/13/chartex" xmlns:cx8="http://schemas.microsoft.com/office/drawing/2016/5/14/chartex" xmlns:mc="http://schemas.openxmlformats.org/markup-compatibility/2006" xmlns:aink="http://schemas.microsoft.com/office/drawing/2016/ink" xmlns:am3d="http://schemas.microsoft.com/office/drawing/2017/model3d" xmlns:o="urn:schemas-microsoft-com:office:office" xmlns:oel="http://schemas.microsoft.com/office/2019/extlst" xmlns:r="http://schemas.openxmlformats.org/officeDocument/2006/relationships" xmlns:m="http://schemas.openxmlformats.org/officeDocument/2006/math" xmlns:v="urn:schemas-microsoft-com:vml" xmlns:wp14="http://schemas.microsoft.com/office/word/2010/wordprocessingDrawing" xmlns:wp="http://schemas.openxmlformats.org/drawingml/2006/wordprocessingDrawing" xmlns:w10="urn:schemas-microsoft-com:office:word" xmlns:w="http://schemas.openxmlformats.org/wordprocessingml/2006/main" xmlns:w14="http://schemas.microsoft.com/office/word/2010/wordml" xmlns:w15="http://schemas.microsoft.com/office/word/2012/wordml" xmlns:w16cex="http://schemas.microsoft.com/office/word/2018/wordml/cex" xmlns:w16cid="http://schemas.microsoft.com/office/word/2016/wordml/cid" xmlns:w16="http://schemas.microsoft.com/office/word/2018/wordml" xmlns:w16du="http://schemas.microsoft.com/office/word/2023/wordml/word16du" xmlns:w16sdtdh="http://schemas.microsoft.com/office/word/2020/wordml/sdtdatahash" xmlns:w16sdtfl="http://schemas.microsoft.com/office/word/2024/wordml/sdtformatlock" xmlns:w16se="http://schemas.microsoft.com/office/word/2015/wordml/symex" xmlns:wpg="http://schemas.microsoft.com/office/word/2010/wordprocessingGroup" xmlns:wpi="http://schemas.microsoft.com/office/word/2010/wordprocessingInk" xmlns:wne="http://schemas.microsoft.com/office/word/2006/wordml" xmlns:wps="http://schemas.microsoft.com/office/word/2010/wordprocessingShape" mc:Ignorable="w14 w15 w16se w16cid w16 w16cex w16sdtdh w16sdtfl w16du wp14">
+<w:footnotes xmlns:wpc="http://schemas.microsoft.com/office/word/2010/wordprocessingCanvas" xmlns:cx="http://schemas.microsoft.com/office/drawing/2014/chartex" xmlns:cx1="http://schemas.microsoft.com/office/drawing/2015/9/8/chartex" xmlns:cx2="http://schemas.microsoft.com/office/drawing/2015/10/21/chartex" xmlns:cx3="http://schemas.microsoft.com/office/drawing/2016/5/9/chartex" xmlns:cx4="http://schemas.microsoft.com/office/drawing/2016/5/10/chartex" xmlns:cx5="http://schemas.microsoft.com/office/drawing/2016/5/11/chartex" xmlns:cx6="http://schemas.microsoft.com/office/drawing/2016/5/12/chartex" xmlns:cx7="http://schemas.microsoft.com/office/drawing/2016/5/13/chartex" xmlns:cx8="http://schemas.microsoft.com/office/drawing/2016/5/14/chartex" xmlns:mc="http://schemas.openxmlformats.org/markup-compatibility/2006" xmlns:aink="http://schemas.microsoft.com/office/drawing/2016/ink" xmlns:am3d="http://schemas.microsoft.com/office/drawing/2017/model3d" xmlns:o="urn:schemas-microsoft-com:office:office" xmlns:oel="http://schemas.microsoft.com/office/2019/extlst" xmlns:r="http://schemas.openxmlformats.org/officeDocument/2006/relationships" xmlns:m="http://schemas.openxmlformats.org/officeDocument/2006/math" xmlns:v="urn:schemas-microsoft-com:vml" xmlns:wp14="http://schemas.microsoft.com/office/word/2010/wordprocessingDrawing" xmlns:wp="http://schemas.openxmlformats.org/drawingml/2006/wordprocessingDrawing" xmlns:w10="urn:schemas-microsoft-com:office:word" xmlns:w="http://schemas.openxmlformats.org/wordprocessingml/2006/main" xmlns:w14="http://schemas.microsoft.com/office/word/2010/wordml" xmlns:w15="http://schemas.microsoft.com/office/word/2012/wordml" xmlns:w16cex="http://schemas.microsoft.com/office/word/2018/wordml/cex" xmlns:w16cid="http://schemas.microsoft.com/office/word/2016/wordml/cid" xmlns:w16="http://schemas.microsoft.com/office/word/2018/wordml" xmlns:w16du="http://schemas.microsoft.com/office/word/2023/wordml/word16du" xmlns:w16sdtdh="http://schemas.microsoft.com/office/word/2020/wordml/sdtdatahash" xmlns:w16se="http://schemas.microsoft.com/office/word/2015/wordml/symex" xmlns:wpg="http://schemas.microsoft.com/office/word/2010/wordprocessingGroup" xmlns:wpi="http://schemas.microsoft.com/office/word/2010/wordprocessingInk" xmlns:wne="http://schemas.microsoft.com/office/word/2006/wordml" xmlns:wps="http://schemas.microsoft.com/office/word/2010/wordprocessingShape" mc:Ignorable="w14 w15 w16se w16cid w16 w16cex w16sdtdh w16du wp14">
   <w:footnote w:type="separator" w:id="-1">
     <w:p>
       <w:pPr>
@@ -5358,7 +5721,7 @@
 </file>
 
 <file path=word/header1.xml><?xml version="1.0" encoding="utf-8"?>
-<w:hdr xmlns:wpc="http://schemas.microsoft.com/office/word/2010/wordprocessingCanvas" xmlns:cx="http://schemas.microsoft.com/office/drawing/2014/chartex" xmlns:cx1="http://schemas.microsoft.com/office/drawing/2015/9/8/chartex" xmlns:cx2="http://schemas.microsoft.com/office/drawing/2015/10/21/chartex" xmlns:cx3="http://schemas.microsoft.com/office/drawing/2016/5/9/chartex" xmlns:cx4="http://schemas.microsoft.com/office/drawing/2016/5/10/chartex" xmlns:cx5="http://schemas.microsoft.com/office/drawing/2016/5/11/chartex" xmlns:cx6="http://schemas.microsoft.com/office/drawing/2016/5/12/chartex" xmlns:cx7="http://schemas.microsoft.com/office/drawing/2016/5/13/chartex" xmlns:cx8="http://schemas.microsoft.com/office/drawing/2016/5/14/chartex" xmlns:mc="http://schemas.openxmlformats.org/markup-compatibility/2006" xmlns:aink="http://schemas.microsoft.com/office/drawing/2016/ink" xmlns:am3d="http://schemas.microsoft.com/office/drawing/2017/model3d" xmlns:o="urn:schemas-microsoft-com:office:office" xmlns:oel="http://schemas.microsoft.com/office/2019/extlst" xmlns:r="http://schemas.openxmlformats.org/officeDocument/2006/relationships" xmlns:m="http://schemas.openxmlformats.org/officeDocument/2006/math" xmlns:v="urn:schemas-microsoft-com:vml" xmlns:wp14="http://schemas.microsoft.com/office/word/2010/wordprocessingDrawing" xmlns:wp="http://schemas.openxmlformats.org/drawingml/2006/wordprocessingDrawing" xmlns:w10="urn:schemas-microsoft-com:office:word" xmlns:w="http://schemas.openxmlformats.org/wordprocessingml/2006/main" xmlns:w14="http://schemas.microsoft.com/office/word/2010/wordml" xmlns:w15="http://schemas.microsoft.com/office/word/2012/wordml" xmlns:w16cex="http://schemas.microsoft.com/office/word/2018/wordml/cex" xmlns:w16cid="http://schemas.microsoft.com/office/word/2016/wordml/cid" xmlns:w16="http://schemas.microsoft.com/office/word/2018/wordml" xmlns:w16du="http://schemas.microsoft.com/office/word/2023/wordml/word16du" xmlns:w16sdtdh="http://schemas.microsoft.com/office/word/2020/wordml/sdtdatahash" xmlns:w16sdtfl="http://schemas.microsoft.com/office/word/2024/wordml/sdtformatlock" xmlns:w16se="http://schemas.microsoft.com/office/word/2015/wordml/symex" xmlns:wpg="http://schemas.microsoft.com/office/word/2010/wordprocessingGroup" xmlns:wpi="http://schemas.microsoft.com/office/word/2010/wordprocessingInk" xmlns:wne="http://schemas.microsoft.com/office/word/2006/wordml" xmlns:wps="http://schemas.microsoft.com/office/word/2010/wordprocessingShape" mc:Ignorable="w14 w15 w16se w16cid w16 w16cex w16sdtdh w16sdtfl w16du wp14">
+<w:hdr xmlns:wpc="http://schemas.microsoft.com/office/word/2010/wordprocessingCanvas" xmlns:cx="http://schemas.microsoft.com/office/drawing/2014/chartex" xmlns:cx1="http://schemas.microsoft.com/office/drawing/2015/9/8/chartex" xmlns:cx2="http://schemas.microsoft.com/office/drawing/2015/10/21/chartex" xmlns:cx3="http://schemas.microsoft.com/office/drawing/2016/5/9/chartex" xmlns:cx4="http://schemas.microsoft.com/office/drawing/2016/5/10/chartex" xmlns:cx5="http://schemas.microsoft.com/office/drawing/2016/5/11/chartex" xmlns:cx6="http://schemas.microsoft.com/office/drawing/2016/5/12/chartex" xmlns:cx7="http://schemas.microsoft.com/office/drawing/2016/5/13/chartex" xmlns:cx8="http://schemas.microsoft.com/office/drawing/2016/5/14/chartex" xmlns:mc="http://schemas.openxmlformats.org/markup-compatibility/2006" xmlns:aink="http://schemas.microsoft.com/office/drawing/2016/ink" xmlns:am3d="http://schemas.microsoft.com/office/drawing/2017/model3d" xmlns:o="urn:schemas-microsoft-com:office:office" xmlns:oel="http://schemas.microsoft.com/office/2019/extlst" xmlns:r="http://schemas.openxmlformats.org/officeDocument/2006/relationships" xmlns:m="http://schemas.openxmlformats.org/officeDocument/2006/math" xmlns:v="urn:schemas-microsoft-com:vml" xmlns:wp14="http://schemas.microsoft.com/office/word/2010/wordprocessingDrawing" xmlns:wp="http://schemas.openxmlformats.org/drawingml/2006/wordprocessingDrawing" xmlns:w10="urn:schemas-microsoft-com:office:word" xmlns:w="http://schemas.openxmlformats.org/wordprocessingml/2006/main" xmlns:w14="http://schemas.microsoft.com/office/word/2010/wordml" xmlns:w15="http://schemas.microsoft.com/office/word/2012/wordml" xmlns:w16cex="http://schemas.microsoft.com/office/word/2018/wordml/cex" xmlns:w16cid="http://schemas.microsoft.com/office/word/2016/wordml/cid" xmlns:w16="http://schemas.microsoft.com/office/word/2018/wordml" xmlns:w16du="http://schemas.microsoft.com/office/word/2023/wordml/word16du" xmlns:w16sdtdh="http://schemas.microsoft.com/office/word/2020/wordml/sdtdatahash" xmlns:w16se="http://schemas.microsoft.com/office/word/2015/wordml/symex" xmlns:wpg="http://schemas.microsoft.com/office/word/2010/wordprocessingGroup" xmlns:wpi="http://schemas.microsoft.com/office/word/2010/wordprocessingInk" xmlns:wne="http://schemas.microsoft.com/office/word/2006/wordml" xmlns:wps="http://schemas.microsoft.com/office/word/2010/wordprocessingShape" mc:Ignorable="w14 w15 w16se w16cid w16 w16cex w16sdtdh w16du wp14">
   <w:p>
     <w:pPr>
       <w:pStyle w:val="Header"/>
@@ -5368,7 +5731,7 @@
 </file>
 
 <file path=word/header2.xml><?xml version="1.0" encoding="utf-8"?>
-<w:hdr xmlns:wpc="http://schemas.microsoft.com/office/word/2010/wordprocessingCanvas" xmlns:cx="http://schemas.microsoft.com/office/drawing/2014/chartex" xmlns:cx1="http://schemas.microsoft.com/office/drawing/2015/9/8/chartex" xmlns:cx2="http://schemas.microsoft.com/office/drawing/2015/10/21/chartex" xmlns:cx3="http://schemas.microsoft.com/office/drawing/2016/5/9/chartex" xmlns:cx4="http://schemas.microsoft.com/office/drawing/2016/5/10/chartex" xmlns:cx5="http://schemas.microsoft.com/office/drawing/2016/5/11/chartex" xmlns:cx6="http://schemas.microsoft.com/office/drawing/2016/5/12/chartex" xmlns:cx7="http://schemas.microsoft.com/office/drawing/2016/5/13/chartex" xmlns:cx8="http://schemas.microsoft.com/office/drawing/2016/5/14/chartex" xmlns:mc="http://schemas.openxmlformats.org/markup-compatibility/2006" xmlns:aink="http://schemas.microsoft.com/office/drawing/2016/ink" xmlns:am3d="http://schemas.microsoft.com/office/drawing/2017/model3d" xmlns:o="urn:schemas-microsoft-com:office:office" xmlns:oel="http://schemas.microsoft.com/office/2019/extlst" xmlns:r="http://schemas.openxmlformats.org/officeDocument/2006/relationships" xmlns:m="http://schemas.openxmlformats.org/officeDocument/2006/math" xmlns:v="urn:schemas-microsoft-com:vml" xmlns:wp14="http://schemas.microsoft.com/office/word/2010/wordprocessingDrawing" xmlns:wp="http://schemas.openxmlformats.org/drawingml/2006/wordprocessingDrawing" xmlns:w10="urn:schemas-microsoft-com:office:word" xmlns:w="http://schemas.openxmlformats.org/wordprocessingml/2006/main" xmlns:w14="http://schemas.microsoft.com/office/word/2010/wordml" xmlns:w15="http://schemas.microsoft.com/office/word/2012/wordml" xmlns:w16cex="http://schemas.microsoft.com/office/word/2018/wordml/cex" xmlns:w16cid="http://schemas.microsoft.com/office/word/2016/wordml/cid" xmlns:w16="http://schemas.microsoft.com/office/word/2018/wordml" xmlns:w16du="http://schemas.microsoft.com/office/word/2023/wordml/word16du" xmlns:w16sdtdh="http://schemas.microsoft.com/office/word/2020/wordml/sdtdatahash" xmlns:w16sdtfl="http://schemas.microsoft.com/office/word/2024/wordml/sdtformatlock" xmlns:w16se="http://schemas.microsoft.com/office/word/2015/wordml/symex" xmlns:wpg="http://schemas.microsoft.com/office/word/2010/wordprocessingGroup" xmlns:wpi="http://schemas.microsoft.com/office/word/2010/wordprocessingInk" xmlns:wne="http://schemas.microsoft.com/office/word/2006/wordml" xmlns:wps="http://schemas.microsoft.com/office/word/2010/wordprocessingShape" mc:Ignorable="w14 w15 w16se w16cid w16 w16cex w16sdtdh w16sdtfl w16du wp14">
+<w:hdr xmlns:wpc="http://schemas.microsoft.com/office/word/2010/wordprocessingCanvas" xmlns:cx="http://schemas.microsoft.com/office/drawing/2014/chartex" xmlns:cx1="http://schemas.microsoft.com/office/drawing/2015/9/8/chartex" xmlns:cx2="http://schemas.microsoft.com/office/drawing/2015/10/21/chartex" xmlns:cx3="http://schemas.microsoft.com/office/drawing/2016/5/9/chartex" xmlns:cx4="http://schemas.microsoft.com/office/drawing/2016/5/10/chartex" xmlns:cx5="http://schemas.microsoft.com/office/drawing/2016/5/11/chartex" xmlns:cx6="http://schemas.microsoft.com/office/drawing/2016/5/12/chartex" xmlns:cx7="http://schemas.microsoft.com/office/drawing/2016/5/13/chartex" xmlns:cx8="http://schemas.microsoft.com/office/drawing/2016/5/14/chartex" xmlns:mc="http://schemas.openxmlformats.org/markup-compatibility/2006" xmlns:aink="http://schemas.microsoft.com/office/drawing/2016/ink" xmlns:am3d="http://schemas.microsoft.com/office/drawing/2017/model3d" xmlns:o="urn:schemas-microsoft-com:office:office" xmlns:oel="http://schemas.microsoft.com/office/2019/extlst" xmlns:r="http://schemas.openxmlformats.org/officeDocument/2006/relationships" xmlns:m="http://schemas.openxmlformats.org/officeDocument/2006/math" xmlns:v="urn:schemas-microsoft-com:vml" xmlns:wp14="http://schemas.microsoft.com/office/word/2010/wordprocessingDrawing" xmlns:wp="http://schemas.openxmlformats.org/drawingml/2006/wordprocessingDrawing" xmlns:w10="urn:schemas-microsoft-com:office:word" xmlns:w="http://schemas.openxmlformats.org/wordprocessingml/2006/main" xmlns:w14="http://schemas.microsoft.com/office/word/2010/wordml" xmlns:w15="http://schemas.microsoft.com/office/word/2012/wordml" xmlns:w16cex="http://schemas.microsoft.com/office/word/2018/wordml/cex" xmlns:w16cid="http://schemas.microsoft.com/office/word/2016/wordml/cid" xmlns:w16="http://schemas.microsoft.com/office/word/2018/wordml" xmlns:w16du="http://schemas.microsoft.com/office/word/2023/wordml/word16du" xmlns:w16sdtdh="http://schemas.microsoft.com/office/word/2020/wordml/sdtdatahash" xmlns:w16se="http://schemas.microsoft.com/office/word/2015/wordml/symex" xmlns:wpg="http://schemas.microsoft.com/office/word/2010/wordprocessingGroup" xmlns:wpi="http://schemas.microsoft.com/office/word/2010/wordprocessingInk" xmlns:wne="http://schemas.microsoft.com/office/word/2006/wordml" xmlns:wps="http://schemas.microsoft.com/office/word/2010/wordprocessingShape" mc:Ignorable="w14 w15 w16se w16cid w16 w16cex w16sdtdh w16du wp14">
   <w:p>
     <w:pPr>
       <w:pStyle w:val="Header"/>
@@ -5378,7 +5741,7 @@
 </file>
 
 <file path=word/header3.xml><?xml version="1.0" encoding="utf-8"?>
-<w:hdr xmlns:wpc="http://schemas.microsoft.com/office/word/2010/wordprocessingCanvas" xmlns:cx="http://schemas.microsoft.com/office/drawing/2014/chartex" xmlns:cx1="http://schemas.microsoft.com/office/drawing/2015/9/8/chartex" xmlns:cx2="http://schemas.microsoft.com/office/drawing/2015/10/21/chartex" xmlns:cx3="http://schemas.microsoft.com/office/drawing/2016/5/9/chartex" xmlns:cx4="http://schemas.microsoft.com/office/drawing/2016/5/10/chartex" xmlns:cx5="http://schemas.microsoft.com/office/drawing/2016/5/11/chartex" xmlns:cx6="http://schemas.microsoft.com/office/drawing/2016/5/12/chartex" xmlns:cx7="http://schemas.microsoft.com/office/drawing/2016/5/13/chartex" xmlns:cx8="http://schemas.microsoft.com/office/drawing/2016/5/14/chartex" xmlns:mc="http://schemas.openxmlformats.org/markup-compatibility/2006" xmlns:aink="http://schemas.microsoft.com/office/drawing/2016/ink" xmlns:am3d="http://schemas.microsoft.com/office/drawing/2017/model3d" xmlns:o="urn:schemas-microsoft-com:office:office" xmlns:oel="http://schemas.microsoft.com/office/2019/extlst" xmlns:r="http://schemas.openxmlformats.org/officeDocument/2006/relationships" xmlns:m="http://schemas.openxmlformats.org/officeDocument/2006/math" xmlns:v="urn:schemas-microsoft-com:vml" xmlns:wp14="http://schemas.microsoft.com/office/word/2010/wordprocessingDrawing" xmlns:wp="http://schemas.openxmlformats.org/drawingml/2006/wordprocessingDrawing" xmlns:w10="urn:schemas-microsoft-com:office:word" xmlns:w="http://schemas.openxmlformats.org/wordprocessingml/2006/main" xmlns:w14="http://schemas.microsoft.com/office/word/2010/wordml" xmlns:w15="http://schemas.microsoft.com/office/word/2012/wordml" xmlns:w16cex="http://schemas.microsoft.com/office/word/2018/wordml/cex" xmlns:w16cid="http://schemas.microsoft.com/office/word/2016/wordml/cid" xmlns:w16="http://schemas.microsoft.com/office/word/2018/wordml" xmlns:w16du="http://schemas.microsoft.com/office/word/2023/wordml/word16du" xmlns:w16sdtdh="http://schemas.microsoft.com/office/word/2020/wordml/sdtdatahash" xmlns:w16sdtfl="http://schemas.microsoft.com/office/word/2024/wordml/sdtformatlock" xmlns:w16se="http://schemas.microsoft.com/office/word/2015/wordml/symex" xmlns:wpg="http://schemas.microsoft.com/office/word/2010/wordprocessingGroup" xmlns:wpi="http://schemas.microsoft.com/office/word/2010/wordprocessingInk" xmlns:wne="http://schemas.microsoft.com/office/word/2006/wordml" xmlns:wps="http://schemas.microsoft.com/office/word/2010/wordprocessingShape" mc:Ignorable="w14 w15 w16se w16cid w16 w16cex w16sdtdh w16sdtfl w16du wp14">
+<w:hdr xmlns:wpc="http://schemas.microsoft.com/office/word/2010/wordprocessingCanvas" xmlns:cx="http://schemas.microsoft.com/office/drawing/2014/chartex" xmlns:cx1="http://schemas.microsoft.com/office/drawing/2015/9/8/chartex" xmlns:cx2="http://schemas.microsoft.com/office/drawing/2015/10/21/chartex" xmlns:cx3="http://schemas.microsoft.com/office/drawing/2016/5/9/chartex" xmlns:cx4="http://schemas.microsoft.com/office/drawing/2016/5/10/chartex" xmlns:cx5="http://schemas.microsoft.com/office/drawing/2016/5/11/chartex" xmlns:cx6="http://schemas.microsoft.com/office/drawing/2016/5/12/chartex" xmlns:cx7="http://schemas.microsoft.com/office/drawing/2016/5/13/chartex" xmlns:cx8="http://schemas.microsoft.com/office/drawing/2016/5/14/chartex" xmlns:mc="http://schemas.openxmlformats.org/markup-compatibility/2006" xmlns:aink="http://schemas.microsoft.com/office/drawing/2016/ink" xmlns:am3d="http://schemas.microsoft.com/office/drawing/2017/model3d" xmlns:o="urn:schemas-microsoft-com:office:office" xmlns:oel="http://schemas.microsoft.com/office/2019/extlst" xmlns:r="http://schemas.openxmlformats.org/officeDocument/2006/relationships" xmlns:m="http://schemas.openxmlformats.org/officeDocument/2006/math" xmlns:v="urn:schemas-microsoft-com:vml" xmlns:wp14="http://schemas.microsoft.com/office/word/2010/wordprocessingDrawing" xmlns:wp="http://schemas.openxmlformats.org/drawingml/2006/wordprocessingDrawing" xmlns:w10="urn:schemas-microsoft-com:office:word" xmlns:w="http://schemas.openxmlformats.org/wordprocessingml/2006/main" xmlns:w14="http://schemas.microsoft.com/office/word/2010/wordml" xmlns:w15="http://schemas.microsoft.com/office/word/2012/wordml" xmlns:w16cex="http://schemas.microsoft.com/office/word/2018/wordml/cex" xmlns:w16cid="http://schemas.microsoft.com/office/word/2016/wordml/cid" xmlns:w16="http://schemas.microsoft.com/office/word/2018/wordml" xmlns:w16du="http://schemas.microsoft.com/office/word/2023/wordml/word16du" xmlns:w16sdtdh="http://schemas.microsoft.com/office/word/2020/wordml/sdtdatahash" xmlns:w16se="http://schemas.microsoft.com/office/word/2015/wordml/symex" xmlns:wpg="http://schemas.microsoft.com/office/word/2010/wordprocessingGroup" xmlns:wpi="http://schemas.microsoft.com/office/word/2010/wordprocessingInk" xmlns:wne="http://schemas.microsoft.com/office/word/2006/wordml" xmlns:wps="http://schemas.microsoft.com/office/word/2010/wordprocessingShape" mc:Ignorable="w14 w15 w16se w16cid w16 w16cex w16sdtdh w16du wp14">
   <w:p>
     <w:pPr>
       <w:pStyle w:val="Header"/>
@@ -5388,7 +5751,7 @@
 </file>
 
 <file path=word/numbering.xml><?xml version="1.0" encoding="utf-8"?>
-<w:numbering xmlns:wpc="http://schemas.microsoft.com/office/word/2010/wordprocessingCanvas" xmlns:cx="http://schemas.microsoft.com/office/drawing/2014/chartex" xmlns:cx1="http://schemas.microsoft.com/office/drawing/2015/9/8/chartex" xmlns:cx2="http://schemas.microsoft.com/office/drawing/2015/10/21/chartex" xmlns:cx3="http://schemas.microsoft.com/office/drawing/2016/5/9/chartex" xmlns:cx4="http://schemas.microsoft.com/office/drawing/2016/5/10/chartex" xmlns:cx5="http://schemas.microsoft.com/office/drawing/2016/5/11/chartex" xmlns:cx6="http://schemas.microsoft.com/office/drawing/2016/5/12/chartex" xmlns:cx7="http://schemas.microsoft.com/office/drawing/2016/5/13/chartex" xmlns:cx8="http://schemas.microsoft.com/office/drawing/2016/5/14/chartex" xmlns:mc="http://schemas.openxmlformats.org/markup-compatibility/2006" xmlns:aink="http://schemas.microsoft.com/office/drawing/2016/ink" xmlns:am3d="http://schemas.microsoft.com/office/drawing/2017/model3d" xmlns:o="urn:schemas-microsoft-com:office:office" xmlns:oel="http://schemas.microsoft.com/office/2019/extlst" xmlns:r="http://schemas.openxmlformats.org/officeDocument/2006/relationships" xmlns:m="http://schemas.openxmlformats.org/officeDocument/2006/math" xmlns:v="urn:schemas-microsoft-com:vml" xmlns:wp14="http://schemas.microsoft.com/office/word/2010/wordprocessingDrawing" xmlns:wp="http://schemas.openxmlformats.org/drawingml/2006/wordprocessingDrawing" xmlns:w10="urn:schemas-microsoft-com:office:word" xmlns:w="http://schemas.openxmlformats.org/wordprocessingml/2006/main" xmlns:w14="http://schemas.microsoft.com/office/word/2010/wordml" xmlns:w15="http://schemas.microsoft.com/office/word/2012/wordml" xmlns:w16cex="http://schemas.microsoft.com/office/word/2018/wordml/cex" xmlns:w16cid="http://schemas.microsoft.com/office/word/2016/wordml/cid" xmlns:w16="http://schemas.microsoft.com/office/word/2018/wordml" xmlns:w16du="http://schemas.microsoft.com/office/word/2023/wordml/word16du" xmlns:w16sdtdh="http://schemas.microsoft.com/office/word/2020/wordml/sdtdatahash" xmlns:w16sdtfl="http://schemas.microsoft.com/office/word/2024/wordml/sdtformatlock" xmlns:w16se="http://schemas.microsoft.com/office/word/2015/wordml/symex" xmlns:wpg="http://schemas.microsoft.com/office/word/2010/wordprocessingGroup" xmlns:wpi="http://schemas.microsoft.com/office/word/2010/wordprocessingInk" xmlns:wne="http://schemas.microsoft.com/office/word/2006/wordml" xmlns:wps="http://schemas.microsoft.com/office/word/2010/wordprocessingShape" mc:Ignorable="w14 w15 w16se w16cid w16 w16cex w16sdtdh w16sdtfl w16du wp14">
+<w:numbering xmlns:wpc="http://schemas.microsoft.com/office/word/2010/wordprocessingCanvas" xmlns:cx="http://schemas.microsoft.com/office/drawing/2014/chartex" xmlns:cx1="http://schemas.microsoft.com/office/drawing/2015/9/8/chartex" xmlns:cx2="http://schemas.microsoft.com/office/drawing/2015/10/21/chartex" xmlns:cx3="http://schemas.microsoft.com/office/drawing/2016/5/9/chartex" xmlns:cx4="http://schemas.microsoft.com/office/drawing/2016/5/10/chartex" xmlns:cx5="http://schemas.microsoft.com/office/drawing/2016/5/11/chartex" xmlns:cx6="http://schemas.microsoft.com/office/drawing/2016/5/12/chartex" xmlns:cx7="http://schemas.microsoft.com/office/drawing/2016/5/13/chartex" xmlns:cx8="http://schemas.microsoft.com/office/drawing/2016/5/14/chartex" xmlns:mc="http://schemas.openxmlformats.org/markup-compatibility/2006" xmlns:aink="http://schemas.microsoft.com/office/drawing/2016/ink" xmlns:am3d="http://schemas.microsoft.com/office/drawing/2017/model3d" xmlns:o="urn:schemas-microsoft-com:office:office" xmlns:oel="http://schemas.microsoft.com/office/2019/extlst" xmlns:r="http://schemas.openxmlformats.org/officeDocument/2006/relationships" xmlns:m="http://schemas.openxmlformats.org/officeDocument/2006/math" xmlns:v="urn:schemas-microsoft-com:vml" xmlns:wp14="http://schemas.microsoft.com/office/word/2010/wordprocessingDrawing" xmlns:wp="http://schemas.openxmlformats.org/drawingml/2006/wordprocessingDrawing" xmlns:w10="urn:schemas-microsoft-com:office:word" xmlns:w="http://schemas.openxmlformats.org/wordprocessingml/2006/main" xmlns:w14="http://schemas.microsoft.com/office/word/2010/wordml" xmlns:w15="http://schemas.microsoft.com/office/word/2012/wordml" xmlns:w16cex="http://schemas.microsoft.com/office/word/2018/wordml/cex" xmlns:w16cid="http://schemas.microsoft.com/office/word/2016/wordml/cid" xmlns:w16="http://schemas.microsoft.com/office/word/2018/wordml" xmlns:w16du="http://schemas.microsoft.com/office/word/2023/wordml/word16du" xmlns:w16sdtdh="http://schemas.microsoft.com/office/word/2020/wordml/sdtdatahash" xmlns:w16se="http://schemas.microsoft.com/office/word/2015/wordml/symex" xmlns:wpg="http://schemas.microsoft.com/office/word/2010/wordprocessingGroup" xmlns:wpi="http://schemas.microsoft.com/office/word/2010/wordprocessingInk" xmlns:wne="http://schemas.microsoft.com/office/word/2006/wordml" xmlns:wps="http://schemas.microsoft.com/office/word/2010/wordprocessingShape" mc:Ignorable="w14 w15 w16se w16cid w16 w16cex w16sdtdh w16du wp14">
   <w:abstractNum w:abstractNumId="0" w15:restartNumberingAfterBreak="0">
     <w:nsid w:val="4F5B2EFE"/>
     <w:multiLevelType w:val="multilevel"/>
@@ -5634,7 +5997,7 @@
 </file>
 
 <file path=word/people.xml><?xml version="1.0" encoding="utf-8"?>
-<w15:people xmlns:wpc="http://schemas.microsoft.com/office/word/2010/wordprocessingCanvas" xmlns:cx="http://schemas.microsoft.com/office/drawing/2014/chartex" xmlns:cx1="http://schemas.microsoft.com/office/drawing/2015/9/8/chartex" xmlns:cx2="http://schemas.microsoft.com/office/drawing/2015/10/21/chartex" xmlns:cx3="http://schemas.microsoft.com/office/drawing/2016/5/9/chartex" xmlns:cx4="http://schemas.microsoft.com/office/drawing/2016/5/10/chartex" xmlns:cx5="http://schemas.microsoft.com/office/drawing/2016/5/11/chartex" xmlns:cx6="http://schemas.microsoft.com/office/drawing/2016/5/12/chartex" xmlns:cx7="http://schemas.microsoft.com/office/drawing/2016/5/13/chartex" xmlns:cx8="http://schemas.microsoft.com/office/drawing/2016/5/14/chartex" xmlns:mc="http://schemas.openxmlformats.org/markup-compatibility/2006" xmlns:aink="http://schemas.microsoft.com/office/drawing/2016/ink" xmlns:am3d="http://schemas.microsoft.com/office/drawing/2017/model3d" xmlns:o="urn:schemas-microsoft-com:office:office" xmlns:oel="http://schemas.microsoft.com/office/2019/extlst" xmlns:r="http://schemas.openxmlformats.org/officeDocument/2006/relationships" xmlns:m="http://schemas.openxmlformats.org/officeDocument/2006/math" xmlns:v="urn:schemas-microsoft-com:vml" xmlns:wp14="http://schemas.microsoft.com/office/word/2010/wordprocessingDrawing" xmlns:wp="http://schemas.openxmlformats.org/drawingml/2006/wordprocessingDrawing" xmlns:w10="urn:schemas-microsoft-com:office:word" xmlns:w="http://schemas.openxmlformats.org/wordprocessingml/2006/main" xmlns:w14="http://schemas.microsoft.com/office/word/2010/wordml" xmlns:w15="http://schemas.microsoft.com/office/word/2012/wordml" xmlns:w16cex="http://schemas.microsoft.com/office/word/2018/wordml/cex" xmlns:w16cid="http://schemas.microsoft.com/office/word/2016/wordml/cid" xmlns:w16="http://schemas.microsoft.com/office/word/2018/wordml" xmlns:w16du="http://schemas.microsoft.com/office/word/2023/wordml/word16du" xmlns:w16sdtdh="http://schemas.microsoft.com/office/word/2020/wordml/sdtdatahash" xmlns:w16sdtfl="http://schemas.microsoft.com/office/word/2024/wordml/sdtformatlock" xmlns:w16se="http://schemas.microsoft.com/office/word/2015/wordml/symex" xmlns:wpg="http://schemas.microsoft.com/office/word/2010/wordprocessingGroup" xmlns:wpi="http://schemas.microsoft.com/office/word/2010/wordprocessingInk" xmlns:wne="http://schemas.microsoft.com/office/word/2006/wordml" xmlns:wps="http://schemas.microsoft.com/office/word/2010/wordprocessingShape" mc:Ignorable="w14 w15 w16se w16cid w16 w16cex w16sdtdh w16sdtfl w16du wp14">
+<w15:people xmlns:wpc="http://schemas.microsoft.com/office/word/2010/wordprocessingCanvas" xmlns:cx="http://schemas.microsoft.com/office/drawing/2014/chartex" xmlns:cx1="http://schemas.microsoft.com/office/drawing/2015/9/8/chartex" xmlns:cx2="http://schemas.microsoft.com/office/drawing/2015/10/21/chartex" xmlns:cx3="http://schemas.microsoft.com/office/drawing/2016/5/9/chartex" xmlns:cx4="http://schemas.microsoft.com/office/drawing/2016/5/10/chartex" xmlns:cx5="http://schemas.microsoft.com/office/drawing/2016/5/11/chartex" xmlns:cx6="http://schemas.microsoft.com/office/drawing/2016/5/12/chartex" xmlns:cx7="http://schemas.microsoft.com/office/drawing/2016/5/13/chartex" xmlns:cx8="http://schemas.microsoft.com/office/drawing/2016/5/14/chartex" xmlns:mc="http://schemas.openxmlformats.org/markup-compatibility/2006" xmlns:aink="http://schemas.microsoft.com/office/drawing/2016/ink" xmlns:am3d="http://schemas.microsoft.com/office/drawing/2017/model3d" xmlns:o="urn:schemas-microsoft-com:office:office" xmlns:oel="http://schemas.microsoft.com/office/2019/extlst" xmlns:r="http://schemas.openxmlformats.org/officeDocument/2006/relationships" xmlns:m="http://schemas.openxmlformats.org/officeDocument/2006/math" xmlns:v="urn:schemas-microsoft-com:vml" xmlns:wp14="http://schemas.microsoft.com/office/word/2010/wordprocessingDrawing" xmlns:wp="http://schemas.openxmlformats.org/drawingml/2006/wordprocessingDrawing" xmlns:w10="urn:schemas-microsoft-com:office:word" xmlns:w="http://schemas.openxmlformats.org/wordprocessingml/2006/main" xmlns:w14="http://schemas.microsoft.com/office/word/2010/wordml" xmlns:w15="http://schemas.microsoft.com/office/word/2012/wordml" xmlns:w16cex="http://schemas.microsoft.com/office/word/2018/wordml/cex" xmlns:w16cid="http://schemas.microsoft.com/office/word/2016/wordml/cid" xmlns:w16="http://schemas.microsoft.com/office/word/2018/wordml" xmlns:w16du="http://schemas.microsoft.com/office/word/2023/wordml/word16du" xmlns:w16sdtdh="http://schemas.microsoft.com/office/word/2020/wordml/sdtdatahash" xmlns:w16se="http://schemas.microsoft.com/office/word/2015/wordml/symex" xmlns:wpg="http://schemas.microsoft.com/office/word/2010/wordprocessingGroup" xmlns:wpi="http://schemas.microsoft.com/office/word/2010/wordprocessingInk" xmlns:wne="http://schemas.microsoft.com/office/word/2006/wordml" xmlns:wps="http://schemas.microsoft.com/office/word/2010/wordprocessingShape" mc:Ignorable="w14 w15 w16se w16cid w16 w16cex w16sdtdh w16du wp14">
   <w15:person w15:author="Jaeger, Florian">
     <w15:presenceInfo w15:providerId="AD" w15:userId="S::fjaeger@ur.rochester.edu::0d0acd91-09a2-4ddb-a934-22efc544688e"/>
   </w15:person>
@@ -5645,7 +6008,7 @@
 </file>
 
 <file path=word/styles.xml><?xml version="1.0" encoding="utf-8"?>
-<w:styles xmlns:mc="http://schemas.openxmlformats.org/markup-compatibility/2006" xmlns:r="http://schemas.openxmlformats.org/officeDocument/2006/relationships" xmlns:w="http://schemas.openxmlformats.org/wordprocessingml/2006/main" xmlns:w14="http://schemas.microsoft.com/office/word/2010/wordml" xmlns:w15="http://schemas.microsoft.com/office/word/2012/wordml" xmlns:w16cex="http://schemas.microsoft.com/office/word/2018/wordml/cex" xmlns:w16cid="http://schemas.microsoft.com/office/word/2016/wordml/cid" xmlns:w16="http://schemas.microsoft.com/office/word/2018/wordml" xmlns:w16du="http://schemas.microsoft.com/office/word/2023/wordml/word16du" xmlns:w16sdtdh="http://schemas.microsoft.com/office/word/2020/wordml/sdtdatahash" xmlns:w16sdtfl="http://schemas.microsoft.com/office/word/2024/wordml/sdtformatlock" xmlns:w16se="http://schemas.microsoft.com/office/word/2015/wordml/symex" mc:Ignorable="w14 w15 w16se w16cid w16 w16cex w16sdtdh w16sdtfl w16du">
+<w:styles xmlns:mc="http://schemas.openxmlformats.org/markup-compatibility/2006" xmlns:r="http://schemas.openxmlformats.org/officeDocument/2006/relationships" xmlns:w="http://schemas.openxmlformats.org/wordprocessingml/2006/main" xmlns:w14="http://schemas.microsoft.com/office/word/2010/wordml" xmlns:w15="http://schemas.microsoft.com/office/word/2012/wordml" xmlns:w16cex="http://schemas.microsoft.com/office/word/2018/wordml/cex" xmlns:w16cid="http://schemas.microsoft.com/office/word/2016/wordml/cid" xmlns:w16="http://schemas.microsoft.com/office/word/2018/wordml" xmlns:w16du="http://schemas.microsoft.com/office/word/2023/wordml/word16du" xmlns:w16sdtdh="http://schemas.microsoft.com/office/word/2020/wordml/sdtdatahash" xmlns:w16se="http://schemas.microsoft.com/office/word/2015/wordml/symex" mc:Ignorable="w14 w15 w16se w16cid w16 w16cex w16sdtdh w16du">
   <w:docDefaults>
     <w:rPrDefault>
       <w:rPr>

</xml_diff>

<commit_message>
messy edits/notes from meeting
</commit_message>
<xml_diff>
--- a/output/papers/Round 2/Response-to-reviewers.docx
+++ b/output/papers/Round 2/Response-to-reviewers.docx
@@ -1762,7 +1762,31 @@
           <w:sz w:val="24"/>
           <w:szCs w:val="24"/>
         </w:rPr>
-        <w:t>I really liked the idea of testing whether the visibility of the pen-in-the-mouth manipulation modulates the effect; however, it is also possible that the black square was simply distracting and it was this distraction (rather than the occlusion of the articulatory information) what caused the effect going away. I am not sure whether this can be fully addressed without an additional experiment, but the authors can at least acknowledge this possibility.</w:t>
+        <w:t xml:space="preserve">I </w:t>
+      </w:r>
+      <w:commentRangeStart w:id="1"/>
+      <w:commentRangeStart w:id="2"/>
+      <w:r>
+        <w:rPr>
+          <w:rFonts w:ascii="Times New Roman" w:hAnsi="Times New Roman" w:cs="Times New Roman"/>
+          <w:sz w:val="24"/>
+          <w:szCs w:val="24"/>
+        </w:rPr>
+        <w:t>really liked the idea of testing whether the visibility of the pen-in-the-mouth manipulation modulates the effect; however, it is also possible that the black square was simply distracting and it was this distraction (rather than the occlusion of the articulatory information) what caused the effect going away. I am not sure whether this can be fully addressed without an additional experiment, but the authors can at least acknowledge this possibility.</w:t>
+      </w:r>
+      <w:commentRangeEnd w:id="1"/>
+      <w:r>
+        <w:rPr>
+          <w:rStyle w:val="CommentReference"/>
+        </w:rPr>
+        <w:commentReference w:id="1"/>
+      </w:r>
+      <w:commentRangeEnd w:id="2"/>
+      <w:r>
+        <w:rPr>
+          <w:rStyle w:val="CommentReference"/>
+        </w:rPr>
+        <w:commentReference w:id="2"/>
       </w:r>
     </w:p>
     <w:p>
@@ -1880,7 +1904,7 @@
         </w:rPr>
         <w:t>We have added the requested details</w:t>
       </w:r>
-      <w:ins w:id="1" w:author="Cummings, Shawn" w:date="2025-05-09T12:51:00Z" w16du:dateUtc="2025-05-09T16:51:00Z">
+      <w:ins w:id="3" w:author="Cummings, Shawn" w:date="2025-05-09T12:51:00Z" w16du:dateUtc="2025-05-09T16:51:00Z">
         <w:r>
           <w:rPr>
             <w:rFonts w:ascii="Times New Roman" w:hAnsi="Times New Roman" w:cs="Times New Roman"/>
@@ -1940,7 +1964,7 @@
           <w:szCs w:val="24"/>
         </w:rPr>
       </w:pPr>
-      <w:commentRangeStart w:id="2"/>
+      <w:commentRangeStart w:id="4"/>
       <w:r>
         <w:rPr>
           <w:rFonts w:ascii="Times New Roman" w:hAnsi="Times New Roman" w:cs="Times New Roman"/>
@@ -1977,12 +2001,12 @@
         </w:rPr>
         <w:t>We have done so.</w:t>
       </w:r>
-      <w:commentRangeEnd w:id="2"/>
+      <w:commentRangeEnd w:id="4"/>
       <w:r>
         <w:rPr>
           <w:rStyle w:val="CommentReference"/>
         </w:rPr>
-        <w:commentReference w:id="2"/>
+        <w:commentReference w:id="4"/>
       </w:r>
     </w:p>
     <w:p>
@@ -2352,13 +2376,13 @@
       <w:pPr>
         <w:spacing w:after="0" w:line="240" w:lineRule="auto"/>
         <w:rPr>
-          <w:ins w:id="3" w:author="Cummings, Shawn" w:date="2025-05-09T12:48:00Z" w16du:dateUtc="2025-05-09T16:48:00Z"/>
-          <w:rFonts w:ascii="Times New Roman" w:hAnsi="Times New Roman" w:cs="Times New Roman"/>
-          <w:sz w:val="24"/>
-          <w:szCs w:val="24"/>
-        </w:rPr>
-      </w:pPr>
-      <w:ins w:id="4" w:author="Cummings, Shawn" w:date="2025-05-09T12:46:00Z" w16du:dateUtc="2025-05-09T16:46:00Z">
+          <w:ins w:id="5" w:author="Cummings, Shawn" w:date="2025-05-09T12:48:00Z" w16du:dateUtc="2025-05-09T16:48:00Z"/>
+          <w:rFonts w:ascii="Times New Roman" w:hAnsi="Times New Roman" w:cs="Times New Roman"/>
+          <w:sz w:val="24"/>
+          <w:szCs w:val="24"/>
+        </w:rPr>
+      </w:pPr>
+      <w:ins w:id="6" w:author="Cummings, Shawn" w:date="2025-05-09T12:46:00Z" w16du:dateUtc="2025-05-09T16:46:00Z">
         <w:r>
           <w:rPr>
             <w:rFonts w:ascii="Times New Roman" w:hAnsi="Times New Roman" w:cs="Times New Roman"/>
@@ -2368,7 +2392,7 @@
           <w:t xml:space="preserve">By “in kind”, we meant a </w:t>
         </w:r>
       </w:ins>
-      <w:ins w:id="5" w:author="Cummings, Shawn" w:date="2025-05-09T12:47:00Z" w16du:dateUtc="2025-05-09T16:47:00Z">
+      <w:ins w:id="7" w:author="Cummings, Shawn" w:date="2025-05-09T12:47:00Z" w16du:dateUtc="2025-05-09T16:47:00Z">
         <w:r>
           <w:rPr>
             <w:rFonts w:ascii="Times New Roman" w:hAnsi="Times New Roman" w:cs="Times New Roman"/>
@@ -2378,7 +2402,7 @@
           <w:t xml:space="preserve">different </w:t>
         </w:r>
       </w:ins>
-      <w:ins w:id="6" w:author="Cummings, Shawn" w:date="2025-05-09T12:46:00Z" w16du:dateUtc="2025-05-09T16:46:00Z">
+      <w:ins w:id="8" w:author="Cummings, Shawn" w:date="2025-05-09T12:46:00Z" w16du:dateUtc="2025-05-09T16:46:00Z">
         <w:r>
           <w:rPr>
             <w:rFonts w:ascii="Times New Roman" w:hAnsi="Times New Roman" w:cs="Times New Roman"/>
@@ -2388,7 +2412,7 @@
           <w:t>video</w:t>
         </w:r>
       </w:ins>
-      <w:ins w:id="7" w:author="Cummings, Shawn" w:date="2025-05-09T12:47:00Z" w16du:dateUtc="2025-05-09T16:47:00Z">
+      <w:ins w:id="9" w:author="Cummings, Shawn" w:date="2025-05-09T12:47:00Z" w16du:dateUtc="2025-05-09T16:47:00Z">
         <w:r>
           <w:rPr>
             <w:rFonts w:ascii="Times New Roman" w:hAnsi="Times New Roman" w:cs="Times New Roman"/>
@@ -2398,7 +2422,7 @@
           <w:t xml:space="preserve"> which fulfilled all the same criteria as the original (in this case, similar phonetic context and original fricative). We have clarified these criteria in the revised </w:t>
         </w:r>
       </w:ins>
-      <w:ins w:id="8" w:author="Cummings, Shawn" w:date="2025-05-09T12:48:00Z" w16du:dateUtc="2025-05-09T16:48:00Z">
+      <w:ins w:id="10" w:author="Cummings, Shawn" w:date="2025-05-09T12:48:00Z" w16du:dateUtc="2025-05-09T16:48:00Z">
         <w:r>
           <w:rPr>
             <w:rFonts w:ascii="Times New Roman" w:hAnsi="Times New Roman" w:cs="Times New Roman"/>
@@ -2408,7 +2432,7 @@
           <w:t xml:space="preserve">manuscript. </w:t>
         </w:r>
       </w:ins>
-      <w:ins w:id="9" w:author="Cummings, Shawn" w:date="2025-05-09T12:46:00Z" w16du:dateUtc="2025-05-09T16:46:00Z">
+      <w:ins w:id="11" w:author="Cummings, Shawn" w:date="2025-05-09T12:46:00Z" w16du:dateUtc="2025-05-09T16:46:00Z">
         <w:r>
           <w:rPr>
             <w:rFonts w:ascii="Times New Roman" w:hAnsi="Times New Roman" w:cs="Times New Roman"/>
@@ -2433,13 +2457,13 @@
       <w:pPr>
         <w:spacing w:after="0" w:line="240" w:lineRule="auto"/>
         <w:rPr>
-          <w:del w:id="10" w:author="Cummings, Shawn" w:date="2025-05-09T12:48:00Z" w16du:dateUtc="2025-05-09T16:48:00Z"/>
-          <w:rFonts w:ascii="Times New Roman" w:hAnsi="Times New Roman" w:cs="Times New Roman"/>
-          <w:sz w:val="24"/>
-          <w:szCs w:val="24"/>
-        </w:rPr>
-      </w:pPr>
-      <w:del w:id="11" w:author="Cummings, Shawn" w:date="2025-05-09T12:48:00Z" w16du:dateUtc="2025-05-09T16:48:00Z">
+          <w:del w:id="12" w:author="Cummings, Shawn" w:date="2025-05-09T12:48:00Z" w16du:dateUtc="2025-05-09T16:48:00Z"/>
+          <w:rFonts w:ascii="Times New Roman" w:hAnsi="Times New Roman" w:cs="Times New Roman"/>
+          <w:sz w:val="24"/>
+          <w:szCs w:val="24"/>
+        </w:rPr>
+      </w:pPr>
+      <w:del w:id="13" w:author="Cummings, Shawn" w:date="2025-05-09T12:48:00Z" w16du:dateUtc="2025-05-09T16:48:00Z">
         <w:r>
           <w:rPr>
             <w:rFonts w:ascii="Times New Roman" w:hAnsi="Times New Roman" w:cs="Times New Roman"/>
@@ -2491,7 +2515,7 @@
           <w:szCs w:val="24"/>
         </w:rPr>
       </w:pPr>
-      <w:ins w:id="12" w:author="Cummings, Shawn" w:date="2025-05-09T12:48:00Z" w16du:dateUtc="2025-05-09T16:48:00Z">
+      <w:ins w:id="14" w:author="Cummings, Shawn" w:date="2025-05-09T12:48:00Z" w16du:dateUtc="2025-05-09T16:48:00Z">
         <w:r>
           <w:rPr>
             <w:rFonts w:ascii="Times New Roman" w:hAnsi="Times New Roman" w:cs="Times New Roman"/>
@@ -2501,7 +2525,7 @@
           <w:t xml:space="preserve">The methods now clarify that </w:t>
         </w:r>
       </w:ins>
-      <w:del w:id="13" w:author="Cummings, Shawn" w:date="2025-05-09T12:46:00Z" w16du:dateUtc="2025-05-09T16:46:00Z">
+      <w:del w:id="15" w:author="Cummings, Shawn" w:date="2025-05-09T12:46:00Z" w16du:dateUtc="2025-05-09T16:46:00Z">
         <w:r>
           <w:rPr>
             <w:rFonts w:ascii="Times New Roman" w:hAnsi="Times New Roman" w:cs="Times New Roman"/>
@@ -2511,7 +2535,7 @@
           <w:delText>We have added ____.</w:delText>
         </w:r>
       </w:del>
-      <w:ins w:id="14" w:author="Cummings, Shawn" w:date="2025-05-09T12:48:00Z" w16du:dateUtc="2025-05-09T16:48:00Z">
+      <w:ins w:id="16" w:author="Cummings, Shawn" w:date="2025-05-09T12:48:00Z" w16du:dateUtc="2025-05-09T16:48:00Z">
         <w:r>
           <w:rPr>
             <w:rFonts w:ascii="Times New Roman" w:hAnsi="Times New Roman" w:cs="Times New Roman"/>
@@ -2521,7 +2545,7 @@
           <w:t>p</w:t>
         </w:r>
       </w:ins>
-      <w:ins w:id="15" w:author="Cummings, Shawn" w:date="2025-05-09T12:46:00Z" w16du:dateUtc="2025-05-09T16:46:00Z">
+      <w:ins w:id="17" w:author="Cummings, Shawn" w:date="2025-05-09T12:46:00Z" w16du:dateUtc="2025-05-09T16:46:00Z">
         <w:r>
           <w:rPr>
             <w:rFonts w:ascii="Times New Roman" w:hAnsi="Times New Roman" w:cs="Times New Roman"/>
@@ -2531,7 +2555,7 @@
           <w:t xml:space="preserve">articipants were excluded if their mean log </w:t>
         </w:r>
       </w:ins>
-      <w:ins w:id="16" w:author="Cummings, Shawn" w:date="2025-05-09T12:48:00Z" w16du:dateUtc="2025-05-09T16:48:00Z">
+      <w:ins w:id="18" w:author="Cummings, Shawn" w:date="2025-05-09T12:48:00Z" w16du:dateUtc="2025-05-09T16:48:00Z">
         <w:r>
           <w:rPr>
             <w:rFonts w:ascii="Times New Roman" w:hAnsi="Times New Roman" w:cs="Times New Roman"/>
@@ -2541,7 +2565,7 @@
           <w:t>reaction time</w:t>
         </w:r>
       </w:ins>
-      <w:ins w:id="17" w:author="Cummings, Shawn" w:date="2025-05-09T12:46:00Z" w16du:dateUtc="2025-05-09T16:46:00Z">
+      <w:ins w:id="19" w:author="Cummings, Shawn" w:date="2025-05-09T12:46:00Z" w16du:dateUtc="2025-05-09T16:46:00Z">
         <w:r>
           <w:rPr>
             <w:rFonts w:ascii="Times New Roman" w:hAnsi="Times New Roman" w:cs="Times New Roman"/>
@@ -2551,7 +2575,7 @@
           <w:t xml:space="preserve"> was 3 </w:t>
         </w:r>
       </w:ins>
-      <w:ins w:id="18" w:author="Cummings, Shawn" w:date="2025-05-09T12:48:00Z" w16du:dateUtc="2025-05-09T16:48:00Z">
+      <w:ins w:id="20" w:author="Cummings, Shawn" w:date="2025-05-09T12:48:00Z" w16du:dateUtc="2025-05-09T16:48:00Z">
         <w:r>
           <w:rPr>
             <w:rFonts w:ascii="Times New Roman" w:hAnsi="Times New Roman" w:cs="Times New Roman"/>
@@ -2561,7 +2585,7 @@
           <w:t>standard deviations</w:t>
         </w:r>
       </w:ins>
-      <w:ins w:id="19" w:author="Cummings, Shawn" w:date="2025-05-09T12:46:00Z" w16du:dateUtc="2025-05-09T16:46:00Z">
+      <w:ins w:id="21" w:author="Cummings, Shawn" w:date="2025-05-09T12:46:00Z" w16du:dateUtc="2025-05-09T16:46:00Z">
         <w:r>
           <w:rPr>
             <w:rFonts w:ascii="Times New Roman" w:hAnsi="Times New Roman" w:cs="Times New Roman"/>
@@ -2571,7 +2595,7 @@
           <w:t xml:space="preserve"> above or below the mean</w:t>
         </w:r>
       </w:ins>
-      <w:ins w:id="20" w:author="Cummings, Shawn" w:date="2025-05-09T12:48:00Z" w16du:dateUtc="2025-05-09T16:48:00Z">
+      <w:ins w:id="22" w:author="Cummings, Shawn" w:date="2025-05-09T12:48:00Z" w16du:dateUtc="2025-05-09T16:48:00Z">
         <w:r>
           <w:rPr>
             <w:rFonts w:ascii="Times New Roman" w:hAnsi="Times New Roman" w:cs="Times New Roman"/>
@@ -2776,8 +2800,8 @@
           <w:szCs w:val="24"/>
         </w:rPr>
       </w:pPr>
-      <w:commentRangeStart w:id="21"/>
-      <w:commentRangeStart w:id="22"/>
+      <w:commentRangeStart w:id="23"/>
+      <w:commentRangeStart w:id="24"/>
       <w:r>
         <w:rPr>
           <w:rFonts w:ascii="Times New Roman" w:hAnsi="Times New Roman" w:cs="Times New Roman"/>
@@ -2786,19 +2810,19 @@
         </w:rPr>
         <w:t>We have added ____.</w:t>
       </w:r>
-      <w:commentRangeEnd w:id="21"/>
+      <w:commentRangeEnd w:id="23"/>
       <w:r>
         <w:rPr>
           <w:rStyle w:val="CommentReference"/>
         </w:rPr>
-        <w:commentReference w:id="21"/>
-      </w:r>
-      <w:commentRangeEnd w:id="22"/>
+        <w:commentReference w:id="23"/>
+      </w:r>
+      <w:commentRangeEnd w:id="24"/>
       <w:r>
         <w:rPr>
           <w:rStyle w:val="CommentReference"/>
         </w:rPr>
-        <w:commentReference w:id="22"/>
+        <w:commentReference w:id="24"/>
       </w:r>
     </w:p>
     <w:p>
@@ -2832,7 +2856,16 @@
           <w:sz w:val="24"/>
           <w:szCs w:val="24"/>
         </w:rPr>
-        <w:t xml:space="preserve">-it is impossible to understand the difference between the a-c versions of Experiment 1 without reading the supplemental materials. All the main text says is that there were different test stimuli across their experiments, because they were chosen such that they elicited a certain percent of s and </w:t>
+        <w:t>-</w:t>
+      </w:r>
+      <w:commentRangeStart w:id="25"/>
+      <w:r>
+        <w:rPr>
+          <w:rFonts w:ascii="Times New Roman" w:hAnsi="Times New Roman" w:cs="Times New Roman"/>
+          <w:sz w:val="24"/>
+          <w:szCs w:val="24"/>
+        </w:rPr>
+        <w:t xml:space="preserve">it is impossible to understand the difference between the a-c versions of Experiment 1 without reading the supplemental materials. All the main text says is that there were different test stimuli across their experiments, because they were chosen such that they elicited a certain percent of s and </w:t>
       </w:r>
       <w:proofErr w:type="spellStart"/>
       <w:r>
@@ -2897,6 +2930,13 @@
           <w:szCs w:val="24"/>
         </w:rPr>
         <w:t>We have followed these suggestions (thank you for going the extra step of identifying the parts that are critical for understanding the experiments).</w:t>
+      </w:r>
+      <w:commentRangeEnd w:id="25"/>
+      <w:r>
+        <w:rPr>
+          <w:rStyle w:val="CommentReference"/>
+        </w:rPr>
+        <w:commentReference w:id="25"/>
       </w:r>
     </w:p>
     <w:p>
@@ -3304,7 +3344,7 @@
           <w:szCs w:val="24"/>
         </w:rPr>
       </w:pPr>
-      <w:commentRangeStart w:id="23"/>
+      <w:commentRangeStart w:id="26"/>
       <w:r>
         <w:rPr>
           <w:rFonts w:ascii="Times New Roman" w:hAnsi="Times New Roman" w:cs="Times New Roman"/>
@@ -3313,134 +3353,134 @@
         </w:rPr>
         <w:t>We have added ____.</w:t>
       </w:r>
-      <w:commentRangeEnd w:id="23"/>
+      <w:commentRangeEnd w:id="26"/>
       <w:r>
         <w:rPr>
           <w:rStyle w:val="CommentReference"/>
         </w:rPr>
-        <w:commentReference w:id="23"/>
-      </w:r>
-    </w:p>
-    <w:p>
-      <w:pPr>
-        <w:spacing w:after="0" w:line="240" w:lineRule="auto"/>
-        <w:rPr>
-          <w:rFonts w:ascii="Times New Roman" w:hAnsi="Times New Roman" w:cs="Times New Roman"/>
-          <w:sz w:val="24"/>
-          <w:szCs w:val="24"/>
-        </w:rPr>
-      </w:pPr>
-    </w:p>
-    <w:p>
-      <w:pPr>
-        <w:spacing w:after="0" w:line="240" w:lineRule="auto"/>
-        <w:rPr>
-          <w:rFonts w:ascii="Times New Roman" w:hAnsi="Times New Roman" w:cs="Times New Roman"/>
-          <w:sz w:val="24"/>
-          <w:szCs w:val="24"/>
-        </w:rPr>
-      </w:pPr>
-    </w:p>
-    <w:p>
-      <w:pPr>
-        <w:spacing w:after="0" w:line="240" w:lineRule="auto"/>
-        <w:rPr>
-          <w:rFonts w:ascii="Times New Roman" w:hAnsi="Times New Roman" w:cs="Times New Roman"/>
-          <w:sz w:val="24"/>
-          <w:szCs w:val="24"/>
-        </w:rPr>
-      </w:pPr>
-    </w:p>
-    <w:p>
-      <w:pPr>
-        <w:spacing w:after="0" w:line="240" w:lineRule="auto"/>
-        <w:rPr>
-          <w:rFonts w:ascii="Times New Roman" w:hAnsi="Times New Roman" w:cs="Times New Roman"/>
-          <w:sz w:val="24"/>
-          <w:szCs w:val="24"/>
-        </w:rPr>
-      </w:pPr>
-    </w:p>
-    <w:p>
-      <w:pPr>
-        <w:spacing w:after="0" w:line="240" w:lineRule="auto"/>
-        <w:rPr>
-          <w:rFonts w:ascii="Times New Roman" w:hAnsi="Times New Roman" w:cs="Times New Roman"/>
-          <w:sz w:val="24"/>
-          <w:szCs w:val="24"/>
-        </w:rPr>
-      </w:pPr>
-    </w:p>
-    <w:p>
-      <w:pPr>
-        <w:spacing w:after="0" w:line="240" w:lineRule="auto"/>
-        <w:rPr>
-          <w:rFonts w:ascii="Times New Roman" w:hAnsi="Times New Roman" w:cs="Times New Roman"/>
-          <w:sz w:val="24"/>
-          <w:szCs w:val="24"/>
-        </w:rPr>
-      </w:pPr>
-    </w:p>
-    <w:p>
-      <w:pPr>
-        <w:spacing w:after="0" w:line="240" w:lineRule="auto"/>
-        <w:rPr>
-          <w:rFonts w:ascii="Times New Roman" w:hAnsi="Times New Roman" w:cs="Times New Roman"/>
-          <w:sz w:val="24"/>
-          <w:szCs w:val="24"/>
-        </w:rPr>
-      </w:pPr>
-    </w:p>
-    <w:p>
-      <w:pPr>
-        <w:spacing w:after="0" w:line="240" w:lineRule="auto"/>
-        <w:rPr>
-          <w:rFonts w:ascii="Times New Roman" w:hAnsi="Times New Roman" w:cs="Times New Roman"/>
-          <w:sz w:val="24"/>
-          <w:szCs w:val="24"/>
-        </w:rPr>
-      </w:pPr>
-    </w:p>
-    <w:p>
-      <w:pPr>
-        <w:spacing w:after="0" w:line="240" w:lineRule="auto"/>
-        <w:rPr>
-          <w:rFonts w:ascii="Times New Roman" w:hAnsi="Times New Roman" w:cs="Times New Roman"/>
-          <w:sz w:val="24"/>
-          <w:szCs w:val="24"/>
-        </w:rPr>
-      </w:pPr>
-    </w:p>
-    <w:p>
-      <w:pPr>
-        <w:spacing w:after="0" w:line="240" w:lineRule="auto"/>
-        <w:rPr>
-          <w:rFonts w:ascii="Times New Roman" w:hAnsi="Times New Roman" w:cs="Times New Roman"/>
-          <w:sz w:val="24"/>
-          <w:szCs w:val="24"/>
-        </w:rPr>
-      </w:pPr>
-    </w:p>
-    <w:p>
-      <w:pPr>
-        <w:spacing w:after="0" w:line="240" w:lineRule="auto"/>
-        <w:rPr>
-          <w:rFonts w:ascii="Times New Roman" w:hAnsi="Times New Roman" w:cs="Times New Roman"/>
-          <w:sz w:val="24"/>
-          <w:szCs w:val="24"/>
-        </w:rPr>
-      </w:pPr>
-    </w:p>
-    <w:p>
-      <w:pPr>
-        <w:rPr>
-          <w:del w:id="24" w:author="Cummings, Shawn" w:date="2025-05-09T12:49:00Z" w16du:dateUtc="2025-05-09T16:49:00Z"/>
-          <w:rFonts w:ascii="Times New Roman" w:hAnsi="Times New Roman" w:cs="Times New Roman"/>
-          <w:sz w:val="24"/>
-          <w:szCs w:val="24"/>
-        </w:rPr>
-      </w:pPr>
-      <w:del w:id="25" w:author="Cummings, Shawn" w:date="2025-05-09T12:49:00Z" w16du:dateUtc="2025-05-09T16:49:00Z">
+        <w:commentReference w:id="26"/>
+      </w:r>
+    </w:p>
+    <w:p>
+      <w:pPr>
+        <w:spacing w:after="0" w:line="240" w:lineRule="auto"/>
+        <w:rPr>
+          <w:rFonts w:ascii="Times New Roman" w:hAnsi="Times New Roman" w:cs="Times New Roman"/>
+          <w:sz w:val="24"/>
+          <w:szCs w:val="24"/>
+        </w:rPr>
+      </w:pPr>
+    </w:p>
+    <w:p>
+      <w:pPr>
+        <w:spacing w:after="0" w:line="240" w:lineRule="auto"/>
+        <w:rPr>
+          <w:rFonts w:ascii="Times New Roman" w:hAnsi="Times New Roman" w:cs="Times New Roman"/>
+          <w:sz w:val="24"/>
+          <w:szCs w:val="24"/>
+        </w:rPr>
+      </w:pPr>
+    </w:p>
+    <w:p>
+      <w:pPr>
+        <w:spacing w:after="0" w:line="240" w:lineRule="auto"/>
+        <w:rPr>
+          <w:rFonts w:ascii="Times New Roman" w:hAnsi="Times New Roman" w:cs="Times New Roman"/>
+          <w:sz w:val="24"/>
+          <w:szCs w:val="24"/>
+        </w:rPr>
+      </w:pPr>
+    </w:p>
+    <w:p>
+      <w:pPr>
+        <w:spacing w:after="0" w:line="240" w:lineRule="auto"/>
+        <w:rPr>
+          <w:rFonts w:ascii="Times New Roman" w:hAnsi="Times New Roman" w:cs="Times New Roman"/>
+          <w:sz w:val="24"/>
+          <w:szCs w:val="24"/>
+        </w:rPr>
+      </w:pPr>
+    </w:p>
+    <w:p>
+      <w:pPr>
+        <w:spacing w:after="0" w:line="240" w:lineRule="auto"/>
+        <w:rPr>
+          <w:rFonts w:ascii="Times New Roman" w:hAnsi="Times New Roman" w:cs="Times New Roman"/>
+          <w:sz w:val="24"/>
+          <w:szCs w:val="24"/>
+        </w:rPr>
+      </w:pPr>
+    </w:p>
+    <w:p>
+      <w:pPr>
+        <w:spacing w:after="0" w:line="240" w:lineRule="auto"/>
+        <w:rPr>
+          <w:rFonts w:ascii="Times New Roman" w:hAnsi="Times New Roman" w:cs="Times New Roman"/>
+          <w:sz w:val="24"/>
+          <w:szCs w:val="24"/>
+        </w:rPr>
+      </w:pPr>
+    </w:p>
+    <w:p>
+      <w:pPr>
+        <w:spacing w:after="0" w:line="240" w:lineRule="auto"/>
+        <w:rPr>
+          <w:rFonts w:ascii="Times New Roman" w:hAnsi="Times New Roman" w:cs="Times New Roman"/>
+          <w:sz w:val="24"/>
+          <w:szCs w:val="24"/>
+        </w:rPr>
+      </w:pPr>
+    </w:p>
+    <w:p>
+      <w:pPr>
+        <w:spacing w:after="0" w:line="240" w:lineRule="auto"/>
+        <w:rPr>
+          <w:rFonts w:ascii="Times New Roman" w:hAnsi="Times New Roman" w:cs="Times New Roman"/>
+          <w:sz w:val="24"/>
+          <w:szCs w:val="24"/>
+        </w:rPr>
+      </w:pPr>
+    </w:p>
+    <w:p>
+      <w:pPr>
+        <w:spacing w:after="0" w:line="240" w:lineRule="auto"/>
+        <w:rPr>
+          <w:rFonts w:ascii="Times New Roman" w:hAnsi="Times New Roman" w:cs="Times New Roman"/>
+          <w:sz w:val="24"/>
+          <w:szCs w:val="24"/>
+        </w:rPr>
+      </w:pPr>
+    </w:p>
+    <w:p>
+      <w:pPr>
+        <w:spacing w:after="0" w:line="240" w:lineRule="auto"/>
+        <w:rPr>
+          <w:rFonts w:ascii="Times New Roman" w:hAnsi="Times New Roman" w:cs="Times New Roman"/>
+          <w:sz w:val="24"/>
+          <w:szCs w:val="24"/>
+        </w:rPr>
+      </w:pPr>
+    </w:p>
+    <w:p>
+      <w:pPr>
+        <w:spacing w:after="0" w:line="240" w:lineRule="auto"/>
+        <w:rPr>
+          <w:rFonts w:ascii="Times New Roman" w:hAnsi="Times New Roman" w:cs="Times New Roman"/>
+          <w:sz w:val="24"/>
+          <w:szCs w:val="24"/>
+        </w:rPr>
+      </w:pPr>
+    </w:p>
+    <w:p>
+      <w:pPr>
+        <w:rPr>
+          <w:del w:id="27" w:author="Cummings, Shawn" w:date="2025-05-09T12:49:00Z" w16du:dateUtc="2025-05-09T16:49:00Z"/>
+          <w:rFonts w:ascii="Times New Roman" w:hAnsi="Times New Roman" w:cs="Times New Roman"/>
+          <w:sz w:val="24"/>
+          <w:szCs w:val="24"/>
+        </w:rPr>
+      </w:pPr>
+      <w:del w:id="28" w:author="Cummings, Shawn" w:date="2025-05-09T12:49:00Z" w16du:dateUtc="2025-05-09T16:49:00Z">
         <w:r>
           <w:rPr>
             <w:rFonts w:ascii="Times New Roman" w:hAnsi="Times New Roman" w:cs="Times New Roman"/>
@@ -3455,14 +3495,14 @@
       <w:pPr>
         <w:spacing w:after="0" w:line="240" w:lineRule="auto"/>
         <w:rPr>
-          <w:del w:id="26" w:author="Cummings, Shawn" w:date="2025-05-09T12:49:00Z" w16du:dateUtc="2025-05-09T16:49:00Z"/>
-          <w:rFonts w:ascii="Times New Roman" w:hAnsi="Times New Roman" w:cs="Times New Roman"/>
-          <w:sz w:val="24"/>
-          <w:szCs w:val="24"/>
-        </w:rPr>
-      </w:pPr>
-      <w:commentRangeStart w:id="27"/>
-      <w:del w:id="28" w:author="Cummings, Shawn" w:date="2025-05-09T12:49:00Z" w16du:dateUtc="2025-05-09T16:49:00Z">
+          <w:del w:id="29" w:author="Cummings, Shawn" w:date="2025-05-09T12:49:00Z" w16du:dateUtc="2025-05-09T16:49:00Z"/>
+          <w:rFonts w:ascii="Times New Roman" w:hAnsi="Times New Roman" w:cs="Times New Roman"/>
+          <w:sz w:val="24"/>
+          <w:szCs w:val="24"/>
+        </w:rPr>
+      </w:pPr>
+      <w:commentRangeStart w:id="30"/>
+      <w:del w:id="31" w:author="Cummings, Shawn" w:date="2025-05-09T12:49:00Z" w16du:dateUtc="2025-05-09T16:49:00Z">
         <w:r>
           <w:rPr>
             <w:rFonts w:ascii="Times New Roman" w:hAnsi="Times New Roman" w:cs="Times New Roman"/>
@@ -3471,12 +3511,12 @@
           </w:rPr>
           <w:delText>TYPOS:</w:delText>
         </w:r>
-        <w:commentRangeEnd w:id="27"/>
+        <w:commentRangeEnd w:id="30"/>
         <w:r>
           <w:rPr>
             <w:rStyle w:val="CommentReference"/>
           </w:rPr>
-          <w:commentReference w:id="27"/>
+          <w:commentReference w:id="30"/>
         </w:r>
       </w:del>
     </w:p>
@@ -3484,7 +3524,7 @@
       <w:pPr>
         <w:spacing w:after="0" w:line="240" w:lineRule="auto"/>
         <w:rPr>
-          <w:del w:id="29" w:author="Cummings, Shawn" w:date="2025-05-09T12:49:00Z" w16du:dateUtc="2025-05-09T16:49:00Z"/>
+          <w:del w:id="32" w:author="Cummings, Shawn" w:date="2025-05-09T12:49:00Z" w16du:dateUtc="2025-05-09T16:49:00Z"/>
           <w:rFonts w:ascii="Times New Roman" w:hAnsi="Times New Roman" w:cs="Times New Roman"/>
           <w:sz w:val="24"/>
           <w:szCs w:val="24"/>
@@ -3501,23 +3541,23 @@
         </w:pBdr>
         <w:spacing w:after="0" w:line="240" w:lineRule="auto"/>
         <w:rPr>
-          <w:del w:id="30" w:author="Cummings, Shawn" w:date="2025-05-09T12:49:00Z" w16du:dateUtc="2025-05-09T16:49:00Z"/>
-          <w:rFonts w:ascii="Times New Roman" w:hAnsi="Times New Roman" w:cs="Times New Roman"/>
-          <w:sz w:val="24"/>
-          <w:szCs w:val="24"/>
-        </w:rPr>
-      </w:pPr>
-    </w:p>
-    <w:p>
-      <w:pPr>
-        <w:spacing w:after="0" w:line="240" w:lineRule="auto"/>
-        <w:rPr>
-          <w:rFonts w:ascii="Times New Roman" w:hAnsi="Times New Roman" w:cs="Times New Roman"/>
-          <w:sz w:val="24"/>
-          <w:szCs w:val="24"/>
-        </w:rPr>
-      </w:pPr>
-      <w:del w:id="31" w:author="Cummings, Shawn" w:date="2025-05-09T12:49:00Z" w16du:dateUtc="2025-05-09T16:49:00Z">
+          <w:del w:id="33" w:author="Cummings, Shawn" w:date="2025-05-09T12:49:00Z" w16du:dateUtc="2025-05-09T16:49:00Z"/>
+          <w:rFonts w:ascii="Times New Roman" w:hAnsi="Times New Roman" w:cs="Times New Roman"/>
+          <w:sz w:val="24"/>
+          <w:szCs w:val="24"/>
+        </w:rPr>
+      </w:pPr>
+    </w:p>
+    <w:p>
+      <w:pPr>
+        <w:spacing w:after="0" w:line="240" w:lineRule="auto"/>
+        <w:rPr>
+          <w:rFonts w:ascii="Times New Roman" w:hAnsi="Times New Roman" w:cs="Times New Roman"/>
+          <w:sz w:val="24"/>
+          <w:szCs w:val="24"/>
+        </w:rPr>
+      </w:pPr>
+      <w:del w:id="34" w:author="Cummings, Shawn" w:date="2025-05-09T12:49:00Z" w16du:dateUtc="2025-05-09T16:49:00Z">
         <w:r>
           <w:rPr>
             <w:rFonts w:ascii="Times New Roman" w:hAnsi="Times New Roman" w:cs="Times New Roman"/>
@@ -3554,7 +3594,7 @@
 
 <file path=word/comments.xml><?xml version="1.0" encoding="utf-8"?>
 <w:comments xmlns:wpc="http://schemas.microsoft.com/office/word/2010/wordprocessingCanvas" xmlns:cx="http://schemas.microsoft.com/office/drawing/2014/chartex" xmlns:cx1="http://schemas.microsoft.com/office/drawing/2015/9/8/chartex" xmlns:cx2="http://schemas.microsoft.com/office/drawing/2015/10/21/chartex" xmlns:cx3="http://schemas.microsoft.com/office/drawing/2016/5/9/chartex" xmlns:cx4="http://schemas.microsoft.com/office/drawing/2016/5/10/chartex" xmlns:cx5="http://schemas.microsoft.com/office/drawing/2016/5/11/chartex" xmlns:cx6="http://schemas.microsoft.com/office/drawing/2016/5/12/chartex" xmlns:cx7="http://schemas.microsoft.com/office/drawing/2016/5/13/chartex" xmlns:cx8="http://schemas.microsoft.com/office/drawing/2016/5/14/chartex" xmlns:mc="http://schemas.openxmlformats.org/markup-compatibility/2006" xmlns:aink="http://schemas.microsoft.com/office/drawing/2016/ink" xmlns:am3d="http://schemas.microsoft.com/office/drawing/2017/model3d" xmlns:o="urn:schemas-microsoft-com:office:office" xmlns:oel="http://schemas.microsoft.com/office/2019/extlst" xmlns:r="http://schemas.openxmlformats.org/officeDocument/2006/relationships" xmlns:m="http://schemas.openxmlformats.org/officeDocument/2006/math" xmlns:v="urn:schemas-microsoft-com:vml" xmlns:wp14="http://schemas.microsoft.com/office/word/2010/wordprocessingDrawing" xmlns:wp="http://schemas.openxmlformats.org/drawingml/2006/wordprocessingDrawing" xmlns:w10="urn:schemas-microsoft-com:office:word" xmlns:w="http://schemas.openxmlformats.org/wordprocessingml/2006/main" xmlns:w14="http://schemas.microsoft.com/office/word/2010/wordml" xmlns:w15="http://schemas.microsoft.com/office/word/2012/wordml" xmlns:w16cex="http://schemas.microsoft.com/office/word/2018/wordml/cex" xmlns:w16cid="http://schemas.microsoft.com/office/word/2016/wordml/cid" xmlns:w16="http://schemas.microsoft.com/office/word/2018/wordml" xmlns:w16du="http://schemas.microsoft.com/office/word/2023/wordml/word16du" xmlns:w16sdtdh="http://schemas.microsoft.com/office/word/2020/wordml/sdtdatahash" xmlns:w16se="http://schemas.microsoft.com/office/word/2015/wordml/symex" xmlns:wpg="http://schemas.microsoft.com/office/word/2010/wordprocessingGroup" xmlns:wpi="http://schemas.microsoft.com/office/word/2010/wordprocessingInk" xmlns:wne="http://schemas.microsoft.com/office/word/2006/wordml" xmlns:wps="http://schemas.microsoft.com/office/word/2010/wordprocessingShape" mc:Ignorable="w14 w15 w16se w16cid w16 w16cex w16sdtdh w16du wp14">
-  <w:comment w:id="2" w:author="Cummings, Shawn" w:date="2025-05-09T13:18:00Z" w:initials="SC">
+  <w:comment w:id="1" w:author="Cummings, Shawn" w:date="2025-05-09T14:25:00Z" w:initials="SC">
     <w:p>
       <w:r>
         <w:rPr>
@@ -3567,11 +3607,81 @@
           <w:sz w:val="20"/>
           <w:szCs w:val="20"/>
         </w:rPr>
+        <w:t>In disc. Of E2:</w:t>
+      </w:r>
+    </w:p>
+    <w:p>
+      <w:r>
+        <w:rPr>
+          <w:sz w:val="20"/>
+          <w:szCs w:val="20"/>
+        </w:rPr>
+        <w:t xml:space="preserve">-sensitivity to continuum preserved , it’s not just inattention. </w:t>
+      </w:r>
+    </w:p>
+    <w:p>
+      <w:r>
+        <w:rPr>
+          <w:sz w:val="20"/>
+          <w:szCs w:val="20"/>
+        </w:rPr>
+        <w:t>-distraction is a potential concern: to really adjudicate, one would need the wild goose chase of a global filter/occluder and another condition with non-occluding distractor…</w:t>
+      </w:r>
+    </w:p>
+    <w:p>
+      <w:r>
+        <w:rPr>
+          <w:sz w:val="20"/>
+          <w:szCs w:val="20"/>
+        </w:rPr>
+        <w:t>-RT is the same, which speaks against any strong confusion</w:t>
+      </w:r>
+    </w:p>
+    <w:p>
+      <w:r>
+        <w:rPr>
+          <w:sz w:val="20"/>
+          <w:szCs w:val="20"/>
+        </w:rPr>
+        <w:t>-TWO POSSIBILITIES: people are just distracted, we can’t rule out but not super plausible (black box always showed up, sensitivity retained, no diff in RT), OR we made the visual information harder to access (so either listeners missed it more often or disengaged.</w:t>
+      </w:r>
+    </w:p>
+  </w:comment>
+  <w:comment w:id="2" w:author="Cummings, Shawn" w:date="2025-05-09T14:26:00Z" w:initials="SC">
+    <w:p>
+      <w:r>
+        <w:rPr>
+          <w:rStyle w:val="CommentReference"/>
+        </w:rPr>
+        <w:annotationRef/>
+      </w:r>
+      <w:r>
+        <w:rPr>
+          <w:sz w:val="20"/>
+          <w:szCs w:val="20"/>
+        </w:rPr>
+        <w:t>2nd option left for future experiments</w:t>
+      </w:r>
+    </w:p>
+  </w:comment>
+  <w:comment w:id="4" w:author="Cummings, Shawn" w:date="2025-05-09T13:18:00Z" w:initials="SC">
+    <w:p>
+      <w:r>
+        <w:rPr>
+          <w:rStyle w:val="CommentReference"/>
+        </w:rPr>
+        <w:annotationRef/>
+      </w:r>
+      <w:r>
+        <w:rPr>
+          <w:sz w:val="20"/>
+          <w:szCs w:val="20"/>
+        </w:rPr>
         <w:t>Unless we instead just remove the LJ18 line</w:t>
       </w:r>
     </w:p>
   </w:comment>
-  <w:comment w:id="21" w:author="Jaeger, Florian" w:date="2025-05-08T18:41:00Z" w:initials="TJ">
+  <w:comment w:id="23" w:author="Jaeger, Florian" w:date="2025-05-08T18:41:00Z" w:initials="TJ">
     <w:p>
       <w:r>
         <w:rPr>
@@ -3589,7 +3699,7 @@
       </w:r>
     </w:p>
   </w:comment>
-  <w:comment w:id="22" w:author="Cummings, Shawn" w:date="2025-05-09T12:06:00Z" w:initials="SC">
+  <w:comment w:id="24" w:author="Cummings, Shawn" w:date="2025-05-09T12:06:00Z" w:initials="SC">
     <w:p>
       <w:r>
         <w:rPr>
@@ -3606,7 +3716,24 @@
       </w:r>
     </w:p>
   </w:comment>
-  <w:comment w:id="23" w:author="Jaeger, Florian" w:date="2025-05-08T18:51:00Z" w:initials="TJ">
+  <w:comment w:id="25" w:author="Cummings, Shawn" w:date="2025-05-09T13:26:00Z" w:initials="SC">
+    <w:p>
+      <w:r>
+        <w:rPr>
+          <w:rStyle w:val="CommentReference"/>
+        </w:rPr>
+        <w:annotationRef/>
+      </w:r>
+      <w:r>
+        <w:rPr>
+          <w:sz w:val="20"/>
+          <w:szCs w:val="20"/>
+        </w:rPr>
+        <w:t xml:space="preserve">I actually think this reader got garden-pathed by E1a-b? </w:t>
+      </w:r>
+    </w:p>
+  </w:comment>
+  <w:comment w:id="26" w:author="Jaeger, Florian" w:date="2025-05-08T18:51:00Z" w:initials="TJ">
     <w:p>
       <w:r>
         <w:rPr>
@@ -3624,7 +3751,7 @@
       </w:r>
     </w:p>
   </w:comment>
-  <w:comment w:id="27" w:author="Cummings, Shawn" w:date="2025-05-03T11:40:00Z" w:initials="SC">
+  <w:comment w:id="30" w:author="Cummings, Shawn" w:date="2025-05-03T11:40:00Z" w:initials="SC">
     <w:p>
       <w:pPr>
         <w:pStyle w:val="CommentText"/>
@@ -3645,9 +3772,12 @@
 
 <file path=word/commentsExtended.xml><?xml version="1.0" encoding="utf-8"?>
 <w15:commentsEx xmlns:wpc="http://schemas.microsoft.com/office/word/2010/wordprocessingCanvas" xmlns:cx="http://schemas.microsoft.com/office/drawing/2014/chartex" xmlns:cx1="http://schemas.microsoft.com/office/drawing/2015/9/8/chartex" xmlns:cx2="http://schemas.microsoft.com/office/drawing/2015/10/21/chartex" xmlns:cx3="http://schemas.microsoft.com/office/drawing/2016/5/9/chartex" xmlns:cx4="http://schemas.microsoft.com/office/drawing/2016/5/10/chartex" xmlns:cx5="http://schemas.microsoft.com/office/drawing/2016/5/11/chartex" xmlns:cx6="http://schemas.microsoft.com/office/drawing/2016/5/12/chartex" xmlns:cx7="http://schemas.microsoft.com/office/drawing/2016/5/13/chartex" xmlns:cx8="http://schemas.microsoft.com/office/drawing/2016/5/14/chartex" xmlns:mc="http://schemas.openxmlformats.org/markup-compatibility/2006" xmlns:aink="http://schemas.microsoft.com/office/drawing/2016/ink" xmlns:am3d="http://schemas.microsoft.com/office/drawing/2017/model3d" xmlns:o="urn:schemas-microsoft-com:office:office" xmlns:oel="http://schemas.microsoft.com/office/2019/extlst" xmlns:r="http://schemas.openxmlformats.org/officeDocument/2006/relationships" xmlns:m="http://schemas.openxmlformats.org/officeDocument/2006/math" xmlns:v="urn:schemas-microsoft-com:vml" xmlns:wp14="http://schemas.microsoft.com/office/word/2010/wordprocessingDrawing" xmlns:wp="http://schemas.openxmlformats.org/drawingml/2006/wordprocessingDrawing" xmlns:w10="urn:schemas-microsoft-com:office:word" xmlns:w="http://schemas.openxmlformats.org/wordprocessingml/2006/main" xmlns:w14="http://schemas.microsoft.com/office/word/2010/wordml" xmlns:w15="http://schemas.microsoft.com/office/word/2012/wordml" xmlns:w16cex="http://schemas.microsoft.com/office/word/2018/wordml/cex" xmlns:w16cid="http://schemas.microsoft.com/office/word/2016/wordml/cid" xmlns:w16="http://schemas.microsoft.com/office/word/2018/wordml" xmlns:w16du="http://schemas.microsoft.com/office/word/2023/wordml/word16du" xmlns:w16sdtdh="http://schemas.microsoft.com/office/word/2020/wordml/sdtdatahash" xmlns:w16se="http://schemas.microsoft.com/office/word/2015/wordml/symex" xmlns:wpg="http://schemas.microsoft.com/office/word/2010/wordprocessingGroup" xmlns:wpi="http://schemas.microsoft.com/office/word/2010/wordprocessingInk" xmlns:wne="http://schemas.microsoft.com/office/word/2006/wordml" xmlns:wps="http://schemas.microsoft.com/office/word/2010/wordprocessingShape" mc:Ignorable="w14 w15 w16se w16cid w16 w16cex w16sdtdh w16du wp14">
+  <w15:commentEx w15:paraId="5DE0D8CE" w15:done="0"/>
+  <w15:commentEx w15:paraId="7AF8D018" w15:paraIdParent="5DE0D8CE" w15:done="0"/>
   <w15:commentEx w15:paraId="492B34B2" w15:done="0"/>
   <w15:commentEx w15:paraId="6F322517" w15:done="0"/>
   <w15:commentEx w15:paraId="176D0065" w15:paraIdParent="6F322517" w15:done="0"/>
+  <w15:commentEx w15:paraId="4DC50076" w15:done="0"/>
   <w15:commentEx w15:paraId="2A929C5A" w15:done="0"/>
   <w15:commentEx w15:paraId="6D2F08B0" w15:done="1"/>
 </w15:commentsEx>
@@ -3655,9 +3785,12 @@
 
 <file path=word/commentsExtensible.xml><?xml version="1.0" encoding="utf-8"?>
 <w16cex:commentsExtensible xmlns:wpc="http://schemas.microsoft.com/office/word/2010/wordprocessingCanvas" xmlns:cx="http://schemas.microsoft.com/office/drawing/2014/chartex" xmlns:cx1="http://schemas.microsoft.com/office/drawing/2015/9/8/chartex" xmlns:cx2="http://schemas.microsoft.com/office/drawing/2015/10/21/chartex" xmlns:cx3="http://schemas.microsoft.com/office/drawing/2016/5/9/chartex" xmlns:cx4="http://schemas.microsoft.com/office/drawing/2016/5/10/chartex" xmlns:cx5="http://schemas.microsoft.com/office/drawing/2016/5/11/chartex" xmlns:cx6="http://schemas.microsoft.com/office/drawing/2016/5/12/chartex" xmlns:cx7="http://schemas.microsoft.com/office/drawing/2016/5/13/chartex" xmlns:cx8="http://schemas.microsoft.com/office/drawing/2016/5/14/chartex" xmlns:cr="http://schemas.microsoft.com/office/comments/2020/reactions" xmlns:mc="http://schemas.openxmlformats.org/markup-compatibility/2006" xmlns:aink="http://schemas.microsoft.com/office/drawing/2016/ink" xmlns:am3d="http://schemas.microsoft.com/office/drawing/2017/model3d" xmlns:o="urn:schemas-microsoft-com:office:office" xmlns:oel="http://schemas.microsoft.com/office/2019/extlst" xmlns:r="http://schemas.openxmlformats.org/officeDocument/2006/relationships" xmlns:m="http://schemas.openxmlformats.org/officeDocument/2006/math" xmlns:v="urn:schemas-microsoft-com:vml" xmlns:wp14="http://schemas.microsoft.com/office/word/2010/wordprocessingDrawing" xmlns:wp="http://schemas.openxmlformats.org/drawingml/2006/wordprocessingDrawing" xmlns:w10="urn:schemas-microsoft-com:office:word" xmlns:w="http://schemas.openxmlformats.org/wordprocessingml/2006/main" xmlns:w14="http://schemas.microsoft.com/office/word/2010/wordml" xmlns:w15="http://schemas.microsoft.com/office/word/2012/wordml" xmlns:w16cex="http://schemas.microsoft.com/office/word/2018/wordml/cex" xmlns:w16cid="http://schemas.microsoft.com/office/word/2016/wordml/cid" xmlns:w16="http://schemas.microsoft.com/office/word/2018/wordml" xmlns:w16du="http://schemas.microsoft.com/office/word/2023/wordml/word16du" xmlns:w16sdtdh="http://schemas.microsoft.com/office/word/2020/wordml/sdtdatahash" xmlns:w16se="http://schemas.microsoft.com/office/word/2015/wordml/symex" xmlns:wpg="http://schemas.microsoft.com/office/word/2010/wordprocessingGroup" xmlns:wpi="http://schemas.microsoft.com/office/word/2010/wordprocessingInk" xmlns:wne="http://schemas.microsoft.com/office/word/2006/wordml" xmlns:wps="http://schemas.microsoft.com/office/word/2010/wordprocessingShape" mc:Ignorable="w14 w15 w16se w16cid w16 w16cex w16sdtdh cr w16du wp14">
+  <w16cex:commentExtensible w16cex:durableId="2359F89B" w16cex:dateUtc="2025-05-09T18:25:00Z"/>
+  <w16cex:commentExtensible w16cex:durableId="11B78463" w16cex:dateUtc="2025-05-09T18:26:00Z"/>
   <w16cex:commentExtensible w16cex:durableId="3BC2F3FC" w16cex:dateUtc="2025-05-09T17:18:00Z"/>
   <w16cex:commentExtensible w16cex:durableId="5FDB0EAD" w16cex:dateUtc="2025-05-08T22:41:00Z"/>
   <w16cex:commentExtensible w16cex:durableId="461AD974" w16cex:dateUtc="2025-05-09T16:06:00Z"/>
+  <w16cex:commentExtensible w16cex:durableId="0A32BC00" w16cex:dateUtc="2025-05-09T17:26:00Z"/>
   <w16cex:commentExtensible w16cex:durableId="019ED708" w16cex:dateUtc="2025-05-08T22:51:00Z"/>
   <w16cex:commentExtensible w16cex:durableId="45BDE0BE" w16cex:dateUtc="2025-05-03T15:40:00Z">
     <w16cex:extLst>
@@ -3677,9 +3810,12 @@
 
 <file path=word/commentsIds.xml><?xml version="1.0" encoding="utf-8"?>
 <w16cid:commentsIds xmlns:wpc="http://schemas.microsoft.com/office/word/2010/wordprocessingCanvas" xmlns:cx="http://schemas.microsoft.com/office/drawing/2014/chartex" xmlns:cx1="http://schemas.microsoft.com/office/drawing/2015/9/8/chartex" xmlns:cx2="http://schemas.microsoft.com/office/drawing/2015/10/21/chartex" xmlns:cx3="http://schemas.microsoft.com/office/drawing/2016/5/9/chartex" xmlns:cx4="http://schemas.microsoft.com/office/drawing/2016/5/10/chartex" xmlns:cx5="http://schemas.microsoft.com/office/drawing/2016/5/11/chartex" xmlns:cx6="http://schemas.microsoft.com/office/drawing/2016/5/12/chartex" xmlns:cx7="http://schemas.microsoft.com/office/drawing/2016/5/13/chartex" xmlns:cx8="http://schemas.microsoft.com/office/drawing/2016/5/14/chartex" xmlns:mc="http://schemas.openxmlformats.org/markup-compatibility/2006" xmlns:aink="http://schemas.microsoft.com/office/drawing/2016/ink" xmlns:am3d="http://schemas.microsoft.com/office/drawing/2017/model3d" xmlns:o="urn:schemas-microsoft-com:office:office" xmlns:oel="http://schemas.microsoft.com/office/2019/extlst" xmlns:r="http://schemas.openxmlformats.org/officeDocument/2006/relationships" xmlns:m="http://schemas.openxmlformats.org/officeDocument/2006/math" xmlns:v="urn:schemas-microsoft-com:vml" xmlns:wp14="http://schemas.microsoft.com/office/word/2010/wordprocessingDrawing" xmlns:wp="http://schemas.openxmlformats.org/drawingml/2006/wordprocessingDrawing" xmlns:w10="urn:schemas-microsoft-com:office:word" xmlns:w="http://schemas.openxmlformats.org/wordprocessingml/2006/main" xmlns:w14="http://schemas.microsoft.com/office/word/2010/wordml" xmlns:w15="http://schemas.microsoft.com/office/word/2012/wordml" xmlns:w16cex="http://schemas.microsoft.com/office/word/2018/wordml/cex" xmlns:w16cid="http://schemas.microsoft.com/office/word/2016/wordml/cid" xmlns:w16="http://schemas.microsoft.com/office/word/2018/wordml" xmlns:w16du="http://schemas.microsoft.com/office/word/2023/wordml/word16du" xmlns:w16sdtdh="http://schemas.microsoft.com/office/word/2020/wordml/sdtdatahash" xmlns:w16se="http://schemas.microsoft.com/office/word/2015/wordml/symex" xmlns:wpg="http://schemas.microsoft.com/office/word/2010/wordprocessingGroup" xmlns:wpi="http://schemas.microsoft.com/office/word/2010/wordprocessingInk" xmlns:wne="http://schemas.microsoft.com/office/word/2006/wordml" xmlns:wps="http://schemas.microsoft.com/office/word/2010/wordprocessingShape" mc:Ignorable="w14 w15 w16se w16cid w16 w16cex w16sdtdh w16du wp14">
+  <w16cid:commentId w16cid:paraId="5DE0D8CE" w16cid:durableId="2359F89B"/>
+  <w16cid:commentId w16cid:paraId="7AF8D018" w16cid:durableId="11B78463"/>
   <w16cid:commentId w16cid:paraId="492B34B2" w16cid:durableId="3BC2F3FC"/>
   <w16cid:commentId w16cid:paraId="6F322517" w16cid:durableId="5FDB0EAD"/>
   <w16cid:commentId w16cid:paraId="176D0065" w16cid:durableId="461AD974"/>
+  <w16cid:commentId w16cid:paraId="4DC50076" w16cid:durableId="0A32BC00"/>
   <w16cid:commentId w16cid:paraId="2A929C5A" w16cid:durableId="019ED708"/>
   <w16cid:commentId w16cid:paraId="6D2F08B0" w16cid:durableId="45BDE0BE"/>
 </w16cid:commentsIds>
@@ -3726,7 +3862,7 @@
     <w:pPr>
       <w:pStyle w:val="Footer"/>
     </w:pPr>
-    <w:bookmarkStart w:id="32" w:name="TITUS1FooterPrimary"/>
+    <w:bookmarkStart w:id="35" w:name="TITUS1FooterPrimary"/>
     <w:r>
       <w:rPr>
         <w:color w:val="000000"/>
@@ -3734,7 +3870,7 @@
       </w:rPr>
       <w:t>  </w:t>
     </w:r>
-    <w:bookmarkEnd w:id="32"/>
+    <w:bookmarkEnd w:id="35"/>
   </w:p>
 </w:ftr>
 </file>

</xml_diff>

<commit_message>
accepted changes and added a few
</commit_message>
<xml_diff>
--- a/output/papers/Round 2/Response-to-reviewers.docx
+++ b/output/papers/Round 2/Response-to-reviewers.docx
@@ -1,6 +1,6 @@
 
 <file path=word/document.xml><?xml version="1.0" encoding="utf-8"?>
-<w:document xmlns:wpc="http://schemas.microsoft.com/office/word/2010/wordprocessingCanvas" xmlns:cx="http://schemas.microsoft.com/office/drawing/2014/chartex" xmlns:cx1="http://schemas.microsoft.com/office/drawing/2015/9/8/chartex" xmlns:cx2="http://schemas.microsoft.com/office/drawing/2015/10/21/chartex" xmlns:cx3="http://schemas.microsoft.com/office/drawing/2016/5/9/chartex" xmlns:cx4="http://schemas.microsoft.com/office/drawing/2016/5/10/chartex" xmlns:cx5="http://schemas.microsoft.com/office/drawing/2016/5/11/chartex" xmlns:cx6="http://schemas.microsoft.com/office/drawing/2016/5/12/chartex" xmlns:cx7="http://schemas.microsoft.com/office/drawing/2016/5/13/chartex" xmlns:cx8="http://schemas.microsoft.com/office/drawing/2016/5/14/chartex" xmlns:mc="http://schemas.openxmlformats.org/markup-compatibility/2006" xmlns:aink="http://schemas.microsoft.com/office/drawing/2016/ink" xmlns:am3d="http://schemas.microsoft.com/office/drawing/2017/model3d" xmlns:o="urn:schemas-microsoft-com:office:office" xmlns:oel="http://schemas.microsoft.com/office/2019/extlst" xmlns:r="http://schemas.openxmlformats.org/officeDocument/2006/relationships" xmlns:m="http://schemas.openxmlformats.org/officeDocument/2006/math" xmlns:v="urn:schemas-microsoft-com:vml" xmlns:wp14="http://schemas.microsoft.com/office/word/2010/wordprocessingDrawing" xmlns:wp="http://schemas.openxmlformats.org/drawingml/2006/wordprocessingDrawing" xmlns:w10="urn:schemas-microsoft-com:office:word" xmlns:w="http://schemas.openxmlformats.org/wordprocessingml/2006/main" xmlns:w14="http://schemas.microsoft.com/office/word/2010/wordml" xmlns:w15="http://schemas.microsoft.com/office/word/2012/wordml" xmlns:w16cex="http://schemas.microsoft.com/office/word/2018/wordml/cex" xmlns:w16cid="http://schemas.microsoft.com/office/word/2016/wordml/cid" xmlns:w16="http://schemas.microsoft.com/office/word/2018/wordml" xmlns:w16du="http://schemas.microsoft.com/office/word/2023/wordml/word16du" xmlns:w16sdtdh="http://schemas.microsoft.com/office/word/2020/wordml/sdtdatahash" xmlns:w16sdtfl="http://schemas.microsoft.com/office/word/2024/wordml/sdtformatlock" xmlns:w16se="http://schemas.microsoft.com/office/word/2015/wordml/symex" xmlns:wpg="http://schemas.microsoft.com/office/word/2010/wordprocessingGroup" xmlns:wpi="http://schemas.microsoft.com/office/word/2010/wordprocessingInk" xmlns:wne="http://schemas.microsoft.com/office/word/2006/wordml" xmlns:wps="http://schemas.microsoft.com/office/word/2010/wordprocessingShape" mc:Ignorable="w14 w15 w16se w16cid w16 w16cex w16sdtdh w16sdtfl w16du wp14">
+<w:document xmlns:wpc="http://schemas.microsoft.com/office/word/2010/wordprocessingCanvas" xmlns:cx="http://schemas.microsoft.com/office/drawing/2014/chartex" xmlns:cx1="http://schemas.microsoft.com/office/drawing/2015/9/8/chartex" xmlns:cx2="http://schemas.microsoft.com/office/drawing/2015/10/21/chartex" xmlns:cx3="http://schemas.microsoft.com/office/drawing/2016/5/9/chartex" xmlns:cx4="http://schemas.microsoft.com/office/drawing/2016/5/10/chartex" xmlns:cx5="http://schemas.microsoft.com/office/drawing/2016/5/11/chartex" xmlns:cx6="http://schemas.microsoft.com/office/drawing/2016/5/12/chartex" xmlns:cx7="http://schemas.microsoft.com/office/drawing/2016/5/13/chartex" xmlns:cx8="http://schemas.microsoft.com/office/drawing/2016/5/14/chartex" xmlns:mc="http://schemas.openxmlformats.org/markup-compatibility/2006" xmlns:aink="http://schemas.microsoft.com/office/drawing/2016/ink" xmlns:am3d="http://schemas.microsoft.com/office/drawing/2017/model3d" xmlns:o="urn:schemas-microsoft-com:office:office" xmlns:oel="http://schemas.microsoft.com/office/2019/extlst" xmlns:r="http://schemas.openxmlformats.org/officeDocument/2006/relationships" xmlns:m="http://schemas.openxmlformats.org/officeDocument/2006/math" xmlns:v="urn:schemas-microsoft-com:vml" xmlns:wp14="http://schemas.microsoft.com/office/word/2010/wordprocessingDrawing" xmlns:wp="http://schemas.openxmlformats.org/drawingml/2006/wordprocessingDrawing" xmlns:w10="urn:schemas-microsoft-com:office:word" xmlns:w="http://schemas.openxmlformats.org/wordprocessingml/2006/main" xmlns:w14="http://schemas.microsoft.com/office/word/2010/wordml" xmlns:w15="http://schemas.microsoft.com/office/word/2012/wordml" xmlns:w16cex="http://schemas.microsoft.com/office/word/2018/wordml/cex" xmlns:w16cid="http://schemas.microsoft.com/office/word/2016/wordml/cid" xmlns:w16="http://schemas.microsoft.com/office/word/2018/wordml" xmlns:w16du="http://schemas.microsoft.com/office/word/2023/wordml/word16du" xmlns:w16sdtdh="http://schemas.microsoft.com/office/word/2020/wordml/sdtdatahash" xmlns:w16se="http://schemas.microsoft.com/office/word/2015/wordml/symex" xmlns:wpg="http://schemas.microsoft.com/office/word/2010/wordprocessingGroup" xmlns:wpi="http://schemas.microsoft.com/office/word/2010/wordprocessingInk" xmlns:wne="http://schemas.microsoft.com/office/word/2006/wordml" xmlns:wps="http://schemas.microsoft.com/office/word/2010/wordprocessingShape" mc:Ignorable="w14 w15 w16se w16cid w16 w16cex w16sdtdh w16du wp14">
   <w:body>
     <w:p>
       <w:pPr>
@@ -193,25 +193,7 @@
           <w:sz w:val="24"/>
           <w:szCs w:val="24"/>
         </w:rPr>
-        <w:t>” and</w:t>
-      </w:r>
-      <w:proofErr w:type="gramStart"/>
-      <w:r>
-        <w:rPr>
-          <w:rFonts w:ascii="Times New Roman" w:hAnsi="Times New Roman" w:cs="Times New Roman"/>
-          <w:sz w:val="24"/>
-          <w:szCs w:val="24"/>
-        </w:rPr>
-        <w:t>, in particular, that</w:t>
-      </w:r>
-      <w:proofErr w:type="gramEnd"/>
-      <w:r>
-        <w:rPr>
-          <w:rFonts w:ascii="Times New Roman" w:hAnsi="Times New Roman" w:cs="Times New Roman"/>
-          <w:sz w:val="24"/>
-          <w:szCs w:val="24"/>
-        </w:rPr>
-        <w:t xml:space="preserve"> considered the focus on</w:t>
+        <w:t>” and, in particular, that considered the focus on</w:t>
       </w:r>
       <w:r>
         <w:rPr>
@@ -255,18 +237,8 @@
           <w:sz w:val="24"/>
           <w:szCs w:val="24"/>
         </w:rPr>
-        <w:t xml:space="preserve">We very much appreciate the feedback from reviewers, which helped us address the presentational points they raised, </w:t>
-      </w:r>
-      <w:proofErr w:type="gramStart"/>
-      <w:r>
-        <w:rPr>
-          <w:rFonts w:ascii="Times New Roman" w:hAnsi="Times New Roman" w:cs="Times New Roman"/>
-          <w:sz w:val="24"/>
-          <w:szCs w:val="24"/>
-        </w:rPr>
-        <w:t>and also</w:t>
-      </w:r>
-      <w:proofErr w:type="gramEnd"/>
+        <w:t>We very much appreciate the feedback from reviewers, which helped us address the presentational points they raised, and also</w:t>
+      </w:r>
       <w:r>
         <w:rPr>
           <w:rFonts w:ascii="Times New Roman" w:hAnsi="Times New Roman" w:cs="Times New Roman"/>
@@ -387,25 +359,7 @@
           <w:sz w:val="24"/>
           <w:szCs w:val="24"/>
         </w:rPr>
-        <w:t xml:space="preserve">that has used similar audiovisual manipulations as part of experiments on </w:t>
-      </w:r>
-      <w:proofErr w:type="gramStart"/>
-      <w:r>
-        <w:rPr>
-          <w:rFonts w:ascii="Times New Roman" w:hAnsi="Times New Roman" w:cs="Times New Roman"/>
-          <w:sz w:val="24"/>
-          <w:szCs w:val="24"/>
-        </w:rPr>
-        <w:t>lexically-guided</w:t>
-      </w:r>
-      <w:proofErr w:type="gramEnd"/>
-      <w:r>
-        <w:rPr>
-          <w:rFonts w:ascii="Times New Roman" w:hAnsi="Times New Roman" w:cs="Times New Roman"/>
-          <w:sz w:val="24"/>
-          <w:szCs w:val="24"/>
-        </w:rPr>
-        <w:t xml:space="preserve"> perceptual recalibration </w:t>
+        <w:t xml:space="preserve">that has used similar audiovisual manipulations as part of experiments on lexically-guided perceptual recalibration </w:t>
       </w:r>
       <w:r>
         <w:rPr>
@@ -501,43 +455,7 @@
           <w:sz w:val="24"/>
           <w:szCs w:val="24"/>
         </w:rPr>
-        <w:t xml:space="preserve">how a </w:t>
-      </w:r>
-      <w:proofErr w:type="gramStart"/>
-      <w:r>
-        <w:rPr>
-          <w:rFonts w:ascii="Times New Roman" w:hAnsi="Times New Roman" w:cs="Times New Roman"/>
-          <w:sz w:val="24"/>
-          <w:szCs w:val="24"/>
-        </w:rPr>
-        <w:t>visually-presented</w:t>
-      </w:r>
-      <w:proofErr w:type="gramEnd"/>
-      <w:r>
-        <w:rPr>
-          <w:rFonts w:ascii="Times New Roman" w:hAnsi="Times New Roman" w:cs="Times New Roman"/>
-          <w:sz w:val="24"/>
-          <w:szCs w:val="24"/>
-        </w:rPr>
-        <w:t xml:space="preserve"> pen in the mouth (vs. hand) of a speaker during the </w:t>
-      </w:r>
-      <w:proofErr w:type="gramStart"/>
-      <w:r>
-        <w:rPr>
-          <w:rFonts w:ascii="Times New Roman" w:hAnsi="Times New Roman" w:cs="Times New Roman"/>
-          <w:sz w:val="24"/>
-          <w:szCs w:val="24"/>
-        </w:rPr>
-        <w:t>lexically-guided</w:t>
-      </w:r>
-      <w:proofErr w:type="gramEnd"/>
-      <w:r>
-        <w:rPr>
-          <w:rFonts w:ascii="Times New Roman" w:hAnsi="Times New Roman" w:cs="Times New Roman"/>
-          <w:sz w:val="24"/>
-          <w:szCs w:val="24"/>
-        </w:rPr>
-        <w:t xml:space="preserve"> </w:t>
+        <w:t xml:space="preserve">how a visually-presented pen in the mouth (vs. hand) of a speaker during the lexically-guided </w:t>
       </w:r>
       <w:r>
         <w:rPr>
@@ -817,16 +735,7 @@
           <w:sz w:val="24"/>
           <w:szCs w:val="24"/>
         </w:rPr>
-        <w:t xml:space="preserve"> n</w:t>
-      </w:r>
-      <w:commentRangeStart w:id="0"/>
-      <w:r>
-        <w:rPr>
-          <w:rFonts w:ascii="Times New Roman" w:hAnsi="Times New Roman" w:cs="Times New Roman"/>
-          <w:sz w:val="24"/>
-          <w:szCs w:val="24"/>
-        </w:rPr>
-        <w:t xml:space="preserve">ow transparently acknowledges the concern raised by Reviewer 1. In that context, we now also </w:t>
+        <w:t xml:space="preserve"> now transparently acknowledges the concern raised by Reviewer 1. In that context, we now also </w:t>
       </w:r>
       <w:r>
         <w:rPr>
@@ -867,13 +776,6 @@
           <w:szCs w:val="24"/>
         </w:rPr>
         <w:t>and how it speaks to—but does not fully remove—that concern. This revision, we hope, helps readers to maintain an adequate level of uncertainty about our interpretation of our results.</w:t>
-      </w:r>
-      <w:commentRangeEnd w:id="0"/>
-      <w:r>
-        <w:rPr>
-          <w:rStyle w:val="CommentReference"/>
-        </w:rPr>
-        <w:commentReference w:id="0"/>
       </w:r>
     </w:p>
     <w:p>
@@ -1012,13 +914,23 @@
           <w:szCs w:val="24"/>
         </w:rPr>
       </w:pPr>
-      <w:r>
-        <w:rPr>
-          <w:rFonts w:ascii="Times New Roman" w:hAnsi="Times New Roman" w:cs="Times New Roman"/>
-          <w:sz w:val="24"/>
-          <w:szCs w:val="24"/>
-        </w:rPr>
-        <w:t xml:space="preserve">Gevher </w:t>
+      <w:proofErr w:type="spellStart"/>
+      <w:r>
+        <w:rPr>
+          <w:rFonts w:ascii="Times New Roman" w:hAnsi="Times New Roman" w:cs="Times New Roman"/>
+          <w:sz w:val="24"/>
+          <w:szCs w:val="24"/>
+        </w:rPr>
+        <w:t>Gevher</w:t>
+      </w:r>
+      <w:proofErr w:type="spellEnd"/>
+      <w:r>
+        <w:rPr>
+          <w:rFonts w:ascii="Times New Roman" w:hAnsi="Times New Roman" w:cs="Times New Roman"/>
+          <w:sz w:val="24"/>
+          <w:szCs w:val="24"/>
+        </w:rPr>
+        <w:t xml:space="preserve"> </w:t>
       </w:r>
       <w:proofErr w:type="spellStart"/>
       <w:r>
@@ -1143,43 +1055,7 @@
           <w:sz w:val="24"/>
           <w:szCs w:val="24"/>
         </w:rPr>
-        <w:t xml:space="preserve">Overall, this is a very nice study that addresses an interesting question about speech perception. The literature review is brief, but sufficient to give </w:t>
-      </w:r>
-      <w:proofErr w:type="gramStart"/>
-      <w:r>
-        <w:rPr>
-          <w:rFonts w:ascii="Times New Roman" w:hAnsi="Times New Roman" w:cs="Times New Roman"/>
-          <w:sz w:val="24"/>
-          <w:szCs w:val="24"/>
-        </w:rPr>
-        <w:t>an</w:t>
-      </w:r>
-      <w:proofErr w:type="gramEnd"/>
-      <w:r>
-        <w:rPr>
-          <w:rFonts w:ascii="Times New Roman" w:hAnsi="Times New Roman" w:cs="Times New Roman"/>
-          <w:sz w:val="24"/>
-          <w:szCs w:val="24"/>
-        </w:rPr>
-        <w:t xml:space="preserve"> quick overview of the theoretical background. The research questions are clearly </w:t>
-      </w:r>
-      <w:proofErr w:type="gramStart"/>
-      <w:r>
-        <w:rPr>
-          <w:rFonts w:ascii="Times New Roman" w:hAnsi="Times New Roman" w:cs="Times New Roman"/>
-          <w:sz w:val="24"/>
-          <w:szCs w:val="24"/>
-        </w:rPr>
-        <w:t>spelled-out</w:t>
-      </w:r>
-      <w:proofErr w:type="gramEnd"/>
-      <w:r>
-        <w:rPr>
-          <w:rFonts w:ascii="Times New Roman" w:hAnsi="Times New Roman" w:cs="Times New Roman"/>
-          <w:sz w:val="24"/>
-          <w:szCs w:val="24"/>
-        </w:rPr>
-        <w:t>, the writing is quite clear, and the narrative is easy to follow.</w:t>
+        <w:t>Overall, this is a very nice study that addresses an interesting question about speech perception. The literature review is brief, but sufficient to give an quick overview of the theoretical background. The research questions are clearly spelled-out, the writing is quite clear, and the narrative is easy to follow.</w:t>
       </w:r>
       <w:r>
         <w:rPr>
@@ -1384,25 +1260,7 @@
           <w:sz w:val="24"/>
           <w:szCs w:val="24"/>
         </w:rPr>
-        <w:t>For instance, Kraljic &amp; Samuel (2011) proposed an alternative explanation that does not appeal to ‘explaining away</w:t>
-      </w:r>
-      <w:proofErr w:type="gramStart"/>
-      <w:r>
-        <w:rPr>
-          <w:rFonts w:ascii="Times New Roman" w:hAnsi="Times New Roman" w:cs="Times New Roman"/>
-          <w:sz w:val="24"/>
-          <w:szCs w:val="24"/>
-        </w:rPr>
-        <w:t>’, but</w:t>
-      </w:r>
-      <w:proofErr w:type="gramEnd"/>
-      <w:r>
-        <w:rPr>
-          <w:rFonts w:ascii="Times New Roman" w:hAnsi="Times New Roman" w:cs="Times New Roman"/>
-          <w:sz w:val="24"/>
-          <w:szCs w:val="24"/>
-        </w:rPr>
-        <w:t xml:space="preserve"> rather appeals to specifics of exemplar storage. Liu &amp; Jaeger (201</w:t>
+        <w:t>For instance, Kraljic &amp; Samuel (2011) proposed an alternative explanation that does not appeal to ‘explaining away’, but rather appeals to specifics of exemplar storage. Liu &amp; Jaeger (201</w:t>
       </w:r>
       <w:r>
         <w:rPr>
@@ -1502,25 +1360,7 @@
           <w:sz w:val="24"/>
           <w:szCs w:val="24"/>
         </w:rPr>
-        <w:t xml:space="preserve"> experiments addressed how the pen </w:t>
-      </w:r>
-      <w:proofErr w:type="gramStart"/>
-      <w:r>
-        <w:rPr>
-          <w:rFonts w:ascii="Times New Roman" w:hAnsi="Times New Roman" w:cs="Times New Roman"/>
-          <w:sz w:val="24"/>
-          <w:szCs w:val="24"/>
-        </w:rPr>
-        <w:t>actually affects</w:t>
-      </w:r>
-      <w:proofErr w:type="gramEnd"/>
-      <w:r>
-        <w:rPr>
-          <w:rFonts w:ascii="Times New Roman" w:hAnsi="Times New Roman" w:cs="Times New Roman"/>
-          <w:sz w:val="24"/>
-          <w:szCs w:val="24"/>
-        </w:rPr>
-        <w:t xml:space="preserve"> perception </w:t>
+        <w:t xml:space="preserve"> experiments addressed how the pen actually affects perception </w:t>
       </w:r>
       <w:r>
         <w:rPr>
@@ -1585,7 +1425,6 @@
         </w:rPr>
         <w:t xml:space="preserve">have limited researchers’ ability to distinguish between the competing hypotheses described above. </w:t>
       </w:r>
-      <w:proofErr w:type="gramStart"/>
       <w:r>
         <w:rPr>
           <w:rFonts w:ascii="Times New Roman" w:hAnsi="Times New Roman" w:cs="Times New Roman"/>
@@ -1608,16 +1447,7 @@
           <w:sz w:val="24"/>
           <w:szCs w:val="24"/>
         </w:rPr>
-        <w:t>our</w:t>
-      </w:r>
-      <w:proofErr w:type="gramEnd"/>
-      <w:r>
-        <w:rPr>
-          <w:rFonts w:ascii="Times New Roman" w:hAnsi="Times New Roman" w:cs="Times New Roman"/>
-          <w:sz w:val="24"/>
-          <w:szCs w:val="24"/>
-        </w:rPr>
-        <w:t xml:space="preserve"> experiments have the potential to shed light on some more nuanced complexities in the line of work inspired by Kraljic and colleagues. For example, </w:t>
+        <w:t xml:space="preserve">our experiments have the potential to shed light on some more nuanced complexities in the line of work inspired by Kraljic and colleagues. For example, </w:t>
       </w:r>
       <w:r>
         <w:rPr>
@@ -1747,25 +1577,7 @@
           <w:sz w:val="24"/>
           <w:szCs w:val="24"/>
         </w:rPr>
-        <w:t xml:space="preserve">I really liked the idea of testing whether the visibility of the pen-in-the-mouth manipulation modulates the effect; however, it is also possible that the black square was simply </w:t>
-      </w:r>
-      <w:proofErr w:type="gramStart"/>
-      <w:r>
-        <w:rPr>
-          <w:rFonts w:ascii="Times New Roman" w:hAnsi="Times New Roman" w:cs="Times New Roman"/>
-          <w:sz w:val="24"/>
-          <w:szCs w:val="24"/>
-        </w:rPr>
-        <w:t>distracting</w:t>
-      </w:r>
-      <w:proofErr w:type="gramEnd"/>
-      <w:r>
-        <w:rPr>
-          <w:rFonts w:ascii="Times New Roman" w:hAnsi="Times New Roman" w:cs="Times New Roman"/>
-          <w:sz w:val="24"/>
-          <w:szCs w:val="24"/>
-        </w:rPr>
-        <w:t xml:space="preserve"> and it was this distraction (rather than the occlusion of the articulatory information) what caused the effect going away. I am not sure whether this can be fully addressed without an additional experiment, but the authors can at least acknowledge this possibility.</w:t>
+        <w:t>I really liked the idea of testing whether the visibility of the pen-in-the-mouth manipulation modulates the effect; however, it is also possible that the black square was simply distracting and it was this distraction (rather than the occlusion of the articulatory information) what caused the effect going away. I am not sure whether this can be fully addressed without an additional experiment, but the authors can at least acknowledge this possibility.</w:t>
       </w:r>
     </w:p>
     <w:p>
@@ -1883,7 +1695,7 @@
         </w:rPr>
         <w:t>We have added the requested details</w:t>
       </w:r>
-      <w:ins w:id="1" w:author="Cummings, Shawn" w:date="2025-05-09T12:51:00Z" w16du:dateUtc="2025-05-09T16:51:00Z">
+      <w:ins w:id="0" w:author="Cummings, Shawn" w:date="2025-05-09T12:51:00Z" w16du:dateUtc="2025-05-09T16:51:00Z">
         <w:r>
           <w:rPr>
             <w:rFonts w:ascii="Times New Roman" w:hAnsi="Times New Roman" w:cs="Times New Roman"/>
@@ -1927,7 +1739,6 @@
           <w:szCs w:val="24"/>
         </w:rPr>
       </w:pPr>
-      <w:commentRangeStart w:id="2"/>
       <w:r>
         <w:rPr>
           <w:rFonts w:ascii="Times New Roman" w:hAnsi="Times New Roman" w:cs="Times New Roman"/>
@@ -1951,26 +1762,43 @@
       <w:pPr>
         <w:spacing w:after="0" w:line="240" w:lineRule="auto"/>
         <w:rPr>
-          <w:rFonts w:ascii="Times New Roman" w:hAnsi="Times New Roman" w:cs="Times New Roman"/>
-          <w:sz w:val="24"/>
-          <w:szCs w:val="24"/>
-        </w:rPr>
-      </w:pPr>
-      <w:r>
-        <w:rPr>
-          <w:rFonts w:ascii="Times New Roman" w:hAnsi="Times New Roman" w:cs="Times New Roman"/>
-          <w:sz w:val="24"/>
-          <w:szCs w:val="24"/>
-        </w:rPr>
-        <w:t>We have done so.</w:t>
-      </w:r>
-      <w:commentRangeEnd w:id="2"/>
-      <w:r>
-        <w:rPr>
-          <w:rStyle w:val="CommentReference"/>
-        </w:rPr>
-        <w:commentReference w:id="2"/>
-      </w:r>
+          <w:ins w:id="1" w:author="Cummings, Shawn" w:date="2025-05-12T21:52:00Z" w16du:dateUtc="2025-05-13T01:52:00Z"/>
+          <w:rFonts w:ascii="Times New Roman" w:hAnsi="Times New Roman" w:cs="Times New Roman"/>
+          <w:sz w:val="24"/>
+          <w:szCs w:val="24"/>
+        </w:rPr>
+      </w:pPr>
+      <w:ins w:id="2" w:author="Cummings, Shawn" w:date="2025-05-12T21:52:00Z" w16du:dateUtc="2025-05-13T01:52:00Z">
+        <w:r>
+          <w:rPr>
+            <w:rFonts w:ascii="Times New Roman" w:hAnsi="Times New Roman" w:cs="Times New Roman"/>
+            <w:sz w:val="24"/>
+            <w:szCs w:val="24"/>
+          </w:rPr>
+          <w:t>We apologize for the confusion. The gray line actually showed the result of the audio-only (no pen) test continuum presented in Liu and Jaeger (2018, in their supplementary information). This gray line was only meant to show in our supplementary information, where we explain its relevance. This has now been fixed.</w:t>
+        </w:r>
+      </w:ins>
+    </w:p>
+    <w:p>
+      <w:pPr>
+        <w:spacing w:after="0" w:line="240" w:lineRule="auto"/>
+        <w:rPr>
+          <w:del w:id="3" w:author="Cummings, Shawn" w:date="2025-05-12T21:49:00Z" w16du:dateUtc="2025-05-13T01:49:00Z"/>
+          <w:rFonts w:ascii="Times New Roman" w:hAnsi="Times New Roman" w:cs="Times New Roman"/>
+          <w:sz w:val="24"/>
+          <w:szCs w:val="24"/>
+        </w:rPr>
+      </w:pPr>
+      <w:del w:id="4" w:author="Cummings, Shawn" w:date="2025-05-12T21:46:00Z" w16du:dateUtc="2025-05-13T01:46:00Z">
+        <w:r>
+          <w:rPr>
+            <w:rFonts w:ascii="Times New Roman" w:hAnsi="Times New Roman" w:cs="Times New Roman"/>
+            <w:sz w:val="24"/>
+            <w:szCs w:val="24"/>
+          </w:rPr>
+          <w:delText>We have done so.</w:delText>
+        </w:r>
+      </w:del>
     </w:p>
     <w:p>
       <w:pPr>
@@ -2123,25 +1951,7 @@
           <w:sz w:val="24"/>
           <w:szCs w:val="24"/>
         </w:rPr>
-        <w:t xml:space="preserve"> thought this was a clever study with exciting results (</w:t>
-      </w:r>
-      <w:proofErr w:type="gramStart"/>
-      <w:r>
-        <w:rPr>
-          <w:rFonts w:ascii="Times New Roman" w:hAnsi="Times New Roman" w:cs="Times New Roman"/>
-          <w:sz w:val="24"/>
-          <w:szCs w:val="24"/>
-        </w:rPr>
-        <w:t>all the more</w:t>
-      </w:r>
-      <w:proofErr w:type="gramEnd"/>
-      <w:r>
-        <w:rPr>
-          <w:rFonts w:ascii="Times New Roman" w:hAnsi="Times New Roman" w:cs="Times New Roman"/>
-          <w:sz w:val="24"/>
-          <w:szCs w:val="24"/>
-        </w:rPr>
-        <w:t xml:space="preserve"> reason I am sorry about my delayed review!) Compensatory processes are both broader than previously thought (in the sense that non-phonetic information leads to compensation, but also narrower than I might have assumed in that it has to be perceptually transparent information, and not inferred - which I initially found surprising, but makes sense since it is not a given that the presence of a pen will always lead to the same articulatory consequences). I also found the </w:t>
+        <w:t xml:space="preserve"> thought this was a clever study with exciting results (all the more reason I am sorry about my delayed review!) Compensatory processes are both broader than previously thought (in the sense that non-phonetic information leads to compensation, but also narrower </w:t>
       </w:r>
       <w:r>
         <w:rPr>
@@ -2150,7 +1960,7 @@
           <w:szCs w:val="24"/>
         </w:rPr>
         <w:lastRenderedPageBreak/>
-        <w:t>proposal at the end for why we might not see perceptual learning when a speaker has a pen in their mouth to be intriguing - if indeed this is due to compensation prior to any perceptual learning, this could indicate that higher level knowledge (i.e., I know this pen could be influencing the production, so I'll wait to see what happens without it) does not play the role we thought in perceptual learning (and would fit with other evidence that perceptual learning is heavily influenced by low-level factors like acoustic similarity).</w:t>
+        <w:t>than I might have assumed in that it has to be perceptually transparent information, and not inferred - which I initially found surprising, but makes sense since it is not a given that the presence of a pen will always lead to the same articulatory consequences). I also found the proposal at the end for why we might not see perceptual learning when a speaker has a pen in their mouth to be intriguing - if indeed this is due to compensation prior to any perceptual learning, this could indicate that higher level knowledge (i.e., I know this pen could be influencing the production, so I'll wait to see what happens without it) does not play the role we thought in perceptual learning (and would fit with other evidence that perceptual learning is heavily influenced by low-level factors like acoustic similarity).</w:t>
       </w:r>
     </w:p>
     <w:p>
@@ -2248,43 +2058,7 @@
           <w:sz w:val="24"/>
           <w:szCs w:val="24"/>
         </w:rPr>
-        <w:t xml:space="preserve">Agreed! R1 also requested more details on the methods to be included in the main part of the paper. And </w:t>
-      </w:r>
-      <w:proofErr w:type="gramStart"/>
-      <w:r>
-        <w:rPr>
-          <w:rFonts w:ascii="Times New Roman" w:hAnsi="Times New Roman" w:cs="Times New Roman"/>
-          <w:sz w:val="24"/>
-          <w:szCs w:val="24"/>
-        </w:rPr>
-        <w:t>so</w:t>
-      </w:r>
-      <w:proofErr w:type="gramEnd"/>
-      <w:r>
-        <w:rPr>
-          <w:rFonts w:ascii="Times New Roman" w:hAnsi="Times New Roman" w:cs="Times New Roman"/>
-          <w:sz w:val="24"/>
-          <w:szCs w:val="24"/>
-        </w:rPr>
-        <w:t xml:space="preserve"> we have moved many of the details from the SI into the paper. This includes clarifications for </w:t>
-      </w:r>
-      <w:proofErr w:type="gramStart"/>
-      <w:r>
-        <w:rPr>
-          <w:rFonts w:ascii="Times New Roman" w:hAnsi="Times New Roman" w:cs="Times New Roman"/>
-          <w:sz w:val="24"/>
-          <w:szCs w:val="24"/>
-        </w:rPr>
-        <w:t>all of</w:t>
-      </w:r>
-      <w:proofErr w:type="gramEnd"/>
-      <w:r>
-        <w:rPr>
-          <w:rFonts w:ascii="Times New Roman" w:hAnsi="Times New Roman" w:cs="Times New Roman"/>
-          <w:sz w:val="24"/>
-          <w:szCs w:val="24"/>
-        </w:rPr>
-        <w:t xml:space="preserve"> the questions raised below (thank you for listing them! That was very helpful in deciding what detail to include in the text).</w:t>
+        <w:t>Agreed! R1 also requested more details on the methods to be included in the main part of the paper. And so we have moved many of the details from the SI into the paper. This includes clarifications for all of the questions raised below (thank you for listing them! That was very helpful in deciding what detail to include in the text).</w:t>
       </w:r>
     </w:p>
     <w:p>
@@ -2357,7 +2131,7 @@
       <w:pPr>
         <w:spacing w:after="0" w:line="240" w:lineRule="auto"/>
         <w:rPr>
-          <w:ins w:id="3" w:author="Jaeger, Florian" w:date="2025-05-11T13:57:00Z" w16du:dateUtc="2025-05-11T17:57:00Z"/>
+          <w:ins w:id="5" w:author="Jaeger, Florian" w:date="2025-05-11T13:57:00Z" w16du:dateUtc="2025-05-11T17:57:00Z"/>
           <w:rFonts w:ascii="Times New Roman" w:hAnsi="Times New Roman" w:cs="Times New Roman"/>
           <w:sz w:val="24"/>
           <w:szCs w:val="24"/>
@@ -2428,7 +2202,7 @@
       <w:pPr>
         <w:spacing w:after="0" w:line="240" w:lineRule="auto"/>
         <w:rPr>
-          <w:ins w:id="4" w:author="Jaeger, Florian" w:date="2025-05-11T13:57:00Z" w16du:dateUtc="2025-05-11T17:57:00Z"/>
+          <w:ins w:id="6" w:author="Jaeger, Florian" w:date="2025-05-11T13:57:00Z" w16du:dateUtc="2025-05-11T17:57:00Z"/>
           <w:rFonts w:ascii="Times New Roman" w:hAnsi="Times New Roman" w:cs="Times New Roman"/>
           <w:sz w:val="24"/>
           <w:szCs w:val="24"/>
@@ -2492,46 +2266,8 @@
           <w:sz w:val="24"/>
           <w:szCs w:val="24"/>
         </w:rPr>
-        <w:t xml:space="preserve">-I'm not entirely clear on what is happening with the white dot catch trials - I had assumed that if a participant failed these trials (indicated there was a white dot when there wasn't) that they would be discarded. But </w:t>
-      </w:r>
-      <w:proofErr w:type="gramStart"/>
-      <w:r>
-        <w:rPr>
-          <w:rFonts w:ascii="Times New Roman" w:hAnsi="Times New Roman" w:cs="Times New Roman"/>
-          <w:sz w:val="24"/>
-          <w:szCs w:val="24"/>
-        </w:rPr>
-        <w:t>instead</w:t>
-      </w:r>
-      <w:proofErr w:type="gramEnd"/>
-      <w:r>
-        <w:rPr>
-          <w:rFonts w:ascii="Times New Roman" w:hAnsi="Times New Roman" w:cs="Times New Roman"/>
-          <w:sz w:val="24"/>
-          <w:szCs w:val="24"/>
-        </w:rPr>
-        <w:t xml:space="preserve"> it seems that only the trials themselves were discarded, not the participants?</w:t>
-      </w:r>
-    </w:p>
-    <w:p>
-      <w:pPr>
-        <w:spacing w:after="0" w:line="240" w:lineRule="auto"/>
-        <w:rPr>
-          <w:rFonts w:ascii="Times New Roman" w:hAnsi="Times New Roman" w:cs="Times New Roman"/>
-          <w:sz w:val="24"/>
-          <w:szCs w:val="24"/>
-        </w:rPr>
-      </w:pPr>
-    </w:p>
-    <w:p>
-      <w:pPr>
-        <w:spacing w:after="0" w:line="240" w:lineRule="auto"/>
-        <w:rPr>
-          <w:rFonts w:ascii="Times New Roman" w:hAnsi="Times New Roman" w:cs="Times New Roman"/>
-          <w:sz w:val="24"/>
-          <w:szCs w:val="24"/>
-        </w:rPr>
-      </w:pPr>
+        <w:t xml:space="preserve">-I'm not entirely clear on what is happening with the white dot catch trials - I had assumed that if a participant failed these trials (indicated there was a white dot when there wasn't) that they </w:t>
+      </w:r>
       <w:r>
         <w:rPr>
           <w:rFonts w:ascii="Times New Roman" w:hAnsi="Times New Roman" w:cs="Times New Roman"/>
@@ -2539,42 +2275,43 @@
           <w:szCs w:val="24"/>
         </w:rPr>
         <w:lastRenderedPageBreak/>
-        <w:t xml:space="preserve">None of the experiments </w:t>
-      </w:r>
-      <w:proofErr w:type="gramStart"/>
-      <w:r>
-        <w:rPr>
-          <w:rFonts w:ascii="Times New Roman" w:hAnsi="Times New Roman" w:cs="Times New Roman"/>
-          <w:sz w:val="24"/>
-          <w:szCs w:val="24"/>
-        </w:rPr>
-        <w:t>actually had</w:t>
-      </w:r>
-      <w:proofErr w:type="gramEnd"/>
-      <w:r>
-        <w:rPr>
-          <w:rFonts w:ascii="Times New Roman" w:hAnsi="Times New Roman" w:cs="Times New Roman"/>
-          <w:sz w:val="24"/>
-          <w:szCs w:val="24"/>
-        </w:rPr>
-        <w:t xml:space="preserve"> any trials with white dots. We only included the instructions about the white dots because we had planned to use such catch trials in subsequent perceptual recalibration experiments (which we have since done). </w:t>
-      </w:r>
-      <w:r>
-        <w:rPr>
-          <w:rFonts w:ascii="Times New Roman" w:hAnsi="Times New Roman" w:cs="Times New Roman"/>
-          <w:sz w:val="24"/>
-          <w:szCs w:val="24"/>
-        </w:rPr>
-        <w:t xml:space="preserve">This meant that the only way to make a mistake that related to catch trials was to press SPACE on trials that were </w:t>
-      </w:r>
-      <w:proofErr w:type="gramStart"/>
-      <w:r>
-        <w:rPr>
-          <w:rFonts w:ascii="Times New Roman" w:hAnsi="Times New Roman" w:cs="Times New Roman"/>
-          <w:sz w:val="24"/>
-          <w:szCs w:val="24"/>
-        </w:rPr>
-        <w:t xml:space="preserve">actually </w:t>
+        <w:t>would be discarded. But instead it seems that only the trials themselves were discarded, not the participants?</w:t>
+      </w:r>
+    </w:p>
+    <w:p>
+      <w:pPr>
+        <w:spacing w:after="0" w:line="240" w:lineRule="auto"/>
+        <w:rPr>
+          <w:rFonts w:ascii="Times New Roman" w:hAnsi="Times New Roman" w:cs="Times New Roman"/>
+          <w:sz w:val="24"/>
+          <w:szCs w:val="24"/>
+        </w:rPr>
+      </w:pPr>
+    </w:p>
+    <w:p>
+      <w:pPr>
+        <w:spacing w:after="0" w:line="240" w:lineRule="auto"/>
+        <w:rPr>
+          <w:rFonts w:ascii="Times New Roman" w:hAnsi="Times New Roman" w:cs="Times New Roman"/>
+          <w:sz w:val="24"/>
+          <w:szCs w:val="24"/>
+        </w:rPr>
+      </w:pPr>
+      <w:r>
+        <w:rPr>
+          <w:rFonts w:ascii="Times New Roman" w:hAnsi="Times New Roman" w:cs="Times New Roman"/>
+          <w:sz w:val="24"/>
+          <w:szCs w:val="24"/>
+        </w:rPr>
+        <w:t xml:space="preserve">None of the experiments actually had any trials with white dots. We only included the instructions about the white dots because we had planned to use such catch trials in subsequent perceptual recalibration experiments (which we have since done). </w:t>
+      </w:r>
+      <w:r>
+        <w:rPr>
+          <w:rFonts w:ascii="Times New Roman" w:hAnsi="Times New Roman" w:cs="Times New Roman"/>
+          <w:sz w:val="24"/>
+          <w:szCs w:val="24"/>
+        </w:rPr>
+        <w:t xml:space="preserve">This meant that the only way to make a mistake that related to catch trials was to press SPACE on trials that were actually </w:t>
       </w:r>
       <w:r>
         <w:rPr>
@@ -2586,7 +2323,6 @@
         </w:rPr>
         <w:t>not</w:t>
       </w:r>
-      <w:proofErr w:type="gramEnd"/>
       <w:r>
         <w:rPr>
           <w:rFonts w:ascii="Times New Roman" w:hAnsi="Times New Roman" w:cs="Times New Roman"/>
@@ -2641,7 +2377,7 @@
         </w:rPr>
         <w:t xml:space="preserve"> made that mistake, and no participant had to be excluded based on that criterion. However, since pressing the SPACE bar auto-advanced to the next trial, trials with SPACE bar responses are lacking categorization responses, and thus had to be excluded (</w:t>
       </w:r>
-      <w:commentRangeStart w:id="5"/>
+      <w:commentRangeStart w:id="7"/>
       <w:r>
         <w:rPr>
           <w:rFonts w:ascii="Times New Roman" w:hAnsi="Times New Roman" w:cs="Times New Roman"/>
@@ -2650,12 +2386,12 @@
         </w:rPr>
         <w:t xml:space="preserve">1.6% </w:t>
       </w:r>
-      <w:commentRangeEnd w:id="5"/>
+      <w:commentRangeEnd w:id="7"/>
       <w:r>
         <w:rPr>
           <w:rStyle w:val="CommentReference"/>
         </w:rPr>
-        <w:commentReference w:id="5"/>
+        <w:commentReference w:id="7"/>
       </w:r>
       <w:r>
         <w:rPr>
@@ -2704,265 +2440,153 @@
       <w:pPr>
         <w:spacing w:after="0" w:line="240" w:lineRule="auto"/>
         <w:rPr>
-          <w:ins w:id="6" w:author="Jaeger, Florian" w:date="2025-05-11T13:59:00Z" w16du:dateUtc="2025-05-11T17:59:00Z"/>
-          <w:rFonts w:ascii="Times New Roman" w:hAnsi="Times New Roman" w:cs="Times New Roman"/>
-          <w:sz w:val="24"/>
-          <w:szCs w:val="24"/>
-        </w:rPr>
-      </w:pPr>
-    </w:p>
-    <w:p>
-      <w:pPr>
-        <w:spacing w:after="0" w:line="240" w:lineRule="auto"/>
-        <w:rPr>
-          <w:ins w:id="7" w:author="Jaeger, Florian" w:date="2025-05-11T14:03:00Z" w16du:dateUtc="2025-05-11T18:03:00Z"/>
-          <w:rFonts w:ascii="Times New Roman" w:hAnsi="Times New Roman" w:cs="Times New Roman"/>
-          <w:sz w:val="24"/>
-          <w:szCs w:val="24"/>
-        </w:rPr>
-      </w:pPr>
-      <w:ins w:id="8" w:author="Jaeger, Florian" w:date="2025-05-11T13:59:00Z" w16du:dateUtc="2025-05-11T17:59:00Z">
-        <w:r>
-          <w:rPr>
-            <w:rFonts w:ascii="Times New Roman" w:hAnsi="Times New Roman" w:cs="Times New Roman"/>
-            <w:sz w:val="24"/>
-            <w:szCs w:val="24"/>
-          </w:rPr>
-          <w:t>We apologize for the confusion. Only our R markdown-based SI was meant to contain the comparison to Liu and Jaeg</w:t>
-        </w:r>
-      </w:ins>
-      <w:ins w:id="9" w:author="Jaeger, Florian" w:date="2025-05-11T14:00:00Z" w16du:dateUtc="2025-05-11T18:00:00Z">
-        <w:r>
-          <w:rPr>
-            <w:rFonts w:ascii="Times New Roman" w:hAnsi="Times New Roman" w:cs="Times New Roman"/>
-            <w:sz w:val="24"/>
-            <w:szCs w:val="24"/>
-          </w:rPr>
-          <w:t xml:space="preserve">er (2018, they gray line in the figure). This also confused </w:t>
-        </w:r>
-      </w:ins>
-      <w:ins w:id="10" w:author="Jaeger, Florian" w:date="2025-05-11T14:15:00Z" w16du:dateUtc="2025-05-11T18:15:00Z">
-        <w:r>
-          <w:rPr>
-            <w:rFonts w:ascii="Times New Roman" w:hAnsi="Times New Roman" w:cs="Times New Roman"/>
-            <w:sz w:val="24"/>
-            <w:szCs w:val="24"/>
-          </w:rPr>
-          <w:t>another reviewer</w:t>
-        </w:r>
-      </w:ins>
-      <w:ins w:id="11" w:author="Jaeger, Florian" w:date="2025-05-11T14:03:00Z" w16du:dateUtc="2025-05-11T18:03:00Z">
-        <w:r>
-          <w:rPr>
-            <w:rFonts w:ascii="Times New Roman" w:hAnsi="Times New Roman" w:cs="Times New Roman"/>
-            <w:sz w:val="24"/>
-            <w:szCs w:val="24"/>
-          </w:rPr>
-          <w:t xml:space="preserve"> (understandably given that the legend didn’t mention the gray line at all!)</w:t>
-        </w:r>
-      </w:ins>
-      <w:ins w:id="12" w:author="Jaeger, Florian" w:date="2025-05-11T14:00:00Z" w16du:dateUtc="2025-05-11T18:00:00Z">
-        <w:r>
-          <w:rPr>
-            <w:rFonts w:ascii="Times New Roman" w:hAnsi="Times New Roman" w:cs="Times New Roman"/>
-            <w:sz w:val="24"/>
-            <w:szCs w:val="24"/>
-          </w:rPr>
-          <w:t xml:space="preserve">. </w:t>
-        </w:r>
-      </w:ins>
-    </w:p>
-    <w:p>
-      <w:pPr>
-        <w:spacing w:after="0" w:line="240" w:lineRule="auto"/>
-        <w:rPr>
-          <w:ins w:id="13" w:author="Jaeger, Florian" w:date="2025-05-11T14:03:00Z" w16du:dateUtc="2025-05-11T18:03:00Z"/>
-          <w:rFonts w:ascii="Times New Roman" w:hAnsi="Times New Roman" w:cs="Times New Roman"/>
-          <w:sz w:val="24"/>
-          <w:szCs w:val="24"/>
-        </w:rPr>
-      </w:pPr>
-    </w:p>
-    <w:p>
-      <w:pPr>
-        <w:spacing w:after="0" w:line="240" w:lineRule="auto"/>
-        <w:rPr>
-          <w:rFonts w:ascii="Times New Roman" w:hAnsi="Times New Roman" w:cs="Times New Roman"/>
-          <w:sz w:val="24"/>
-          <w:szCs w:val="24"/>
-        </w:rPr>
-      </w:pPr>
-      <w:ins w:id="14" w:author="Jaeger, Florian" w:date="2025-05-11T14:00:00Z" w16du:dateUtc="2025-05-11T18:00:00Z">
-        <w:r>
-          <w:rPr>
-            <w:rFonts w:ascii="Times New Roman" w:hAnsi="Times New Roman" w:cs="Times New Roman"/>
-            <w:sz w:val="24"/>
-            <w:szCs w:val="24"/>
-          </w:rPr>
-          <w:t>We have now removed the gray line from the plot in the main text. In the SI, we include the comparison to Liu and Jaeger (2018), and clarify its relevanc</w:t>
-        </w:r>
-      </w:ins>
-      <w:ins w:id="15" w:author="Jaeger, Florian" w:date="2025-05-11T14:01:00Z" w16du:dateUtc="2025-05-11T18:01:00Z">
-        <w:r>
-          <w:rPr>
-            <w:rFonts w:ascii="Times New Roman" w:hAnsi="Times New Roman" w:cs="Times New Roman"/>
-            <w:sz w:val="24"/>
-            <w:szCs w:val="24"/>
-          </w:rPr>
-          <w:t>e: comparison to the audio-only</w:t>
-        </w:r>
-      </w:ins>
-      <w:ins w:id="16" w:author="Jaeger, Florian" w:date="2025-05-11T14:15:00Z" w16du:dateUtc="2025-05-11T18:15:00Z">
-        <w:r>
-          <w:rPr>
-            <w:rFonts w:ascii="Times New Roman" w:hAnsi="Times New Roman" w:cs="Times New Roman"/>
-            <w:sz w:val="24"/>
-            <w:szCs w:val="24"/>
-          </w:rPr>
-          <w:t xml:space="preserve"> (</w:t>
-        </w:r>
-      </w:ins>
-      <w:ins w:id="17" w:author="Jaeger, Florian" w:date="2025-05-11T14:16:00Z" w16du:dateUtc="2025-05-11T18:16:00Z">
-        <w:r>
-          <w:rPr>
-            <w:rFonts w:ascii="Times New Roman" w:hAnsi="Times New Roman" w:cs="Times New Roman"/>
-            <w:sz w:val="24"/>
-            <w:szCs w:val="24"/>
-          </w:rPr>
-          <w:t>and thus no pen)</w:t>
-        </w:r>
-      </w:ins>
-      <w:ins w:id="18" w:author="Jaeger, Florian" w:date="2025-05-11T14:01:00Z" w16du:dateUtc="2025-05-11T18:01:00Z">
-        <w:r>
-          <w:rPr>
-            <w:rFonts w:ascii="Times New Roman" w:hAnsi="Times New Roman" w:cs="Times New Roman"/>
-            <w:sz w:val="24"/>
-            <w:szCs w:val="24"/>
-          </w:rPr>
-          <w:t xml:space="preserve"> continuum used in Liu and Jaeger (and all previous work) helps to assess whether </w:t>
-        </w:r>
-        <w:proofErr w:type="spellStart"/>
-        <w:r>
-          <w:rPr>
-            <w:rFonts w:ascii="Times New Roman" w:hAnsi="Times New Roman" w:cs="Times New Roman"/>
-            <w:sz w:val="24"/>
-            <w:szCs w:val="24"/>
-          </w:rPr>
-          <w:t>a</w:t>
-        </w:r>
-        <w:proofErr w:type="spellEnd"/>
-        <w:r>
-          <w:rPr>
-            <w:rFonts w:ascii="Times New Roman" w:hAnsi="Times New Roman" w:cs="Times New Roman"/>
-            <w:sz w:val="24"/>
-            <w:szCs w:val="24"/>
-          </w:rPr>
-          <w:t xml:space="preserve"> audiovisual stimulus with the pen in the </w:t>
-        </w:r>
-        <w:r>
-          <w:rPr>
-            <w:rFonts w:ascii="Times New Roman" w:hAnsi="Times New Roman" w:cs="Times New Roman"/>
-            <w:sz w:val="24"/>
-            <w:szCs w:val="24"/>
-            <w:rPrChange w:id="19" w:author="Jaeger, Florian" w:date="2025-05-11T14:16:00Z" w16du:dateUtc="2025-05-11T18:16:00Z">
-              <w:rPr>
-                <w:rFonts w:ascii="Times New Roman" w:hAnsi="Times New Roman" w:cs="Times New Roman"/>
-                <w:i/>
-                <w:iCs/>
-                <w:sz w:val="24"/>
-                <w:szCs w:val="24"/>
-              </w:rPr>
-            </w:rPrChange>
-          </w:rPr>
-          <w:t>hand</w:t>
-        </w:r>
-        <w:r>
-          <w:rPr>
-            <w:rFonts w:ascii="Times New Roman" w:hAnsi="Times New Roman" w:cs="Times New Roman"/>
-            <w:i/>
-            <w:iCs/>
-            <w:sz w:val="24"/>
-            <w:szCs w:val="24"/>
-          </w:rPr>
-          <w:t xml:space="preserve"> </w:t>
-        </w:r>
-        <w:r>
-          <w:rPr>
-            <w:rFonts w:ascii="Times New Roman" w:hAnsi="Times New Roman" w:cs="Times New Roman"/>
-            <w:sz w:val="24"/>
-            <w:szCs w:val="24"/>
-          </w:rPr>
-          <w:t xml:space="preserve">is actually identical to an audio-only stimulus (an </w:t>
-        </w:r>
-        <w:r>
-          <w:rPr>
-            <w:rFonts w:ascii="Times New Roman" w:hAnsi="Times New Roman" w:cs="Times New Roman"/>
-            <w:i/>
-            <w:iCs/>
-            <w:sz w:val="24"/>
-            <w:szCs w:val="24"/>
-            <w:rPrChange w:id="20" w:author="Jaeger, Florian" w:date="2025-05-11T14:16:00Z" w16du:dateUtc="2025-05-11T18:16:00Z">
-              <w:rPr>
-                <w:rFonts w:ascii="Times New Roman" w:hAnsi="Times New Roman" w:cs="Times New Roman"/>
-                <w:sz w:val="24"/>
-                <w:szCs w:val="24"/>
-              </w:rPr>
-            </w:rPrChange>
-          </w:rPr>
-          <w:t>assumption</w:t>
-        </w:r>
-        <w:r>
-          <w:rPr>
-            <w:rFonts w:ascii="Times New Roman" w:hAnsi="Times New Roman" w:cs="Times New Roman"/>
-            <w:sz w:val="24"/>
-            <w:szCs w:val="24"/>
-          </w:rPr>
-          <w:t xml:space="preserve"> made in </w:t>
-        </w:r>
-      </w:ins>
-      <w:ins w:id="21" w:author="Jaeger, Florian" w:date="2025-05-11T14:16:00Z" w16du:dateUtc="2025-05-11T18:16:00Z">
-        <w:r>
-          <w:rPr>
-            <w:rFonts w:ascii="Times New Roman" w:hAnsi="Times New Roman" w:cs="Times New Roman"/>
-            <w:sz w:val="24"/>
-            <w:szCs w:val="24"/>
-          </w:rPr>
-          <w:t xml:space="preserve">some </w:t>
-        </w:r>
-      </w:ins>
-      <w:ins w:id="22" w:author="Jaeger, Florian" w:date="2025-05-11T14:01:00Z" w16du:dateUtc="2025-05-11T18:01:00Z">
-        <w:r>
-          <w:rPr>
-            <w:rFonts w:ascii="Times New Roman" w:hAnsi="Times New Roman" w:cs="Times New Roman"/>
-            <w:sz w:val="24"/>
-            <w:szCs w:val="24"/>
-          </w:rPr>
-          <w:t>previous work</w:t>
-        </w:r>
-      </w:ins>
-      <w:ins w:id="23" w:author="Jaeger, Florian" w:date="2025-05-11T14:02:00Z" w16du:dateUtc="2025-05-11T18:02:00Z">
-        <w:r>
-          <w:rPr>
-            <w:rFonts w:ascii="Times New Roman" w:hAnsi="Times New Roman" w:cs="Times New Roman"/>
-            <w:sz w:val="24"/>
-            <w:szCs w:val="24"/>
-          </w:rPr>
-          <w:t>, e.g., Kraljic &amp; Samuel, 2011, but not directly relevant to the present work)</w:t>
-        </w:r>
-      </w:ins>
-      <w:commentRangeStart w:id="24"/>
-      <w:commentRangeStart w:id="25"/>
-      <w:commentRangeStart w:id="26"/>
-      <w:del w:id="27" w:author="Jaeger, Florian" w:date="2025-05-11T14:02:00Z" w16du:dateUtc="2025-05-11T18:02:00Z">
-        <w:r>
-          <w:rPr>
-            <w:rFonts w:ascii="Times New Roman" w:hAnsi="Times New Roman" w:cs="Times New Roman"/>
-            <w:sz w:val="24"/>
-            <w:szCs w:val="24"/>
-          </w:rPr>
-          <w:delText>We have added ____</w:delText>
-        </w:r>
-      </w:del>
+          <w:ins w:id="8" w:author="Jaeger, Florian" w:date="2025-05-11T13:59:00Z" w16du:dateUtc="2025-05-11T17:59:00Z"/>
+          <w:rFonts w:ascii="Times New Roman" w:hAnsi="Times New Roman" w:cs="Times New Roman"/>
+          <w:sz w:val="24"/>
+          <w:szCs w:val="24"/>
+        </w:rPr>
+      </w:pPr>
+    </w:p>
+    <w:p>
+      <w:pPr>
+        <w:spacing w:after="0" w:line="240" w:lineRule="auto"/>
+        <w:rPr>
+          <w:rFonts w:ascii="Times New Roman" w:hAnsi="Times New Roman" w:cs="Times New Roman"/>
+          <w:sz w:val="24"/>
+          <w:szCs w:val="24"/>
+        </w:rPr>
+      </w:pPr>
+      <w:r>
+        <w:rPr>
+          <w:rFonts w:ascii="Times New Roman" w:hAnsi="Times New Roman" w:cs="Times New Roman"/>
+          <w:sz w:val="24"/>
+          <w:szCs w:val="24"/>
+        </w:rPr>
+        <w:t xml:space="preserve">We apologize for the confusion. Only our R markdown-based SI was meant to contain the comparison to Liu and Jaeger (2018, they gray line in the figure). This also confused </w:t>
+      </w:r>
+      <w:r>
+        <w:rPr>
+          <w:rFonts w:ascii="Times New Roman" w:hAnsi="Times New Roman" w:cs="Times New Roman"/>
+          <w:sz w:val="24"/>
+          <w:szCs w:val="24"/>
+        </w:rPr>
+        <w:t>another reviewer</w:t>
+      </w:r>
+      <w:r>
+        <w:rPr>
+          <w:rFonts w:ascii="Times New Roman" w:hAnsi="Times New Roman" w:cs="Times New Roman"/>
+          <w:sz w:val="24"/>
+          <w:szCs w:val="24"/>
+        </w:rPr>
+        <w:t xml:space="preserve"> (understandably given that the legend didn’t mention the gray line at all!). </w:t>
+      </w:r>
+    </w:p>
+    <w:p>
+      <w:pPr>
+        <w:spacing w:after="0" w:line="240" w:lineRule="auto"/>
+        <w:rPr>
+          <w:rFonts w:ascii="Times New Roman" w:hAnsi="Times New Roman" w:cs="Times New Roman"/>
+          <w:sz w:val="24"/>
+          <w:szCs w:val="24"/>
+        </w:rPr>
+      </w:pPr>
+    </w:p>
+    <w:p>
+      <w:pPr>
+        <w:spacing w:after="0" w:line="240" w:lineRule="auto"/>
+        <w:rPr>
+          <w:rFonts w:ascii="Times New Roman" w:hAnsi="Times New Roman" w:cs="Times New Roman"/>
+          <w:sz w:val="24"/>
+          <w:szCs w:val="24"/>
+        </w:rPr>
+      </w:pPr>
+      <w:r>
+        <w:rPr>
+          <w:rFonts w:ascii="Times New Roman" w:hAnsi="Times New Roman" w:cs="Times New Roman"/>
+          <w:sz w:val="24"/>
+          <w:szCs w:val="24"/>
+        </w:rPr>
+        <w:t>We have now removed the gray line from the plot in the main text. In the SI, we include the comparison to Liu and Jaeger (2018), and clarify its relevance: comparison to the audio-only</w:t>
+      </w:r>
+      <w:r>
+        <w:rPr>
+          <w:rFonts w:ascii="Times New Roman" w:hAnsi="Times New Roman" w:cs="Times New Roman"/>
+          <w:sz w:val="24"/>
+          <w:szCs w:val="24"/>
+        </w:rPr>
+        <w:t xml:space="preserve"> (and thus no pen)</w:t>
+      </w:r>
+      <w:r>
+        <w:rPr>
+          <w:rFonts w:ascii="Times New Roman" w:hAnsi="Times New Roman" w:cs="Times New Roman"/>
+          <w:sz w:val="24"/>
+          <w:szCs w:val="24"/>
+        </w:rPr>
+        <w:t xml:space="preserve"> continuum used in Liu and Jaeger (and all previous work) helps to assess whether a audiovisual stimulus with the pen in the </w:t>
+      </w:r>
+      <w:r>
+        <w:rPr>
+          <w:rFonts w:ascii="Times New Roman" w:hAnsi="Times New Roman" w:cs="Times New Roman"/>
+          <w:sz w:val="24"/>
+          <w:szCs w:val="24"/>
+        </w:rPr>
+        <w:t>hand</w:t>
+      </w:r>
+      <w:r>
+        <w:rPr>
+          <w:rFonts w:ascii="Times New Roman" w:hAnsi="Times New Roman" w:cs="Times New Roman"/>
+          <w:i/>
+          <w:iCs/>
+          <w:sz w:val="24"/>
+          <w:szCs w:val="24"/>
+        </w:rPr>
+        <w:t xml:space="preserve"> </w:t>
+      </w:r>
+      <w:r>
+        <w:rPr>
+          <w:rFonts w:ascii="Times New Roman" w:hAnsi="Times New Roman" w:cs="Times New Roman"/>
+          <w:sz w:val="24"/>
+          <w:szCs w:val="24"/>
+        </w:rPr>
+        <w:t xml:space="preserve">is actually identical to an audio-only stimulus (an </w:t>
+      </w:r>
+      <w:r>
+        <w:rPr>
+          <w:rFonts w:ascii="Times New Roman" w:hAnsi="Times New Roman" w:cs="Times New Roman"/>
+          <w:i/>
+          <w:iCs/>
+          <w:sz w:val="24"/>
+          <w:szCs w:val="24"/>
+        </w:rPr>
+        <w:t>assumption</w:t>
+      </w:r>
+      <w:r>
+        <w:rPr>
+          <w:rFonts w:ascii="Times New Roman" w:hAnsi="Times New Roman" w:cs="Times New Roman"/>
+          <w:sz w:val="24"/>
+          <w:szCs w:val="24"/>
+        </w:rPr>
+        <w:t xml:space="preserve"> made in </w:t>
+      </w:r>
+      <w:r>
+        <w:rPr>
+          <w:rFonts w:ascii="Times New Roman" w:hAnsi="Times New Roman" w:cs="Times New Roman"/>
+          <w:sz w:val="24"/>
+          <w:szCs w:val="24"/>
+        </w:rPr>
+        <w:t xml:space="preserve">some </w:t>
+      </w:r>
+      <w:r>
+        <w:rPr>
+          <w:rFonts w:ascii="Times New Roman" w:hAnsi="Times New Roman" w:cs="Times New Roman"/>
+          <w:sz w:val="24"/>
+          <w:szCs w:val="24"/>
+        </w:rPr>
+        <w:t>previous work, e.g., Kraljic &amp; Samuel, 2011, but not directly relevant to the present work)</w:t>
+      </w:r>
+      <w:commentRangeStart w:id="9"/>
+      <w:commentRangeStart w:id="10"/>
+      <w:commentRangeStart w:id="11"/>
       <w:r>
         <w:rPr>
           <w:rFonts w:ascii="Times New Roman" w:hAnsi="Times New Roman" w:cs="Times New Roman"/>
@@ -2971,26 +2595,26 @@
         </w:rPr>
         <w:t>.</w:t>
       </w:r>
-      <w:commentRangeEnd w:id="24"/>
+      <w:commentRangeEnd w:id="9"/>
       <w:r>
         <w:rPr>
           <w:rStyle w:val="CommentReference"/>
         </w:rPr>
-        <w:commentReference w:id="24"/>
-      </w:r>
-      <w:commentRangeEnd w:id="25"/>
+        <w:commentReference w:id="9"/>
+      </w:r>
+      <w:commentRangeEnd w:id="10"/>
       <w:r>
         <w:rPr>
           <w:rStyle w:val="CommentReference"/>
         </w:rPr>
-        <w:commentReference w:id="25"/>
-      </w:r>
-      <w:commentRangeEnd w:id="26"/>
+        <w:commentReference w:id="10"/>
+      </w:r>
+      <w:commentRangeEnd w:id="11"/>
       <w:r>
         <w:rPr>
           <w:rStyle w:val="CommentReference"/>
         </w:rPr>
-        <w:commentReference w:id="26"/>
+        <w:commentReference w:id="11"/>
       </w:r>
     </w:p>
     <w:p>
@@ -3024,17 +2648,7 @@
           <w:sz w:val="24"/>
           <w:szCs w:val="24"/>
         </w:rPr>
-        <w:t>-</w:t>
-      </w:r>
-      <w:commentRangeStart w:id="28"/>
-      <w:commentRangeStart w:id="29"/>
-      <w:r>
-        <w:rPr>
-          <w:rFonts w:ascii="Times New Roman" w:hAnsi="Times New Roman" w:cs="Times New Roman"/>
-          <w:sz w:val="24"/>
-          <w:szCs w:val="24"/>
-        </w:rPr>
-        <w:t xml:space="preserve">it is impossible to understand the difference between the a-c versions of Experiment 1 without reading the supplemental materials. All the main text says is that there were different test stimuli across their experiments, because they were chosen such that they elicited a certain percent of s and </w:t>
+        <w:t xml:space="preserve">-it is impossible to understand the difference between the a-c versions of Experiment 1 without reading the supplemental materials. All the main text says is that there were different test stimuli across their experiments, because they were chosen such that they elicited a certain percent of s and </w:t>
       </w:r>
       <w:proofErr w:type="spellStart"/>
       <w:r>
@@ -3099,20 +2713,6 @@
           <w:szCs w:val="24"/>
         </w:rPr>
         <w:t>We have followed these suggestions (thank you for going the extra step of identifying the parts that are critical for understanding the experiments).</w:t>
-      </w:r>
-      <w:commentRangeEnd w:id="28"/>
-      <w:r>
-        <w:rPr>
-          <w:rStyle w:val="CommentReference"/>
-        </w:rPr>
-        <w:commentReference w:id="28"/>
-      </w:r>
-      <w:commentRangeEnd w:id="29"/>
-      <w:r>
-        <w:rPr>
-          <w:rStyle w:val="CommentReference"/>
-        </w:rPr>
-        <w:commentReference w:id="29"/>
       </w:r>
     </w:p>
     <w:p>
@@ -3146,6 +2746,7 @@
           <w:sz w:val="24"/>
           <w:szCs w:val="24"/>
         </w:rPr>
+        <w:lastRenderedPageBreak/>
         <w:t>-"Here and for all other experiments, all 'main' effects were assessed in the center of the acoustic continuum for the first test block" - What counts as the center? Again, more specifics needed!</w:t>
       </w:r>
     </w:p>
@@ -3174,7 +2775,6 @@
           <w:sz w:val="24"/>
           <w:szCs w:val="24"/>
         </w:rPr>
-        <w:lastRenderedPageBreak/>
         <w:t>This was poorly worded: we meant the center/mean of the continuum steps (a direct consequence of centering and standardizing continuum as a predictor for our analysis). We have rephrased this.</w:t>
       </w:r>
     </w:p>
@@ -3209,25 +2809,7 @@
           <w:sz w:val="24"/>
           <w:szCs w:val="24"/>
         </w:rPr>
-        <w:t xml:space="preserve">Once again, I'm </w:t>
-      </w:r>
-      <w:proofErr w:type="gramStart"/>
-      <w:r>
-        <w:rPr>
-          <w:rFonts w:ascii="Times New Roman" w:hAnsi="Times New Roman" w:cs="Times New Roman"/>
-          <w:sz w:val="24"/>
-          <w:szCs w:val="24"/>
-        </w:rPr>
-        <w:t>really enthusiastic</w:t>
-      </w:r>
-      <w:proofErr w:type="gramEnd"/>
-      <w:r>
-        <w:rPr>
-          <w:rFonts w:ascii="Times New Roman" w:hAnsi="Times New Roman" w:cs="Times New Roman"/>
-          <w:sz w:val="24"/>
-          <w:szCs w:val="24"/>
-        </w:rPr>
-        <w:t xml:space="preserve"> about this work and believe it will have a big impact on our understanding of fundamental aspects of speech perception and learning.</w:t>
+        <w:t>Once again, I'm really enthusiastic about this work and believe it will have a big impact on our understanding of fundamental aspects of speech perception and learning.</w:t>
       </w:r>
     </w:p>
     <w:p>
@@ -3526,57 +3108,21 @@
           <w:sz w:val="24"/>
           <w:szCs w:val="24"/>
         </w:rPr>
-        <w:t xml:space="preserve">Pg. 15, Figure 2: this figure is challenging to parse. From the legend it looks like the gray line should be showing the effect of the pen in the hand across experiments, but that can't be true because the gray line is identical across panels. Please state what the gray line is indicating </w:t>
-      </w:r>
-      <w:proofErr w:type="gramStart"/>
-      <w:r>
-        <w:rPr>
-          <w:rFonts w:ascii="Times New Roman" w:hAnsi="Times New Roman" w:cs="Times New Roman"/>
-          <w:sz w:val="24"/>
-          <w:szCs w:val="24"/>
-        </w:rPr>
-        <w:t>and also</w:t>
-      </w:r>
-      <w:proofErr w:type="gramEnd"/>
-      <w:r>
-        <w:rPr>
-          <w:rFonts w:ascii="Times New Roman" w:hAnsi="Times New Roman" w:cs="Times New Roman"/>
-          <w:sz w:val="24"/>
-          <w:szCs w:val="24"/>
-        </w:rPr>
-        <w:t xml:space="preserve"> change the </w:t>
-      </w:r>
-      <w:proofErr w:type="gramStart"/>
-      <w:r>
-        <w:rPr>
-          <w:rFonts w:ascii="Times New Roman" w:hAnsi="Times New Roman" w:cs="Times New Roman"/>
-          <w:sz w:val="24"/>
-          <w:szCs w:val="24"/>
-        </w:rPr>
-        <w:t>legend</w:t>
-      </w:r>
-      <w:proofErr w:type="gramEnd"/>
-      <w:r>
-        <w:rPr>
-          <w:rFonts w:ascii="Times New Roman" w:hAnsi="Times New Roman" w:cs="Times New Roman"/>
-          <w:sz w:val="24"/>
-          <w:szCs w:val="24"/>
-        </w:rPr>
-        <w:t xml:space="preserve"> so the line is darker.</w:t>
-      </w:r>
-    </w:p>
-    <w:p>
-      <w:pPr>
-        <w:spacing w:after="0" w:line="240" w:lineRule="auto"/>
-        <w:rPr>
-          <w:del w:id="30" w:author="Jaeger, Florian" w:date="2025-05-11T14:04:00Z" w16du:dateUtc="2025-05-11T18:04:00Z"/>
-          <w:rFonts w:ascii="Times New Roman" w:hAnsi="Times New Roman" w:cs="Times New Roman"/>
-          <w:sz w:val="24"/>
-          <w:szCs w:val="24"/>
-        </w:rPr>
-      </w:pPr>
-      <w:commentRangeStart w:id="31"/>
-      <w:del w:id="32" w:author="Jaeger, Florian" w:date="2025-05-11T14:04:00Z" w16du:dateUtc="2025-05-11T18:04:00Z">
+        <w:t>Pg. 15, Figure 2: this figure is challenging to parse. From the legend it looks like the gray line should be showing the effect of the pen in the hand across experiments, but that can't be true because the gray line is identical across panels. Please state what the gray line is indicating and also change the legend so the line is darker.</w:t>
+      </w:r>
+    </w:p>
+    <w:p>
+      <w:pPr>
+        <w:spacing w:after="0" w:line="240" w:lineRule="auto"/>
+        <w:rPr>
+          <w:del w:id="12" w:author="Jaeger, Florian" w:date="2025-05-11T14:04:00Z" w16du:dateUtc="2025-05-11T18:04:00Z"/>
+          <w:rFonts w:ascii="Times New Roman" w:hAnsi="Times New Roman" w:cs="Times New Roman"/>
+          <w:sz w:val="24"/>
+          <w:szCs w:val="24"/>
+        </w:rPr>
+      </w:pPr>
+      <w:commentRangeStart w:id="13"/>
+      <w:del w:id="14" w:author="Jaeger, Florian" w:date="2025-05-11T14:04:00Z" w16du:dateUtc="2025-05-11T18:04:00Z">
         <w:r>
           <w:rPr>
             <w:rFonts w:ascii="Times New Roman" w:hAnsi="Times New Roman" w:cs="Times New Roman"/>
@@ -3585,12 +3131,12 @@
           </w:rPr>
           <w:delText>We have added ____.</w:delText>
         </w:r>
-        <w:commentRangeEnd w:id="31"/>
+        <w:commentRangeEnd w:id="13"/>
         <w:r>
           <w:rPr>
             <w:rStyle w:val="CommentReference"/>
           </w:rPr>
-          <w:commentReference w:id="31"/>
+          <w:commentReference w:id="13"/>
         </w:r>
       </w:del>
     </w:p>
@@ -3598,194 +3144,154 @@
       <w:pPr>
         <w:spacing w:after="0" w:line="240" w:lineRule="auto"/>
         <w:rPr>
-          <w:ins w:id="33" w:author="Jaeger, Florian" w:date="2025-05-11T14:04:00Z" w16du:dateUtc="2025-05-11T18:04:00Z"/>
-          <w:rFonts w:ascii="Times New Roman" w:hAnsi="Times New Roman" w:cs="Times New Roman"/>
-          <w:sz w:val="24"/>
-          <w:szCs w:val="24"/>
-        </w:rPr>
-      </w:pPr>
-    </w:p>
-    <w:p>
-      <w:pPr>
-        <w:spacing w:after="0" w:line="240" w:lineRule="auto"/>
-        <w:rPr>
-          <w:rFonts w:ascii="Times New Roman" w:hAnsi="Times New Roman" w:cs="Times New Roman"/>
-          <w:sz w:val="24"/>
-          <w:szCs w:val="24"/>
-        </w:rPr>
-      </w:pPr>
-      <w:ins w:id="34" w:author="Jaeger, Florian" w:date="2025-05-11T14:04:00Z" w16du:dateUtc="2025-05-11T18:04:00Z">
-        <w:r>
-          <w:rPr>
-            <w:rFonts w:ascii="Times New Roman" w:hAnsi="Times New Roman" w:cs="Times New Roman"/>
-            <w:sz w:val="24"/>
-            <w:szCs w:val="24"/>
-          </w:rPr>
-          <w:t xml:space="preserve">We apologize for the confusion. </w:t>
-        </w:r>
-        <w:r>
-          <w:rPr>
-            <w:rFonts w:ascii="Times New Roman" w:hAnsi="Times New Roman" w:cs="Times New Roman"/>
-            <w:sz w:val="24"/>
-            <w:szCs w:val="24"/>
-          </w:rPr>
-          <w:t xml:space="preserve">The gray line </w:t>
-        </w:r>
-        <w:proofErr w:type="gramStart"/>
-        <w:r>
-          <w:rPr>
-            <w:rFonts w:ascii="Times New Roman" w:hAnsi="Times New Roman" w:cs="Times New Roman"/>
-            <w:sz w:val="24"/>
-            <w:szCs w:val="24"/>
-          </w:rPr>
-          <w:t>actually showed</w:t>
-        </w:r>
-        <w:proofErr w:type="gramEnd"/>
-        <w:r>
-          <w:rPr>
-            <w:rFonts w:ascii="Times New Roman" w:hAnsi="Times New Roman" w:cs="Times New Roman"/>
-            <w:sz w:val="24"/>
-            <w:szCs w:val="24"/>
-          </w:rPr>
-          <w:t xml:space="preserve"> the result of the audio-only </w:t>
-        </w:r>
-      </w:ins>
-      <w:ins w:id="35" w:author="Jaeger, Florian" w:date="2025-05-11T14:14:00Z" w16du:dateUtc="2025-05-11T18:14:00Z">
-        <w:r>
-          <w:rPr>
-            <w:rFonts w:ascii="Times New Roman" w:hAnsi="Times New Roman" w:cs="Times New Roman"/>
-            <w:sz w:val="24"/>
-            <w:szCs w:val="24"/>
-          </w:rPr>
-          <w:t>(no pen) test continuum presented in Liu and Jaeger (2018</w:t>
-        </w:r>
-      </w:ins>
-      <w:ins w:id="36" w:author="Jaeger, Florian" w:date="2025-05-11T14:15:00Z" w16du:dateUtc="2025-05-11T18:15:00Z">
-        <w:r>
-          <w:rPr>
-            <w:rFonts w:ascii="Times New Roman" w:hAnsi="Times New Roman" w:cs="Times New Roman"/>
-            <w:sz w:val="24"/>
-            <w:szCs w:val="24"/>
-          </w:rPr>
-          <w:t>, in their supplementary information). This gray line was only meant to show in our supplementary information, where we explain its relevance. This has now been fixed.</w:t>
-        </w:r>
-      </w:ins>
-    </w:p>
-    <w:p>
-      <w:pPr>
-        <w:spacing w:after="0" w:line="240" w:lineRule="auto"/>
-        <w:rPr>
-          <w:rFonts w:ascii="Times New Roman" w:hAnsi="Times New Roman" w:cs="Times New Roman"/>
-          <w:sz w:val="24"/>
-          <w:szCs w:val="24"/>
-        </w:rPr>
-      </w:pPr>
-    </w:p>
-    <w:p>
-      <w:pPr>
-        <w:spacing w:after="0" w:line="240" w:lineRule="auto"/>
-        <w:rPr>
-          <w:rFonts w:ascii="Times New Roman" w:hAnsi="Times New Roman" w:cs="Times New Roman"/>
-          <w:sz w:val="24"/>
-          <w:szCs w:val="24"/>
-        </w:rPr>
-      </w:pPr>
-    </w:p>
-    <w:p>
-      <w:pPr>
-        <w:spacing w:after="0" w:line="240" w:lineRule="auto"/>
-        <w:rPr>
-          <w:rFonts w:ascii="Times New Roman" w:hAnsi="Times New Roman" w:cs="Times New Roman"/>
-          <w:sz w:val="24"/>
-          <w:szCs w:val="24"/>
-        </w:rPr>
-      </w:pPr>
-    </w:p>
-    <w:p>
-      <w:pPr>
-        <w:spacing w:after="0" w:line="240" w:lineRule="auto"/>
-        <w:rPr>
-          <w:rFonts w:ascii="Times New Roman" w:hAnsi="Times New Roman" w:cs="Times New Roman"/>
-          <w:sz w:val="24"/>
-          <w:szCs w:val="24"/>
-        </w:rPr>
-      </w:pPr>
-    </w:p>
-    <w:p>
-      <w:pPr>
-        <w:spacing w:after="0" w:line="240" w:lineRule="auto"/>
-        <w:rPr>
-          <w:rFonts w:ascii="Times New Roman" w:hAnsi="Times New Roman" w:cs="Times New Roman"/>
-          <w:sz w:val="24"/>
-          <w:szCs w:val="24"/>
-        </w:rPr>
-      </w:pPr>
-    </w:p>
-    <w:p>
-      <w:pPr>
-        <w:spacing w:after="0" w:line="240" w:lineRule="auto"/>
-        <w:rPr>
-          <w:rFonts w:ascii="Times New Roman" w:hAnsi="Times New Roman" w:cs="Times New Roman"/>
-          <w:sz w:val="24"/>
-          <w:szCs w:val="24"/>
-        </w:rPr>
-      </w:pPr>
-    </w:p>
-    <w:p>
-      <w:pPr>
-        <w:spacing w:after="0" w:line="240" w:lineRule="auto"/>
-        <w:rPr>
-          <w:rFonts w:ascii="Times New Roman" w:hAnsi="Times New Roman" w:cs="Times New Roman"/>
-          <w:sz w:val="24"/>
-          <w:szCs w:val="24"/>
-        </w:rPr>
-      </w:pPr>
-    </w:p>
-    <w:p>
-      <w:pPr>
-        <w:spacing w:after="0" w:line="240" w:lineRule="auto"/>
-        <w:rPr>
-          <w:rFonts w:ascii="Times New Roman" w:hAnsi="Times New Roman" w:cs="Times New Roman"/>
-          <w:sz w:val="24"/>
-          <w:szCs w:val="24"/>
-        </w:rPr>
-      </w:pPr>
-    </w:p>
-    <w:p>
-      <w:pPr>
-        <w:spacing w:after="0" w:line="240" w:lineRule="auto"/>
-        <w:rPr>
-          <w:rFonts w:ascii="Times New Roman" w:hAnsi="Times New Roman" w:cs="Times New Roman"/>
-          <w:sz w:val="24"/>
-          <w:szCs w:val="24"/>
-        </w:rPr>
-      </w:pPr>
-    </w:p>
-    <w:p>
-      <w:pPr>
-        <w:spacing w:after="0" w:line="240" w:lineRule="auto"/>
-        <w:rPr>
-          <w:rFonts w:ascii="Times New Roman" w:hAnsi="Times New Roman" w:cs="Times New Roman"/>
-          <w:sz w:val="24"/>
-          <w:szCs w:val="24"/>
-        </w:rPr>
-      </w:pPr>
-    </w:p>
-    <w:p>
-      <w:pPr>
-        <w:spacing w:after="0" w:line="240" w:lineRule="auto"/>
-        <w:rPr>
-          <w:rFonts w:ascii="Times New Roman" w:hAnsi="Times New Roman" w:cs="Times New Roman"/>
-          <w:sz w:val="24"/>
-          <w:szCs w:val="24"/>
-        </w:rPr>
-      </w:pPr>
-      <w:r>
-        <w:rPr>
-          <w:rFonts w:ascii="Times New Roman" w:hAnsi="Times New Roman" w:cs="Times New Roman"/>
-          <w:sz w:val="24"/>
-          <w:szCs w:val="24"/>
-        </w:rPr>
+          <w:rFonts w:ascii="Times New Roman" w:hAnsi="Times New Roman" w:cs="Times New Roman"/>
+          <w:sz w:val="24"/>
+          <w:szCs w:val="24"/>
+        </w:rPr>
+      </w:pPr>
+    </w:p>
+    <w:p>
+      <w:pPr>
+        <w:spacing w:after="0" w:line="240" w:lineRule="auto"/>
+        <w:rPr>
+          <w:rFonts w:ascii="Times New Roman" w:hAnsi="Times New Roman" w:cs="Times New Roman"/>
+          <w:sz w:val="24"/>
+          <w:szCs w:val="24"/>
+        </w:rPr>
+      </w:pPr>
+      <w:r>
+        <w:rPr>
+          <w:rFonts w:ascii="Times New Roman" w:hAnsi="Times New Roman" w:cs="Times New Roman"/>
+          <w:sz w:val="24"/>
+          <w:szCs w:val="24"/>
+        </w:rPr>
+        <w:t xml:space="preserve">We apologize for the confusion. The gray line actually showed the result of the audio-only </w:t>
+      </w:r>
+      <w:r>
+        <w:rPr>
+          <w:rFonts w:ascii="Times New Roman" w:hAnsi="Times New Roman" w:cs="Times New Roman"/>
+          <w:sz w:val="24"/>
+          <w:szCs w:val="24"/>
+        </w:rPr>
+        <w:t>(no pen) test continuum presented in Liu and Jaeger (2018, in their supplementary information). This gray line was only meant to show in our supplementary information, where we explain its relevance. This has now been fixed.</w:t>
+      </w:r>
+    </w:p>
+    <w:p>
+      <w:pPr>
+        <w:spacing w:after="0" w:line="240" w:lineRule="auto"/>
+        <w:rPr>
+          <w:rFonts w:ascii="Times New Roman" w:hAnsi="Times New Roman" w:cs="Times New Roman"/>
+          <w:sz w:val="24"/>
+          <w:szCs w:val="24"/>
+        </w:rPr>
+      </w:pPr>
+    </w:p>
+    <w:p>
+      <w:pPr>
+        <w:spacing w:after="0" w:line="240" w:lineRule="auto"/>
+        <w:rPr>
+          <w:rFonts w:ascii="Times New Roman" w:hAnsi="Times New Roman" w:cs="Times New Roman"/>
+          <w:sz w:val="24"/>
+          <w:szCs w:val="24"/>
+        </w:rPr>
+      </w:pPr>
+    </w:p>
+    <w:p>
+      <w:pPr>
+        <w:spacing w:after="0" w:line="240" w:lineRule="auto"/>
+        <w:rPr>
+          <w:rFonts w:ascii="Times New Roman" w:hAnsi="Times New Roman" w:cs="Times New Roman"/>
+          <w:sz w:val="24"/>
+          <w:szCs w:val="24"/>
+        </w:rPr>
+      </w:pPr>
+    </w:p>
+    <w:p>
+      <w:pPr>
+        <w:spacing w:after="0" w:line="240" w:lineRule="auto"/>
+        <w:rPr>
+          <w:rFonts w:ascii="Times New Roman" w:hAnsi="Times New Roman" w:cs="Times New Roman"/>
+          <w:sz w:val="24"/>
+          <w:szCs w:val="24"/>
+        </w:rPr>
+      </w:pPr>
+    </w:p>
+    <w:p>
+      <w:pPr>
+        <w:spacing w:after="0" w:line="240" w:lineRule="auto"/>
+        <w:rPr>
+          <w:rFonts w:ascii="Times New Roman" w:hAnsi="Times New Roman" w:cs="Times New Roman"/>
+          <w:sz w:val="24"/>
+          <w:szCs w:val="24"/>
+        </w:rPr>
+      </w:pPr>
+    </w:p>
+    <w:p>
+      <w:pPr>
+        <w:spacing w:after="0" w:line="240" w:lineRule="auto"/>
+        <w:rPr>
+          <w:rFonts w:ascii="Times New Roman" w:hAnsi="Times New Roman" w:cs="Times New Roman"/>
+          <w:sz w:val="24"/>
+          <w:szCs w:val="24"/>
+        </w:rPr>
+      </w:pPr>
+    </w:p>
+    <w:p>
+      <w:pPr>
+        <w:spacing w:after="0" w:line="240" w:lineRule="auto"/>
+        <w:rPr>
+          <w:rFonts w:ascii="Times New Roman" w:hAnsi="Times New Roman" w:cs="Times New Roman"/>
+          <w:sz w:val="24"/>
+          <w:szCs w:val="24"/>
+        </w:rPr>
+      </w:pPr>
+    </w:p>
+    <w:p>
+      <w:pPr>
+        <w:spacing w:after="0" w:line="240" w:lineRule="auto"/>
+        <w:rPr>
+          <w:rFonts w:ascii="Times New Roman" w:hAnsi="Times New Roman" w:cs="Times New Roman"/>
+          <w:sz w:val="24"/>
+          <w:szCs w:val="24"/>
+        </w:rPr>
+      </w:pPr>
+    </w:p>
+    <w:p>
+      <w:pPr>
+        <w:spacing w:after="0" w:line="240" w:lineRule="auto"/>
+        <w:rPr>
+          <w:rFonts w:ascii="Times New Roman" w:hAnsi="Times New Roman" w:cs="Times New Roman"/>
+          <w:sz w:val="24"/>
+          <w:szCs w:val="24"/>
+        </w:rPr>
+      </w:pPr>
+    </w:p>
+    <w:p>
+      <w:pPr>
+        <w:spacing w:after="0" w:line="240" w:lineRule="auto"/>
+        <w:rPr>
+          <w:rFonts w:ascii="Times New Roman" w:hAnsi="Times New Roman" w:cs="Times New Roman"/>
+          <w:sz w:val="24"/>
+          <w:szCs w:val="24"/>
+        </w:rPr>
+      </w:pPr>
+    </w:p>
+    <w:p>
+      <w:pPr>
+        <w:spacing w:after="0" w:line="240" w:lineRule="auto"/>
+        <w:rPr>
+          <w:rFonts w:ascii="Times New Roman" w:hAnsi="Times New Roman" w:cs="Times New Roman"/>
+          <w:sz w:val="24"/>
+          <w:szCs w:val="24"/>
+        </w:rPr>
+      </w:pPr>
+      <w:r>
+        <w:rPr>
+          <w:rFonts w:ascii="Times New Roman" w:hAnsi="Times New Roman" w:cs="Times New Roman"/>
+          <w:sz w:val="24"/>
+          <w:szCs w:val="24"/>
+        </w:rPr>
+        <w:lastRenderedPageBreak/>
         <w:t xml:space="preserve"> </w:t>
       </w:r>
     </w:p>
@@ -3806,8 +3312,8 @@
 </file>
 
 <file path=word/comments.xml><?xml version="1.0" encoding="utf-8"?>
-<w:comments xmlns:wpc="http://schemas.microsoft.com/office/word/2010/wordprocessingCanvas" xmlns:cx="http://schemas.microsoft.com/office/drawing/2014/chartex" xmlns:cx1="http://schemas.microsoft.com/office/drawing/2015/9/8/chartex" xmlns:cx2="http://schemas.microsoft.com/office/drawing/2015/10/21/chartex" xmlns:cx3="http://schemas.microsoft.com/office/drawing/2016/5/9/chartex" xmlns:cx4="http://schemas.microsoft.com/office/drawing/2016/5/10/chartex" xmlns:cx5="http://schemas.microsoft.com/office/drawing/2016/5/11/chartex" xmlns:cx6="http://schemas.microsoft.com/office/drawing/2016/5/12/chartex" xmlns:cx7="http://schemas.microsoft.com/office/drawing/2016/5/13/chartex" xmlns:cx8="http://schemas.microsoft.com/office/drawing/2016/5/14/chartex" xmlns:mc="http://schemas.openxmlformats.org/markup-compatibility/2006" xmlns:aink="http://schemas.microsoft.com/office/drawing/2016/ink" xmlns:am3d="http://schemas.microsoft.com/office/drawing/2017/model3d" xmlns:o="urn:schemas-microsoft-com:office:office" xmlns:oel="http://schemas.microsoft.com/office/2019/extlst" xmlns:r="http://schemas.openxmlformats.org/officeDocument/2006/relationships" xmlns:m="http://schemas.openxmlformats.org/officeDocument/2006/math" xmlns:v="urn:schemas-microsoft-com:vml" xmlns:wp14="http://schemas.microsoft.com/office/word/2010/wordprocessingDrawing" xmlns:wp="http://schemas.openxmlformats.org/drawingml/2006/wordprocessingDrawing" xmlns:w10="urn:schemas-microsoft-com:office:word" xmlns:w="http://schemas.openxmlformats.org/wordprocessingml/2006/main" xmlns:w14="http://schemas.microsoft.com/office/word/2010/wordml" xmlns:w15="http://schemas.microsoft.com/office/word/2012/wordml" xmlns:w16cex="http://schemas.microsoft.com/office/word/2018/wordml/cex" xmlns:w16cid="http://schemas.microsoft.com/office/word/2016/wordml/cid" xmlns:w16="http://schemas.microsoft.com/office/word/2018/wordml" xmlns:w16du="http://schemas.microsoft.com/office/word/2023/wordml/word16du" xmlns:w16sdtdh="http://schemas.microsoft.com/office/word/2020/wordml/sdtdatahash" xmlns:w16sdtfl="http://schemas.microsoft.com/office/word/2024/wordml/sdtformatlock" xmlns:w16se="http://schemas.microsoft.com/office/word/2015/wordml/symex" xmlns:wpg="http://schemas.microsoft.com/office/word/2010/wordprocessingGroup" xmlns:wpi="http://schemas.microsoft.com/office/word/2010/wordprocessingInk" xmlns:wne="http://schemas.microsoft.com/office/word/2006/wordml" xmlns:wps="http://schemas.microsoft.com/office/word/2010/wordprocessingShape" mc:Ignorable="w14 w15 w16se w16cid w16 w16cex w16sdtdh w16sdtfl w16du wp14">
-  <w:comment w:id="0" w:author="Cummings, Shawn" w:date="2025-05-10T13:53:00Z" w:initials="SC">
+<w:comments xmlns:wpc="http://schemas.microsoft.com/office/word/2010/wordprocessingCanvas" xmlns:cx="http://schemas.microsoft.com/office/drawing/2014/chartex" xmlns:cx1="http://schemas.microsoft.com/office/drawing/2015/9/8/chartex" xmlns:cx2="http://schemas.microsoft.com/office/drawing/2015/10/21/chartex" xmlns:cx3="http://schemas.microsoft.com/office/drawing/2016/5/9/chartex" xmlns:cx4="http://schemas.microsoft.com/office/drawing/2016/5/10/chartex" xmlns:cx5="http://schemas.microsoft.com/office/drawing/2016/5/11/chartex" xmlns:cx6="http://schemas.microsoft.com/office/drawing/2016/5/12/chartex" xmlns:cx7="http://schemas.microsoft.com/office/drawing/2016/5/13/chartex" xmlns:cx8="http://schemas.microsoft.com/office/drawing/2016/5/14/chartex" xmlns:mc="http://schemas.openxmlformats.org/markup-compatibility/2006" xmlns:aink="http://schemas.microsoft.com/office/drawing/2016/ink" xmlns:am3d="http://schemas.microsoft.com/office/drawing/2017/model3d" xmlns:o="urn:schemas-microsoft-com:office:office" xmlns:oel="http://schemas.microsoft.com/office/2019/extlst" xmlns:r="http://schemas.openxmlformats.org/officeDocument/2006/relationships" xmlns:m="http://schemas.openxmlformats.org/officeDocument/2006/math" xmlns:v="urn:schemas-microsoft-com:vml" xmlns:wp14="http://schemas.microsoft.com/office/word/2010/wordprocessingDrawing" xmlns:wp="http://schemas.openxmlformats.org/drawingml/2006/wordprocessingDrawing" xmlns:w10="urn:schemas-microsoft-com:office:word" xmlns:w="http://schemas.openxmlformats.org/wordprocessingml/2006/main" xmlns:w14="http://schemas.microsoft.com/office/word/2010/wordml" xmlns:w15="http://schemas.microsoft.com/office/word/2012/wordml" xmlns:w16cex="http://schemas.microsoft.com/office/word/2018/wordml/cex" xmlns:w16cid="http://schemas.microsoft.com/office/word/2016/wordml/cid" xmlns:w16="http://schemas.microsoft.com/office/word/2018/wordml" xmlns:w16du="http://schemas.microsoft.com/office/word/2023/wordml/word16du" xmlns:w16sdtdh="http://schemas.microsoft.com/office/word/2020/wordml/sdtdatahash" xmlns:w16se="http://schemas.microsoft.com/office/word/2015/wordml/symex" xmlns:wpg="http://schemas.microsoft.com/office/word/2010/wordprocessingGroup" xmlns:wpi="http://schemas.microsoft.com/office/word/2010/wordprocessingInk" xmlns:wne="http://schemas.microsoft.com/office/word/2006/wordml" xmlns:wps="http://schemas.microsoft.com/office/word/2010/wordprocessingShape" mc:Ignorable="w14 w15 w16se w16cid w16 w16cex w16sdtdh w16du wp14">
+  <w:comment w:id="7" w:author="Cummings, Shawn" w:date="2025-05-10T15:00:00Z" w:initials="SC">
     <w:p>
       <w:r>
         <w:rPr>
@@ -3820,45 +3326,11 @@
           <w:sz w:val="20"/>
           <w:szCs w:val="20"/>
         </w:rPr>
-        <w:t>Revisit once paragraph drafted</w:t>
+        <w:t>In text we say 0.5%— let’s double check this?</w:t>
       </w:r>
     </w:p>
   </w:comment>
-  <w:comment w:id="2" w:author="Cummings, Shawn" w:date="2025-05-09T13:18:00Z" w:initials="SC">
-    <w:p>
-      <w:r>
-        <w:rPr>
-          <w:rStyle w:val="CommentReference"/>
-        </w:rPr>
-        <w:annotationRef/>
-      </w:r>
-      <w:r>
-        <w:rPr>
-          <w:sz w:val="20"/>
-          <w:szCs w:val="20"/>
-        </w:rPr>
-        <w:t>Unless we instead just remove the LJ18 line</w:t>
-      </w:r>
-    </w:p>
-  </w:comment>
-  <w:comment w:id="5" w:author="Cummings, Shawn" w:date="2025-05-10T15:00:00Z" w:initials="SC">
-    <w:p>
-      <w:r>
-        <w:rPr>
-          <w:rStyle w:val="CommentReference"/>
-        </w:rPr>
-        <w:annotationRef/>
-      </w:r>
-      <w:r>
-        <w:rPr>
-          <w:sz w:val="20"/>
-          <w:szCs w:val="20"/>
-        </w:rPr>
-        <w:t>In text we say 0.5%— let’s double check this?</w:t>
-      </w:r>
-    </w:p>
-  </w:comment>
-  <w:comment w:id="24" w:author="Jaeger, Florian" w:date="2025-05-08T18:41:00Z" w:initials="TJ">
+  <w:comment w:id="9" w:author="Jaeger, Florian" w:date="2025-05-08T18:41:00Z" w:initials="TJ">
     <w:p>
       <w:r>
         <w:rPr>
@@ -3876,7 +3348,7 @@
       </w:r>
     </w:p>
   </w:comment>
-  <w:comment w:id="25" w:author="Cummings, Shawn" w:date="2025-05-09T12:06:00Z" w:initials="SC">
+  <w:comment w:id="10" w:author="Cummings, Shawn" w:date="2025-05-09T12:06:00Z" w:initials="SC">
     <w:p>
       <w:r>
         <w:rPr>
@@ -3893,7 +3365,7 @@
       </w:r>
     </w:p>
   </w:comment>
-  <w:comment w:id="26" w:author="Jaeger, Florian" w:date="2025-05-11T13:59:00Z" w:initials="TJ">
+  <w:comment w:id="11" w:author="Jaeger, Florian" w:date="2025-05-11T13:59:00Z" w:initials="TJ">
     <w:p>
       <w:r>
         <w:rPr>
@@ -3911,42 +3383,7 @@
       </w:r>
     </w:p>
   </w:comment>
-  <w:comment w:id="28" w:author="Cummings, Shawn" w:date="2025-05-09T13:26:00Z" w:initials="SC">
-    <w:p>
-      <w:r>
-        <w:rPr>
-          <w:rStyle w:val="CommentReference"/>
-        </w:rPr>
-        <w:annotationRef/>
-      </w:r>
-      <w:r>
-        <w:rPr>
-          <w:sz w:val="20"/>
-          <w:szCs w:val="20"/>
-        </w:rPr>
-        <w:t xml:space="preserve">I actually think this reader got garden-pathed by E1a-b? </w:t>
-      </w:r>
-    </w:p>
-  </w:comment>
-  <w:comment w:id="29" w:author="Jaeger, Florian" w:date="2025-05-11T14:03:00Z" w:initials="TJ">
-    <w:p>
-      <w:r>
-        <w:rPr>
-          <w:rStyle w:val="CommentReference"/>
-        </w:rPr>
-        <w:annotationRef/>
-      </w:r>
-      <w:r>
-        <w:rPr>
-          <w:color w:val="000000"/>
-          <w:sz w:val="20"/>
-          <w:szCs w:val="20"/>
-        </w:rPr>
-        <w:t>Not quite sure what you mean?</w:t>
-      </w:r>
-    </w:p>
-  </w:comment>
-  <w:comment w:id="31" w:author="Jaeger, Florian" w:date="2025-05-08T18:51:00Z" w:initials="TJ">
+  <w:comment w:id="13" w:author="Jaeger, Florian" w:date="2025-05-08T18:51:00Z" w:initials="TJ">
     <w:p>
       <w:r>
         <w:rPr>
@@ -3968,49 +3405,37 @@
 </file>
 
 <file path=word/commentsExtended.xml><?xml version="1.0" encoding="utf-8"?>
-<w15:commentsEx xmlns:wpc="http://schemas.microsoft.com/office/word/2010/wordprocessingCanvas" xmlns:cx="http://schemas.microsoft.com/office/drawing/2014/chartex" xmlns:cx1="http://schemas.microsoft.com/office/drawing/2015/9/8/chartex" xmlns:cx2="http://schemas.microsoft.com/office/drawing/2015/10/21/chartex" xmlns:cx3="http://schemas.microsoft.com/office/drawing/2016/5/9/chartex" xmlns:cx4="http://schemas.microsoft.com/office/drawing/2016/5/10/chartex" xmlns:cx5="http://schemas.microsoft.com/office/drawing/2016/5/11/chartex" xmlns:cx6="http://schemas.microsoft.com/office/drawing/2016/5/12/chartex" xmlns:cx7="http://schemas.microsoft.com/office/drawing/2016/5/13/chartex" xmlns:cx8="http://schemas.microsoft.com/office/drawing/2016/5/14/chartex" xmlns:mc="http://schemas.openxmlformats.org/markup-compatibility/2006" xmlns:aink="http://schemas.microsoft.com/office/drawing/2016/ink" xmlns:am3d="http://schemas.microsoft.com/office/drawing/2017/model3d" xmlns:o="urn:schemas-microsoft-com:office:office" xmlns:oel="http://schemas.microsoft.com/office/2019/extlst" xmlns:r="http://schemas.openxmlformats.org/officeDocument/2006/relationships" xmlns:m="http://schemas.openxmlformats.org/officeDocument/2006/math" xmlns:v="urn:schemas-microsoft-com:vml" xmlns:wp14="http://schemas.microsoft.com/office/word/2010/wordprocessingDrawing" xmlns:wp="http://schemas.openxmlformats.org/drawingml/2006/wordprocessingDrawing" xmlns:w10="urn:schemas-microsoft-com:office:word" xmlns:w="http://schemas.openxmlformats.org/wordprocessingml/2006/main" xmlns:w14="http://schemas.microsoft.com/office/word/2010/wordml" xmlns:w15="http://schemas.microsoft.com/office/word/2012/wordml" xmlns:w16cex="http://schemas.microsoft.com/office/word/2018/wordml/cex" xmlns:w16cid="http://schemas.microsoft.com/office/word/2016/wordml/cid" xmlns:w16="http://schemas.microsoft.com/office/word/2018/wordml" xmlns:w16du="http://schemas.microsoft.com/office/word/2023/wordml/word16du" xmlns:w16sdtdh="http://schemas.microsoft.com/office/word/2020/wordml/sdtdatahash" xmlns:w16sdtfl="http://schemas.microsoft.com/office/word/2024/wordml/sdtformatlock" xmlns:w16se="http://schemas.microsoft.com/office/word/2015/wordml/symex" xmlns:wpg="http://schemas.microsoft.com/office/word/2010/wordprocessingGroup" xmlns:wpi="http://schemas.microsoft.com/office/word/2010/wordprocessingInk" xmlns:wne="http://schemas.microsoft.com/office/word/2006/wordml" xmlns:wps="http://schemas.microsoft.com/office/word/2010/wordprocessingShape" mc:Ignorable="w14 w15 w16se w16cid w16 w16cex w16sdtdh w16sdtfl w16du wp14">
-  <w15:commentEx w15:paraId="2C45303E" w15:done="0"/>
-  <w15:commentEx w15:paraId="492B34B2" w15:done="0"/>
+<w15:commentsEx xmlns:wpc="http://schemas.microsoft.com/office/word/2010/wordprocessingCanvas" xmlns:cx="http://schemas.microsoft.com/office/drawing/2014/chartex" xmlns:cx1="http://schemas.microsoft.com/office/drawing/2015/9/8/chartex" xmlns:cx2="http://schemas.microsoft.com/office/drawing/2015/10/21/chartex" xmlns:cx3="http://schemas.microsoft.com/office/drawing/2016/5/9/chartex" xmlns:cx4="http://schemas.microsoft.com/office/drawing/2016/5/10/chartex" xmlns:cx5="http://schemas.microsoft.com/office/drawing/2016/5/11/chartex" xmlns:cx6="http://schemas.microsoft.com/office/drawing/2016/5/12/chartex" xmlns:cx7="http://schemas.microsoft.com/office/drawing/2016/5/13/chartex" xmlns:cx8="http://schemas.microsoft.com/office/drawing/2016/5/14/chartex" xmlns:mc="http://schemas.openxmlformats.org/markup-compatibility/2006" xmlns:aink="http://schemas.microsoft.com/office/drawing/2016/ink" xmlns:am3d="http://schemas.microsoft.com/office/drawing/2017/model3d" xmlns:o="urn:schemas-microsoft-com:office:office" xmlns:oel="http://schemas.microsoft.com/office/2019/extlst" xmlns:r="http://schemas.openxmlformats.org/officeDocument/2006/relationships" xmlns:m="http://schemas.openxmlformats.org/officeDocument/2006/math" xmlns:v="urn:schemas-microsoft-com:vml" xmlns:wp14="http://schemas.microsoft.com/office/word/2010/wordprocessingDrawing" xmlns:wp="http://schemas.openxmlformats.org/drawingml/2006/wordprocessingDrawing" xmlns:w10="urn:schemas-microsoft-com:office:word" xmlns:w="http://schemas.openxmlformats.org/wordprocessingml/2006/main" xmlns:w14="http://schemas.microsoft.com/office/word/2010/wordml" xmlns:w15="http://schemas.microsoft.com/office/word/2012/wordml" xmlns:w16cex="http://schemas.microsoft.com/office/word/2018/wordml/cex" xmlns:w16cid="http://schemas.microsoft.com/office/word/2016/wordml/cid" xmlns:w16="http://schemas.microsoft.com/office/word/2018/wordml" xmlns:w16du="http://schemas.microsoft.com/office/word/2023/wordml/word16du" xmlns:w16sdtdh="http://schemas.microsoft.com/office/word/2020/wordml/sdtdatahash" xmlns:w16se="http://schemas.microsoft.com/office/word/2015/wordml/symex" xmlns:wpg="http://schemas.microsoft.com/office/word/2010/wordprocessingGroup" xmlns:wpi="http://schemas.microsoft.com/office/word/2010/wordprocessingInk" xmlns:wne="http://schemas.microsoft.com/office/word/2006/wordml" xmlns:wps="http://schemas.microsoft.com/office/word/2010/wordprocessingShape" mc:Ignorable="w14 w15 w16se w16cid w16 w16cex w16sdtdh w16du wp14">
   <w15:commentEx w15:paraId="7C915410" w15:done="0"/>
-  <w15:commentEx w15:paraId="6F322517" w15:done="0"/>
-  <w15:commentEx w15:paraId="176D0065" w15:paraIdParent="6F322517" w15:done="0"/>
-  <w15:commentEx w15:paraId="32BC88D6" w15:paraIdParent="6F322517" w15:done="0"/>
-  <w15:commentEx w15:paraId="4DC50076" w15:done="0"/>
-  <w15:commentEx w15:paraId="1051E364" w15:paraIdParent="4DC50076" w15:done="0"/>
+  <w15:commentEx w15:paraId="6F322517" w15:done="1"/>
+  <w15:commentEx w15:paraId="176D0065" w15:paraIdParent="6F322517" w15:done="1"/>
+  <w15:commentEx w15:paraId="32BC88D6" w15:paraIdParent="6F322517" w15:done="1"/>
   <w15:commentEx w15:paraId="2A929C5A" w15:done="0"/>
 </w15:commentsEx>
 </file>
 
 <file path=word/commentsExtensible.xml><?xml version="1.0" encoding="utf-8"?>
-<w16cex:commentsExtensible xmlns:wpc="http://schemas.microsoft.com/office/word/2010/wordprocessingCanvas" xmlns:cx="http://schemas.microsoft.com/office/drawing/2014/chartex" xmlns:cx1="http://schemas.microsoft.com/office/drawing/2015/9/8/chartex" xmlns:cx2="http://schemas.microsoft.com/office/drawing/2015/10/21/chartex" xmlns:cx3="http://schemas.microsoft.com/office/drawing/2016/5/9/chartex" xmlns:cx4="http://schemas.microsoft.com/office/drawing/2016/5/10/chartex" xmlns:cx5="http://schemas.microsoft.com/office/drawing/2016/5/11/chartex" xmlns:cx6="http://schemas.microsoft.com/office/drawing/2016/5/12/chartex" xmlns:cx7="http://schemas.microsoft.com/office/drawing/2016/5/13/chartex" xmlns:cx8="http://schemas.microsoft.com/office/drawing/2016/5/14/chartex" xmlns:cr="http://schemas.microsoft.com/office/comments/2020/reactions" xmlns:mc="http://schemas.openxmlformats.org/markup-compatibility/2006" xmlns:aink="http://schemas.microsoft.com/office/drawing/2016/ink" xmlns:am3d="http://schemas.microsoft.com/office/drawing/2017/model3d" xmlns:o="urn:schemas-microsoft-com:office:office" xmlns:oel="http://schemas.microsoft.com/office/2019/extlst" xmlns:r="http://schemas.openxmlformats.org/officeDocument/2006/relationships" xmlns:m="http://schemas.openxmlformats.org/officeDocument/2006/math" xmlns:v="urn:schemas-microsoft-com:vml" xmlns:wp14="http://schemas.microsoft.com/office/word/2010/wordprocessingDrawing" xmlns:wp="http://schemas.openxmlformats.org/drawingml/2006/wordprocessingDrawing" xmlns:w10="urn:schemas-microsoft-com:office:word" xmlns:w="http://schemas.openxmlformats.org/wordprocessingml/2006/main" xmlns:w14="http://schemas.microsoft.com/office/word/2010/wordml" xmlns:w15="http://schemas.microsoft.com/office/word/2012/wordml" xmlns:w16cex="http://schemas.microsoft.com/office/word/2018/wordml/cex" xmlns:w16cid="http://schemas.microsoft.com/office/word/2016/wordml/cid" xmlns:w16="http://schemas.microsoft.com/office/word/2018/wordml" xmlns:w16du="http://schemas.microsoft.com/office/word/2023/wordml/word16du" xmlns:w16sdtdh="http://schemas.microsoft.com/office/word/2020/wordml/sdtdatahash" xmlns:w16sdtfl="http://schemas.microsoft.com/office/word/2024/wordml/sdtformatlock" xmlns:w16se="http://schemas.microsoft.com/office/word/2015/wordml/symex" xmlns:wpg="http://schemas.microsoft.com/office/word/2010/wordprocessingGroup" xmlns:wpi="http://schemas.microsoft.com/office/word/2010/wordprocessingInk" xmlns:wne="http://schemas.microsoft.com/office/word/2006/wordml" xmlns:wps="http://schemas.microsoft.com/office/word/2010/wordprocessingShape" mc:Ignorable="w14 w15 w16se w16cid w16 w16cex w16sdtdh w16sdtfl cr w16du wp14">
-  <w16cex:commentExtensible w16cex:durableId="6CD008D0" w16cex:dateUtc="2025-05-10T17:53:00Z"/>
-  <w16cex:commentExtensible w16cex:durableId="3BC2F3FC" w16cex:dateUtc="2025-05-09T17:18:00Z"/>
+<w16cex:commentsExtensible xmlns:wpc="http://schemas.microsoft.com/office/word/2010/wordprocessingCanvas" xmlns:cx="http://schemas.microsoft.com/office/drawing/2014/chartex" xmlns:cx1="http://schemas.microsoft.com/office/drawing/2015/9/8/chartex" xmlns:cx2="http://schemas.microsoft.com/office/drawing/2015/10/21/chartex" xmlns:cx3="http://schemas.microsoft.com/office/drawing/2016/5/9/chartex" xmlns:cx4="http://schemas.microsoft.com/office/drawing/2016/5/10/chartex" xmlns:cx5="http://schemas.microsoft.com/office/drawing/2016/5/11/chartex" xmlns:cx6="http://schemas.microsoft.com/office/drawing/2016/5/12/chartex" xmlns:cx7="http://schemas.microsoft.com/office/drawing/2016/5/13/chartex" xmlns:cx8="http://schemas.microsoft.com/office/drawing/2016/5/14/chartex" xmlns:cr="http://schemas.microsoft.com/office/comments/2020/reactions" xmlns:mc="http://schemas.openxmlformats.org/markup-compatibility/2006" xmlns:aink="http://schemas.microsoft.com/office/drawing/2016/ink" xmlns:am3d="http://schemas.microsoft.com/office/drawing/2017/model3d" xmlns:o="urn:schemas-microsoft-com:office:office" xmlns:oel="http://schemas.microsoft.com/office/2019/extlst" xmlns:r="http://schemas.openxmlformats.org/officeDocument/2006/relationships" xmlns:m="http://schemas.openxmlformats.org/officeDocument/2006/math" xmlns:v="urn:schemas-microsoft-com:vml" xmlns:wp14="http://schemas.microsoft.com/office/word/2010/wordprocessingDrawing" xmlns:wp="http://schemas.openxmlformats.org/drawingml/2006/wordprocessingDrawing" xmlns:w10="urn:schemas-microsoft-com:office:word" xmlns:w="http://schemas.openxmlformats.org/wordprocessingml/2006/main" xmlns:w14="http://schemas.microsoft.com/office/word/2010/wordml" xmlns:w15="http://schemas.microsoft.com/office/word/2012/wordml" xmlns:w16cex="http://schemas.microsoft.com/office/word/2018/wordml/cex" xmlns:w16cid="http://schemas.microsoft.com/office/word/2016/wordml/cid" xmlns:w16="http://schemas.microsoft.com/office/word/2018/wordml" xmlns:w16du="http://schemas.microsoft.com/office/word/2023/wordml/word16du" xmlns:w16sdtdh="http://schemas.microsoft.com/office/word/2020/wordml/sdtdatahash" xmlns:w16se="http://schemas.microsoft.com/office/word/2015/wordml/symex" xmlns:wpg="http://schemas.microsoft.com/office/word/2010/wordprocessingGroup" xmlns:wpi="http://schemas.microsoft.com/office/word/2010/wordprocessingInk" xmlns:wne="http://schemas.microsoft.com/office/word/2006/wordml" xmlns:wps="http://schemas.microsoft.com/office/word/2010/wordprocessingShape" mc:Ignorable="w14 w15 w16se w16cid w16 w16cex w16sdtdh cr w16du wp14">
   <w16cex:commentExtensible w16cex:durableId="5B5573C8" w16cex:dateUtc="2025-05-10T19:00:00Z"/>
   <w16cex:commentExtensible w16cex:durableId="5FDB0EAD" w16cex:dateUtc="2025-05-08T22:41:00Z"/>
   <w16cex:commentExtensible w16cex:durableId="461AD974" w16cex:dateUtc="2025-05-09T16:06:00Z"/>
   <w16cex:commentExtensible w16cex:durableId="778F29AB" w16cex:dateUtc="2025-05-11T17:59:00Z"/>
-  <w16cex:commentExtensible w16cex:durableId="0A32BC00" w16cex:dateUtc="2025-05-09T17:26:00Z"/>
-  <w16cex:commentExtensible w16cex:durableId="76B63400" w16cex:dateUtc="2025-05-11T18:03:00Z"/>
   <w16cex:commentExtensible w16cex:durableId="019ED708" w16cex:dateUtc="2025-05-08T22:51:00Z"/>
 </w16cex:commentsExtensible>
 </file>
 
 <file path=word/commentsIds.xml><?xml version="1.0" encoding="utf-8"?>
-<w16cid:commentsIds xmlns:wpc="http://schemas.microsoft.com/office/word/2010/wordprocessingCanvas" xmlns:cx="http://schemas.microsoft.com/office/drawing/2014/chartex" xmlns:cx1="http://schemas.microsoft.com/office/drawing/2015/9/8/chartex" xmlns:cx2="http://schemas.microsoft.com/office/drawing/2015/10/21/chartex" xmlns:cx3="http://schemas.microsoft.com/office/drawing/2016/5/9/chartex" xmlns:cx4="http://schemas.microsoft.com/office/drawing/2016/5/10/chartex" xmlns:cx5="http://schemas.microsoft.com/office/drawing/2016/5/11/chartex" xmlns:cx6="http://schemas.microsoft.com/office/drawing/2016/5/12/chartex" xmlns:cx7="http://schemas.microsoft.com/office/drawing/2016/5/13/chartex" xmlns:cx8="http://schemas.microsoft.com/office/drawing/2016/5/14/chartex" xmlns:mc="http://schemas.openxmlformats.org/markup-compatibility/2006" xmlns:aink="http://schemas.microsoft.com/office/drawing/2016/ink" xmlns:am3d="http://schemas.microsoft.com/office/drawing/2017/model3d" xmlns:o="urn:schemas-microsoft-com:office:office" xmlns:oel="http://schemas.microsoft.com/office/2019/extlst" xmlns:r="http://schemas.openxmlformats.org/officeDocument/2006/relationships" xmlns:m="http://schemas.openxmlformats.org/officeDocument/2006/math" xmlns:v="urn:schemas-microsoft-com:vml" xmlns:wp14="http://schemas.microsoft.com/office/word/2010/wordprocessingDrawing" xmlns:wp="http://schemas.openxmlformats.org/drawingml/2006/wordprocessingDrawing" xmlns:w10="urn:schemas-microsoft-com:office:word" xmlns:w="http://schemas.openxmlformats.org/wordprocessingml/2006/main" xmlns:w14="http://schemas.microsoft.com/office/word/2010/wordml" xmlns:w15="http://schemas.microsoft.com/office/word/2012/wordml" xmlns:w16cex="http://schemas.microsoft.com/office/word/2018/wordml/cex" xmlns:w16cid="http://schemas.microsoft.com/office/word/2016/wordml/cid" xmlns:w16="http://schemas.microsoft.com/office/word/2018/wordml" xmlns:w16du="http://schemas.microsoft.com/office/word/2023/wordml/word16du" xmlns:w16sdtdh="http://schemas.microsoft.com/office/word/2020/wordml/sdtdatahash" xmlns:w16sdtfl="http://schemas.microsoft.com/office/word/2024/wordml/sdtformatlock" xmlns:w16se="http://schemas.microsoft.com/office/word/2015/wordml/symex" xmlns:wpg="http://schemas.microsoft.com/office/word/2010/wordprocessingGroup" xmlns:wpi="http://schemas.microsoft.com/office/word/2010/wordprocessingInk" xmlns:wne="http://schemas.microsoft.com/office/word/2006/wordml" xmlns:wps="http://schemas.microsoft.com/office/word/2010/wordprocessingShape" mc:Ignorable="w14 w15 w16se w16cid w16 w16cex w16sdtdh w16sdtfl w16du wp14">
-  <w16cid:commentId w16cid:paraId="2C45303E" w16cid:durableId="6CD008D0"/>
-  <w16cid:commentId w16cid:paraId="492B34B2" w16cid:durableId="3BC2F3FC"/>
+<w16cid:commentsIds xmlns:wpc="http://schemas.microsoft.com/office/word/2010/wordprocessingCanvas" xmlns:cx="http://schemas.microsoft.com/office/drawing/2014/chartex" xmlns:cx1="http://schemas.microsoft.com/office/drawing/2015/9/8/chartex" xmlns:cx2="http://schemas.microsoft.com/office/drawing/2015/10/21/chartex" xmlns:cx3="http://schemas.microsoft.com/office/drawing/2016/5/9/chartex" xmlns:cx4="http://schemas.microsoft.com/office/drawing/2016/5/10/chartex" xmlns:cx5="http://schemas.microsoft.com/office/drawing/2016/5/11/chartex" xmlns:cx6="http://schemas.microsoft.com/office/drawing/2016/5/12/chartex" xmlns:cx7="http://schemas.microsoft.com/office/drawing/2016/5/13/chartex" xmlns:cx8="http://schemas.microsoft.com/office/drawing/2016/5/14/chartex" xmlns:mc="http://schemas.openxmlformats.org/markup-compatibility/2006" xmlns:aink="http://schemas.microsoft.com/office/drawing/2016/ink" xmlns:am3d="http://schemas.microsoft.com/office/drawing/2017/model3d" xmlns:o="urn:schemas-microsoft-com:office:office" xmlns:oel="http://schemas.microsoft.com/office/2019/extlst" xmlns:r="http://schemas.openxmlformats.org/officeDocument/2006/relationships" xmlns:m="http://schemas.openxmlformats.org/officeDocument/2006/math" xmlns:v="urn:schemas-microsoft-com:vml" xmlns:wp14="http://schemas.microsoft.com/office/word/2010/wordprocessingDrawing" xmlns:wp="http://schemas.openxmlformats.org/drawingml/2006/wordprocessingDrawing" xmlns:w10="urn:schemas-microsoft-com:office:word" xmlns:w="http://schemas.openxmlformats.org/wordprocessingml/2006/main" xmlns:w14="http://schemas.microsoft.com/office/word/2010/wordml" xmlns:w15="http://schemas.microsoft.com/office/word/2012/wordml" xmlns:w16cex="http://schemas.microsoft.com/office/word/2018/wordml/cex" xmlns:w16cid="http://schemas.microsoft.com/office/word/2016/wordml/cid" xmlns:w16="http://schemas.microsoft.com/office/word/2018/wordml" xmlns:w16du="http://schemas.microsoft.com/office/word/2023/wordml/word16du" xmlns:w16sdtdh="http://schemas.microsoft.com/office/word/2020/wordml/sdtdatahash" xmlns:w16se="http://schemas.microsoft.com/office/word/2015/wordml/symex" xmlns:wpg="http://schemas.microsoft.com/office/word/2010/wordprocessingGroup" xmlns:wpi="http://schemas.microsoft.com/office/word/2010/wordprocessingInk" xmlns:wne="http://schemas.microsoft.com/office/word/2006/wordml" xmlns:wps="http://schemas.microsoft.com/office/word/2010/wordprocessingShape" mc:Ignorable="w14 w15 w16se w16cid w16 w16cex w16sdtdh w16du wp14">
   <w16cid:commentId w16cid:paraId="7C915410" w16cid:durableId="5B5573C8"/>
   <w16cid:commentId w16cid:paraId="6F322517" w16cid:durableId="5FDB0EAD"/>
   <w16cid:commentId w16cid:paraId="176D0065" w16cid:durableId="461AD974"/>
   <w16cid:commentId w16cid:paraId="32BC88D6" w16cid:durableId="778F29AB"/>
-  <w16cid:commentId w16cid:paraId="4DC50076" w16cid:durableId="0A32BC00"/>
-  <w16cid:commentId w16cid:paraId="1051E364" w16cid:durableId="76B63400"/>
   <w16cid:commentId w16cid:paraId="2A929C5A" w16cid:durableId="019ED708"/>
 </w16cid:commentsIds>
 </file>
 
 <file path=word/endnotes.xml><?xml version="1.0" encoding="utf-8"?>
-<w:endnotes xmlns:wpc="http://schemas.microsoft.com/office/word/2010/wordprocessingCanvas" xmlns:cx="http://schemas.microsoft.com/office/drawing/2014/chartex" xmlns:cx1="http://schemas.microsoft.com/office/drawing/2015/9/8/chartex" xmlns:cx2="http://schemas.microsoft.com/office/drawing/2015/10/21/chartex" xmlns:cx3="http://schemas.microsoft.com/office/drawing/2016/5/9/chartex" xmlns:cx4="http://schemas.microsoft.com/office/drawing/2016/5/10/chartex" xmlns:cx5="http://schemas.microsoft.com/office/drawing/2016/5/11/chartex" xmlns:cx6="http://schemas.microsoft.com/office/drawing/2016/5/12/chartex" xmlns:cx7="http://schemas.microsoft.com/office/drawing/2016/5/13/chartex" xmlns:cx8="http://schemas.microsoft.com/office/drawing/2016/5/14/chartex" xmlns:mc="http://schemas.openxmlformats.org/markup-compatibility/2006" xmlns:aink="http://schemas.microsoft.com/office/drawing/2016/ink" xmlns:am3d="http://schemas.microsoft.com/office/drawing/2017/model3d" xmlns:o="urn:schemas-microsoft-com:office:office" xmlns:oel="http://schemas.microsoft.com/office/2019/extlst" xmlns:r="http://schemas.openxmlformats.org/officeDocument/2006/relationships" xmlns:m="http://schemas.openxmlformats.org/officeDocument/2006/math" xmlns:v="urn:schemas-microsoft-com:vml" xmlns:wp14="http://schemas.microsoft.com/office/word/2010/wordprocessingDrawing" xmlns:wp="http://schemas.openxmlformats.org/drawingml/2006/wordprocessingDrawing" xmlns:w10="urn:schemas-microsoft-com:office:word" xmlns:w="http://schemas.openxmlformats.org/wordprocessingml/2006/main" xmlns:w14="http://schemas.microsoft.com/office/word/2010/wordml" xmlns:w15="http://schemas.microsoft.com/office/word/2012/wordml" xmlns:w16cex="http://schemas.microsoft.com/office/word/2018/wordml/cex" xmlns:w16cid="http://schemas.microsoft.com/office/word/2016/wordml/cid" xmlns:w16="http://schemas.microsoft.com/office/word/2018/wordml" xmlns:w16du="http://schemas.microsoft.com/office/word/2023/wordml/word16du" xmlns:w16sdtdh="http://schemas.microsoft.com/office/word/2020/wordml/sdtdatahash" xmlns:w16sdtfl="http://schemas.microsoft.com/office/word/2024/wordml/sdtformatlock" xmlns:w16se="http://schemas.microsoft.com/office/word/2015/wordml/symex" xmlns:wpg="http://schemas.microsoft.com/office/word/2010/wordprocessingGroup" xmlns:wpi="http://schemas.microsoft.com/office/word/2010/wordprocessingInk" xmlns:wne="http://schemas.microsoft.com/office/word/2006/wordml" xmlns:wps="http://schemas.microsoft.com/office/word/2010/wordprocessingShape" mc:Ignorable="w14 w15 w16se w16cid w16 w16cex w16sdtdh w16sdtfl w16du wp14">
+<w:endnotes xmlns:wpc="http://schemas.microsoft.com/office/word/2010/wordprocessingCanvas" xmlns:cx="http://schemas.microsoft.com/office/drawing/2014/chartex" xmlns:cx1="http://schemas.microsoft.com/office/drawing/2015/9/8/chartex" xmlns:cx2="http://schemas.microsoft.com/office/drawing/2015/10/21/chartex" xmlns:cx3="http://schemas.microsoft.com/office/drawing/2016/5/9/chartex" xmlns:cx4="http://schemas.microsoft.com/office/drawing/2016/5/10/chartex" xmlns:cx5="http://schemas.microsoft.com/office/drawing/2016/5/11/chartex" xmlns:cx6="http://schemas.microsoft.com/office/drawing/2016/5/12/chartex" xmlns:cx7="http://schemas.microsoft.com/office/drawing/2016/5/13/chartex" xmlns:cx8="http://schemas.microsoft.com/office/drawing/2016/5/14/chartex" xmlns:mc="http://schemas.openxmlformats.org/markup-compatibility/2006" xmlns:aink="http://schemas.microsoft.com/office/drawing/2016/ink" xmlns:am3d="http://schemas.microsoft.com/office/drawing/2017/model3d" xmlns:o="urn:schemas-microsoft-com:office:office" xmlns:oel="http://schemas.microsoft.com/office/2019/extlst" xmlns:r="http://schemas.openxmlformats.org/officeDocument/2006/relationships" xmlns:m="http://schemas.openxmlformats.org/officeDocument/2006/math" xmlns:v="urn:schemas-microsoft-com:vml" xmlns:wp14="http://schemas.microsoft.com/office/word/2010/wordprocessingDrawing" xmlns:wp="http://schemas.openxmlformats.org/drawingml/2006/wordprocessingDrawing" xmlns:w10="urn:schemas-microsoft-com:office:word" xmlns:w="http://schemas.openxmlformats.org/wordprocessingml/2006/main" xmlns:w14="http://schemas.microsoft.com/office/word/2010/wordml" xmlns:w15="http://schemas.microsoft.com/office/word/2012/wordml" xmlns:w16cex="http://schemas.microsoft.com/office/word/2018/wordml/cex" xmlns:w16cid="http://schemas.microsoft.com/office/word/2016/wordml/cid" xmlns:w16="http://schemas.microsoft.com/office/word/2018/wordml" xmlns:w16du="http://schemas.microsoft.com/office/word/2023/wordml/word16du" xmlns:w16sdtdh="http://schemas.microsoft.com/office/word/2020/wordml/sdtdatahash" xmlns:w16se="http://schemas.microsoft.com/office/word/2015/wordml/symex" xmlns:wpg="http://schemas.microsoft.com/office/word/2010/wordprocessingGroup" xmlns:wpi="http://schemas.microsoft.com/office/word/2010/wordprocessingInk" xmlns:wne="http://schemas.microsoft.com/office/word/2006/wordml" xmlns:wps="http://schemas.microsoft.com/office/word/2010/wordprocessingShape" mc:Ignorable="w14 w15 w16se w16cid w16 w16cex w16sdtdh w16du wp14">
   <w:endnote w:type="separator" w:id="-1">
     <w:p>
       <w:pPr>
@@ -4035,7 +3460,7 @@
 </file>
 
 <file path=word/footer1.xml><?xml version="1.0" encoding="utf-8"?>
-<w:ftr xmlns:wpc="http://schemas.microsoft.com/office/word/2010/wordprocessingCanvas" xmlns:cx="http://schemas.microsoft.com/office/drawing/2014/chartex" xmlns:cx1="http://schemas.microsoft.com/office/drawing/2015/9/8/chartex" xmlns:cx2="http://schemas.microsoft.com/office/drawing/2015/10/21/chartex" xmlns:cx3="http://schemas.microsoft.com/office/drawing/2016/5/9/chartex" xmlns:cx4="http://schemas.microsoft.com/office/drawing/2016/5/10/chartex" xmlns:cx5="http://schemas.microsoft.com/office/drawing/2016/5/11/chartex" xmlns:cx6="http://schemas.microsoft.com/office/drawing/2016/5/12/chartex" xmlns:cx7="http://schemas.microsoft.com/office/drawing/2016/5/13/chartex" xmlns:cx8="http://schemas.microsoft.com/office/drawing/2016/5/14/chartex" xmlns:mc="http://schemas.openxmlformats.org/markup-compatibility/2006" xmlns:aink="http://schemas.microsoft.com/office/drawing/2016/ink" xmlns:am3d="http://schemas.microsoft.com/office/drawing/2017/model3d" xmlns:o="urn:schemas-microsoft-com:office:office" xmlns:oel="http://schemas.microsoft.com/office/2019/extlst" xmlns:r="http://schemas.openxmlformats.org/officeDocument/2006/relationships" xmlns:m="http://schemas.openxmlformats.org/officeDocument/2006/math" xmlns:v="urn:schemas-microsoft-com:vml" xmlns:wp14="http://schemas.microsoft.com/office/word/2010/wordprocessingDrawing" xmlns:wp="http://schemas.openxmlformats.org/drawingml/2006/wordprocessingDrawing" xmlns:w10="urn:schemas-microsoft-com:office:word" xmlns:w="http://schemas.openxmlformats.org/wordprocessingml/2006/main" xmlns:w14="http://schemas.microsoft.com/office/word/2010/wordml" xmlns:w15="http://schemas.microsoft.com/office/word/2012/wordml" xmlns:w16cex="http://schemas.microsoft.com/office/word/2018/wordml/cex" xmlns:w16cid="http://schemas.microsoft.com/office/word/2016/wordml/cid" xmlns:w16="http://schemas.microsoft.com/office/word/2018/wordml" xmlns:w16du="http://schemas.microsoft.com/office/word/2023/wordml/word16du" xmlns:w16sdtdh="http://schemas.microsoft.com/office/word/2020/wordml/sdtdatahash" xmlns:w16sdtfl="http://schemas.microsoft.com/office/word/2024/wordml/sdtformatlock" xmlns:w16se="http://schemas.microsoft.com/office/word/2015/wordml/symex" xmlns:wpg="http://schemas.microsoft.com/office/word/2010/wordprocessingGroup" xmlns:wpi="http://schemas.microsoft.com/office/word/2010/wordprocessingInk" xmlns:wne="http://schemas.microsoft.com/office/word/2006/wordml" xmlns:wps="http://schemas.microsoft.com/office/word/2010/wordprocessingShape" mc:Ignorable="w14 w15 w16se w16cid w16 w16cex w16sdtdh w16sdtfl w16du wp14">
+<w:ftr xmlns:wpc="http://schemas.microsoft.com/office/word/2010/wordprocessingCanvas" xmlns:cx="http://schemas.microsoft.com/office/drawing/2014/chartex" xmlns:cx1="http://schemas.microsoft.com/office/drawing/2015/9/8/chartex" xmlns:cx2="http://schemas.microsoft.com/office/drawing/2015/10/21/chartex" xmlns:cx3="http://schemas.microsoft.com/office/drawing/2016/5/9/chartex" xmlns:cx4="http://schemas.microsoft.com/office/drawing/2016/5/10/chartex" xmlns:cx5="http://schemas.microsoft.com/office/drawing/2016/5/11/chartex" xmlns:cx6="http://schemas.microsoft.com/office/drawing/2016/5/12/chartex" xmlns:cx7="http://schemas.microsoft.com/office/drawing/2016/5/13/chartex" xmlns:cx8="http://schemas.microsoft.com/office/drawing/2016/5/14/chartex" xmlns:mc="http://schemas.openxmlformats.org/markup-compatibility/2006" xmlns:aink="http://schemas.microsoft.com/office/drawing/2016/ink" xmlns:am3d="http://schemas.microsoft.com/office/drawing/2017/model3d" xmlns:o="urn:schemas-microsoft-com:office:office" xmlns:oel="http://schemas.microsoft.com/office/2019/extlst" xmlns:r="http://schemas.openxmlformats.org/officeDocument/2006/relationships" xmlns:m="http://schemas.openxmlformats.org/officeDocument/2006/math" xmlns:v="urn:schemas-microsoft-com:vml" xmlns:wp14="http://schemas.microsoft.com/office/word/2010/wordprocessingDrawing" xmlns:wp="http://schemas.openxmlformats.org/drawingml/2006/wordprocessingDrawing" xmlns:w10="urn:schemas-microsoft-com:office:word" xmlns:w="http://schemas.openxmlformats.org/wordprocessingml/2006/main" xmlns:w14="http://schemas.microsoft.com/office/word/2010/wordml" xmlns:w15="http://schemas.microsoft.com/office/word/2012/wordml" xmlns:w16cex="http://schemas.microsoft.com/office/word/2018/wordml/cex" xmlns:w16cid="http://schemas.microsoft.com/office/word/2016/wordml/cid" xmlns:w16="http://schemas.microsoft.com/office/word/2018/wordml" xmlns:w16du="http://schemas.microsoft.com/office/word/2023/wordml/word16du" xmlns:w16sdtdh="http://schemas.microsoft.com/office/word/2020/wordml/sdtdatahash" xmlns:w16se="http://schemas.microsoft.com/office/word/2015/wordml/symex" xmlns:wpg="http://schemas.microsoft.com/office/word/2010/wordprocessingGroup" xmlns:wpi="http://schemas.microsoft.com/office/word/2010/wordprocessingInk" xmlns:wne="http://schemas.microsoft.com/office/word/2006/wordml" xmlns:wps="http://schemas.microsoft.com/office/word/2010/wordprocessingShape" mc:Ignorable="w14 w15 w16se w16cid w16 w16cex w16sdtdh w16du wp14">
   <w:p>
     <w:pPr>
       <w:pStyle w:val="Footer"/>
@@ -4045,12 +3470,12 @@
 </file>
 
 <file path=word/footer2.xml><?xml version="1.0" encoding="utf-8"?>
-<w:ftr xmlns:wpc="http://schemas.microsoft.com/office/word/2010/wordprocessingCanvas" xmlns:cx="http://schemas.microsoft.com/office/drawing/2014/chartex" xmlns:cx1="http://schemas.microsoft.com/office/drawing/2015/9/8/chartex" xmlns:cx2="http://schemas.microsoft.com/office/drawing/2015/10/21/chartex" xmlns:cx3="http://schemas.microsoft.com/office/drawing/2016/5/9/chartex" xmlns:cx4="http://schemas.microsoft.com/office/drawing/2016/5/10/chartex" xmlns:cx5="http://schemas.microsoft.com/office/drawing/2016/5/11/chartex" xmlns:cx6="http://schemas.microsoft.com/office/drawing/2016/5/12/chartex" xmlns:cx7="http://schemas.microsoft.com/office/drawing/2016/5/13/chartex" xmlns:cx8="http://schemas.microsoft.com/office/drawing/2016/5/14/chartex" xmlns:mc="http://schemas.openxmlformats.org/markup-compatibility/2006" xmlns:aink="http://schemas.microsoft.com/office/drawing/2016/ink" xmlns:am3d="http://schemas.microsoft.com/office/drawing/2017/model3d" xmlns:o="urn:schemas-microsoft-com:office:office" xmlns:oel="http://schemas.microsoft.com/office/2019/extlst" xmlns:r="http://schemas.openxmlformats.org/officeDocument/2006/relationships" xmlns:m="http://schemas.openxmlformats.org/officeDocument/2006/math" xmlns:v="urn:schemas-microsoft-com:vml" xmlns:wp14="http://schemas.microsoft.com/office/word/2010/wordprocessingDrawing" xmlns:wp="http://schemas.openxmlformats.org/drawingml/2006/wordprocessingDrawing" xmlns:w10="urn:schemas-microsoft-com:office:word" xmlns:w="http://schemas.openxmlformats.org/wordprocessingml/2006/main" xmlns:w14="http://schemas.microsoft.com/office/word/2010/wordml" xmlns:w15="http://schemas.microsoft.com/office/word/2012/wordml" xmlns:w16cex="http://schemas.microsoft.com/office/word/2018/wordml/cex" xmlns:w16cid="http://schemas.microsoft.com/office/word/2016/wordml/cid" xmlns:w16="http://schemas.microsoft.com/office/word/2018/wordml" xmlns:w16du="http://schemas.microsoft.com/office/word/2023/wordml/word16du" xmlns:w16sdtdh="http://schemas.microsoft.com/office/word/2020/wordml/sdtdatahash" xmlns:w16sdtfl="http://schemas.microsoft.com/office/word/2024/wordml/sdtformatlock" xmlns:w16se="http://schemas.microsoft.com/office/word/2015/wordml/symex" xmlns:wpg="http://schemas.microsoft.com/office/word/2010/wordprocessingGroup" xmlns:wpi="http://schemas.microsoft.com/office/word/2010/wordprocessingInk" xmlns:wne="http://schemas.microsoft.com/office/word/2006/wordml" xmlns:wps="http://schemas.microsoft.com/office/word/2010/wordprocessingShape" mc:Ignorable="w14 w15 w16se w16cid w16 w16cex w16sdtdh w16sdtfl w16du wp14">
+<w:ftr xmlns:wpc="http://schemas.microsoft.com/office/word/2010/wordprocessingCanvas" xmlns:cx="http://schemas.microsoft.com/office/drawing/2014/chartex" xmlns:cx1="http://schemas.microsoft.com/office/drawing/2015/9/8/chartex" xmlns:cx2="http://schemas.microsoft.com/office/drawing/2015/10/21/chartex" xmlns:cx3="http://schemas.microsoft.com/office/drawing/2016/5/9/chartex" xmlns:cx4="http://schemas.microsoft.com/office/drawing/2016/5/10/chartex" xmlns:cx5="http://schemas.microsoft.com/office/drawing/2016/5/11/chartex" xmlns:cx6="http://schemas.microsoft.com/office/drawing/2016/5/12/chartex" xmlns:cx7="http://schemas.microsoft.com/office/drawing/2016/5/13/chartex" xmlns:cx8="http://schemas.microsoft.com/office/drawing/2016/5/14/chartex" xmlns:mc="http://schemas.openxmlformats.org/markup-compatibility/2006" xmlns:aink="http://schemas.microsoft.com/office/drawing/2016/ink" xmlns:am3d="http://schemas.microsoft.com/office/drawing/2017/model3d" xmlns:o="urn:schemas-microsoft-com:office:office" xmlns:oel="http://schemas.microsoft.com/office/2019/extlst" xmlns:r="http://schemas.openxmlformats.org/officeDocument/2006/relationships" xmlns:m="http://schemas.openxmlformats.org/officeDocument/2006/math" xmlns:v="urn:schemas-microsoft-com:vml" xmlns:wp14="http://schemas.microsoft.com/office/word/2010/wordprocessingDrawing" xmlns:wp="http://schemas.openxmlformats.org/drawingml/2006/wordprocessingDrawing" xmlns:w10="urn:schemas-microsoft-com:office:word" xmlns:w="http://schemas.openxmlformats.org/wordprocessingml/2006/main" xmlns:w14="http://schemas.microsoft.com/office/word/2010/wordml" xmlns:w15="http://schemas.microsoft.com/office/word/2012/wordml" xmlns:w16cex="http://schemas.microsoft.com/office/word/2018/wordml/cex" xmlns:w16cid="http://schemas.microsoft.com/office/word/2016/wordml/cid" xmlns:w16="http://schemas.microsoft.com/office/word/2018/wordml" xmlns:w16du="http://schemas.microsoft.com/office/word/2023/wordml/word16du" xmlns:w16sdtdh="http://schemas.microsoft.com/office/word/2020/wordml/sdtdatahash" xmlns:w16se="http://schemas.microsoft.com/office/word/2015/wordml/symex" xmlns:wpg="http://schemas.microsoft.com/office/word/2010/wordprocessingGroup" xmlns:wpi="http://schemas.microsoft.com/office/word/2010/wordprocessingInk" xmlns:wne="http://schemas.microsoft.com/office/word/2006/wordml" xmlns:wps="http://schemas.microsoft.com/office/word/2010/wordprocessingShape" mc:Ignorable="w14 w15 w16se w16cid w16 w16cex w16sdtdh w16du wp14">
   <w:p>
     <w:pPr>
       <w:pStyle w:val="Footer"/>
     </w:pPr>
-    <w:bookmarkStart w:id="37" w:name="TITUS1FooterPrimary"/>
+    <w:bookmarkStart w:id="15" w:name="TITUS1FooterPrimary"/>
     <w:r>
       <w:rPr>
         <w:color w:val="000000"/>
@@ -4058,13 +3483,13 @@
       </w:rPr>
       <w:t>  </w:t>
     </w:r>
-    <w:bookmarkEnd w:id="37"/>
+    <w:bookmarkEnd w:id="15"/>
   </w:p>
 </w:ftr>
 </file>
 
 <file path=word/footer3.xml><?xml version="1.0" encoding="utf-8"?>
-<w:ftr xmlns:wpc="http://schemas.microsoft.com/office/word/2010/wordprocessingCanvas" xmlns:cx="http://schemas.microsoft.com/office/drawing/2014/chartex" xmlns:cx1="http://schemas.microsoft.com/office/drawing/2015/9/8/chartex" xmlns:cx2="http://schemas.microsoft.com/office/drawing/2015/10/21/chartex" xmlns:cx3="http://schemas.microsoft.com/office/drawing/2016/5/9/chartex" xmlns:cx4="http://schemas.microsoft.com/office/drawing/2016/5/10/chartex" xmlns:cx5="http://schemas.microsoft.com/office/drawing/2016/5/11/chartex" xmlns:cx6="http://schemas.microsoft.com/office/drawing/2016/5/12/chartex" xmlns:cx7="http://schemas.microsoft.com/office/drawing/2016/5/13/chartex" xmlns:cx8="http://schemas.microsoft.com/office/drawing/2016/5/14/chartex" xmlns:mc="http://schemas.openxmlformats.org/markup-compatibility/2006" xmlns:aink="http://schemas.microsoft.com/office/drawing/2016/ink" xmlns:am3d="http://schemas.microsoft.com/office/drawing/2017/model3d" xmlns:o="urn:schemas-microsoft-com:office:office" xmlns:oel="http://schemas.microsoft.com/office/2019/extlst" xmlns:r="http://schemas.openxmlformats.org/officeDocument/2006/relationships" xmlns:m="http://schemas.openxmlformats.org/officeDocument/2006/math" xmlns:v="urn:schemas-microsoft-com:vml" xmlns:wp14="http://schemas.microsoft.com/office/word/2010/wordprocessingDrawing" xmlns:wp="http://schemas.openxmlformats.org/drawingml/2006/wordprocessingDrawing" xmlns:w10="urn:schemas-microsoft-com:office:word" xmlns:w="http://schemas.openxmlformats.org/wordprocessingml/2006/main" xmlns:w14="http://schemas.microsoft.com/office/word/2010/wordml" xmlns:w15="http://schemas.microsoft.com/office/word/2012/wordml" xmlns:w16cex="http://schemas.microsoft.com/office/word/2018/wordml/cex" xmlns:w16cid="http://schemas.microsoft.com/office/word/2016/wordml/cid" xmlns:w16="http://schemas.microsoft.com/office/word/2018/wordml" xmlns:w16du="http://schemas.microsoft.com/office/word/2023/wordml/word16du" xmlns:w16sdtdh="http://schemas.microsoft.com/office/word/2020/wordml/sdtdatahash" xmlns:w16sdtfl="http://schemas.microsoft.com/office/word/2024/wordml/sdtformatlock" xmlns:w16se="http://schemas.microsoft.com/office/word/2015/wordml/symex" xmlns:wpg="http://schemas.microsoft.com/office/word/2010/wordprocessingGroup" xmlns:wpi="http://schemas.microsoft.com/office/word/2010/wordprocessingInk" xmlns:wne="http://schemas.microsoft.com/office/word/2006/wordml" xmlns:wps="http://schemas.microsoft.com/office/word/2010/wordprocessingShape" mc:Ignorable="w14 w15 w16se w16cid w16 w16cex w16sdtdh w16sdtfl w16du wp14">
+<w:ftr xmlns:wpc="http://schemas.microsoft.com/office/word/2010/wordprocessingCanvas" xmlns:cx="http://schemas.microsoft.com/office/drawing/2014/chartex" xmlns:cx1="http://schemas.microsoft.com/office/drawing/2015/9/8/chartex" xmlns:cx2="http://schemas.microsoft.com/office/drawing/2015/10/21/chartex" xmlns:cx3="http://schemas.microsoft.com/office/drawing/2016/5/9/chartex" xmlns:cx4="http://schemas.microsoft.com/office/drawing/2016/5/10/chartex" xmlns:cx5="http://schemas.microsoft.com/office/drawing/2016/5/11/chartex" xmlns:cx6="http://schemas.microsoft.com/office/drawing/2016/5/12/chartex" xmlns:cx7="http://schemas.microsoft.com/office/drawing/2016/5/13/chartex" xmlns:cx8="http://schemas.microsoft.com/office/drawing/2016/5/14/chartex" xmlns:mc="http://schemas.openxmlformats.org/markup-compatibility/2006" xmlns:aink="http://schemas.microsoft.com/office/drawing/2016/ink" xmlns:am3d="http://schemas.microsoft.com/office/drawing/2017/model3d" xmlns:o="urn:schemas-microsoft-com:office:office" xmlns:oel="http://schemas.microsoft.com/office/2019/extlst" xmlns:r="http://schemas.openxmlformats.org/officeDocument/2006/relationships" xmlns:m="http://schemas.openxmlformats.org/officeDocument/2006/math" xmlns:v="urn:schemas-microsoft-com:vml" xmlns:wp14="http://schemas.microsoft.com/office/word/2010/wordprocessingDrawing" xmlns:wp="http://schemas.openxmlformats.org/drawingml/2006/wordprocessingDrawing" xmlns:w10="urn:schemas-microsoft-com:office:word" xmlns:w="http://schemas.openxmlformats.org/wordprocessingml/2006/main" xmlns:w14="http://schemas.microsoft.com/office/word/2010/wordml" xmlns:w15="http://schemas.microsoft.com/office/word/2012/wordml" xmlns:w16cex="http://schemas.microsoft.com/office/word/2018/wordml/cex" xmlns:w16cid="http://schemas.microsoft.com/office/word/2016/wordml/cid" xmlns:w16="http://schemas.microsoft.com/office/word/2018/wordml" xmlns:w16du="http://schemas.microsoft.com/office/word/2023/wordml/word16du" xmlns:w16sdtdh="http://schemas.microsoft.com/office/word/2020/wordml/sdtdatahash" xmlns:w16se="http://schemas.microsoft.com/office/word/2015/wordml/symex" xmlns:wpg="http://schemas.microsoft.com/office/word/2010/wordprocessingGroup" xmlns:wpi="http://schemas.microsoft.com/office/word/2010/wordprocessingInk" xmlns:wne="http://schemas.microsoft.com/office/word/2006/wordml" xmlns:wps="http://schemas.microsoft.com/office/word/2010/wordprocessingShape" mc:Ignorable="w14 w15 w16se w16cid w16 w16cex w16sdtdh w16du wp14">
   <w:p>
     <w:pPr>
       <w:pStyle w:val="Footer"/>
@@ -4074,7 +3499,7 @@
 </file>
 
 <file path=word/footnotes.xml><?xml version="1.0" encoding="utf-8"?>
-<w:footnotes xmlns:wpc="http://schemas.microsoft.com/office/word/2010/wordprocessingCanvas" xmlns:cx="http://schemas.microsoft.com/office/drawing/2014/chartex" xmlns:cx1="http://schemas.microsoft.com/office/drawing/2015/9/8/chartex" xmlns:cx2="http://schemas.microsoft.com/office/drawing/2015/10/21/chartex" xmlns:cx3="http://schemas.microsoft.com/office/drawing/2016/5/9/chartex" xmlns:cx4="http://schemas.microsoft.com/office/drawing/2016/5/10/chartex" xmlns:cx5="http://schemas.microsoft.com/office/drawing/2016/5/11/chartex" xmlns:cx6="http://schemas.microsoft.com/office/drawing/2016/5/12/chartex" xmlns:cx7="http://schemas.microsoft.com/office/drawing/2016/5/13/chartex" xmlns:cx8="http://schemas.microsoft.com/office/drawing/2016/5/14/chartex" xmlns:mc="http://schemas.openxmlformats.org/markup-compatibility/2006" xmlns:aink="http://schemas.microsoft.com/office/drawing/2016/ink" xmlns:am3d="http://schemas.microsoft.com/office/drawing/2017/model3d" xmlns:o="urn:schemas-microsoft-com:office:office" xmlns:oel="http://schemas.microsoft.com/office/2019/extlst" xmlns:r="http://schemas.openxmlformats.org/officeDocument/2006/relationships" xmlns:m="http://schemas.openxmlformats.org/officeDocument/2006/math" xmlns:v="urn:schemas-microsoft-com:vml" xmlns:wp14="http://schemas.microsoft.com/office/word/2010/wordprocessingDrawing" xmlns:wp="http://schemas.openxmlformats.org/drawingml/2006/wordprocessingDrawing" xmlns:w10="urn:schemas-microsoft-com:office:word" xmlns:w="http://schemas.openxmlformats.org/wordprocessingml/2006/main" xmlns:w14="http://schemas.microsoft.com/office/word/2010/wordml" xmlns:w15="http://schemas.microsoft.com/office/word/2012/wordml" xmlns:w16cex="http://schemas.microsoft.com/office/word/2018/wordml/cex" xmlns:w16cid="http://schemas.microsoft.com/office/word/2016/wordml/cid" xmlns:w16="http://schemas.microsoft.com/office/word/2018/wordml" xmlns:w16du="http://schemas.microsoft.com/office/word/2023/wordml/word16du" xmlns:w16sdtdh="http://schemas.microsoft.com/office/word/2020/wordml/sdtdatahash" xmlns:w16sdtfl="http://schemas.microsoft.com/office/word/2024/wordml/sdtformatlock" xmlns:w16se="http://schemas.microsoft.com/office/word/2015/wordml/symex" xmlns:wpg="http://schemas.microsoft.com/office/word/2010/wordprocessingGroup" xmlns:wpi="http://schemas.microsoft.com/office/word/2010/wordprocessingInk" xmlns:wne="http://schemas.microsoft.com/office/word/2006/wordml" xmlns:wps="http://schemas.microsoft.com/office/word/2010/wordprocessingShape" mc:Ignorable="w14 w15 w16se w16cid w16 w16cex w16sdtdh w16sdtfl w16du wp14">
+<w:footnotes xmlns:wpc="http://schemas.microsoft.com/office/word/2010/wordprocessingCanvas" xmlns:cx="http://schemas.microsoft.com/office/drawing/2014/chartex" xmlns:cx1="http://schemas.microsoft.com/office/drawing/2015/9/8/chartex" xmlns:cx2="http://schemas.microsoft.com/office/drawing/2015/10/21/chartex" xmlns:cx3="http://schemas.microsoft.com/office/drawing/2016/5/9/chartex" xmlns:cx4="http://schemas.microsoft.com/office/drawing/2016/5/10/chartex" xmlns:cx5="http://schemas.microsoft.com/office/drawing/2016/5/11/chartex" xmlns:cx6="http://schemas.microsoft.com/office/drawing/2016/5/12/chartex" xmlns:cx7="http://schemas.microsoft.com/office/drawing/2016/5/13/chartex" xmlns:cx8="http://schemas.microsoft.com/office/drawing/2016/5/14/chartex" xmlns:mc="http://schemas.openxmlformats.org/markup-compatibility/2006" xmlns:aink="http://schemas.microsoft.com/office/drawing/2016/ink" xmlns:am3d="http://schemas.microsoft.com/office/drawing/2017/model3d" xmlns:o="urn:schemas-microsoft-com:office:office" xmlns:oel="http://schemas.microsoft.com/office/2019/extlst" xmlns:r="http://schemas.openxmlformats.org/officeDocument/2006/relationships" xmlns:m="http://schemas.openxmlformats.org/officeDocument/2006/math" xmlns:v="urn:schemas-microsoft-com:vml" xmlns:wp14="http://schemas.microsoft.com/office/word/2010/wordprocessingDrawing" xmlns:wp="http://schemas.openxmlformats.org/drawingml/2006/wordprocessingDrawing" xmlns:w10="urn:schemas-microsoft-com:office:word" xmlns:w="http://schemas.openxmlformats.org/wordprocessingml/2006/main" xmlns:w14="http://schemas.microsoft.com/office/word/2010/wordml" xmlns:w15="http://schemas.microsoft.com/office/word/2012/wordml" xmlns:w16cex="http://schemas.microsoft.com/office/word/2018/wordml/cex" xmlns:w16cid="http://schemas.microsoft.com/office/word/2016/wordml/cid" xmlns:w16="http://schemas.microsoft.com/office/word/2018/wordml" xmlns:w16du="http://schemas.microsoft.com/office/word/2023/wordml/word16du" xmlns:w16sdtdh="http://schemas.microsoft.com/office/word/2020/wordml/sdtdatahash" xmlns:w16se="http://schemas.microsoft.com/office/word/2015/wordml/symex" xmlns:wpg="http://schemas.microsoft.com/office/word/2010/wordprocessingGroup" xmlns:wpi="http://schemas.microsoft.com/office/word/2010/wordprocessingInk" xmlns:wne="http://schemas.microsoft.com/office/word/2006/wordml" xmlns:wps="http://schemas.microsoft.com/office/word/2010/wordprocessingShape" mc:Ignorable="w14 w15 w16se w16cid w16 w16cex w16sdtdh w16du wp14">
   <w:footnote w:type="separator" w:id="-1">
     <w:p>
       <w:pPr>
@@ -4099,7 +3524,7 @@
 </file>
 
 <file path=word/header1.xml><?xml version="1.0" encoding="utf-8"?>
-<w:hdr xmlns:wpc="http://schemas.microsoft.com/office/word/2010/wordprocessingCanvas" xmlns:cx="http://schemas.microsoft.com/office/drawing/2014/chartex" xmlns:cx1="http://schemas.microsoft.com/office/drawing/2015/9/8/chartex" xmlns:cx2="http://schemas.microsoft.com/office/drawing/2015/10/21/chartex" xmlns:cx3="http://schemas.microsoft.com/office/drawing/2016/5/9/chartex" xmlns:cx4="http://schemas.microsoft.com/office/drawing/2016/5/10/chartex" xmlns:cx5="http://schemas.microsoft.com/office/drawing/2016/5/11/chartex" xmlns:cx6="http://schemas.microsoft.com/office/drawing/2016/5/12/chartex" xmlns:cx7="http://schemas.microsoft.com/office/drawing/2016/5/13/chartex" xmlns:cx8="http://schemas.microsoft.com/office/drawing/2016/5/14/chartex" xmlns:mc="http://schemas.openxmlformats.org/markup-compatibility/2006" xmlns:aink="http://schemas.microsoft.com/office/drawing/2016/ink" xmlns:am3d="http://schemas.microsoft.com/office/drawing/2017/model3d" xmlns:o="urn:schemas-microsoft-com:office:office" xmlns:oel="http://schemas.microsoft.com/office/2019/extlst" xmlns:r="http://schemas.openxmlformats.org/officeDocument/2006/relationships" xmlns:m="http://schemas.openxmlformats.org/officeDocument/2006/math" xmlns:v="urn:schemas-microsoft-com:vml" xmlns:wp14="http://schemas.microsoft.com/office/word/2010/wordprocessingDrawing" xmlns:wp="http://schemas.openxmlformats.org/drawingml/2006/wordprocessingDrawing" xmlns:w10="urn:schemas-microsoft-com:office:word" xmlns:w="http://schemas.openxmlformats.org/wordprocessingml/2006/main" xmlns:w14="http://schemas.microsoft.com/office/word/2010/wordml" xmlns:w15="http://schemas.microsoft.com/office/word/2012/wordml" xmlns:w16cex="http://schemas.microsoft.com/office/word/2018/wordml/cex" xmlns:w16cid="http://schemas.microsoft.com/office/word/2016/wordml/cid" xmlns:w16="http://schemas.microsoft.com/office/word/2018/wordml" xmlns:w16du="http://schemas.microsoft.com/office/word/2023/wordml/word16du" xmlns:w16sdtdh="http://schemas.microsoft.com/office/word/2020/wordml/sdtdatahash" xmlns:w16sdtfl="http://schemas.microsoft.com/office/word/2024/wordml/sdtformatlock" xmlns:w16se="http://schemas.microsoft.com/office/word/2015/wordml/symex" xmlns:wpg="http://schemas.microsoft.com/office/word/2010/wordprocessingGroup" xmlns:wpi="http://schemas.microsoft.com/office/word/2010/wordprocessingInk" xmlns:wne="http://schemas.microsoft.com/office/word/2006/wordml" xmlns:wps="http://schemas.microsoft.com/office/word/2010/wordprocessingShape" mc:Ignorable="w14 w15 w16se w16cid w16 w16cex w16sdtdh w16sdtfl w16du wp14">
+<w:hdr xmlns:wpc="http://schemas.microsoft.com/office/word/2010/wordprocessingCanvas" xmlns:cx="http://schemas.microsoft.com/office/drawing/2014/chartex" xmlns:cx1="http://schemas.microsoft.com/office/drawing/2015/9/8/chartex" xmlns:cx2="http://schemas.microsoft.com/office/drawing/2015/10/21/chartex" xmlns:cx3="http://schemas.microsoft.com/office/drawing/2016/5/9/chartex" xmlns:cx4="http://schemas.microsoft.com/office/drawing/2016/5/10/chartex" xmlns:cx5="http://schemas.microsoft.com/office/drawing/2016/5/11/chartex" xmlns:cx6="http://schemas.microsoft.com/office/drawing/2016/5/12/chartex" xmlns:cx7="http://schemas.microsoft.com/office/drawing/2016/5/13/chartex" xmlns:cx8="http://schemas.microsoft.com/office/drawing/2016/5/14/chartex" xmlns:mc="http://schemas.openxmlformats.org/markup-compatibility/2006" xmlns:aink="http://schemas.microsoft.com/office/drawing/2016/ink" xmlns:am3d="http://schemas.microsoft.com/office/drawing/2017/model3d" xmlns:o="urn:schemas-microsoft-com:office:office" xmlns:oel="http://schemas.microsoft.com/office/2019/extlst" xmlns:r="http://schemas.openxmlformats.org/officeDocument/2006/relationships" xmlns:m="http://schemas.openxmlformats.org/officeDocument/2006/math" xmlns:v="urn:schemas-microsoft-com:vml" xmlns:wp14="http://schemas.microsoft.com/office/word/2010/wordprocessingDrawing" xmlns:wp="http://schemas.openxmlformats.org/drawingml/2006/wordprocessingDrawing" xmlns:w10="urn:schemas-microsoft-com:office:word" xmlns:w="http://schemas.openxmlformats.org/wordprocessingml/2006/main" xmlns:w14="http://schemas.microsoft.com/office/word/2010/wordml" xmlns:w15="http://schemas.microsoft.com/office/word/2012/wordml" xmlns:w16cex="http://schemas.microsoft.com/office/word/2018/wordml/cex" xmlns:w16cid="http://schemas.microsoft.com/office/word/2016/wordml/cid" xmlns:w16="http://schemas.microsoft.com/office/word/2018/wordml" xmlns:w16du="http://schemas.microsoft.com/office/word/2023/wordml/word16du" xmlns:w16sdtdh="http://schemas.microsoft.com/office/word/2020/wordml/sdtdatahash" xmlns:w16se="http://schemas.microsoft.com/office/word/2015/wordml/symex" xmlns:wpg="http://schemas.microsoft.com/office/word/2010/wordprocessingGroup" xmlns:wpi="http://schemas.microsoft.com/office/word/2010/wordprocessingInk" xmlns:wne="http://schemas.microsoft.com/office/word/2006/wordml" xmlns:wps="http://schemas.microsoft.com/office/word/2010/wordprocessingShape" mc:Ignorable="w14 w15 w16se w16cid w16 w16cex w16sdtdh w16du wp14">
   <w:p>
     <w:pPr>
       <w:pStyle w:val="Header"/>
@@ -4109,7 +3534,7 @@
 </file>
 
 <file path=word/header2.xml><?xml version="1.0" encoding="utf-8"?>
-<w:hdr xmlns:wpc="http://schemas.microsoft.com/office/word/2010/wordprocessingCanvas" xmlns:cx="http://schemas.microsoft.com/office/drawing/2014/chartex" xmlns:cx1="http://schemas.microsoft.com/office/drawing/2015/9/8/chartex" xmlns:cx2="http://schemas.microsoft.com/office/drawing/2015/10/21/chartex" xmlns:cx3="http://schemas.microsoft.com/office/drawing/2016/5/9/chartex" xmlns:cx4="http://schemas.microsoft.com/office/drawing/2016/5/10/chartex" xmlns:cx5="http://schemas.microsoft.com/office/drawing/2016/5/11/chartex" xmlns:cx6="http://schemas.microsoft.com/office/drawing/2016/5/12/chartex" xmlns:cx7="http://schemas.microsoft.com/office/drawing/2016/5/13/chartex" xmlns:cx8="http://schemas.microsoft.com/office/drawing/2016/5/14/chartex" xmlns:mc="http://schemas.openxmlformats.org/markup-compatibility/2006" xmlns:aink="http://schemas.microsoft.com/office/drawing/2016/ink" xmlns:am3d="http://schemas.microsoft.com/office/drawing/2017/model3d" xmlns:o="urn:schemas-microsoft-com:office:office" xmlns:oel="http://schemas.microsoft.com/office/2019/extlst" xmlns:r="http://schemas.openxmlformats.org/officeDocument/2006/relationships" xmlns:m="http://schemas.openxmlformats.org/officeDocument/2006/math" xmlns:v="urn:schemas-microsoft-com:vml" xmlns:wp14="http://schemas.microsoft.com/office/word/2010/wordprocessingDrawing" xmlns:wp="http://schemas.openxmlformats.org/drawingml/2006/wordprocessingDrawing" xmlns:w10="urn:schemas-microsoft-com:office:word" xmlns:w="http://schemas.openxmlformats.org/wordprocessingml/2006/main" xmlns:w14="http://schemas.microsoft.com/office/word/2010/wordml" xmlns:w15="http://schemas.microsoft.com/office/word/2012/wordml" xmlns:w16cex="http://schemas.microsoft.com/office/word/2018/wordml/cex" xmlns:w16cid="http://schemas.microsoft.com/office/word/2016/wordml/cid" xmlns:w16="http://schemas.microsoft.com/office/word/2018/wordml" xmlns:w16du="http://schemas.microsoft.com/office/word/2023/wordml/word16du" xmlns:w16sdtdh="http://schemas.microsoft.com/office/word/2020/wordml/sdtdatahash" xmlns:w16sdtfl="http://schemas.microsoft.com/office/word/2024/wordml/sdtformatlock" xmlns:w16se="http://schemas.microsoft.com/office/word/2015/wordml/symex" xmlns:wpg="http://schemas.microsoft.com/office/word/2010/wordprocessingGroup" xmlns:wpi="http://schemas.microsoft.com/office/word/2010/wordprocessingInk" xmlns:wne="http://schemas.microsoft.com/office/word/2006/wordml" xmlns:wps="http://schemas.microsoft.com/office/word/2010/wordprocessingShape" mc:Ignorable="w14 w15 w16se w16cid w16 w16cex w16sdtdh w16sdtfl w16du wp14">
+<w:hdr xmlns:wpc="http://schemas.microsoft.com/office/word/2010/wordprocessingCanvas" xmlns:cx="http://schemas.microsoft.com/office/drawing/2014/chartex" xmlns:cx1="http://schemas.microsoft.com/office/drawing/2015/9/8/chartex" xmlns:cx2="http://schemas.microsoft.com/office/drawing/2015/10/21/chartex" xmlns:cx3="http://schemas.microsoft.com/office/drawing/2016/5/9/chartex" xmlns:cx4="http://schemas.microsoft.com/office/drawing/2016/5/10/chartex" xmlns:cx5="http://schemas.microsoft.com/office/drawing/2016/5/11/chartex" xmlns:cx6="http://schemas.microsoft.com/office/drawing/2016/5/12/chartex" xmlns:cx7="http://schemas.microsoft.com/office/drawing/2016/5/13/chartex" xmlns:cx8="http://schemas.microsoft.com/office/drawing/2016/5/14/chartex" xmlns:mc="http://schemas.openxmlformats.org/markup-compatibility/2006" xmlns:aink="http://schemas.microsoft.com/office/drawing/2016/ink" xmlns:am3d="http://schemas.microsoft.com/office/drawing/2017/model3d" xmlns:o="urn:schemas-microsoft-com:office:office" xmlns:oel="http://schemas.microsoft.com/office/2019/extlst" xmlns:r="http://schemas.openxmlformats.org/officeDocument/2006/relationships" xmlns:m="http://schemas.openxmlformats.org/officeDocument/2006/math" xmlns:v="urn:schemas-microsoft-com:vml" xmlns:wp14="http://schemas.microsoft.com/office/word/2010/wordprocessingDrawing" xmlns:wp="http://schemas.openxmlformats.org/drawingml/2006/wordprocessingDrawing" xmlns:w10="urn:schemas-microsoft-com:office:word" xmlns:w="http://schemas.openxmlformats.org/wordprocessingml/2006/main" xmlns:w14="http://schemas.microsoft.com/office/word/2010/wordml" xmlns:w15="http://schemas.microsoft.com/office/word/2012/wordml" xmlns:w16cex="http://schemas.microsoft.com/office/word/2018/wordml/cex" xmlns:w16cid="http://schemas.microsoft.com/office/word/2016/wordml/cid" xmlns:w16="http://schemas.microsoft.com/office/word/2018/wordml" xmlns:w16du="http://schemas.microsoft.com/office/word/2023/wordml/word16du" xmlns:w16sdtdh="http://schemas.microsoft.com/office/word/2020/wordml/sdtdatahash" xmlns:w16se="http://schemas.microsoft.com/office/word/2015/wordml/symex" xmlns:wpg="http://schemas.microsoft.com/office/word/2010/wordprocessingGroup" xmlns:wpi="http://schemas.microsoft.com/office/word/2010/wordprocessingInk" xmlns:wne="http://schemas.microsoft.com/office/word/2006/wordml" xmlns:wps="http://schemas.microsoft.com/office/word/2010/wordprocessingShape" mc:Ignorable="w14 w15 w16se w16cid w16 w16cex w16sdtdh w16du wp14">
   <w:p>
     <w:pPr>
       <w:pStyle w:val="Header"/>
@@ -4119,7 +3544,7 @@
 </file>
 
 <file path=word/header3.xml><?xml version="1.0" encoding="utf-8"?>
-<w:hdr xmlns:wpc="http://schemas.microsoft.com/office/word/2010/wordprocessingCanvas" xmlns:cx="http://schemas.microsoft.com/office/drawing/2014/chartex" xmlns:cx1="http://schemas.microsoft.com/office/drawing/2015/9/8/chartex" xmlns:cx2="http://schemas.microsoft.com/office/drawing/2015/10/21/chartex" xmlns:cx3="http://schemas.microsoft.com/office/drawing/2016/5/9/chartex" xmlns:cx4="http://schemas.microsoft.com/office/drawing/2016/5/10/chartex" xmlns:cx5="http://schemas.microsoft.com/office/drawing/2016/5/11/chartex" xmlns:cx6="http://schemas.microsoft.com/office/drawing/2016/5/12/chartex" xmlns:cx7="http://schemas.microsoft.com/office/drawing/2016/5/13/chartex" xmlns:cx8="http://schemas.microsoft.com/office/drawing/2016/5/14/chartex" xmlns:mc="http://schemas.openxmlformats.org/markup-compatibility/2006" xmlns:aink="http://schemas.microsoft.com/office/drawing/2016/ink" xmlns:am3d="http://schemas.microsoft.com/office/drawing/2017/model3d" xmlns:o="urn:schemas-microsoft-com:office:office" xmlns:oel="http://schemas.microsoft.com/office/2019/extlst" xmlns:r="http://schemas.openxmlformats.org/officeDocument/2006/relationships" xmlns:m="http://schemas.openxmlformats.org/officeDocument/2006/math" xmlns:v="urn:schemas-microsoft-com:vml" xmlns:wp14="http://schemas.microsoft.com/office/word/2010/wordprocessingDrawing" xmlns:wp="http://schemas.openxmlformats.org/drawingml/2006/wordprocessingDrawing" xmlns:w10="urn:schemas-microsoft-com:office:word" xmlns:w="http://schemas.openxmlformats.org/wordprocessingml/2006/main" xmlns:w14="http://schemas.microsoft.com/office/word/2010/wordml" xmlns:w15="http://schemas.microsoft.com/office/word/2012/wordml" xmlns:w16cex="http://schemas.microsoft.com/office/word/2018/wordml/cex" xmlns:w16cid="http://schemas.microsoft.com/office/word/2016/wordml/cid" xmlns:w16="http://schemas.microsoft.com/office/word/2018/wordml" xmlns:w16du="http://schemas.microsoft.com/office/word/2023/wordml/word16du" xmlns:w16sdtdh="http://schemas.microsoft.com/office/word/2020/wordml/sdtdatahash" xmlns:w16sdtfl="http://schemas.microsoft.com/office/word/2024/wordml/sdtformatlock" xmlns:w16se="http://schemas.microsoft.com/office/word/2015/wordml/symex" xmlns:wpg="http://schemas.microsoft.com/office/word/2010/wordprocessingGroup" xmlns:wpi="http://schemas.microsoft.com/office/word/2010/wordprocessingInk" xmlns:wne="http://schemas.microsoft.com/office/word/2006/wordml" xmlns:wps="http://schemas.microsoft.com/office/word/2010/wordprocessingShape" mc:Ignorable="w14 w15 w16se w16cid w16 w16cex w16sdtdh w16sdtfl w16du wp14">
+<w:hdr xmlns:wpc="http://schemas.microsoft.com/office/word/2010/wordprocessingCanvas" xmlns:cx="http://schemas.microsoft.com/office/drawing/2014/chartex" xmlns:cx1="http://schemas.microsoft.com/office/drawing/2015/9/8/chartex" xmlns:cx2="http://schemas.microsoft.com/office/drawing/2015/10/21/chartex" xmlns:cx3="http://schemas.microsoft.com/office/drawing/2016/5/9/chartex" xmlns:cx4="http://schemas.microsoft.com/office/drawing/2016/5/10/chartex" xmlns:cx5="http://schemas.microsoft.com/office/drawing/2016/5/11/chartex" xmlns:cx6="http://schemas.microsoft.com/office/drawing/2016/5/12/chartex" xmlns:cx7="http://schemas.microsoft.com/office/drawing/2016/5/13/chartex" xmlns:cx8="http://schemas.microsoft.com/office/drawing/2016/5/14/chartex" xmlns:mc="http://schemas.openxmlformats.org/markup-compatibility/2006" xmlns:aink="http://schemas.microsoft.com/office/drawing/2016/ink" xmlns:am3d="http://schemas.microsoft.com/office/drawing/2017/model3d" xmlns:o="urn:schemas-microsoft-com:office:office" xmlns:oel="http://schemas.microsoft.com/office/2019/extlst" xmlns:r="http://schemas.openxmlformats.org/officeDocument/2006/relationships" xmlns:m="http://schemas.openxmlformats.org/officeDocument/2006/math" xmlns:v="urn:schemas-microsoft-com:vml" xmlns:wp14="http://schemas.microsoft.com/office/word/2010/wordprocessingDrawing" xmlns:wp="http://schemas.openxmlformats.org/drawingml/2006/wordprocessingDrawing" xmlns:w10="urn:schemas-microsoft-com:office:word" xmlns:w="http://schemas.openxmlformats.org/wordprocessingml/2006/main" xmlns:w14="http://schemas.microsoft.com/office/word/2010/wordml" xmlns:w15="http://schemas.microsoft.com/office/word/2012/wordml" xmlns:w16cex="http://schemas.microsoft.com/office/word/2018/wordml/cex" xmlns:w16cid="http://schemas.microsoft.com/office/word/2016/wordml/cid" xmlns:w16="http://schemas.microsoft.com/office/word/2018/wordml" xmlns:w16du="http://schemas.microsoft.com/office/word/2023/wordml/word16du" xmlns:w16sdtdh="http://schemas.microsoft.com/office/word/2020/wordml/sdtdatahash" xmlns:w16se="http://schemas.microsoft.com/office/word/2015/wordml/symex" xmlns:wpg="http://schemas.microsoft.com/office/word/2010/wordprocessingGroup" xmlns:wpi="http://schemas.microsoft.com/office/word/2010/wordprocessingInk" xmlns:wne="http://schemas.microsoft.com/office/word/2006/wordml" xmlns:wps="http://schemas.microsoft.com/office/word/2010/wordprocessingShape" mc:Ignorable="w14 w15 w16se w16cid w16 w16cex w16sdtdh w16du wp14">
   <w:p>
     <w:pPr>
       <w:pStyle w:val="Header"/>
@@ -4129,7 +3554,7 @@
 </file>
 
 <file path=word/numbering.xml><?xml version="1.0" encoding="utf-8"?>
-<w:numbering xmlns:wpc="http://schemas.microsoft.com/office/word/2010/wordprocessingCanvas" xmlns:cx="http://schemas.microsoft.com/office/drawing/2014/chartex" xmlns:cx1="http://schemas.microsoft.com/office/drawing/2015/9/8/chartex" xmlns:cx2="http://schemas.microsoft.com/office/drawing/2015/10/21/chartex" xmlns:cx3="http://schemas.microsoft.com/office/drawing/2016/5/9/chartex" xmlns:cx4="http://schemas.microsoft.com/office/drawing/2016/5/10/chartex" xmlns:cx5="http://schemas.microsoft.com/office/drawing/2016/5/11/chartex" xmlns:cx6="http://schemas.microsoft.com/office/drawing/2016/5/12/chartex" xmlns:cx7="http://schemas.microsoft.com/office/drawing/2016/5/13/chartex" xmlns:cx8="http://schemas.microsoft.com/office/drawing/2016/5/14/chartex" xmlns:mc="http://schemas.openxmlformats.org/markup-compatibility/2006" xmlns:aink="http://schemas.microsoft.com/office/drawing/2016/ink" xmlns:am3d="http://schemas.microsoft.com/office/drawing/2017/model3d" xmlns:o="urn:schemas-microsoft-com:office:office" xmlns:oel="http://schemas.microsoft.com/office/2019/extlst" xmlns:r="http://schemas.openxmlformats.org/officeDocument/2006/relationships" xmlns:m="http://schemas.openxmlformats.org/officeDocument/2006/math" xmlns:v="urn:schemas-microsoft-com:vml" xmlns:wp14="http://schemas.microsoft.com/office/word/2010/wordprocessingDrawing" xmlns:wp="http://schemas.openxmlformats.org/drawingml/2006/wordprocessingDrawing" xmlns:w10="urn:schemas-microsoft-com:office:word" xmlns:w="http://schemas.openxmlformats.org/wordprocessingml/2006/main" xmlns:w14="http://schemas.microsoft.com/office/word/2010/wordml" xmlns:w15="http://schemas.microsoft.com/office/word/2012/wordml" xmlns:w16cex="http://schemas.microsoft.com/office/word/2018/wordml/cex" xmlns:w16cid="http://schemas.microsoft.com/office/word/2016/wordml/cid" xmlns:w16="http://schemas.microsoft.com/office/word/2018/wordml" xmlns:w16du="http://schemas.microsoft.com/office/word/2023/wordml/word16du" xmlns:w16sdtdh="http://schemas.microsoft.com/office/word/2020/wordml/sdtdatahash" xmlns:w16sdtfl="http://schemas.microsoft.com/office/word/2024/wordml/sdtformatlock" xmlns:w16se="http://schemas.microsoft.com/office/word/2015/wordml/symex" xmlns:wpg="http://schemas.microsoft.com/office/word/2010/wordprocessingGroup" xmlns:wpi="http://schemas.microsoft.com/office/word/2010/wordprocessingInk" xmlns:wne="http://schemas.microsoft.com/office/word/2006/wordml" xmlns:wps="http://schemas.microsoft.com/office/word/2010/wordprocessingShape" mc:Ignorable="w14 w15 w16se w16cid w16 w16cex w16sdtdh w16sdtfl w16du wp14">
+<w:numbering xmlns:wpc="http://schemas.microsoft.com/office/word/2010/wordprocessingCanvas" xmlns:cx="http://schemas.microsoft.com/office/drawing/2014/chartex" xmlns:cx1="http://schemas.microsoft.com/office/drawing/2015/9/8/chartex" xmlns:cx2="http://schemas.microsoft.com/office/drawing/2015/10/21/chartex" xmlns:cx3="http://schemas.microsoft.com/office/drawing/2016/5/9/chartex" xmlns:cx4="http://schemas.microsoft.com/office/drawing/2016/5/10/chartex" xmlns:cx5="http://schemas.microsoft.com/office/drawing/2016/5/11/chartex" xmlns:cx6="http://schemas.microsoft.com/office/drawing/2016/5/12/chartex" xmlns:cx7="http://schemas.microsoft.com/office/drawing/2016/5/13/chartex" xmlns:cx8="http://schemas.microsoft.com/office/drawing/2016/5/14/chartex" xmlns:mc="http://schemas.openxmlformats.org/markup-compatibility/2006" xmlns:aink="http://schemas.microsoft.com/office/drawing/2016/ink" xmlns:am3d="http://schemas.microsoft.com/office/drawing/2017/model3d" xmlns:o="urn:schemas-microsoft-com:office:office" xmlns:oel="http://schemas.microsoft.com/office/2019/extlst" xmlns:r="http://schemas.openxmlformats.org/officeDocument/2006/relationships" xmlns:m="http://schemas.openxmlformats.org/officeDocument/2006/math" xmlns:v="urn:schemas-microsoft-com:vml" xmlns:wp14="http://schemas.microsoft.com/office/word/2010/wordprocessingDrawing" xmlns:wp="http://schemas.openxmlformats.org/drawingml/2006/wordprocessingDrawing" xmlns:w10="urn:schemas-microsoft-com:office:word" xmlns:w="http://schemas.openxmlformats.org/wordprocessingml/2006/main" xmlns:w14="http://schemas.microsoft.com/office/word/2010/wordml" xmlns:w15="http://schemas.microsoft.com/office/word/2012/wordml" xmlns:w16cex="http://schemas.microsoft.com/office/word/2018/wordml/cex" xmlns:w16cid="http://schemas.microsoft.com/office/word/2016/wordml/cid" xmlns:w16="http://schemas.microsoft.com/office/word/2018/wordml" xmlns:w16du="http://schemas.microsoft.com/office/word/2023/wordml/word16du" xmlns:w16sdtdh="http://schemas.microsoft.com/office/word/2020/wordml/sdtdatahash" xmlns:w16se="http://schemas.microsoft.com/office/word/2015/wordml/symex" xmlns:wpg="http://schemas.microsoft.com/office/word/2010/wordprocessingGroup" xmlns:wpi="http://schemas.microsoft.com/office/word/2010/wordprocessingInk" xmlns:wne="http://schemas.microsoft.com/office/word/2006/wordml" xmlns:wps="http://schemas.microsoft.com/office/word/2010/wordprocessingShape" mc:Ignorable="w14 w15 w16se w16cid w16 w16cex w16sdtdh w16du wp14">
   <w:abstractNum w:abstractNumId="0" w15:restartNumberingAfterBreak="0">
     <w:nsid w:val="4F5B2EFE"/>
     <w:multiLevelType w:val="multilevel"/>
@@ -4375,7 +3800,7 @@
 </file>
 
 <file path=word/people.xml><?xml version="1.0" encoding="utf-8"?>
-<w15:people xmlns:wpc="http://schemas.microsoft.com/office/word/2010/wordprocessingCanvas" xmlns:cx="http://schemas.microsoft.com/office/drawing/2014/chartex" xmlns:cx1="http://schemas.microsoft.com/office/drawing/2015/9/8/chartex" xmlns:cx2="http://schemas.microsoft.com/office/drawing/2015/10/21/chartex" xmlns:cx3="http://schemas.microsoft.com/office/drawing/2016/5/9/chartex" xmlns:cx4="http://schemas.microsoft.com/office/drawing/2016/5/10/chartex" xmlns:cx5="http://schemas.microsoft.com/office/drawing/2016/5/11/chartex" xmlns:cx6="http://schemas.microsoft.com/office/drawing/2016/5/12/chartex" xmlns:cx7="http://schemas.microsoft.com/office/drawing/2016/5/13/chartex" xmlns:cx8="http://schemas.microsoft.com/office/drawing/2016/5/14/chartex" xmlns:mc="http://schemas.openxmlformats.org/markup-compatibility/2006" xmlns:aink="http://schemas.microsoft.com/office/drawing/2016/ink" xmlns:am3d="http://schemas.microsoft.com/office/drawing/2017/model3d" xmlns:o="urn:schemas-microsoft-com:office:office" xmlns:oel="http://schemas.microsoft.com/office/2019/extlst" xmlns:r="http://schemas.openxmlformats.org/officeDocument/2006/relationships" xmlns:m="http://schemas.openxmlformats.org/officeDocument/2006/math" xmlns:v="urn:schemas-microsoft-com:vml" xmlns:wp14="http://schemas.microsoft.com/office/word/2010/wordprocessingDrawing" xmlns:wp="http://schemas.openxmlformats.org/drawingml/2006/wordprocessingDrawing" xmlns:w10="urn:schemas-microsoft-com:office:word" xmlns:w="http://schemas.openxmlformats.org/wordprocessingml/2006/main" xmlns:w14="http://schemas.microsoft.com/office/word/2010/wordml" xmlns:w15="http://schemas.microsoft.com/office/word/2012/wordml" xmlns:w16cex="http://schemas.microsoft.com/office/word/2018/wordml/cex" xmlns:w16cid="http://schemas.microsoft.com/office/word/2016/wordml/cid" xmlns:w16="http://schemas.microsoft.com/office/word/2018/wordml" xmlns:w16du="http://schemas.microsoft.com/office/word/2023/wordml/word16du" xmlns:w16sdtdh="http://schemas.microsoft.com/office/word/2020/wordml/sdtdatahash" xmlns:w16sdtfl="http://schemas.microsoft.com/office/word/2024/wordml/sdtformatlock" xmlns:w16se="http://schemas.microsoft.com/office/word/2015/wordml/symex" xmlns:wpg="http://schemas.microsoft.com/office/word/2010/wordprocessingGroup" xmlns:wpi="http://schemas.microsoft.com/office/word/2010/wordprocessingInk" xmlns:wne="http://schemas.microsoft.com/office/word/2006/wordml" xmlns:wps="http://schemas.microsoft.com/office/word/2010/wordprocessingShape" mc:Ignorable="w14 w15 w16se w16cid w16 w16cex w16sdtdh w16sdtfl w16du wp14">
+<w15:people xmlns:wpc="http://schemas.microsoft.com/office/word/2010/wordprocessingCanvas" xmlns:cx="http://schemas.microsoft.com/office/drawing/2014/chartex" xmlns:cx1="http://schemas.microsoft.com/office/drawing/2015/9/8/chartex" xmlns:cx2="http://schemas.microsoft.com/office/drawing/2015/10/21/chartex" xmlns:cx3="http://schemas.microsoft.com/office/drawing/2016/5/9/chartex" xmlns:cx4="http://schemas.microsoft.com/office/drawing/2016/5/10/chartex" xmlns:cx5="http://schemas.microsoft.com/office/drawing/2016/5/11/chartex" xmlns:cx6="http://schemas.microsoft.com/office/drawing/2016/5/12/chartex" xmlns:cx7="http://schemas.microsoft.com/office/drawing/2016/5/13/chartex" xmlns:cx8="http://schemas.microsoft.com/office/drawing/2016/5/14/chartex" xmlns:mc="http://schemas.openxmlformats.org/markup-compatibility/2006" xmlns:aink="http://schemas.microsoft.com/office/drawing/2016/ink" xmlns:am3d="http://schemas.microsoft.com/office/drawing/2017/model3d" xmlns:o="urn:schemas-microsoft-com:office:office" xmlns:oel="http://schemas.microsoft.com/office/2019/extlst" xmlns:r="http://schemas.openxmlformats.org/officeDocument/2006/relationships" xmlns:m="http://schemas.openxmlformats.org/officeDocument/2006/math" xmlns:v="urn:schemas-microsoft-com:vml" xmlns:wp14="http://schemas.microsoft.com/office/word/2010/wordprocessingDrawing" xmlns:wp="http://schemas.openxmlformats.org/drawingml/2006/wordprocessingDrawing" xmlns:w10="urn:schemas-microsoft-com:office:word" xmlns:w="http://schemas.openxmlformats.org/wordprocessingml/2006/main" xmlns:w14="http://schemas.microsoft.com/office/word/2010/wordml" xmlns:w15="http://schemas.microsoft.com/office/word/2012/wordml" xmlns:w16cex="http://schemas.microsoft.com/office/word/2018/wordml/cex" xmlns:w16cid="http://schemas.microsoft.com/office/word/2016/wordml/cid" xmlns:w16="http://schemas.microsoft.com/office/word/2018/wordml" xmlns:w16du="http://schemas.microsoft.com/office/word/2023/wordml/word16du" xmlns:w16sdtdh="http://schemas.microsoft.com/office/word/2020/wordml/sdtdatahash" xmlns:w16se="http://schemas.microsoft.com/office/word/2015/wordml/symex" xmlns:wpg="http://schemas.microsoft.com/office/word/2010/wordprocessingGroup" xmlns:wpi="http://schemas.microsoft.com/office/word/2010/wordprocessingInk" xmlns:wne="http://schemas.microsoft.com/office/word/2006/wordml" xmlns:wps="http://schemas.microsoft.com/office/word/2010/wordprocessingShape" mc:Ignorable="w14 w15 w16se w16cid w16 w16cex w16sdtdh w16du wp14">
   <w15:person w15:author="Cummings, Shawn">
     <w15:presenceInfo w15:providerId="AD" w15:userId="S::shawn.cummings@uconn.edu::de2d00fc-0438-4d53-9dfb-ffd47e6e9224"/>
   </w15:person>
@@ -4386,7 +3811,7 @@
 </file>
 
 <file path=word/styles.xml><?xml version="1.0" encoding="utf-8"?>
-<w:styles xmlns:mc="http://schemas.openxmlformats.org/markup-compatibility/2006" xmlns:r="http://schemas.openxmlformats.org/officeDocument/2006/relationships" xmlns:w="http://schemas.openxmlformats.org/wordprocessingml/2006/main" xmlns:w14="http://schemas.microsoft.com/office/word/2010/wordml" xmlns:w15="http://schemas.microsoft.com/office/word/2012/wordml" xmlns:w16cex="http://schemas.microsoft.com/office/word/2018/wordml/cex" xmlns:w16cid="http://schemas.microsoft.com/office/word/2016/wordml/cid" xmlns:w16="http://schemas.microsoft.com/office/word/2018/wordml" xmlns:w16du="http://schemas.microsoft.com/office/word/2023/wordml/word16du" xmlns:w16sdtdh="http://schemas.microsoft.com/office/word/2020/wordml/sdtdatahash" xmlns:w16sdtfl="http://schemas.microsoft.com/office/word/2024/wordml/sdtformatlock" xmlns:w16se="http://schemas.microsoft.com/office/word/2015/wordml/symex" mc:Ignorable="w14 w15 w16se w16cid w16 w16cex w16sdtdh w16sdtfl w16du">
+<w:styles xmlns:mc="http://schemas.openxmlformats.org/markup-compatibility/2006" xmlns:r="http://schemas.openxmlformats.org/officeDocument/2006/relationships" xmlns:w="http://schemas.openxmlformats.org/wordprocessingml/2006/main" xmlns:w14="http://schemas.microsoft.com/office/word/2010/wordml" xmlns:w15="http://schemas.microsoft.com/office/word/2012/wordml" xmlns:w16cex="http://schemas.microsoft.com/office/word/2018/wordml/cex" xmlns:w16cid="http://schemas.microsoft.com/office/word/2016/wordml/cid" xmlns:w16="http://schemas.microsoft.com/office/word/2018/wordml" xmlns:w16du="http://schemas.microsoft.com/office/word/2023/wordml/word16du" xmlns:w16sdtdh="http://schemas.microsoft.com/office/word/2020/wordml/sdtdatahash" xmlns:w16se="http://schemas.microsoft.com/office/word/2015/wordml/symex" mc:Ignorable="w14 w15 w16se w16cid w16 w16cex w16sdtdh w16du">
   <w:docDefaults>
     <w:rPrDefault>
       <w:rPr>

</xml_diff>